<commit_message>
Postman koleksiyonu Newman ile dogrulandi; script ve assertion hatalari duzeltildi
Co-Authored-By: Claude Opus 5.5 <noreply@anthropic.com>
</commit_message>
<xml_diff>
--- a/docs/Snack_Attack_Test_Plani.docx
+++ b/docs/Snack_Attack_Test_Plani.docx
@@ -615,9 +615,8 @@
       <w:pPr>
         <w:pStyle w:val="Balk1"/>
       </w:pPr>
-      <w:bookmarkStart w:id="0" w:name="_Toc242531359"/>
+      <w:bookmarkStart w:id="0" w:name="_Toc242531990"/>
       <w:r>
-        <w:lastRenderedPageBreak/>
         <w:t>Revizyon Geçmişi</w:t>
       </w:r>
       <w:bookmarkEnd w:id="0"/>
@@ -886,7 +885,7 @@
       <w:pPr>
         <w:pStyle w:val="Balk1"/>
       </w:pPr>
-      <w:bookmarkStart w:id="1" w:name="_Toc242531360"/>
+      <w:bookmarkStart w:id="1" w:name="_Toc242531991"/>
       <w:r>
         <w:t>İçindekiler</w:t>
       </w:r>
@@ -895,7 +894,7 @@
     <w:sdt>
       <w:sdtPr>
         <w:alias w:val="İçindekiler"/>
-        <w:id w:val="1344752851"/>
+        <w:id w:val="-1698687325"/>
       </w:sdtPr>
       <w:sdtEndPr/>
       <w:sdtContent>
@@ -918,7 +917,7 @@
           <w:r>
             <w:fldChar w:fldCharType="separate"/>
           </w:r>
-          <w:hyperlink w:anchor="_Toc242531359" w:history="1">
+          <w:hyperlink w:anchor="_Toc242531990" w:history="1">
             <w:r>
               <w:rPr>
                 <w:rStyle w:val="Kpr"/>
@@ -942,7 +941,7 @@
               <w:rPr>
                 <w:noProof/>
               </w:rPr>
-              <w:instrText xml:space="preserve"> PAGEREF _Toc242531359 \h </w:instrText>
+              <w:instrText xml:space="preserve"> PAGEREF _Toc242531990 \h </w:instrText>
             </w:r>
             <w:r>
               <w:rPr>
@@ -979,7 +978,7 @@
               <w:noProof/>
             </w:rPr>
           </w:pPr>
-          <w:hyperlink w:anchor="_Toc242531360" w:history="1">
+          <w:hyperlink w:anchor="_Toc242531991" w:history="1">
             <w:r>
               <w:rPr>
                 <w:rStyle w:val="Kpr"/>
@@ -1003,7 +1002,7 @@
               <w:rPr>
                 <w:noProof/>
               </w:rPr>
-              <w:instrText xml:space="preserve"> PAGEREF _Toc242531360 \h </w:instrText>
+              <w:instrText xml:space="preserve"> PAGEREF _Toc242531991 \h </w:instrText>
             </w:r>
             <w:r>
               <w:rPr>
@@ -1040,7 +1039,7 @@
               <w:noProof/>
             </w:rPr>
           </w:pPr>
-          <w:hyperlink w:anchor="_Toc242531361" w:history="1">
+          <w:hyperlink w:anchor="_Toc242531992" w:history="1">
             <w:r>
               <w:rPr>
                 <w:rStyle w:val="Kpr"/>
@@ -1064,7 +1063,7 @@
               <w:rPr>
                 <w:noProof/>
               </w:rPr>
-              <w:instrText xml:space="preserve"> PAGEREF _Toc242531361 \h </w:instrText>
+              <w:instrText xml:space="preserve"> PAGEREF _Toc242531992 \h </w:instrText>
             </w:r>
             <w:r>
               <w:rPr>
@@ -1101,7 +1100,7 @@
               <w:noProof/>
             </w:rPr>
           </w:pPr>
-          <w:hyperlink w:anchor="_Toc242531362" w:history="1">
+          <w:hyperlink w:anchor="_Toc242531993" w:history="1">
             <w:r>
               <w:rPr>
                 <w:rStyle w:val="Kpr"/>
@@ -1125,7 +1124,7 @@
               <w:rPr>
                 <w:noProof/>
               </w:rPr>
-              <w:instrText xml:space="preserve"> PAGEREF _Toc242531362 \h </w:instrText>
+              <w:instrText xml:space="preserve"> PAGEREF _Toc242531993 \h </w:instrText>
             </w:r>
             <w:r>
               <w:rPr>
@@ -1162,7 +1161,7 @@
               <w:noProof/>
             </w:rPr>
           </w:pPr>
-          <w:hyperlink w:anchor="_Toc242531363" w:history="1">
+          <w:hyperlink w:anchor="_Toc242531994" w:history="1">
             <w:r>
               <w:rPr>
                 <w:rStyle w:val="Kpr"/>
@@ -1186,7 +1185,7 @@
               <w:rPr>
                 <w:noProof/>
               </w:rPr>
-              <w:instrText xml:space="preserve"> PAGEREF _Toc242531363 \h </w:instrText>
+              <w:instrText xml:space="preserve"> PAGEREF _Toc242531994 \h </w:instrText>
             </w:r>
             <w:r>
               <w:rPr>
@@ -1223,7 +1222,7 @@
               <w:noProof/>
             </w:rPr>
           </w:pPr>
-          <w:hyperlink w:anchor="_Toc242531364" w:history="1">
+          <w:hyperlink w:anchor="_Toc242531995" w:history="1">
             <w:r>
               <w:rPr>
                 <w:rStyle w:val="Kpr"/>
@@ -1247,7 +1246,7 @@
               <w:rPr>
                 <w:noProof/>
               </w:rPr>
-              <w:instrText xml:space="preserve"> PAGEREF _Toc242531364 \h </w:instrText>
+              <w:instrText xml:space="preserve"> PAGEREF _Toc242531995 \h </w:instrText>
             </w:r>
             <w:r>
               <w:rPr>
@@ -1284,7 +1283,7 @@
               <w:noProof/>
             </w:rPr>
           </w:pPr>
-          <w:hyperlink w:anchor="_Toc242531365" w:history="1">
+          <w:hyperlink w:anchor="_Toc242531996" w:history="1">
             <w:r>
               <w:rPr>
                 <w:rStyle w:val="Kpr"/>
@@ -1308,7 +1307,7 @@
               <w:rPr>
                 <w:noProof/>
               </w:rPr>
-              <w:instrText xml:space="preserve"> PAGEREF _Toc242531365 \h </w:instrText>
+              <w:instrText xml:space="preserve"> PAGEREF _Toc242531996 \h </w:instrText>
             </w:r>
             <w:r>
               <w:rPr>
@@ -1345,7 +1344,7 @@
               <w:noProof/>
             </w:rPr>
           </w:pPr>
-          <w:hyperlink w:anchor="_Toc242531366" w:history="1">
+          <w:hyperlink w:anchor="_Toc242531997" w:history="1">
             <w:r>
               <w:rPr>
                 <w:rStyle w:val="Kpr"/>
@@ -1369,7 +1368,7 @@
               <w:rPr>
                 <w:noProof/>
               </w:rPr>
-              <w:instrText xml:space="preserve"> PAGEREF _Toc242531366 \h </w:instrText>
+              <w:instrText xml:space="preserve"> PAGEREF _Toc242531997 \h </w:instrText>
             </w:r>
             <w:r>
               <w:rPr>
@@ -1406,7 +1405,7 @@
               <w:noProof/>
             </w:rPr>
           </w:pPr>
-          <w:hyperlink w:anchor="_Toc242531367" w:history="1">
+          <w:hyperlink w:anchor="_Toc242531998" w:history="1">
             <w:r>
               <w:rPr>
                 <w:rStyle w:val="Kpr"/>
@@ -1430,7 +1429,7 @@
               <w:rPr>
                 <w:noProof/>
               </w:rPr>
-              <w:instrText xml:space="preserve"> PAGEREF _Toc242531367 \h </w:instrText>
+              <w:instrText xml:space="preserve"> PAGEREF _Toc242531998 \h </w:instrText>
             </w:r>
             <w:r>
               <w:rPr>
@@ -1467,7 +1466,7 @@
               <w:noProof/>
             </w:rPr>
           </w:pPr>
-          <w:hyperlink w:anchor="_Toc242531368" w:history="1">
+          <w:hyperlink w:anchor="_Toc242531999" w:history="1">
             <w:r>
               <w:rPr>
                 <w:rStyle w:val="Kpr"/>
@@ -1491,7 +1490,7 @@
               <w:rPr>
                 <w:noProof/>
               </w:rPr>
-              <w:instrText xml:space="preserve"> PAGEREF _Toc242531368 \h </w:instrText>
+              <w:instrText xml:space="preserve"> PAGEREF _Toc242531999 \h </w:instrText>
             </w:r>
             <w:r>
               <w:rPr>
@@ -1528,7 +1527,7 @@
               <w:noProof/>
             </w:rPr>
           </w:pPr>
-          <w:hyperlink w:anchor="_Toc242531369" w:history="1">
+          <w:hyperlink w:anchor="_Toc242532000" w:history="1">
             <w:r>
               <w:rPr>
                 <w:rStyle w:val="Kpr"/>
@@ -1552,7 +1551,7 @@
               <w:rPr>
                 <w:noProof/>
               </w:rPr>
-              <w:instrText xml:space="preserve"> PAGEREF _Toc242531369 \h </w:instrText>
+              <w:instrText xml:space="preserve"> PAGEREF _Toc242532000 \h </w:instrText>
             </w:r>
             <w:r>
               <w:rPr>
@@ -1589,7 +1588,7 @@
               <w:noProof/>
             </w:rPr>
           </w:pPr>
-          <w:hyperlink w:anchor="_Toc242531370" w:history="1">
+          <w:hyperlink w:anchor="_Toc242532001" w:history="1">
             <w:r>
               <w:rPr>
                 <w:rStyle w:val="Kpr"/>
@@ -1613,7 +1612,7 @@
               <w:rPr>
                 <w:noProof/>
               </w:rPr>
-              <w:instrText xml:space="preserve"> PAGEREF _Toc242531370 \h </w:instrText>
+              <w:instrText xml:space="preserve"> PAGEREF _Toc242532001 \h </w:instrText>
             </w:r>
             <w:r>
               <w:rPr>
@@ -1650,7 +1649,7 @@
               <w:noProof/>
             </w:rPr>
           </w:pPr>
-          <w:hyperlink w:anchor="_Toc242531371" w:history="1">
+          <w:hyperlink w:anchor="_Toc242532002" w:history="1">
             <w:r>
               <w:rPr>
                 <w:rStyle w:val="Kpr"/>
@@ -1674,7 +1673,7 @@
               <w:rPr>
                 <w:noProof/>
               </w:rPr>
-              <w:instrText xml:space="preserve"> PAGEREF _Toc242531371 \h </w:instrText>
+              <w:instrText xml:space="preserve"> PAGEREF _Toc242532002 \h </w:instrText>
             </w:r>
             <w:r>
               <w:rPr>
@@ -1711,7 +1710,7 @@
               <w:noProof/>
             </w:rPr>
           </w:pPr>
-          <w:hyperlink w:anchor="_Toc242531372" w:history="1">
+          <w:hyperlink w:anchor="_Toc242532003" w:history="1">
             <w:r>
               <w:rPr>
                 <w:rStyle w:val="Kpr"/>
@@ -1735,7 +1734,7 @@
               <w:rPr>
                 <w:noProof/>
               </w:rPr>
-              <w:instrText xml:space="preserve"> PAGEREF _Toc242531372 \h </w:instrText>
+              <w:instrText xml:space="preserve"> PAGEREF _Toc242532003 \h </w:instrText>
             </w:r>
             <w:r>
               <w:rPr>
@@ -1772,7 +1771,7 @@
               <w:noProof/>
             </w:rPr>
           </w:pPr>
-          <w:hyperlink w:anchor="_Toc242531373" w:history="1">
+          <w:hyperlink w:anchor="_Toc242532004" w:history="1">
             <w:r>
               <w:rPr>
                 <w:rStyle w:val="Kpr"/>
@@ -1796,7 +1795,7 @@
               <w:rPr>
                 <w:noProof/>
               </w:rPr>
-              <w:instrText xml:space="preserve"> PAGEREF _Toc242531373 \h </w:instrText>
+              <w:instrText xml:space="preserve"> PAGEREF _Toc242532004 \h </w:instrText>
             </w:r>
             <w:r>
               <w:rPr>
@@ -1833,7 +1832,7 @@
               <w:noProof/>
             </w:rPr>
           </w:pPr>
-          <w:hyperlink w:anchor="_Toc242531374" w:history="1">
+          <w:hyperlink w:anchor="_Toc242532005" w:history="1">
             <w:r>
               <w:rPr>
                 <w:rStyle w:val="Kpr"/>
@@ -1857,7 +1856,7 @@
               <w:rPr>
                 <w:noProof/>
               </w:rPr>
-              <w:instrText xml:space="preserve"> PAGEREF _Toc242531374 \h </w:instrText>
+              <w:instrText xml:space="preserve"> PAGEREF _Toc242532005 \h </w:instrText>
             </w:r>
             <w:r>
               <w:rPr>
@@ -1894,7 +1893,7 @@
               <w:noProof/>
             </w:rPr>
           </w:pPr>
-          <w:hyperlink w:anchor="_Toc242531375" w:history="1">
+          <w:hyperlink w:anchor="_Toc242532006" w:history="1">
             <w:r>
               <w:rPr>
                 <w:rStyle w:val="Kpr"/>
@@ -1918,7 +1917,7 @@
               <w:rPr>
                 <w:noProof/>
               </w:rPr>
-              <w:instrText xml:space="preserve"> PAGEREF _Toc242531375 \h </w:instrText>
+              <w:instrText xml:space="preserve"> PAGEREF _Toc242532006 \h </w:instrText>
             </w:r>
             <w:r>
               <w:rPr>
@@ -1955,7 +1954,7 @@
               <w:noProof/>
             </w:rPr>
           </w:pPr>
-          <w:hyperlink w:anchor="_Toc242531376" w:history="1">
+          <w:hyperlink w:anchor="_Toc242532007" w:history="1">
             <w:r>
               <w:rPr>
                 <w:rStyle w:val="Kpr"/>
@@ -1979,7 +1978,7 @@
               <w:rPr>
                 <w:noProof/>
               </w:rPr>
-              <w:instrText xml:space="preserve"> PAGEREF _Toc242531376 \h </w:instrText>
+              <w:instrText xml:space="preserve"> PAGEREF _Toc242532007 \h </w:instrText>
             </w:r>
             <w:r>
               <w:rPr>
@@ -2016,7 +2015,7 @@
               <w:noProof/>
             </w:rPr>
           </w:pPr>
-          <w:hyperlink w:anchor="_Toc242531377" w:history="1">
+          <w:hyperlink w:anchor="_Toc242532008" w:history="1">
             <w:r>
               <w:rPr>
                 <w:rStyle w:val="Kpr"/>
@@ -2040,7 +2039,7 @@
               <w:rPr>
                 <w:noProof/>
               </w:rPr>
-              <w:instrText xml:space="preserve"> PAGEREF _Toc242531377 \h </w:instrText>
+              <w:instrText xml:space="preserve"> PAGEREF _Toc242532008 \h </w:instrText>
             </w:r>
             <w:r>
               <w:rPr>
@@ -2077,7 +2076,7 @@
               <w:noProof/>
             </w:rPr>
           </w:pPr>
-          <w:hyperlink w:anchor="_Toc242531378" w:history="1">
+          <w:hyperlink w:anchor="_Toc242532009" w:history="1">
             <w:r>
               <w:rPr>
                 <w:rStyle w:val="Kpr"/>
@@ -2101,7 +2100,7 @@
               <w:rPr>
                 <w:noProof/>
               </w:rPr>
-              <w:instrText xml:space="preserve"> PAGEREF _Toc242531378 \h </w:instrText>
+              <w:instrText xml:space="preserve"> PAGEREF _Toc242532009 \h </w:instrText>
             </w:r>
             <w:r>
               <w:rPr>
@@ -2138,7 +2137,7 @@
               <w:noProof/>
             </w:rPr>
           </w:pPr>
-          <w:hyperlink w:anchor="_Toc242531379" w:history="1">
+          <w:hyperlink w:anchor="_Toc242532010" w:history="1">
             <w:r>
               <w:rPr>
                 <w:rStyle w:val="Kpr"/>
@@ -2162,7 +2161,7 @@
               <w:rPr>
                 <w:noProof/>
               </w:rPr>
-              <w:instrText xml:space="preserve"> PAGEREF _Toc242531379 \h </w:instrText>
+              <w:instrText xml:space="preserve"> PAGEREF _Toc242532010 \h </w:instrText>
             </w:r>
             <w:r>
               <w:rPr>
@@ -2199,7 +2198,7 @@
               <w:noProof/>
             </w:rPr>
           </w:pPr>
-          <w:hyperlink w:anchor="_Toc242531380" w:history="1">
+          <w:hyperlink w:anchor="_Toc242532011" w:history="1">
             <w:r>
               <w:rPr>
                 <w:rStyle w:val="Kpr"/>
@@ -2223,7 +2222,7 @@
               <w:rPr>
                 <w:noProof/>
               </w:rPr>
-              <w:instrText xml:space="preserve"> PAGEREF _Toc242531380 \h </w:instrText>
+              <w:instrText xml:space="preserve"> PAGEREF _Toc242532011 \h </w:instrText>
             </w:r>
             <w:r>
               <w:rPr>
@@ -2260,7 +2259,7 @@
               <w:noProof/>
             </w:rPr>
           </w:pPr>
-          <w:hyperlink w:anchor="_Toc242531381" w:history="1">
+          <w:hyperlink w:anchor="_Toc242532012" w:history="1">
             <w:r>
               <w:rPr>
                 <w:rStyle w:val="Kpr"/>
@@ -2284,7 +2283,7 @@
               <w:rPr>
                 <w:noProof/>
               </w:rPr>
-              <w:instrText xml:space="preserve"> PAGEREF _Toc242531381 \h </w:instrText>
+              <w:instrText xml:space="preserve"> PAGEREF _Toc242532012 \h </w:instrText>
             </w:r>
             <w:r>
               <w:rPr>
@@ -2321,7 +2320,7 @@
               <w:noProof/>
             </w:rPr>
           </w:pPr>
-          <w:hyperlink w:anchor="_Toc242531382" w:history="1">
+          <w:hyperlink w:anchor="_Toc242532013" w:history="1">
             <w:r>
               <w:rPr>
                 <w:rStyle w:val="Kpr"/>
@@ -2345,7 +2344,7 @@
               <w:rPr>
                 <w:noProof/>
               </w:rPr>
-              <w:instrText xml:space="preserve"> PAGEREF _Toc242531382 \h </w:instrText>
+              <w:instrText xml:space="preserve"> PAGEREF _Toc242532013 \h </w:instrText>
             </w:r>
             <w:r>
               <w:rPr>
@@ -2382,7 +2381,7 @@
               <w:noProof/>
             </w:rPr>
           </w:pPr>
-          <w:hyperlink w:anchor="_Toc242531383" w:history="1">
+          <w:hyperlink w:anchor="_Toc242532014" w:history="1">
             <w:r>
               <w:rPr>
                 <w:rStyle w:val="Kpr"/>
@@ -2406,7 +2405,7 @@
               <w:rPr>
                 <w:noProof/>
               </w:rPr>
-              <w:instrText xml:space="preserve"> PAGEREF _Toc242531383 \h </w:instrText>
+              <w:instrText xml:space="preserve"> PAGEREF _Toc242532014 \h </w:instrText>
             </w:r>
             <w:r>
               <w:rPr>
@@ -2443,7 +2442,7 @@
               <w:noProof/>
             </w:rPr>
           </w:pPr>
-          <w:hyperlink w:anchor="_Toc242531384" w:history="1">
+          <w:hyperlink w:anchor="_Toc242532015" w:history="1">
             <w:r>
               <w:rPr>
                 <w:rStyle w:val="Kpr"/>
@@ -2467,7 +2466,7 @@
               <w:rPr>
                 <w:noProof/>
               </w:rPr>
-              <w:instrText xml:space="preserve"> PAGEREF _Toc242531384 \h </w:instrText>
+              <w:instrText xml:space="preserve"> PAGEREF _Toc242532015 \h </w:instrText>
             </w:r>
             <w:r>
               <w:rPr>
@@ -2504,7 +2503,7 @@
               <w:noProof/>
             </w:rPr>
           </w:pPr>
-          <w:hyperlink w:anchor="_Toc242531385" w:history="1">
+          <w:hyperlink w:anchor="_Toc242532016" w:history="1">
             <w:r>
               <w:rPr>
                 <w:rStyle w:val="Kpr"/>
@@ -2528,7 +2527,7 @@
               <w:rPr>
                 <w:noProof/>
               </w:rPr>
-              <w:instrText xml:space="preserve"> PAGEREF _Toc242531385 \h </w:instrText>
+              <w:instrText xml:space="preserve"> PAGEREF _Toc242532016 \h </w:instrText>
             </w:r>
             <w:r>
               <w:rPr>
@@ -2565,7 +2564,7 @@
               <w:noProof/>
             </w:rPr>
           </w:pPr>
-          <w:hyperlink w:anchor="_Toc242531386" w:history="1">
+          <w:hyperlink w:anchor="_Toc242532017" w:history="1">
             <w:r>
               <w:rPr>
                 <w:rStyle w:val="Kpr"/>
@@ -2589,7 +2588,7 @@
               <w:rPr>
                 <w:noProof/>
               </w:rPr>
-              <w:instrText xml:space="preserve"> PAGEREF _Toc242531386 \h </w:instrText>
+              <w:instrText xml:space="preserve"> PAGEREF _Toc242532017 \h </w:instrText>
             </w:r>
             <w:r>
               <w:rPr>
@@ -2626,7 +2625,7 @@
               <w:noProof/>
             </w:rPr>
           </w:pPr>
-          <w:hyperlink w:anchor="_Toc242531387" w:history="1">
+          <w:hyperlink w:anchor="_Toc242532018" w:history="1">
             <w:r>
               <w:rPr>
                 <w:rStyle w:val="Kpr"/>
@@ -2650,7 +2649,7 @@
               <w:rPr>
                 <w:noProof/>
               </w:rPr>
-              <w:instrText xml:space="preserve"> PAGEREF _Toc242531387 \h </w:instrText>
+              <w:instrText xml:space="preserve"> PAGEREF _Toc242532018 \h </w:instrText>
             </w:r>
             <w:r>
               <w:rPr>
@@ -2687,7 +2686,7 @@
               <w:noProof/>
             </w:rPr>
           </w:pPr>
-          <w:hyperlink w:anchor="_Toc242531388" w:history="1">
+          <w:hyperlink w:anchor="_Toc242532019" w:history="1">
             <w:r>
               <w:rPr>
                 <w:rStyle w:val="Kpr"/>
@@ -2711,7 +2710,7 @@
               <w:rPr>
                 <w:noProof/>
               </w:rPr>
-              <w:instrText xml:space="preserve"> PAGEREF _Toc242531388 \h </w:instrText>
+              <w:instrText xml:space="preserve"> PAGEREF _Toc242532019 \h </w:instrText>
             </w:r>
             <w:r>
               <w:rPr>
@@ -2748,7 +2747,7 @@
               <w:noProof/>
             </w:rPr>
           </w:pPr>
-          <w:hyperlink w:anchor="_Toc242531389" w:history="1">
+          <w:hyperlink w:anchor="_Toc242532020" w:history="1">
             <w:r>
               <w:rPr>
                 <w:rStyle w:val="Kpr"/>
@@ -2772,7 +2771,7 @@
               <w:rPr>
                 <w:noProof/>
               </w:rPr>
-              <w:instrText xml:space="preserve"> PAGEREF _Toc242531389 \h </w:instrText>
+              <w:instrText xml:space="preserve"> PAGEREF _Toc242532020 \h </w:instrText>
             </w:r>
             <w:r>
               <w:rPr>
@@ -2809,7 +2808,7 @@
               <w:noProof/>
             </w:rPr>
           </w:pPr>
-          <w:hyperlink w:anchor="_Toc242531390" w:history="1">
+          <w:hyperlink w:anchor="_Toc242532021" w:history="1">
             <w:r>
               <w:rPr>
                 <w:rStyle w:val="Kpr"/>
@@ -2833,7 +2832,7 @@
               <w:rPr>
                 <w:noProof/>
               </w:rPr>
-              <w:instrText xml:space="preserve"> PAGEREF _Toc242531390 \h </w:instrText>
+              <w:instrText xml:space="preserve"> PAGEREF _Toc242532021 \h </w:instrText>
             </w:r>
             <w:r>
               <w:rPr>
@@ -2870,7 +2869,7 @@
               <w:noProof/>
             </w:rPr>
           </w:pPr>
-          <w:hyperlink w:anchor="_Toc242531391" w:history="1">
+          <w:hyperlink w:anchor="_Toc242532022" w:history="1">
             <w:r>
               <w:rPr>
                 <w:rStyle w:val="Kpr"/>
@@ -2894,7 +2893,7 @@
               <w:rPr>
                 <w:noProof/>
               </w:rPr>
-              <w:instrText xml:space="preserve"> PAGEREF _Toc242531391 \h </w:instrText>
+              <w:instrText xml:space="preserve"> PAGEREF _Toc242532022 \h </w:instrText>
             </w:r>
             <w:r>
               <w:rPr>
@@ -2931,7 +2930,7 @@
               <w:noProof/>
             </w:rPr>
           </w:pPr>
-          <w:hyperlink w:anchor="_Toc242531392" w:history="1">
+          <w:hyperlink w:anchor="_Toc242532023" w:history="1">
             <w:r>
               <w:rPr>
                 <w:rStyle w:val="Kpr"/>
@@ -2955,7 +2954,7 @@
               <w:rPr>
                 <w:noProof/>
               </w:rPr>
-              <w:instrText xml:space="preserve"> PAGEREF _Toc242531392 \h </w:instrText>
+              <w:instrText xml:space="preserve"> PAGEREF _Toc242532023 \h </w:instrText>
             </w:r>
             <w:r>
               <w:rPr>
@@ -2992,7 +2991,7 @@
               <w:noProof/>
             </w:rPr>
           </w:pPr>
-          <w:hyperlink w:anchor="_Toc242531393" w:history="1">
+          <w:hyperlink w:anchor="_Toc242532024" w:history="1">
             <w:r>
               <w:rPr>
                 <w:rStyle w:val="Kpr"/>
@@ -3016,7 +3015,7 @@
               <w:rPr>
                 <w:noProof/>
               </w:rPr>
-              <w:instrText xml:space="preserve"> PAGEREF _Toc242531393 \h </w:instrText>
+              <w:instrText xml:space="preserve"> PAGEREF _Toc242532024 \h </w:instrText>
             </w:r>
             <w:r>
               <w:rPr>
@@ -3053,7 +3052,7 @@
               <w:noProof/>
             </w:rPr>
           </w:pPr>
-          <w:hyperlink w:anchor="_Toc242531394" w:history="1">
+          <w:hyperlink w:anchor="_Toc242532025" w:history="1">
             <w:r>
               <w:rPr>
                 <w:rStyle w:val="Kpr"/>
@@ -3077,7 +3076,7 @@
               <w:rPr>
                 <w:noProof/>
               </w:rPr>
-              <w:instrText xml:space="preserve"> PAGEREF _Toc242531394 \h </w:instrText>
+              <w:instrText xml:space="preserve"> PAGEREF _Toc242532025 \h </w:instrText>
             </w:r>
             <w:r>
               <w:rPr>
@@ -3114,7 +3113,7 @@
               <w:noProof/>
             </w:rPr>
           </w:pPr>
-          <w:hyperlink w:anchor="_Toc242531395" w:history="1">
+          <w:hyperlink w:anchor="_Toc242532026" w:history="1">
             <w:r>
               <w:rPr>
                 <w:rStyle w:val="Kpr"/>
@@ -3138,7 +3137,7 @@
               <w:rPr>
                 <w:noProof/>
               </w:rPr>
-              <w:instrText xml:space="preserve"> PAGEREF _Toc242531395 \h </w:instrText>
+              <w:instrText xml:space="preserve"> PAGEREF _Toc242532026 \h </w:instrText>
             </w:r>
             <w:r>
               <w:rPr>
@@ -3175,7 +3174,7 @@
               <w:noProof/>
             </w:rPr>
           </w:pPr>
-          <w:hyperlink w:anchor="_Toc242531396" w:history="1">
+          <w:hyperlink w:anchor="_Toc242532027" w:history="1">
             <w:r>
               <w:rPr>
                 <w:rStyle w:val="Kpr"/>
@@ -3199,7 +3198,7 @@
               <w:rPr>
                 <w:noProof/>
               </w:rPr>
-              <w:instrText xml:space="preserve"> PAGEREF _Toc242531396 \h </w:instrText>
+              <w:instrText xml:space="preserve"> PAGEREF _Toc242532027 \h </w:instrText>
             </w:r>
             <w:r>
               <w:rPr>
@@ -3236,7 +3235,7 @@
               <w:noProof/>
             </w:rPr>
           </w:pPr>
-          <w:hyperlink w:anchor="_Toc242531397" w:history="1">
+          <w:hyperlink w:anchor="_Toc242532028" w:history="1">
             <w:r>
               <w:rPr>
                 <w:rStyle w:val="Kpr"/>
@@ -3260,7 +3259,7 @@
               <w:rPr>
                 <w:noProof/>
               </w:rPr>
-              <w:instrText xml:space="preserve"> PAGEREF _Toc242531397 \h </w:instrText>
+              <w:instrText xml:space="preserve"> PAGEREF _Toc242532028 \h </w:instrText>
             </w:r>
             <w:r>
               <w:rPr>
@@ -3297,7 +3296,7 @@
               <w:noProof/>
             </w:rPr>
           </w:pPr>
-          <w:hyperlink w:anchor="_Toc242531398" w:history="1">
+          <w:hyperlink w:anchor="_Toc242532029" w:history="1">
             <w:r>
               <w:rPr>
                 <w:rStyle w:val="Kpr"/>
@@ -3321,7 +3320,7 @@
               <w:rPr>
                 <w:noProof/>
               </w:rPr>
-              <w:instrText xml:space="preserve"> PAGEREF _Toc242531398 \h </w:instrText>
+              <w:instrText xml:space="preserve"> PAGEREF _Toc242532029 \h </w:instrText>
             </w:r>
             <w:r>
               <w:rPr>
@@ -3358,7 +3357,7 @@
               <w:noProof/>
             </w:rPr>
           </w:pPr>
-          <w:hyperlink w:anchor="_Toc242531399" w:history="1">
+          <w:hyperlink w:anchor="_Toc242532030" w:history="1">
             <w:r>
               <w:rPr>
                 <w:rStyle w:val="Kpr"/>
@@ -3382,7 +3381,7 @@
               <w:rPr>
                 <w:noProof/>
               </w:rPr>
-              <w:instrText xml:space="preserve"> PAGEREF _Toc242531399 \h </w:instrText>
+              <w:instrText xml:space="preserve"> PAGEREF _Toc242532030 \h </w:instrText>
             </w:r>
             <w:r>
               <w:rPr>
@@ -3419,7 +3418,7 @@
               <w:noProof/>
             </w:rPr>
           </w:pPr>
-          <w:hyperlink w:anchor="_Toc242531400" w:history="1">
+          <w:hyperlink w:anchor="_Toc242532031" w:history="1">
             <w:r>
               <w:rPr>
                 <w:rStyle w:val="Kpr"/>
@@ -3443,7 +3442,7 @@
               <w:rPr>
                 <w:noProof/>
               </w:rPr>
-              <w:instrText xml:space="preserve"> PAGEREF _Toc242531400 \h </w:instrText>
+              <w:instrText xml:space="preserve"> PAGEREF _Toc242532031 \h </w:instrText>
             </w:r>
             <w:r>
               <w:rPr>
@@ -3480,7 +3479,7 @@
               <w:noProof/>
             </w:rPr>
           </w:pPr>
-          <w:hyperlink w:anchor="_Toc242531401" w:history="1">
+          <w:hyperlink w:anchor="_Toc242532032" w:history="1">
             <w:r>
               <w:rPr>
                 <w:rStyle w:val="Kpr"/>
@@ -3504,7 +3503,7 @@
               <w:rPr>
                 <w:noProof/>
               </w:rPr>
-              <w:instrText xml:space="preserve"> PAGEREF _Toc242531401 \h </w:instrText>
+              <w:instrText xml:space="preserve"> PAGEREF _Toc242532032 \h </w:instrText>
             </w:r>
             <w:r>
               <w:rPr>
@@ -3541,7 +3540,7 @@
               <w:noProof/>
             </w:rPr>
           </w:pPr>
-          <w:hyperlink w:anchor="_Toc242531402" w:history="1">
+          <w:hyperlink w:anchor="_Toc242532033" w:history="1">
             <w:r>
               <w:rPr>
                 <w:rStyle w:val="Kpr"/>
@@ -3565,7 +3564,7 @@
               <w:rPr>
                 <w:noProof/>
               </w:rPr>
-              <w:instrText xml:space="preserve"> PAGEREF _Toc242531402 \h </w:instrText>
+              <w:instrText xml:space="preserve"> PAGEREF _Toc242532033 \h </w:instrText>
             </w:r>
             <w:r>
               <w:rPr>
@@ -3602,7 +3601,7 @@
               <w:noProof/>
             </w:rPr>
           </w:pPr>
-          <w:hyperlink w:anchor="_Toc242531403" w:history="1">
+          <w:hyperlink w:anchor="_Toc242532034" w:history="1">
             <w:r>
               <w:rPr>
                 <w:rStyle w:val="Kpr"/>
@@ -3626,7 +3625,7 @@
               <w:rPr>
                 <w:noProof/>
               </w:rPr>
-              <w:instrText xml:space="preserve"> PAGEREF _Toc242531403 \h </w:instrText>
+              <w:instrText xml:space="preserve"> PAGEREF _Toc242532034 \h </w:instrText>
             </w:r>
             <w:r>
               <w:rPr>
@@ -3663,7 +3662,7 @@
               <w:noProof/>
             </w:rPr>
           </w:pPr>
-          <w:hyperlink w:anchor="_Toc242531404" w:history="1">
+          <w:hyperlink w:anchor="_Toc242532035" w:history="1">
             <w:r>
               <w:rPr>
                 <w:rStyle w:val="Kpr"/>
@@ -3687,7 +3686,7 @@
               <w:rPr>
                 <w:noProof/>
               </w:rPr>
-              <w:instrText xml:space="preserve"> PAGEREF _Toc242531404 \h </w:instrText>
+              <w:instrText xml:space="preserve"> PAGEREF _Toc242532035 \h </w:instrText>
             </w:r>
             <w:r>
               <w:rPr>
@@ -3724,7 +3723,7 @@
               <w:noProof/>
             </w:rPr>
           </w:pPr>
-          <w:hyperlink w:anchor="_Toc242531405" w:history="1">
+          <w:hyperlink w:anchor="_Toc242532036" w:history="1">
             <w:r>
               <w:rPr>
                 <w:rStyle w:val="Kpr"/>
@@ -3748,7 +3747,7 @@
               <w:rPr>
                 <w:noProof/>
               </w:rPr>
-              <w:instrText xml:space="preserve"> PAGEREF _Toc242531405 \h </w:instrText>
+              <w:instrText xml:space="preserve"> PAGEREF _Toc242532036 \h </w:instrText>
             </w:r>
             <w:r>
               <w:rPr>
@@ -3785,7 +3784,7 @@
               <w:noProof/>
             </w:rPr>
           </w:pPr>
-          <w:hyperlink w:anchor="_Toc242531406" w:history="1">
+          <w:hyperlink w:anchor="_Toc242532037" w:history="1">
             <w:r>
               <w:rPr>
                 <w:rStyle w:val="Kpr"/>
@@ -3809,7 +3808,7 @@
               <w:rPr>
                 <w:noProof/>
               </w:rPr>
-              <w:instrText xml:space="preserve"> PAGEREF _Toc242531406 \h </w:instrText>
+              <w:instrText xml:space="preserve"> PAGEREF _Toc242532037 \h </w:instrText>
             </w:r>
             <w:r>
               <w:rPr>
@@ -3846,7 +3845,7 @@
               <w:noProof/>
             </w:rPr>
           </w:pPr>
-          <w:hyperlink w:anchor="_Toc242531407" w:history="1">
+          <w:hyperlink w:anchor="_Toc242532038" w:history="1">
             <w:r>
               <w:rPr>
                 <w:rStyle w:val="Kpr"/>
@@ -3870,7 +3869,7 @@
               <w:rPr>
                 <w:noProof/>
               </w:rPr>
-              <w:instrText xml:space="preserve"> PAGEREF _Toc242531407 \h </w:instrText>
+              <w:instrText xml:space="preserve"> PAGEREF _Toc242532038 \h </w:instrText>
             </w:r>
             <w:r>
               <w:rPr>
@@ -3907,7 +3906,7 @@
               <w:noProof/>
             </w:rPr>
           </w:pPr>
-          <w:hyperlink w:anchor="_Toc242531408" w:history="1">
+          <w:hyperlink w:anchor="_Toc242532039" w:history="1">
             <w:r>
               <w:rPr>
                 <w:rStyle w:val="Kpr"/>
@@ -3931,7 +3930,7 @@
               <w:rPr>
                 <w:noProof/>
               </w:rPr>
-              <w:instrText xml:space="preserve"> PAGEREF _Toc242531408 \h </w:instrText>
+              <w:instrText xml:space="preserve"> PAGEREF _Toc242532039 \h </w:instrText>
             </w:r>
             <w:r>
               <w:rPr>
@@ -3968,7 +3967,7 @@
               <w:noProof/>
             </w:rPr>
           </w:pPr>
-          <w:hyperlink w:anchor="_Toc242531409" w:history="1">
+          <w:hyperlink w:anchor="_Toc242532040" w:history="1">
             <w:r>
               <w:rPr>
                 <w:rStyle w:val="Kpr"/>
@@ -3992,7 +3991,7 @@
               <w:rPr>
                 <w:noProof/>
               </w:rPr>
-              <w:instrText xml:space="preserve"> PAGEREF _Toc242531409 \h </w:instrText>
+              <w:instrText xml:space="preserve"> PAGEREF _Toc242532040 \h </w:instrText>
             </w:r>
             <w:r>
               <w:rPr>
@@ -4029,7 +4028,7 @@
               <w:noProof/>
             </w:rPr>
           </w:pPr>
-          <w:hyperlink w:anchor="_Toc242531410" w:history="1">
+          <w:hyperlink w:anchor="_Toc242532041" w:history="1">
             <w:r>
               <w:rPr>
                 <w:rStyle w:val="Kpr"/>
@@ -4053,7 +4052,7 @@
               <w:rPr>
                 <w:noProof/>
               </w:rPr>
-              <w:instrText xml:space="preserve"> PAGEREF _Toc242531410 \h </w:instrText>
+              <w:instrText xml:space="preserve"> PAGEREF _Toc242532041 \h </w:instrText>
             </w:r>
             <w:r>
               <w:rPr>
@@ -4090,7 +4089,7 @@
               <w:noProof/>
             </w:rPr>
           </w:pPr>
-          <w:hyperlink w:anchor="_Toc242531411" w:history="1">
+          <w:hyperlink w:anchor="_Toc242532042" w:history="1">
             <w:r>
               <w:rPr>
                 <w:rStyle w:val="Kpr"/>
@@ -4114,7 +4113,7 @@
               <w:rPr>
                 <w:noProof/>
               </w:rPr>
-              <w:instrText xml:space="preserve"> PAGEREF _Toc242531411 \h </w:instrText>
+              <w:instrText xml:space="preserve"> PAGEREF _Toc242532042 \h </w:instrText>
             </w:r>
             <w:r>
               <w:rPr>
@@ -4173,9 +4172,8 @@
       <w:pPr>
         <w:pStyle w:val="Balk1"/>
       </w:pPr>
-      <w:bookmarkStart w:id="2" w:name="_Toc242531361"/>
+      <w:bookmarkStart w:id="2" w:name="_Toc242531992"/>
       <w:r>
-        <w:lastRenderedPageBreak/>
         <w:t>1. Giriş</w:t>
       </w:r>
       <w:bookmarkEnd w:id="2"/>
@@ -4184,7 +4182,7 @@
       <w:pPr>
         <w:pStyle w:val="Balk2"/>
       </w:pPr>
-      <w:bookmarkStart w:id="3" w:name="_Toc242531362"/>
+      <w:bookmarkStart w:id="3" w:name="_Toc242531993"/>
       <w:r>
         <w:t>1.1 Amaç</w:t>
       </w:r>
@@ -4212,7 +4210,7 @@
       <w:pPr>
         <w:pStyle w:val="Balk2"/>
       </w:pPr>
-      <w:bookmarkStart w:id="4" w:name="_Toc242531363"/>
+      <w:bookmarkStart w:id="4" w:name="_Toc242531994"/>
       <w:r>
         <w:t>1.2 Kapsam Özeti</w:t>
       </w:r>
@@ -4231,7 +4229,7 @@
       <w:pPr>
         <w:pStyle w:val="Balk2"/>
       </w:pPr>
-      <w:bookmarkStart w:id="5" w:name="_Toc242531364"/>
+      <w:bookmarkStart w:id="5" w:name="_Toc242531995"/>
       <w:r>
         <w:t>1.3 Referans Dokümanlar</w:t>
       </w:r>
@@ -4770,7 +4768,7 @@
       <w:pPr>
         <w:pStyle w:val="Balk2"/>
       </w:pPr>
-      <w:bookmarkStart w:id="6" w:name="_Toc242531365"/>
+      <w:bookmarkStart w:id="6" w:name="_Toc242531996"/>
       <w:r>
         <w:t>1.4 Kısaltmalar</w:t>
       </w:r>
@@ -5423,9 +5421,8 @@
       <w:pPr>
         <w:pStyle w:val="Balk1"/>
       </w:pPr>
-      <w:bookmarkStart w:id="7" w:name="_Toc242531366"/>
+      <w:bookmarkStart w:id="7" w:name="_Toc242531997"/>
       <w:r>
-        <w:lastRenderedPageBreak/>
         <w:t>2. Test Edilecek Sistem</w:t>
       </w:r>
       <w:bookmarkEnd w:id="7"/>
@@ -5434,7 +5431,7 @@
       <w:pPr>
         <w:pStyle w:val="Balk2"/>
       </w:pPr>
-      <w:bookmarkStart w:id="8" w:name="_Toc242531367"/>
+      <w:bookmarkStart w:id="8" w:name="_Toc242531998"/>
       <w:r>
         <w:t>2.1 Uygulama Tanımı</w:t>
       </w:r>
@@ -5453,7 +5450,7 @@
       <w:pPr>
         <w:pStyle w:val="Balk2"/>
       </w:pPr>
-      <w:bookmarkStart w:id="9" w:name="_Toc242531368"/>
+      <w:bookmarkStart w:id="9" w:name="_Toc242531999"/>
       <w:r>
         <w:t>2.2 Mimari ve Bileşenler</w:t>
       </w:r>
@@ -5909,7 +5906,7 @@
       <w:pPr>
         <w:pStyle w:val="Balk2"/>
       </w:pPr>
-      <w:bookmarkStart w:id="10" w:name="_Toc242531369"/>
+      <w:bookmarkStart w:id="10" w:name="_Toc242532000"/>
       <w:r>
         <w:t>2.3 Kullanıcı Rolleri</w:t>
       </w:r>
@@ -6170,7 +6167,7 @@
       <w:pPr>
         <w:pStyle w:val="Balk2"/>
       </w:pPr>
-      <w:bookmarkStart w:id="11" w:name="_Toc242531370"/>
+      <w:bookmarkStart w:id="11" w:name="_Toc242532001"/>
       <w:r>
         <w:t>2.4 Uygulama Modülleri (Site Analizi Sonucu)</w:t>
       </w:r>
@@ -7124,9 +7121,8 @@
       <w:pPr>
         <w:pStyle w:val="Balk1"/>
       </w:pPr>
-      <w:bookmarkStart w:id="12" w:name="_Toc242531371"/>
+      <w:bookmarkStart w:id="12" w:name="_Toc242532002"/>
       <w:r>
-        <w:lastRenderedPageBreak/>
         <w:t>3. Test Kapsamı</w:t>
       </w:r>
       <w:bookmarkEnd w:id="12"/>
@@ -7135,7 +7131,7 @@
       <w:pPr>
         <w:pStyle w:val="Balk2"/>
       </w:pPr>
-      <w:bookmarkStart w:id="13" w:name="_Toc242531372"/>
+      <w:bookmarkStart w:id="13" w:name="_Toc242532003"/>
       <w:r>
         <w:t>3.1 Test Edilecek Özellikler (In Scope)</w:t>
       </w:r>
@@ -10227,9 +10223,8 @@
       <w:pPr>
         <w:pStyle w:val="Balk2"/>
       </w:pPr>
-      <w:bookmarkStart w:id="14" w:name="_Toc242531373"/>
+      <w:bookmarkStart w:id="14" w:name="_Toc242532004"/>
       <w:r>
-        <w:lastRenderedPageBreak/>
         <w:t>3.2 Test Edilmeyecek Özellikler (Out of Scope)</w:t>
       </w:r>
       <w:bookmarkEnd w:id="14"/>
@@ -10329,7 +10324,7 @@
       <w:pPr>
         <w:pStyle w:val="Balk1"/>
       </w:pPr>
-      <w:bookmarkStart w:id="15" w:name="_Toc242531374"/>
+      <w:bookmarkStart w:id="15" w:name="_Toc242532005"/>
       <w:r>
         <w:t>4. Test Yaklaşımı ve Stratejisi</w:t>
       </w:r>
@@ -10339,7 +10334,7 @@
       <w:pPr>
         <w:pStyle w:val="Balk2"/>
       </w:pPr>
-      <w:bookmarkStart w:id="16" w:name="_Toc242531375"/>
+      <w:bookmarkStart w:id="16" w:name="_Toc242532006"/>
       <w:r>
         <w:t>4.1 Test Seviyeleri</w:t>
       </w:r>
@@ -10961,7 +10956,7 @@
       <w:pPr>
         <w:pStyle w:val="Balk2"/>
       </w:pPr>
-      <w:bookmarkStart w:id="17" w:name="_Toc242531376"/>
+      <w:bookmarkStart w:id="17" w:name="_Toc242532007"/>
       <w:r>
         <w:t>4.2 Test Türleri</w:t>
       </w:r>
@@ -11091,7 +11086,7 @@
       <w:pPr>
         <w:pStyle w:val="Balk2"/>
       </w:pPr>
-      <w:bookmarkStart w:id="18" w:name="_Toc242531377"/>
+      <w:bookmarkStart w:id="18" w:name="_Toc242532008"/>
       <w:r>
         <w:t>4.3 Test Tasarım Teknikleri</w:t>
       </w:r>
@@ -11427,7 +11422,6 @@
                 <w:sz w:val="19"/>
                 <w:szCs w:val="19"/>
               </w:rPr>
-              <w:lastRenderedPageBreak/>
               <w:t>Hata Tahmini</w:t>
             </w:r>
           </w:p>
@@ -11521,7 +11515,7 @@
       <w:pPr>
         <w:pStyle w:val="Balk2"/>
       </w:pPr>
-      <w:bookmarkStart w:id="19" w:name="_Toc242531378"/>
+      <w:bookmarkStart w:id="19" w:name="_Toc242532009"/>
       <w:r>
         <w:t>4.4 Sipariş Statü Geçiş Kuralları</w:t>
       </w:r>
@@ -12116,7 +12110,7 @@
       <w:pPr>
         <w:pStyle w:val="Balk1"/>
       </w:pPr>
-      <w:bookmarkStart w:id="20" w:name="_Toc242531379"/>
+      <w:bookmarkStart w:id="20" w:name="_Toc242532010"/>
       <w:r>
         <w:t>5. Test Süreci ve Fazlar</w:t>
       </w:r>
@@ -13820,9 +13814,8 @@
       <w:pPr>
         <w:pStyle w:val="Balk1"/>
       </w:pPr>
-      <w:bookmarkStart w:id="21" w:name="_Toc242531380"/>
+      <w:bookmarkStart w:id="21" w:name="_Toc242532011"/>
       <w:r>
-        <w:lastRenderedPageBreak/>
         <w:t>6. Test Ortamı</w:t>
       </w:r>
       <w:bookmarkEnd w:id="21"/>
@@ -13831,7 +13824,7 @@
       <w:pPr>
         <w:pStyle w:val="Balk2"/>
       </w:pPr>
-      <w:bookmarkStart w:id="22" w:name="_Toc242531381"/>
+      <w:bookmarkStart w:id="22" w:name="_Toc242532012"/>
       <w:r>
         <w:t>6.1 Ortam Bilgileri</w:t>
       </w:r>
@@ -14316,7 +14309,7 @@
       <w:pPr>
         <w:pStyle w:val="Balk2"/>
       </w:pPr>
-      <w:bookmarkStart w:id="23" w:name="_Toc242531382"/>
+      <w:bookmarkStart w:id="23" w:name="_Toc242532013"/>
       <w:r>
         <w:t>6.2 Araçlar ve Kütüphaneler</w:t>
       </w:r>
@@ -15602,7 +15595,7 @@
       <w:pPr>
         <w:pStyle w:val="Balk2"/>
       </w:pPr>
-      <w:bookmarkStart w:id="24" w:name="_Toc242531383"/>
+      <w:bookmarkStart w:id="24" w:name="_Toc242532014"/>
       <w:r>
         <w:t>6.3 Test Verisi Yönetimi</w:t>
       </w:r>
@@ -15664,9 +15657,8 @@
       <w:pPr>
         <w:pStyle w:val="Balk1"/>
       </w:pPr>
-      <w:bookmarkStart w:id="25" w:name="_Toc242531384"/>
+      <w:bookmarkStart w:id="25" w:name="_Toc242532015"/>
       <w:r>
-        <w:lastRenderedPageBreak/>
         <w:t>7. Test Otomasyon Mimarisi</w:t>
       </w:r>
       <w:bookmarkEnd w:id="25"/>
@@ -15675,7 +15667,7 @@
       <w:pPr>
         <w:pStyle w:val="Balk2"/>
       </w:pPr>
-      <w:bookmarkStart w:id="26" w:name="_Toc242531385"/>
+      <w:bookmarkStart w:id="26" w:name="_Toc242532016"/>
       <w:r>
         <w:t>7.1 Selenium + TestNG (POM)</w:t>
       </w:r>
@@ -15803,7 +15795,7 @@
       <w:pPr>
         <w:pStyle w:val="Balk2"/>
       </w:pPr>
-      <w:bookmarkStart w:id="27" w:name="_Toc242531386"/>
+      <w:bookmarkStart w:id="27" w:name="_Toc242532017"/>
       <w:r>
         <w:t>7.2 Selenium + Cucumber (BDD + POM)</w:t>
       </w:r>
@@ -15892,7 +15884,7 @@
       <w:pPr>
         <w:pStyle w:val="Balk2"/>
       </w:pPr>
-      <w:bookmarkStart w:id="28" w:name="_Toc242531387"/>
+      <w:bookmarkStart w:id="28" w:name="_Toc242532018"/>
       <w:r>
         <w:t>7.3 API Otomasyonu (Rest Assured + POJO)</w:t>
       </w:r>
@@ -15981,7 +15973,7 @@
       <w:pPr>
         <w:pStyle w:val="Balk2"/>
       </w:pPr>
-      <w:bookmarkStart w:id="29" w:name="_Toc242531388"/>
+      <w:bookmarkStart w:id="29" w:name="_Toc242532019"/>
       <w:r>
         <w:t>7.4 Veritabanı ve E2E Otomasyonu</w:t>
       </w:r>
@@ -16000,7 +15992,7 @@
       <w:pPr>
         <w:pStyle w:val="Balk1"/>
       </w:pPr>
-      <w:bookmarkStart w:id="30" w:name="_Toc242531389"/>
+      <w:bookmarkStart w:id="30" w:name="_Toc242532020"/>
       <w:r>
         <w:t>8. Giriş, Çıkış ve Askıya Alma Kriterleri</w:t>
       </w:r>
@@ -16010,7 +16002,7 @@
       <w:pPr>
         <w:pStyle w:val="Balk2"/>
       </w:pPr>
-      <w:bookmarkStart w:id="31" w:name="_Toc242531390"/>
+      <w:bookmarkStart w:id="31" w:name="_Toc242532021"/>
       <w:r>
         <w:t>8.1 Giriş Kriterleri (Entry Criteria)</w:t>
       </w:r>
@@ -16078,7 +16070,6 @@
         <w:spacing w:after="60"/>
       </w:pPr>
       <w:r>
-        <w:lastRenderedPageBreak/>
         <w:t>JIRA projesi, Xray ve Sprint yapılandırılmış olmalı.</w:t>
       </w:r>
     </w:p>
@@ -16099,7 +16090,7 @@
       <w:pPr>
         <w:pStyle w:val="Balk2"/>
       </w:pPr>
-      <w:bookmarkStart w:id="32" w:name="_Toc242531391"/>
+      <w:bookmarkStart w:id="32" w:name="_Toc242532022"/>
       <w:r>
         <w:t>8.2 Çıkış Kriterleri (Exit Criteria)</w:t>
       </w:r>
@@ -16187,7 +16178,7 @@
       <w:pPr>
         <w:pStyle w:val="Balk2"/>
       </w:pPr>
-      <w:bookmarkStart w:id="33" w:name="_Toc242531392"/>
+      <w:bookmarkStart w:id="33" w:name="_Toc242532023"/>
       <w:r>
         <w:t>8.3 Askıya Alma ve Devam Kriterleri</w:t>
       </w:r>
@@ -16448,7 +16439,7 @@
       <w:pPr>
         <w:pStyle w:val="Balk1"/>
       </w:pPr>
-      <w:bookmarkStart w:id="34" w:name="_Toc242531393"/>
+      <w:bookmarkStart w:id="34" w:name="_Toc242532024"/>
       <w:r>
         <w:t>9. Test Case Yazım Standartları</w:t>
       </w:r>
@@ -17183,9 +17174,8 @@
       <w:pPr>
         <w:pStyle w:val="Balk1"/>
       </w:pPr>
-      <w:bookmarkStart w:id="35" w:name="_Toc242531394"/>
+      <w:bookmarkStart w:id="35" w:name="_Toc242532025"/>
       <w:r>
-        <w:lastRenderedPageBreak/>
         <w:t>10. JIRA ve Xray Yapılandırması</w:t>
       </w:r>
       <w:bookmarkEnd w:id="35"/>
@@ -17903,7 +17893,7 @@
       <w:pPr>
         <w:pStyle w:val="Balk1"/>
       </w:pPr>
-      <w:bookmarkStart w:id="36" w:name="_Toc242531395"/>
+      <w:bookmarkStart w:id="36" w:name="_Toc242532026"/>
       <w:r>
         <w:t>11. Hata Yönetimi</w:t>
       </w:r>
@@ -17913,7 +17903,7 @@
       <w:pPr>
         <w:pStyle w:val="Balk2"/>
       </w:pPr>
-      <w:bookmarkStart w:id="37" w:name="_Toc242531396"/>
+      <w:bookmarkStart w:id="37" w:name="_Toc242532027"/>
       <w:r>
         <w:t>11.1 Hata Yaşam Döngüsü</w:t>
       </w:r>
@@ -17932,7 +17922,7 @@
       <w:pPr>
         <w:pStyle w:val="Balk2"/>
       </w:pPr>
-      <w:bookmarkStart w:id="38" w:name="_Toc242531397"/>
+      <w:bookmarkStart w:id="38" w:name="_Toc242532028"/>
       <w:r>
         <w:t>11.2 Severity (Ciddiyet) Tanımları</w:t>
       </w:r>
@@ -18471,7 +18461,7 @@
       <w:pPr>
         <w:pStyle w:val="Balk2"/>
       </w:pPr>
-      <w:bookmarkStart w:id="39" w:name="_Toc242531398"/>
+      <w:bookmarkStart w:id="39" w:name="_Toc242532029"/>
       <w:r>
         <w:t>11.3 Priority (Öncelik) Tanımları</w:t>
       </w:r>
@@ -18732,7 +18722,7 @@
       <w:pPr>
         <w:pStyle w:val="Balk2"/>
       </w:pPr>
-      <w:bookmarkStart w:id="40" w:name="_Toc242531399"/>
+      <w:bookmarkStart w:id="40" w:name="_Toc242532030"/>
       <w:r>
         <w:t>11.4 Bug Ticket Şablonu</w:t>
       </w:r>
@@ -18956,7 +18946,6 @@
                 <w:sz w:val="19"/>
                 <w:szCs w:val="19"/>
               </w:rPr>
-              <w:lastRenderedPageBreak/>
               <w:t>Pre-Condition</w:t>
             </w:r>
           </w:p>
@@ -19386,7 +19375,7 @@
       <w:pPr>
         <w:pStyle w:val="Balk1"/>
       </w:pPr>
-      <w:bookmarkStart w:id="41" w:name="_Toc242531400"/>
+      <w:bookmarkStart w:id="41" w:name="_Toc242532031"/>
       <w:r>
         <w:t>12. Ön Analiz Bulguları</w:t>
       </w:r>
@@ -20320,7 +20309,7 @@
       <w:pPr>
         <w:pStyle w:val="Balk1"/>
       </w:pPr>
-      <w:bookmarkStart w:id="42" w:name="_Toc242531401"/>
+      <w:bookmarkStart w:id="42" w:name="_Toc242532032"/>
       <w:r>
         <w:t>13. Takvim ve Sprint Planı</w:t>
       </w:r>
@@ -20924,9 +20913,8 @@
       <w:pPr>
         <w:pStyle w:val="Balk1"/>
       </w:pPr>
-      <w:bookmarkStart w:id="43" w:name="_Toc242531402"/>
+      <w:bookmarkStart w:id="43" w:name="_Toc242532033"/>
       <w:r>
-        <w:lastRenderedPageBreak/>
         <w:t>14. Roller ve Sorumluluklar</w:t>
       </w:r>
       <w:bookmarkEnd w:id="43"/>
@@ -21298,7 +21286,7 @@
       <w:pPr>
         <w:pStyle w:val="Balk1"/>
       </w:pPr>
-      <w:bookmarkStart w:id="44" w:name="_Toc242531403"/>
+      <w:bookmarkStart w:id="44" w:name="_Toc242532034"/>
       <w:r>
         <w:t>15. Riskler ve Önlemler</w:t>
       </w:r>
@@ -22113,7 +22101,7 @@
       <w:pPr>
         <w:pStyle w:val="Balk1"/>
       </w:pPr>
-      <w:bookmarkStart w:id="45" w:name="_Toc242531404"/>
+      <w:bookmarkStart w:id="45" w:name="_Toc242532035"/>
       <w:r>
         <w:t>16. Teslimatlar</w:t>
       </w:r>
@@ -23067,9 +23055,8 @@
       <w:pPr>
         <w:pStyle w:val="Balk1"/>
       </w:pPr>
-      <w:bookmarkStart w:id="46" w:name="_Toc242531405"/>
+      <w:bookmarkStart w:id="46" w:name="_Toc242532036"/>
       <w:r>
-        <w:lastRenderedPageBreak/>
         <w:t>17. Test Özet Raporu (Koşum Sonuçları)</w:t>
       </w:r>
       <w:bookmarkEnd w:id="46"/>
@@ -23087,7 +23074,7 @@
       <w:pPr>
         <w:pStyle w:val="Balk2"/>
       </w:pPr>
-      <w:bookmarkStart w:id="47" w:name="_Toc242531406"/>
+      <w:bookmarkStart w:id="47" w:name="_Toc242532037"/>
       <w:r>
         <w:t>17.1 Manuel Koşum Özeti</w:t>
       </w:r>
@@ -26961,9 +26948,8 @@
       <w:pPr>
         <w:pStyle w:val="Balk2"/>
       </w:pPr>
-      <w:bookmarkStart w:id="48" w:name="_Toc242531407"/>
+      <w:bookmarkStart w:id="48" w:name="_Toc242532038"/>
       <w:r>
-        <w:lastRenderedPageBreak/>
         <w:t>17.2 Otomasyon Koşum Özeti</w:t>
       </w:r>
       <w:bookmarkEnd w:id="48"/>
@@ -27520,7 +27506,7 @@
                 <w:sz w:val="19"/>
                 <w:szCs w:val="19"/>
               </w:rPr>
-              <w:t>Postman Collection</w:t>
+              <w:t>Postman Collection (Newman)</w:t>
             </w:r>
           </w:p>
         </w:tc>
@@ -27547,7 +27533,7 @@
                 <w:sz w:val="19"/>
                 <w:szCs w:val="19"/>
               </w:rPr>
-              <w:t>20 istek, her istekte assertion</w:t>
+              <w:t>20 istek; Products, Category, Contact klasörleri (13 istek, 31 assertion) Newman ile koşuldu. Auth/Cart klasörleri kullanıcı şifresi ile koşulur.</w:t>
             </w:r>
           </w:p>
         </w:tc>
@@ -27574,7 +27560,7 @@
                 <w:sz w:val="19"/>
                 <w:szCs w:val="19"/>
               </w:rPr>
-              <w:t>Bilinen bug’lar dışında PASS</w:t>
+              <w:t>25 PASS / 6 FAIL</w:t>
             </w:r>
           </w:p>
         </w:tc>
@@ -27593,7 +27579,7 @@
       <w:pPr>
         <w:pStyle w:val="Balk2"/>
       </w:pPr>
-      <w:bookmarkStart w:id="49" w:name="_Toc242531408"/>
+      <w:bookmarkStart w:id="49" w:name="_Toc242532039"/>
       <w:r>
         <w:t>17.3 Bulunan Hatalar (JIRA – SCRUM)</w:t>
       </w:r>
@@ -30517,7 +30503,6 @@
                 <w:sz w:val="19"/>
                 <w:szCs w:val="19"/>
               </w:rPr>
-              <w:lastRenderedPageBreak/>
               <w:t>SCRUM-248</w:t>
             </w:r>
           </w:p>
@@ -31498,7 +31483,7 @@
       <w:pPr>
         <w:pStyle w:val="Balk2"/>
       </w:pPr>
-      <w:bookmarkStart w:id="50" w:name="_Toc242531409"/>
+      <w:bookmarkStart w:id="50" w:name="_Toc242532040"/>
       <w:r>
         <w:t>17.4 Teslimat Konumları</w:t>
       </w:r>
@@ -31815,7 +31800,7 @@
       <w:pPr>
         <w:pStyle w:val="Balk2"/>
       </w:pPr>
-      <w:bookmarkStart w:id="51" w:name="_Toc242531410"/>
+      <w:bookmarkStart w:id="51" w:name="_Toc242532041"/>
       <w:r>
         <w:t>17.5 Sonuç ve Öneriler</w:t>
       </w:r>
@@ -31890,7 +31875,7 @@
       <w:pPr>
         <w:pStyle w:val="Balk1"/>
       </w:pPr>
-      <w:bookmarkStart w:id="52" w:name="_Toc242531411"/>
+      <w:bookmarkStart w:id="52" w:name="_Toc242532042"/>
       <w:r>
         <w:t>18. Onay</w:t>
       </w:r>
@@ -32412,10 +32397,10 @@
 <file path=word/numbering.xml><?xml version="1.0" encoding="utf-8"?>
 <w:numbering xmlns:wpc="http://schemas.microsoft.com/office/word/2010/wordprocessingCanvas" xmlns:cx="http://schemas.microsoft.com/office/drawing/2014/chartex" xmlns:cx1="http://schemas.microsoft.com/office/drawing/2015/9/8/chartex" xmlns:cx2="http://schemas.microsoft.com/office/drawing/2015/10/21/chartex" xmlns:cx3="http://schemas.microsoft.com/office/drawing/2016/5/9/chartex" xmlns:cx4="http://schemas.microsoft.com/office/drawing/2016/5/10/chartex" xmlns:cx5="http://schemas.microsoft.com/office/drawing/2016/5/11/chartex" xmlns:cx6="http://schemas.microsoft.com/office/drawing/2016/5/12/chartex" xmlns:cx7="http://schemas.microsoft.com/office/drawing/2016/5/13/chartex" xmlns:cx8="http://schemas.microsoft.com/office/drawing/2016/5/14/chartex" xmlns:mc="http://schemas.openxmlformats.org/markup-compatibility/2006" xmlns:aink="http://schemas.microsoft.com/office/drawing/2016/ink" xmlns:am3d="http://schemas.microsoft.com/office/drawing/2017/model3d" xmlns:o="urn:schemas-microsoft-com:office:office" xmlns:oel="http://schemas.microsoft.com/office/2019/extlst" xmlns:r="http://schemas.openxmlformats.org/officeDocument/2006/relationships" xmlns:m="http://schemas.openxmlformats.org/officeDocument/2006/math" xmlns:v="urn:schemas-microsoft-com:vml" xmlns:wp14="http://schemas.microsoft.com/office/word/2010/wordprocessingDrawing" xmlns:wp="http://schemas.openxmlformats.org/drawingml/2006/wordprocessingDrawing" xmlns:w10="urn:schemas-microsoft-com:office:word" xmlns:w="http://schemas.openxmlformats.org/wordprocessingml/2006/main" xmlns:w14="http://schemas.microsoft.com/office/word/2010/wordml" xmlns:w15="http://schemas.microsoft.com/office/word/2012/wordml" xmlns:w16cex="http://schemas.microsoft.com/office/word/2018/wordml/cex" xmlns:w16cid="http://schemas.microsoft.com/office/word/2016/wordml/cid" xmlns:w16="http://schemas.microsoft.com/office/word/2018/wordml" xmlns:w16du="http://schemas.microsoft.com/office/word/2023/wordml/word16du" xmlns:w16sdtdh="http://schemas.microsoft.com/office/word/2020/wordml/sdtdatahash" xmlns:w16sdtfl="http://schemas.microsoft.com/office/word/2024/wordml/sdtformatlock" xmlns:w16se="http://schemas.microsoft.com/office/word/2015/wordml/symex" xmlns:wpg="http://schemas.microsoft.com/office/word/2010/wordprocessingGroup" xmlns:wpi="http://schemas.microsoft.com/office/word/2010/wordprocessingInk" xmlns:wne="http://schemas.microsoft.com/office/word/2006/wordml" xmlns:wps="http://schemas.microsoft.com/office/word/2010/wordprocessingShape" mc:Ignorable="w14 w15 w16se w16cid w16 w16cex w16sdtdh w16sdtfl w16du wp14">
   <w:abstractNum w:abstractNumId="0" w15:restartNumberingAfterBreak="0">
-    <w:nsid w:val="0B963AFD"/>
+    <w:nsid w:val="07D411B8"/>
     <w:multiLevelType w:val="hybridMultilevel"/>
-    <w:tmpl w:val="882C6CAE"/>
-    <w:lvl w:ilvl="0" w:tplc="E05A80D8">
+    <w:tmpl w:val="F81A864A"/>
+    <w:lvl w:ilvl="0" w:tplc="3F90C98A">
       <w:start w:val="1"/>
       <w:numFmt w:val="bullet"/>
       <w:lvlText w:val="•"/>
@@ -32424,7 +32409,7 @@
         <w:ind w:left="720" w:hanging="360"/>
       </w:pPr>
     </w:lvl>
-    <w:lvl w:ilvl="1" w:tplc="7D3257E4" w:tentative="1">
+    <w:lvl w:ilvl="1" w:tplc="44C6C3B6" w:tentative="1">
       <w:start w:val="1"/>
       <w:numFmt w:val="bullet"/>
       <w:lvlText w:val="◦"/>
@@ -32433,101 +32418,47 @@
         <w:ind w:left="1440" w:hanging="360"/>
       </w:pPr>
     </w:lvl>
-    <w:lvl w:ilvl="2" w:tplc="3698EBD0">
+    <w:lvl w:ilvl="2" w:tplc="9448F48C">
       <w:numFmt w:val="decimal"/>
       <w:lvlText w:val=""/>
       <w:lvlJc w:val="left"/>
     </w:lvl>
-    <w:lvl w:ilvl="3" w:tplc="11787122">
+    <w:lvl w:ilvl="3" w:tplc="6998705A">
       <w:numFmt w:val="decimal"/>
       <w:lvlText w:val=""/>
       <w:lvlJc w:val="left"/>
     </w:lvl>
-    <w:lvl w:ilvl="4" w:tplc="935CB3B6">
+    <w:lvl w:ilvl="4" w:tplc="B31A876E">
       <w:numFmt w:val="decimal"/>
       <w:lvlText w:val=""/>
       <w:lvlJc w:val="left"/>
     </w:lvl>
-    <w:lvl w:ilvl="5" w:tplc="E554630A">
+    <w:lvl w:ilvl="5" w:tplc="1A1606B6">
       <w:numFmt w:val="decimal"/>
       <w:lvlText w:val=""/>
       <w:lvlJc w:val="left"/>
     </w:lvl>
-    <w:lvl w:ilvl="6" w:tplc="DF24F32C">
+    <w:lvl w:ilvl="6" w:tplc="EEB40756">
       <w:numFmt w:val="decimal"/>
       <w:lvlText w:val=""/>
       <w:lvlJc w:val="left"/>
     </w:lvl>
-    <w:lvl w:ilvl="7" w:tplc="8E389CA4">
+    <w:lvl w:ilvl="7" w:tplc="B498A4FE">
       <w:numFmt w:val="decimal"/>
       <w:lvlText w:val=""/>
       <w:lvlJc w:val="left"/>
     </w:lvl>
-    <w:lvl w:ilvl="8" w:tplc="CBBC8A54">
+    <w:lvl w:ilvl="8" w:tplc="4F0012C0">
       <w:numFmt w:val="decimal"/>
       <w:lvlText w:val=""/>
       <w:lvlJc w:val="left"/>
     </w:lvl>
   </w:abstractNum>
   <w:abstractNum w:abstractNumId="1" w15:restartNumberingAfterBreak="0">
-    <w:nsid w:val="24AA3A7E"/>
+    <w:nsid w:val="1C191E52"/>
     <w:multiLevelType w:val="hybridMultilevel"/>
-    <w:tmpl w:val="64DA697C"/>
-    <w:lvl w:ilvl="0" w:tplc="1D9A1B48" w:tentative="1">
-      <w:start w:val="1"/>
-      <w:numFmt w:val="decimal"/>
-      <w:lvlText w:val="%1."/>
-      <w:lvlJc w:val="left"/>
-      <w:pPr>
-        <w:ind w:left="720" w:hanging="360"/>
-      </w:pPr>
-    </w:lvl>
-    <w:lvl w:ilvl="1" w:tplc="0A7EDE82">
-      <w:numFmt w:val="decimal"/>
-      <w:lvlText w:val=""/>
-      <w:lvlJc w:val="left"/>
-    </w:lvl>
-    <w:lvl w:ilvl="2" w:tplc="D73A523C">
-      <w:numFmt w:val="decimal"/>
-      <w:lvlText w:val=""/>
-      <w:lvlJc w:val="left"/>
-    </w:lvl>
-    <w:lvl w:ilvl="3" w:tplc="3126D834">
-      <w:numFmt w:val="decimal"/>
-      <w:lvlText w:val=""/>
-      <w:lvlJc w:val="left"/>
-    </w:lvl>
-    <w:lvl w:ilvl="4" w:tplc="02469BC6">
-      <w:numFmt w:val="decimal"/>
-      <w:lvlText w:val=""/>
-      <w:lvlJc w:val="left"/>
-    </w:lvl>
-    <w:lvl w:ilvl="5" w:tplc="619ADBBA">
-      <w:numFmt w:val="decimal"/>
-      <w:lvlText w:val=""/>
-      <w:lvlJc w:val="left"/>
-    </w:lvl>
-    <w:lvl w:ilvl="6" w:tplc="208E2842">
-      <w:numFmt w:val="decimal"/>
-      <w:lvlText w:val=""/>
-      <w:lvlJc w:val="left"/>
-    </w:lvl>
-    <w:lvl w:ilvl="7" w:tplc="DCF64D74">
-      <w:numFmt w:val="decimal"/>
-      <w:lvlText w:val=""/>
-      <w:lvlJc w:val="left"/>
-    </w:lvl>
-    <w:lvl w:ilvl="8" w:tplc="C3A06E5E">
-      <w:numFmt w:val="decimal"/>
-      <w:lvlText w:val=""/>
-      <w:lvlJc w:val="left"/>
-    </w:lvl>
-  </w:abstractNum>
-  <w:abstractNum w:abstractNumId="2" w15:restartNumberingAfterBreak="0">
-    <w:nsid w:val="2C057A17"/>
-    <w:multiLevelType w:val="hybridMultilevel"/>
-    <w:tmpl w:val="0AFE1776"/>
-    <w:lvl w:ilvl="0" w:tplc="801C1602" w:tentative="1">
+    <w:tmpl w:val="9D8CA542"/>
+    <w:lvl w:ilvl="0" w:tplc="658AD8FC" w:tentative="1">
       <w:start w:val="1"/>
       <w:numFmt w:val="bullet"/>
       <w:lvlText w:val="●"/>
@@ -32536,7 +32467,7 @@
         <w:ind w:left="720" w:hanging="360"/>
       </w:pPr>
     </w:lvl>
-    <w:lvl w:ilvl="1" w:tplc="BD3C2BB6" w:tentative="1">
+    <w:lvl w:ilvl="1" w:tplc="C15A120A" w:tentative="1">
       <w:start w:val="1"/>
       <w:numFmt w:val="bullet"/>
       <w:lvlText w:val="○"/>
@@ -32545,7 +32476,7 @@
         <w:ind w:left="1440" w:hanging="360"/>
       </w:pPr>
     </w:lvl>
-    <w:lvl w:ilvl="2" w:tplc="5A0E430C" w:tentative="1">
+    <w:lvl w:ilvl="2" w:tplc="6788291E" w:tentative="1">
       <w:start w:val="1"/>
       <w:numFmt w:val="bullet"/>
       <w:lvlText w:val="■"/>
@@ -32554,7 +32485,7 @@
         <w:ind w:left="2160" w:hanging="360"/>
       </w:pPr>
     </w:lvl>
-    <w:lvl w:ilvl="3" w:tplc="AC00F47E" w:tentative="1">
+    <w:lvl w:ilvl="3" w:tplc="CBCCCA3C" w:tentative="1">
       <w:start w:val="1"/>
       <w:numFmt w:val="bullet"/>
       <w:lvlText w:val="●"/>
@@ -32563,7 +32494,7 @@
         <w:ind w:left="2880" w:hanging="360"/>
       </w:pPr>
     </w:lvl>
-    <w:lvl w:ilvl="4" w:tplc="4A16A98E" w:tentative="1">
+    <w:lvl w:ilvl="4" w:tplc="07E4244A" w:tentative="1">
       <w:start w:val="1"/>
       <w:numFmt w:val="bullet"/>
       <w:lvlText w:val="○"/>
@@ -32572,7 +32503,7 @@
         <w:ind w:left="3600" w:hanging="360"/>
       </w:pPr>
     </w:lvl>
-    <w:lvl w:ilvl="5" w:tplc="4CCA5CA8" w:tentative="1">
+    <w:lvl w:ilvl="5" w:tplc="AB929E10" w:tentative="1">
       <w:start w:val="1"/>
       <w:numFmt w:val="bullet"/>
       <w:lvlText w:val="■"/>
@@ -32581,7 +32512,7 @@
         <w:ind w:left="4320" w:hanging="360"/>
       </w:pPr>
     </w:lvl>
-    <w:lvl w:ilvl="6" w:tplc="F0D6CF74" w:tentative="1">
+    <w:lvl w:ilvl="6" w:tplc="7A90792A" w:tentative="1">
       <w:start w:val="1"/>
       <w:numFmt w:val="bullet"/>
       <w:lvlText w:val="●"/>
@@ -32590,7 +32521,7 @@
         <w:ind w:left="5040" w:hanging="360"/>
       </w:pPr>
     </w:lvl>
-    <w:lvl w:ilvl="7" w:tplc="43EE6492" w:tentative="1">
+    <w:lvl w:ilvl="7" w:tplc="CB2E21CC" w:tentative="1">
       <w:start w:val="1"/>
       <w:numFmt w:val="bullet"/>
       <w:lvlText w:val="●"/>
@@ -32599,7 +32530,7 @@
         <w:ind w:left="5760" w:hanging="360"/>
       </w:pPr>
     </w:lvl>
-    <w:lvl w:ilvl="8" w:tplc="B21213C4" w:tentative="1">
+    <w:lvl w:ilvl="8" w:tplc="FDC61940" w:tentative="1">
       <w:start w:val="1"/>
       <w:numFmt w:val="bullet"/>
       <w:lvlText w:val="●"/>
@@ -32609,11 +32540,11 @@
       </w:pPr>
     </w:lvl>
   </w:abstractNum>
-  <w:abstractNum w:abstractNumId="3" w15:restartNumberingAfterBreak="0">
-    <w:nsid w:val="7F1806C9"/>
+  <w:abstractNum w:abstractNumId="2" w15:restartNumberingAfterBreak="0">
+    <w:nsid w:val="55C950C6"/>
     <w:multiLevelType w:val="hybridMultilevel"/>
-    <w:tmpl w:val="E738FB22"/>
-    <w:lvl w:ilvl="0" w:tplc="0D50F480" w:tentative="1">
+    <w:tmpl w:val="1406A034"/>
+    <w:lvl w:ilvl="0" w:tplc="65CE239E" w:tentative="1">
       <w:start w:val="1"/>
       <w:numFmt w:val="decimal"/>
       <w:lvlText w:val="%1."/>
@@ -32622,54 +32553,108 @@
         <w:ind w:left="720" w:hanging="360"/>
       </w:pPr>
     </w:lvl>
-    <w:lvl w:ilvl="1" w:tplc="9E06D7C6">
+    <w:lvl w:ilvl="1" w:tplc="D8EA491C">
       <w:numFmt w:val="decimal"/>
       <w:lvlText w:val=""/>
       <w:lvlJc w:val="left"/>
     </w:lvl>
-    <w:lvl w:ilvl="2" w:tplc="6AA47834">
+    <w:lvl w:ilvl="2" w:tplc="4606A7D8">
       <w:numFmt w:val="decimal"/>
       <w:lvlText w:val=""/>
       <w:lvlJc w:val="left"/>
     </w:lvl>
-    <w:lvl w:ilvl="3" w:tplc="C1148CF4">
+    <w:lvl w:ilvl="3" w:tplc="83EC66FA">
       <w:numFmt w:val="decimal"/>
       <w:lvlText w:val=""/>
       <w:lvlJc w:val="left"/>
     </w:lvl>
-    <w:lvl w:ilvl="4" w:tplc="096242DE">
+    <w:lvl w:ilvl="4" w:tplc="E3560C5E">
       <w:numFmt w:val="decimal"/>
       <w:lvlText w:val=""/>
       <w:lvlJc w:val="left"/>
     </w:lvl>
-    <w:lvl w:ilvl="5" w:tplc="B37A07B4">
+    <w:lvl w:ilvl="5" w:tplc="F4E45866">
       <w:numFmt w:val="decimal"/>
       <w:lvlText w:val=""/>
       <w:lvlJc w:val="left"/>
     </w:lvl>
-    <w:lvl w:ilvl="6" w:tplc="D0CA64BA">
+    <w:lvl w:ilvl="6" w:tplc="D4D4534A">
       <w:numFmt w:val="decimal"/>
       <w:lvlText w:val=""/>
       <w:lvlJc w:val="left"/>
     </w:lvl>
-    <w:lvl w:ilvl="7" w:tplc="B596D9F8">
+    <w:lvl w:ilvl="7" w:tplc="C36A68A0">
       <w:numFmt w:val="decimal"/>
       <w:lvlText w:val=""/>
       <w:lvlJc w:val="left"/>
     </w:lvl>
-    <w:lvl w:ilvl="8" w:tplc="79BA5934">
+    <w:lvl w:ilvl="8" w:tplc="1A743478">
       <w:numFmt w:val="decimal"/>
       <w:lvlText w:val=""/>
       <w:lvlJc w:val="left"/>
     </w:lvl>
   </w:abstractNum>
-  <w:num w:numId="1" w16cid:durableId="1120996393">
-    <w:abstractNumId w:val="2"/>
+  <w:abstractNum w:abstractNumId="3" w15:restartNumberingAfterBreak="0">
+    <w:nsid w:val="5F992B6E"/>
+    <w:multiLevelType w:val="hybridMultilevel"/>
+    <w:tmpl w:val="941804B4"/>
+    <w:lvl w:ilvl="0" w:tplc="EA24020C" w:tentative="1">
+      <w:start w:val="1"/>
+      <w:numFmt w:val="decimal"/>
+      <w:lvlText w:val="%1."/>
+      <w:lvlJc w:val="left"/>
+      <w:pPr>
+        <w:ind w:left="720" w:hanging="360"/>
+      </w:pPr>
+    </w:lvl>
+    <w:lvl w:ilvl="1" w:tplc="DC88F8F4">
+      <w:numFmt w:val="decimal"/>
+      <w:lvlText w:val=""/>
+      <w:lvlJc w:val="left"/>
+    </w:lvl>
+    <w:lvl w:ilvl="2" w:tplc="3F68E62C">
+      <w:numFmt w:val="decimal"/>
+      <w:lvlText w:val=""/>
+      <w:lvlJc w:val="left"/>
+    </w:lvl>
+    <w:lvl w:ilvl="3" w:tplc="D9122B86">
+      <w:numFmt w:val="decimal"/>
+      <w:lvlText w:val=""/>
+      <w:lvlJc w:val="left"/>
+    </w:lvl>
+    <w:lvl w:ilvl="4" w:tplc="26A63A4E">
+      <w:numFmt w:val="decimal"/>
+      <w:lvlText w:val=""/>
+      <w:lvlJc w:val="left"/>
+    </w:lvl>
+    <w:lvl w:ilvl="5" w:tplc="41640B22">
+      <w:numFmt w:val="decimal"/>
+      <w:lvlText w:val=""/>
+      <w:lvlJc w:val="left"/>
+    </w:lvl>
+    <w:lvl w:ilvl="6" w:tplc="5AEA4FB4">
+      <w:numFmt w:val="decimal"/>
+      <w:lvlText w:val=""/>
+      <w:lvlJc w:val="left"/>
+    </w:lvl>
+    <w:lvl w:ilvl="7" w:tplc="1DF00096">
+      <w:numFmt w:val="decimal"/>
+      <w:lvlText w:val=""/>
+      <w:lvlJc w:val="left"/>
+    </w:lvl>
+    <w:lvl w:ilvl="8" w:tplc="DE16AE42">
+      <w:numFmt w:val="decimal"/>
+      <w:lvlText w:val=""/>
+      <w:lvlJc w:val="left"/>
+    </w:lvl>
+  </w:abstractNum>
+  <w:num w:numId="1" w16cid:durableId="529563062">
+    <w:abstractNumId w:val="1"/>
     <w:lvlOverride w:ilvl="0">
       <w:startOverride w:val="1"/>
     </w:lvlOverride>
   </w:num>
-  <w:num w:numId="2" w16cid:durableId="656346390">
+  <w:num w:numId="2" w16cid:durableId="1125662117">
     <w:abstractNumId w:val="0"/>
     <w:lvlOverride w:ilvl="0">
       <w:startOverride w:val="1"/>
@@ -33315,7 +33300,7 @@
     <w:autoRedefine/>
     <w:uiPriority w:val="39"/>
     <w:unhideWhenUsed/>
-    <w:rsid w:val="00510859"/>
+    <w:rsid w:val="00E44D32"/>
     <w:pPr>
       <w:spacing w:after="100"/>
     </w:pPr>
@@ -33327,7 +33312,7 @@
     <w:autoRedefine/>
     <w:uiPriority w:val="39"/>
     <w:unhideWhenUsed/>
-    <w:rsid w:val="00510859"/>
+    <w:rsid w:val="00E44D32"/>
     <w:pPr>
       <w:spacing w:after="100"/>
       <w:ind w:left="220"/>

</xml_diff>

<commit_message>
Postman (Newman) ve Cucumber son kosum sonuclari eklendi
Co-Authored-By: Claude Opus 5.5 <noreply@anthropic.com>
</commit_message>
<xml_diff>
--- a/docs/Snack_Attack_Test_Plani.docx
+++ b/docs/Snack_Attack_Test_Plani.docx
@@ -615,7 +615,7 @@
       <w:pPr>
         <w:pStyle w:val="Balk1"/>
       </w:pPr>
-      <w:bookmarkStart w:id="0" w:name="_Toc242531990"/>
+      <w:bookmarkStart w:id="0" w:name="_Toc242540435"/>
       <w:r>
         <w:t>Revizyon Geçmişi</w:t>
       </w:r>
@@ -885,7 +885,7 @@
       <w:pPr>
         <w:pStyle w:val="Balk1"/>
       </w:pPr>
-      <w:bookmarkStart w:id="1" w:name="_Toc242531991"/>
+      <w:bookmarkStart w:id="1" w:name="_Toc242540436"/>
       <w:r>
         <w:t>İçindekiler</w:t>
       </w:r>
@@ -894,7 +894,7 @@
     <w:sdt>
       <w:sdtPr>
         <w:alias w:val="İçindekiler"/>
-        <w:id w:val="-1698687325"/>
+        <w:id w:val="-537049328"/>
       </w:sdtPr>
       <w:sdtEndPr/>
       <w:sdtContent>
@@ -917,7 +917,7 @@
           <w:r>
             <w:fldChar w:fldCharType="separate"/>
           </w:r>
-          <w:hyperlink w:anchor="_Toc242531990" w:history="1">
+          <w:hyperlink w:anchor="_Toc242540435" w:history="1">
             <w:r>
               <w:rPr>
                 <w:rStyle w:val="Kpr"/>
@@ -941,7 +941,7 @@
               <w:rPr>
                 <w:noProof/>
               </w:rPr>
-              <w:instrText xml:space="preserve"> PAGEREF _Toc242531990 \h </w:instrText>
+              <w:instrText xml:space="preserve"> PAGEREF _Toc242540435 \h </w:instrText>
             </w:r>
             <w:r>
               <w:rPr>
@@ -978,7 +978,7 @@
               <w:noProof/>
             </w:rPr>
           </w:pPr>
-          <w:hyperlink w:anchor="_Toc242531991" w:history="1">
+          <w:hyperlink w:anchor="_Toc242540436" w:history="1">
             <w:r>
               <w:rPr>
                 <w:rStyle w:val="Kpr"/>
@@ -1002,7 +1002,7 @@
               <w:rPr>
                 <w:noProof/>
               </w:rPr>
-              <w:instrText xml:space="preserve"> PAGEREF _Toc242531991 \h </w:instrText>
+              <w:instrText xml:space="preserve"> PAGEREF _Toc242540436 \h </w:instrText>
             </w:r>
             <w:r>
               <w:rPr>
@@ -1039,7 +1039,7 @@
               <w:noProof/>
             </w:rPr>
           </w:pPr>
-          <w:hyperlink w:anchor="_Toc242531992" w:history="1">
+          <w:hyperlink w:anchor="_Toc242540437" w:history="1">
             <w:r>
               <w:rPr>
                 <w:rStyle w:val="Kpr"/>
@@ -1063,7 +1063,7 @@
               <w:rPr>
                 <w:noProof/>
               </w:rPr>
-              <w:instrText xml:space="preserve"> PAGEREF _Toc242531992 \h </w:instrText>
+              <w:instrText xml:space="preserve"> PAGEREF _Toc242540437 \h </w:instrText>
             </w:r>
             <w:r>
               <w:rPr>
@@ -1100,7 +1100,7 @@
               <w:noProof/>
             </w:rPr>
           </w:pPr>
-          <w:hyperlink w:anchor="_Toc242531993" w:history="1">
+          <w:hyperlink w:anchor="_Toc242540438" w:history="1">
             <w:r>
               <w:rPr>
                 <w:rStyle w:val="Kpr"/>
@@ -1124,7 +1124,7 @@
               <w:rPr>
                 <w:noProof/>
               </w:rPr>
-              <w:instrText xml:space="preserve"> PAGEREF _Toc242531993 \h </w:instrText>
+              <w:instrText xml:space="preserve"> PAGEREF _Toc242540438 \h </w:instrText>
             </w:r>
             <w:r>
               <w:rPr>
@@ -1161,7 +1161,7 @@
               <w:noProof/>
             </w:rPr>
           </w:pPr>
-          <w:hyperlink w:anchor="_Toc242531994" w:history="1">
+          <w:hyperlink w:anchor="_Toc242540439" w:history="1">
             <w:r>
               <w:rPr>
                 <w:rStyle w:val="Kpr"/>
@@ -1185,7 +1185,7 @@
               <w:rPr>
                 <w:noProof/>
               </w:rPr>
-              <w:instrText xml:space="preserve"> PAGEREF _Toc242531994 \h </w:instrText>
+              <w:instrText xml:space="preserve"> PAGEREF _Toc242540439 \h </w:instrText>
             </w:r>
             <w:r>
               <w:rPr>
@@ -1222,7 +1222,7 @@
               <w:noProof/>
             </w:rPr>
           </w:pPr>
-          <w:hyperlink w:anchor="_Toc242531995" w:history="1">
+          <w:hyperlink w:anchor="_Toc242540440" w:history="1">
             <w:r>
               <w:rPr>
                 <w:rStyle w:val="Kpr"/>
@@ -1246,7 +1246,7 @@
               <w:rPr>
                 <w:noProof/>
               </w:rPr>
-              <w:instrText xml:space="preserve"> PAGEREF _Toc242531995 \h </w:instrText>
+              <w:instrText xml:space="preserve"> PAGEREF _Toc242540440 \h </w:instrText>
             </w:r>
             <w:r>
               <w:rPr>
@@ -1283,7 +1283,7 @@
               <w:noProof/>
             </w:rPr>
           </w:pPr>
-          <w:hyperlink w:anchor="_Toc242531996" w:history="1">
+          <w:hyperlink w:anchor="_Toc242540441" w:history="1">
             <w:r>
               <w:rPr>
                 <w:rStyle w:val="Kpr"/>
@@ -1307,7 +1307,7 @@
               <w:rPr>
                 <w:noProof/>
               </w:rPr>
-              <w:instrText xml:space="preserve"> PAGEREF _Toc242531996 \h </w:instrText>
+              <w:instrText xml:space="preserve"> PAGEREF _Toc242540441 \h </w:instrText>
             </w:r>
             <w:r>
               <w:rPr>
@@ -1344,7 +1344,7 @@
               <w:noProof/>
             </w:rPr>
           </w:pPr>
-          <w:hyperlink w:anchor="_Toc242531997" w:history="1">
+          <w:hyperlink w:anchor="_Toc242540442" w:history="1">
             <w:r>
               <w:rPr>
                 <w:rStyle w:val="Kpr"/>
@@ -1368,7 +1368,7 @@
               <w:rPr>
                 <w:noProof/>
               </w:rPr>
-              <w:instrText xml:space="preserve"> PAGEREF _Toc242531997 \h </w:instrText>
+              <w:instrText xml:space="preserve"> PAGEREF _Toc242540442 \h </w:instrText>
             </w:r>
             <w:r>
               <w:rPr>
@@ -1405,7 +1405,7 @@
               <w:noProof/>
             </w:rPr>
           </w:pPr>
-          <w:hyperlink w:anchor="_Toc242531998" w:history="1">
+          <w:hyperlink w:anchor="_Toc242540443" w:history="1">
             <w:r>
               <w:rPr>
                 <w:rStyle w:val="Kpr"/>
@@ -1429,7 +1429,7 @@
               <w:rPr>
                 <w:noProof/>
               </w:rPr>
-              <w:instrText xml:space="preserve"> PAGEREF _Toc242531998 \h </w:instrText>
+              <w:instrText xml:space="preserve"> PAGEREF _Toc242540443 \h </w:instrText>
             </w:r>
             <w:r>
               <w:rPr>
@@ -1466,7 +1466,7 @@
               <w:noProof/>
             </w:rPr>
           </w:pPr>
-          <w:hyperlink w:anchor="_Toc242531999" w:history="1">
+          <w:hyperlink w:anchor="_Toc242540444" w:history="1">
             <w:r>
               <w:rPr>
                 <w:rStyle w:val="Kpr"/>
@@ -1490,7 +1490,7 @@
               <w:rPr>
                 <w:noProof/>
               </w:rPr>
-              <w:instrText xml:space="preserve"> PAGEREF _Toc242531999 \h </w:instrText>
+              <w:instrText xml:space="preserve"> PAGEREF _Toc242540444 \h </w:instrText>
             </w:r>
             <w:r>
               <w:rPr>
@@ -1527,7 +1527,7 @@
               <w:noProof/>
             </w:rPr>
           </w:pPr>
-          <w:hyperlink w:anchor="_Toc242532000" w:history="1">
+          <w:hyperlink w:anchor="_Toc242540445" w:history="1">
             <w:r>
               <w:rPr>
                 <w:rStyle w:val="Kpr"/>
@@ -1551,7 +1551,7 @@
               <w:rPr>
                 <w:noProof/>
               </w:rPr>
-              <w:instrText xml:space="preserve"> PAGEREF _Toc242532000 \h </w:instrText>
+              <w:instrText xml:space="preserve"> PAGEREF _Toc242540445 \h </w:instrText>
             </w:r>
             <w:r>
               <w:rPr>
@@ -1588,7 +1588,7 @@
               <w:noProof/>
             </w:rPr>
           </w:pPr>
-          <w:hyperlink w:anchor="_Toc242532001" w:history="1">
+          <w:hyperlink w:anchor="_Toc242540446" w:history="1">
             <w:r>
               <w:rPr>
                 <w:rStyle w:val="Kpr"/>
@@ -1612,7 +1612,7 @@
               <w:rPr>
                 <w:noProof/>
               </w:rPr>
-              <w:instrText xml:space="preserve"> PAGEREF _Toc242532001 \h </w:instrText>
+              <w:instrText xml:space="preserve"> PAGEREF _Toc242540446 \h </w:instrText>
             </w:r>
             <w:r>
               <w:rPr>
@@ -1649,7 +1649,7 @@
               <w:noProof/>
             </w:rPr>
           </w:pPr>
-          <w:hyperlink w:anchor="_Toc242532002" w:history="1">
+          <w:hyperlink w:anchor="_Toc242540447" w:history="1">
             <w:r>
               <w:rPr>
                 <w:rStyle w:val="Kpr"/>
@@ -1673,7 +1673,7 @@
               <w:rPr>
                 <w:noProof/>
               </w:rPr>
-              <w:instrText xml:space="preserve"> PAGEREF _Toc242532002 \h </w:instrText>
+              <w:instrText xml:space="preserve"> PAGEREF _Toc242540447 \h </w:instrText>
             </w:r>
             <w:r>
               <w:rPr>
@@ -1710,7 +1710,7 @@
               <w:noProof/>
             </w:rPr>
           </w:pPr>
-          <w:hyperlink w:anchor="_Toc242532003" w:history="1">
+          <w:hyperlink w:anchor="_Toc242540448" w:history="1">
             <w:r>
               <w:rPr>
                 <w:rStyle w:val="Kpr"/>
@@ -1734,7 +1734,7 @@
               <w:rPr>
                 <w:noProof/>
               </w:rPr>
-              <w:instrText xml:space="preserve"> PAGEREF _Toc242532003 \h </w:instrText>
+              <w:instrText xml:space="preserve"> PAGEREF _Toc242540448 \h </w:instrText>
             </w:r>
             <w:r>
               <w:rPr>
@@ -1771,7 +1771,7 @@
               <w:noProof/>
             </w:rPr>
           </w:pPr>
-          <w:hyperlink w:anchor="_Toc242532004" w:history="1">
+          <w:hyperlink w:anchor="_Toc242540449" w:history="1">
             <w:r>
               <w:rPr>
                 <w:rStyle w:val="Kpr"/>
@@ -1795,7 +1795,7 @@
               <w:rPr>
                 <w:noProof/>
               </w:rPr>
-              <w:instrText xml:space="preserve"> PAGEREF _Toc242532004 \h </w:instrText>
+              <w:instrText xml:space="preserve"> PAGEREF _Toc242540449 \h </w:instrText>
             </w:r>
             <w:r>
               <w:rPr>
@@ -1832,7 +1832,7 @@
               <w:noProof/>
             </w:rPr>
           </w:pPr>
-          <w:hyperlink w:anchor="_Toc242532005" w:history="1">
+          <w:hyperlink w:anchor="_Toc242540450" w:history="1">
             <w:r>
               <w:rPr>
                 <w:rStyle w:val="Kpr"/>
@@ -1856,7 +1856,7 @@
               <w:rPr>
                 <w:noProof/>
               </w:rPr>
-              <w:instrText xml:space="preserve"> PAGEREF _Toc242532005 \h </w:instrText>
+              <w:instrText xml:space="preserve"> PAGEREF _Toc242540450 \h </w:instrText>
             </w:r>
             <w:r>
               <w:rPr>
@@ -1893,7 +1893,7 @@
               <w:noProof/>
             </w:rPr>
           </w:pPr>
-          <w:hyperlink w:anchor="_Toc242532006" w:history="1">
+          <w:hyperlink w:anchor="_Toc242540451" w:history="1">
             <w:r>
               <w:rPr>
                 <w:rStyle w:val="Kpr"/>
@@ -1917,7 +1917,7 @@
               <w:rPr>
                 <w:noProof/>
               </w:rPr>
-              <w:instrText xml:space="preserve"> PAGEREF _Toc242532006 \h </w:instrText>
+              <w:instrText xml:space="preserve"> PAGEREF _Toc242540451 \h </w:instrText>
             </w:r>
             <w:r>
               <w:rPr>
@@ -1954,7 +1954,7 @@
               <w:noProof/>
             </w:rPr>
           </w:pPr>
-          <w:hyperlink w:anchor="_Toc242532007" w:history="1">
+          <w:hyperlink w:anchor="_Toc242540452" w:history="1">
             <w:r>
               <w:rPr>
                 <w:rStyle w:val="Kpr"/>
@@ -1978,7 +1978,7 @@
               <w:rPr>
                 <w:noProof/>
               </w:rPr>
-              <w:instrText xml:space="preserve"> PAGEREF _Toc242532007 \h </w:instrText>
+              <w:instrText xml:space="preserve"> PAGEREF _Toc242540452 \h </w:instrText>
             </w:r>
             <w:r>
               <w:rPr>
@@ -2015,7 +2015,7 @@
               <w:noProof/>
             </w:rPr>
           </w:pPr>
-          <w:hyperlink w:anchor="_Toc242532008" w:history="1">
+          <w:hyperlink w:anchor="_Toc242540453" w:history="1">
             <w:r>
               <w:rPr>
                 <w:rStyle w:val="Kpr"/>
@@ -2039,7 +2039,7 @@
               <w:rPr>
                 <w:noProof/>
               </w:rPr>
-              <w:instrText xml:space="preserve"> PAGEREF _Toc242532008 \h </w:instrText>
+              <w:instrText xml:space="preserve"> PAGEREF _Toc242540453 \h </w:instrText>
             </w:r>
             <w:r>
               <w:rPr>
@@ -2076,7 +2076,7 @@
               <w:noProof/>
             </w:rPr>
           </w:pPr>
-          <w:hyperlink w:anchor="_Toc242532009" w:history="1">
+          <w:hyperlink w:anchor="_Toc242540454" w:history="1">
             <w:r>
               <w:rPr>
                 <w:rStyle w:val="Kpr"/>
@@ -2100,7 +2100,7 @@
               <w:rPr>
                 <w:noProof/>
               </w:rPr>
-              <w:instrText xml:space="preserve"> PAGEREF _Toc242532009 \h </w:instrText>
+              <w:instrText xml:space="preserve"> PAGEREF _Toc242540454 \h </w:instrText>
             </w:r>
             <w:r>
               <w:rPr>
@@ -2137,7 +2137,7 @@
               <w:noProof/>
             </w:rPr>
           </w:pPr>
-          <w:hyperlink w:anchor="_Toc242532010" w:history="1">
+          <w:hyperlink w:anchor="_Toc242540455" w:history="1">
             <w:r>
               <w:rPr>
                 <w:rStyle w:val="Kpr"/>
@@ -2161,7 +2161,7 @@
               <w:rPr>
                 <w:noProof/>
               </w:rPr>
-              <w:instrText xml:space="preserve"> PAGEREF _Toc242532010 \h </w:instrText>
+              <w:instrText xml:space="preserve"> PAGEREF _Toc242540455 \h </w:instrText>
             </w:r>
             <w:r>
               <w:rPr>
@@ -2198,7 +2198,7 @@
               <w:noProof/>
             </w:rPr>
           </w:pPr>
-          <w:hyperlink w:anchor="_Toc242532011" w:history="1">
+          <w:hyperlink w:anchor="_Toc242540456" w:history="1">
             <w:r>
               <w:rPr>
                 <w:rStyle w:val="Kpr"/>
@@ -2222,7 +2222,7 @@
               <w:rPr>
                 <w:noProof/>
               </w:rPr>
-              <w:instrText xml:space="preserve"> PAGEREF _Toc242532011 \h </w:instrText>
+              <w:instrText xml:space="preserve"> PAGEREF _Toc242540456 \h </w:instrText>
             </w:r>
             <w:r>
               <w:rPr>
@@ -2259,7 +2259,7 @@
               <w:noProof/>
             </w:rPr>
           </w:pPr>
-          <w:hyperlink w:anchor="_Toc242532012" w:history="1">
+          <w:hyperlink w:anchor="_Toc242540457" w:history="1">
             <w:r>
               <w:rPr>
                 <w:rStyle w:val="Kpr"/>
@@ -2283,7 +2283,7 @@
               <w:rPr>
                 <w:noProof/>
               </w:rPr>
-              <w:instrText xml:space="preserve"> PAGEREF _Toc242532012 \h </w:instrText>
+              <w:instrText xml:space="preserve"> PAGEREF _Toc242540457 \h </w:instrText>
             </w:r>
             <w:r>
               <w:rPr>
@@ -2320,7 +2320,7 @@
               <w:noProof/>
             </w:rPr>
           </w:pPr>
-          <w:hyperlink w:anchor="_Toc242532013" w:history="1">
+          <w:hyperlink w:anchor="_Toc242540458" w:history="1">
             <w:r>
               <w:rPr>
                 <w:rStyle w:val="Kpr"/>
@@ -2344,7 +2344,7 @@
               <w:rPr>
                 <w:noProof/>
               </w:rPr>
-              <w:instrText xml:space="preserve"> PAGEREF _Toc242532013 \h </w:instrText>
+              <w:instrText xml:space="preserve"> PAGEREF _Toc242540458 \h </w:instrText>
             </w:r>
             <w:r>
               <w:rPr>
@@ -2381,7 +2381,7 @@
               <w:noProof/>
             </w:rPr>
           </w:pPr>
-          <w:hyperlink w:anchor="_Toc242532014" w:history="1">
+          <w:hyperlink w:anchor="_Toc242540459" w:history="1">
             <w:r>
               <w:rPr>
                 <w:rStyle w:val="Kpr"/>
@@ -2405,7 +2405,7 @@
               <w:rPr>
                 <w:noProof/>
               </w:rPr>
-              <w:instrText xml:space="preserve"> PAGEREF _Toc242532014 \h </w:instrText>
+              <w:instrText xml:space="preserve"> PAGEREF _Toc242540459 \h </w:instrText>
             </w:r>
             <w:r>
               <w:rPr>
@@ -2442,7 +2442,7 @@
               <w:noProof/>
             </w:rPr>
           </w:pPr>
-          <w:hyperlink w:anchor="_Toc242532015" w:history="1">
+          <w:hyperlink w:anchor="_Toc242540460" w:history="1">
             <w:r>
               <w:rPr>
                 <w:rStyle w:val="Kpr"/>
@@ -2466,7 +2466,7 @@
               <w:rPr>
                 <w:noProof/>
               </w:rPr>
-              <w:instrText xml:space="preserve"> PAGEREF _Toc242532015 \h </w:instrText>
+              <w:instrText xml:space="preserve"> PAGEREF _Toc242540460 \h </w:instrText>
             </w:r>
             <w:r>
               <w:rPr>
@@ -2503,7 +2503,7 @@
               <w:noProof/>
             </w:rPr>
           </w:pPr>
-          <w:hyperlink w:anchor="_Toc242532016" w:history="1">
+          <w:hyperlink w:anchor="_Toc242540461" w:history="1">
             <w:r>
               <w:rPr>
                 <w:rStyle w:val="Kpr"/>
@@ -2527,7 +2527,7 @@
               <w:rPr>
                 <w:noProof/>
               </w:rPr>
-              <w:instrText xml:space="preserve"> PAGEREF _Toc242532016 \h </w:instrText>
+              <w:instrText xml:space="preserve"> PAGEREF _Toc242540461 \h </w:instrText>
             </w:r>
             <w:r>
               <w:rPr>
@@ -2564,7 +2564,7 @@
               <w:noProof/>
             </w:rPr>
           </w:pPr>
-          <w:hyperlink w:anchor="_Toc242532017" w:history="1">
+          <w:hyperlink w:anchor="_Toc242540462" w:history="1">
             <w:r>
               <w:rPr>
                 <w:rStyle w:val="Kpr"/>
@@ -2588,7 +2588,7 @@
               <w:rPr>
                 <w:noProof/>
               </w:rPr>
-              <w:instrText xml:space="preserve"> PAGEREF _Toc242532017 \h </w:instrText>
+              <w:instrText xml:space="preserve"> PAGEREF _Toc242540462 \h </w:instrText>
             </w:r>
             <w:r>
               <w:rPr>
@@ -2625,7 +2625,7 @@
               <w:noProof/>
             </w:rPr>
           </w:pPr>
-          <w:hyperlink w:anchor="_Toc242532018" w:history="1">
+          <w:hyperlink w:anchor="_Toc242540463" w:history="1">
             <w:r>
               <w:rPr>
                 <w:rStyle w:val="Kpr"/>
@@ -2649,7 +2649,7 @@
               <w:rPr>
                 <w:noProof/>
               </w:rPr>
-              <w:instrText xml:space="preserve"> PAGEREF _Toc242532018 \h </w:instrText>
+              <w:instrText xml:space="preserve"> PAGEREF _Toc242540463 \h </w:instrText>
             </w:r>
             <w:r>
               <w:rPr>
@@ -2686,7 +2686,7 @@
               <w:noProof/>
             </w:rPr>
           </w:pPr>
-          <w:hyperlink w:anchor="_Toc242532019" w:history="1">
+          <w:hyperlink w:anchor="_Toc242540464" w:history="1">
             <w:r>
               <w:rPr>
                 <w:rStyle w:val="Kpr"/>
@@ -2710,7 +2710,7 @@
               <w:rPr>
                 <w:noProof/>
               </w:rPr>
-              <w:instrText xml:space="preserve"> PAGEREF _Toc242532019 \h </w:instrText>
+              <w:instrText xml:space="preserve"> PAGEREF _Toc242540464 \h </w:instrText>
             </w:r>
             <w:r>
               <w:rPr>
@@ -2747,7 +2747,7 @@
               <w:noProof/>
             </w:rPr>
           </w:pPr>
-          <w:hyperlink w:anchor="_Toc242532020" w:history="1">
+          <w:hyperlink w:anchor="_Toc242540465" w:history="1">
             <w:r>
               <w:rPr>
                 <w:rStyle w:val="Kpr"/>
@@ -2771,7 +2771,7 @@
               <w:rPr>
                 <w:noProof/>
               </w:rPr>
-              <w:instrText xml:space="preserve"> PAGEREF _Toc242532020 \h </w:instrText>
+              <w:instrText xml:space="preserve"> PAGEREF _Toc242540465 \h </w:instrText>
             </w:r>
             <w:r>
               <w:rPr>
@@ -2808,7 +2808,7 @@
               <w:noProof/>
             </w:rPr>
           </w:pPr>
-          <w:hyperlink w:anchor="_Toc242532021" w:history="1">
+          <w:hyperlink w:anchor="_Toc242540466" w:history="1">
             <w:r>
               <w:rPr>
                 <w:rStyle w:val="Kpr"/>
@@ -2832,7 +2832,7 @@
               <w:rPr>
                 <w:noProof/>
               </w:rPr>
-              <w:instrText xml:space="preserve"> PAGEREF _Toc242532021 \h </w:instrText>
+              <w:instrText xml:space="preserve"> PAGEREF _Toc242540466 \h </w:instrText>
             </w:r>
             <w:r>
               <w:rPr>
@@ -2869,7 +2869,7 @@
               <w:noProof/>
             </w:rPr>
           </w:pPr>
-          <w:hyperlink w:anchor="_Toc242532022" w:history="1">
+          <w:hyperlink w:anchor="_Toc242540467" w:history="1">
             <w:r>
               <w:rPr>
                 <w:rStyle w:val="Kpr"/>
@@ -2893,7 +2893,7 @@
               <w:rPr>
                 <w:noProof/>
               </w:rPr>
-              <w:instrText xml:space="preserve"> PAGEREF _Toc242532022 \h </w:instrText>
+              <w:instrText xml:space="preserve"> PAGEREF _Toc242540467 \h </w:instrText>
             </w:r>
             <w:r>
               <w:rPr>
@@ -2930,7 +2930,7 @@
               <w:noProof/>
             </w:rPr>
           </w:pPr>
-          <w:hyperlink w:anchor="_Toc242532023" w:history="1">
+          <w:hyperlink w:anchor="_Toc242540468" w:history="1">
             <w:r>
               <w:rPr>
                 <w:rStyle w:val="Kpr"/>
@@ -2954,7 +2954,7 @@
               <w:rPr>
                 <w:noProof/>
               </w:rPr>
-              <w:instrText xml:space="preserve"> PAGEREF _Toc242532023 \h </w:instrText>
+              <w:instrText xml:space="preserve"> PAGEREF _Toc242540468 \h </w:instrText>
             </w:r>
             <w:r>
               <w:rPr>
@@ -2991,7 +2991,7 @@
               <w:noProof/>
             </w:rPr>
           </w:pPr>
-          <w:hyperlink w:anchor="_Toc242532024" w:history="1">
+          <w:hyperlink w:anchor="_Toc242540469" w:history="1">
             <w:r>
               <w:rPr>
                 <w:rStyle w:val="Kpr"/>
@@ -3015,7 +3015,7 @@
               <w:rPr>
                 <w:noProof/>
               </w:rPr>
-              <w:instrText xml:space="preserve"> PAGEREF _Toc242532024 \h </w:instrText>
+              <w:instrText xml:space="preserve"> PAGEREF _Toc242540469 \h </w:instrText>
             </w:r>
             <w:r>
               <w:rPr>
@@ -3052,7 +3052,7 @@
               <w:noProof/>
             </w:rPr>
           </w:pPr>
-          <w:hyperlink w:anchor="_Toc242532025" w:history="1">
+          <w:hyperlink w:anchor="_Toc242540470" w:history="1">
             <w:r>
               <w:rPr>
                 <w:rStyle w:val="Kpr"/>
@@ -3076,7 +3076,7 @@
               <w:rPr>
                 <w:noProof/>
               </w:rPr>
-              <w:instrText xml:space="preserve"> PAGEREF _Toc242532025 \h </w:instrText>
+              <w:instrText xml:space="preserve"> PAGEREF _Toc242540470 \h </w:instrText>
             </w:r>
             <w:r>
               <w:rPr>
@@ -3113,7 +3113,7 @@
               <w:noProof/>
             </w:rPr>
           </w:pPr>
-          <w:hyperlink w:anchor="_Toc242532026" w:history="1">
+          <w:hyperlink w:anchor="_Toc242540471" w:history="1">
             <w:r>
               <w:rPr>
                 <w:rStyle w:val="Kpr"/>
@@ -3137,7 +3137,7 @@
               <w:rPr>
                 <w:noProof/>
               </w:rPr>
-              <w:instrText xml:space="preserve"> PAGEREF _Toc242532026 \h </w:instrText>
+              <w:instrText xml:space="preserve"> PAGEREF _Toc242540471 \h </w:instrText>
             </w:r>
             <w:r>
               <w:rPr>
@@ -3174,7 +3174,7 @@
               <w:noProof/>
             </w:rPr>
           </w:pPr>
-          <w:hyperlink w:anchor="_Toc242532027" w:history="1">
+          <w:hyperlink w:anchor="_Toc242540472" w:history="1">
             <w:r>
               <w:rPr>
                 <w:rStyle w:val="Kpr"/>
@@ -3198,7 +3198,7 @@
               <w:rPr>
                 <w:noProof/>
               </w:rPr>
-              <w:instrText xml:space="preserve"> PAGEREF _Toc242532027 \h </w:instrText>
+              <w:instrText xml:space="preserve"> PAGEREF _Toc242540472 \h </w:instrText>
             </w:r>
             <w:r>
               <w:rPr>
@@ -3235,7 +3235,7 @@
               <w:noProof/>
             </w:rPr>
           </w:pPr>
-          <w:hyperlink w:anchor="_Toc242532028" w:history="1">
+          <w:hyperlink w:anchor="_Toc242540473" w:history="1">
             <w:r>
               <w:rPr>
                 <w:rStyle w:val="Kpr"/>
@@ -3259,7 +3259,7 @@
               <w:rPr>
                 <w:noProof/>
               </w:rPr>
-              <w:instrText xml:space="preserve"> PAGEREF _Toc242532028 \h </w:instrText>
+              <w:instrText xml:space="preserve"> PAGEREF _Toc242540473 \h </w:instrText>
             </w:r>
             <w:r>
               <w:rPr>
@@ -3296,7 +3296,7 @@
               <w:noProof/>
             </w:rPr>
           </w:pPr>
-          <w:hyperlink w:anchor="_Toc242532029" w:history="1">
+          <w:hyperlink w:anchor="_Toc242540474" w:history="1">
             <w:r>
               <w:rPr>
                 <w:rStyle w:val="Kpr"/>
@@ -3320,7 +3320,7 @@
               <w:rPr>
                 <w:noProof/>
               </w:rPr>
-              <w:instrText xml:space="preserve"> PAGEREF _Toc242532029 \h </w:instrText>
+              <w:instrText xml:space="preserve"> PAGEREF _Toc242540474 \h </w:instrText>
             </w:r>
             <w:r>
               <w:rPr>
@@ -3357,7 +3357,7 @@
               <w:noProof/>
             </w:rPr>
           </w:pPr>
-          <w:hyperlink w:anchor="_Toc242532030" w:history="1">
+          <w:hyperlink w:anchor="_Toc242540475" w:history="1">
             <w:r>
               <w:rPr>
                 <w:rStyle w:val="Kpr"/>
@@ -3381,7 +3381,7 @@
               <w:rPr>
                 <w:noProof/>
               </w:rPr>
-              <w:instrText xml:space="preserve"> PAGEREF _Toc242532030 \h </w:instrText>
+              <w:instrText xml:space="preserve"> PAGEREF _Toc242540475 \h </w:instrText>
             </w:r>
             <w:r>
               <w:rPr>
@@ -3418,7 +3418,7 @@
               <w:noProof/>
             </w:rPr>
           </w:pPr>
-          <w:hyperlink w:anchor="_Toc242532031" w:history="1">
+          <w:hyperlink w:anchor="_Toc242540476" w:history="1">
             <w:r>
               <w:rPr>
                 <w:rStyle w:val="Kpr"/>
@@ -3442,7 +3442,7 @@
               <w:rPr>
                 <w:noProof/>
               </w:rPr>
-              <w:instrText xml:space="preserve"> PAGEREF _Toc242532031 \h </w:instrText>
+              <w:instrText xml:space="preserve"> PAGEREF _Toc242540476 \h </w:instrText>
             </w:r>
             <w:r>
               <w:rPr>
@@ -3479,7 +3479,7 @@
               <w:noProof/>
             </w:rPr>
           </w:pPr>
-          <w:hyperlink w:anchor="_Toc242532032" w:history="1">
+          <w:hyperlink w:anchor="_Toc242540477" w:history="1">
             <w:r>
               <w:rPr>
                 <w:rStyle w:val="Kpr"/>
@@ -3503,7 +3503,7 @@
               <w:rPr>
                 <w:noProof/>
               </w:rPr>
-              <w:instrText xml:space="preserve"> PAGEREF _Toc242532032 \h </w:instrText>
+              <w:instrText xml:space="preserve"> PAGEREF _Toc242540477 \h </w:instrText>
             </w:r>
             <w:r>
               <w:rPr>
@@ -3540,7 +3540,7 @@
               <w:noProof/>
             </w:rPr>
           </w:pPr>
-          <w:hyperlink w:anchor="_Toc242532033" w:history="1">
+          <w:hyperlink w:anchor="_Toc242540478" w:history="1">
             <w:r>
               <w:rPr>
                 <w:rStyle w:val="Kpr"/>
@@ -3564,7 +3564,7 @@
               <w:rPr>
                 <w:noProof/>
               </w:rPr>
-              <w:instrText xml:space="preserve"> PAGEREF _Toc242532033 \h </w:instrText>
+              <w:instrText xml:space="preserve"> PAGEREF _Toc242540478 \h </w:instrText>
             </w:r>
             <w:r>
               <w:rPr>
@@ -3601,7 +3601,7 @@
               <w:noProof/>
             </w:rPr>
           </w:pPr>
-          <w:hyperlink w:anchor="_Toc242532034" w:history="1">
+          <w:hyperlink w:anchor="_Toc242540479" w:history="1">
             <w:r>
               <w:rPr>
                 <w:rStyle w:val="Kpr"/>
@@ -3625,7 +3625,7 @@
               <w:rPr>
                 <w:noProof/>
               </w:rPr>
-              <w:instrText xml:space="preserve"> PAGEREF _Toc242532034 \h </w:instrText>
+              <w:instrText xml:space="preserve"> PAGEREF _Toc242540479 \h </w:instrText>
             </w:r>
             <w:r>
               <w:rPr>
@@ -3662,7 +3662,7 @@
               <w:noProof/>
             </w:rPr>
           </w:pPr>
-          <w:hyperlink w:anchor="_Toc242532035" w:history="1">
+          <w:hyperlink w:anchor="_Toc242540480" w:history="1">
             <w:r>
               <w:rPr>
                 <w:rStyle w:val="Kpr"/>
@@ -3686,7 +3686,7 @@
               <w:rPr>
                 <w:noProof/>
               </w:rPr>
-              <w:instrText xml:space="preserve"> PAGEREF _Toc242532035 \h </w:instrText>
+              <w:instrText xml:space="preserve"> PAGEREF _Toc242540480 \h </w:instrText>
             </w:r>
             <w:r>
               <w:rPr>
@@ -3723,7 +3723,7 @@
               <w:noProof/>
             </w:rPr>
           </w:pPr>
-          <w:hyperlink w:anchor="_Toc242532036" w:history="1">
+          <w:hyperlink w:anchor="_Toc242540481" w:history="1">
             <w:r>
               <w:rPr>
                 <w:rStyle w:val="Kpr"/>
@@ -3747,7 +3747,7 @@
               <w:rPr>
                 <w:noProof/>
               </w:rPr>
-              <w:instrText xml:space="preserve"> PAGEREF _Toc242532036 \h </w:instrText>
+              <w:instrText xml:space="preserve"> PAGEREF _Toc242540481 \h </w:instrText>
             </w:r>
             <w:r>
               <w:rPr>
@@ -3784,7 +3784,7 @@
               <w:noProof/>
             </w:rPr>
           </w:pPr>
-          <w:hyperlink w:anchor="_Toc242532037" w:history="1">
+          <w:hyperlink w:anchor="_Toc242540482" w:history="1">
             <w:r>
               <w:rPr>
                 <w:rStyle w:val="Kpr"/>
@@ -3808,7 +3808,7 @@
               <w:rPr>
                 <w:noProof/>
               </w:rPr>
-              <w:instrText xml:space="preserve"> PAGEREF _Toc242532037 \h </w:instrText>
+              <w:instrText xml:space="preserve"> PAGEREF _Toc242540482 \h </w:instrText>
             </w:r>
             <w:r>
               <w:rPr>
@@ -3845,7 +3845,7 @@
               <w:noProof/>
             </w:rPr>
           </w:pPr>
-          <w:hyperlink w:anchor="_Toc242532038" w:history="1">
+          <w:hyperlink w:anchor="_Toc242540483" w:history="1">
             <w:r>
               <w:rPr>
                 <w:rStyle w:val="Kpr"/>
@@ -3869,7 +3869,7 @@
               <w:rPr>
                 <w:noProof/>
               </w:rPr>
-              <w:instrText xml:space="preserve"> PAGEREF _Toc242532038 \h </w:instrText>
+              <w:instrText xml:space="preserve"> PAGEREF _Toc242540483 \h </w:instrText>
             </w:r>
             <w:r>
               <w:rPr>
@@ -3906,7 +3906,7 @@
               <w:noProof/>
             </w:rPr>
           </w:pPr>
-          <w:hyperlink w:anchor="_Toc242532039" w:history="1">
+          <w:hyperlink w:anchor="_Toc242540484" w:history="1">
             <w:r>
               <w:rPr>
                 <w:rStyle w:val="Kpr"/>
@@ -3930,7 +3930,7 @@
               <w:rPr>
                 <w:noProof/>
               </w:rPr>
-              <w:instrText xml:space="preserve"> PAGEREF _Toc242532039 \h </w:instrText>
+              <w:instrText xml:space="preserve"> PAGEREF _Toc242540484 \h </w:instrText>
             </w:r>
             <w:r>
               <w:rPr>
@@ -3967,7 +3967,7 @@
               <w:noProof/>
             </w:rPr>
           </w:pPr>
-          <w:hyperlink w:anchor="_Toc242532040" w:history="1">
+          <w:hyperlink w:anchor="_Toc242540485" w:history="1">
             <w:r>
               <w:rPr>
                 <w:rStyle w:val="Kpr"/>
@@ -3991,7 +3991,7 @@
               <w:rPr>
                 <w:noProof/>
               </w:rPr>
-              <w:instrText xml:space="preserve"> PAGEREF _Toc242532040 \h </w:instrText>
+              <w:instrText xml:space="preserve"> PAGEREF _Toc242540485 \h </w:instrText>
             </w:r>
             <w:r>
               <w:rPr>
@@ -4028,7 +4028,7 @@
               <w:noProof/>
             </w:rPr>
           </w:pPr>
-          <w:hyperlink w:anchor="_Toc242532041" w:history="1">
+          <w:hyperlink w:anchor="_Toc242540486" w:history="1">
             <w:r>
               <w:rPr>
                 <w:rStyle w:val="Kpr"/>
@@ -4052,7 +4052,7 @@
               <w:rPr>
                 <w:noProof/>
               </w:rPr>
-              <w:instrText xml:space="preserve"> PAGEREF _Toc242532041 \h </w:instrText>
+              <w:instrText xml:space="preserve"> PAGEREF _Toc242540486 \h </w:instrText>
             </w:r>
             <w:r>
               <w:rPr>
@@ -4089,7 +4089,7 @@
               <w:noProof/>
             </w:rPr>
           </w:pPr>
-          <w:hyperlink w:anchor="_Toc242532042" w:history="1">
+          <w:hyperlink w:anchor="_Toc242540487" w:history="1">
             <w:r>
               <w:rPr>
                 <w:rStyle w:val="Kpr"/>
@@ -4113,7 +4113,7 @@
               <w:rPr>
                 <w:noProof/>
               </w:rPr>
-              <w:instrText xml:space="preserve"> PAGEREF _Toc242532042 \h </w:instrText>
+              <w:instrText xml:space="preserve"> PAGEREF _Toc242540487 \h </w:instrText>
             </w:r>
             <w:r>
               <w:rPr>
@@ -4172,7 +4172,7 @@
       <w:pPr>
         <w:pStyle w:val="Balk1"/>
       </w:pPr>
-      <w:bookmarkStart w:id="2" w:name="_Toc242531992"/>
+      <w:bookmarkStart w:id="2" w:name="_Toc242540437"/>
       <w:r>
         <w:t>1. Giriş</w:t>
       </w:r>
@@ -4182,7 +4182,7 @@
       <w:pPr>
         <w:pStyle w:val="Balk2"/>
       </w:pPr>
-      <w:bookmarkStart w:id="3" w:name="_Toc242531993"/>
+      <w:bookmarkStart w:id="3" w:name="_Toc242540438"/>
       <w:r>
         <w:t>1.1 Amaç</w:t>
       </w:r>
@@ -4210,7 +4210,7 @@
       <w:pPr>
         <w:pStyle w:val="Balk2"/>
       </w:pPr>
-      <w:bookmarkStart w:id="4" w:name="_Toc242531994"/>
+      <w:bookmarkStart w:id="4" w:name="_Toc242540439"/>
       <w:r>
         <w:t>1.2 Kapsam Özeti</w:t>
       </w:r>
@@ -4229,7 +4229,7 @@
       <w:pPr>
         <w:pStyle w:val="Balk2"/>
       </w:pPr>
-      <w:bookmarkStart w:id="5" w:name="_Toc242531995"/>
+      <w:bookmarkStart w:id="5" w:name="_Toc242540440"/>
       <w:r>
         <w:t>1.3 Referans Dokümanlar</w:t>
       </w:r>
@@ -4768,7 +4768,7 @@
       <w:pPr>
         <w:pStyle w:val="Balk2"/>
       </w:pPr>
-      <w:bookmarkStart w:id="6" w:name="_Toc242531996"/>
+      <w:bookmarkStart w:id="6" w:name="_Toc242540441"/>
       <w:r>
         <w:t>1.4 Kısaltmalar</w:t>
       </w:r>
@@ -5421,7 +5421,7 @@
       <w:pPr>
         <w:pStyle w:val="Balk1"/>
       </w:pPr>
-      <w:bookmarkStart w:id="7" w:name="_Toc242531997"/>
+      <w:bookmarkStart w:id="7" w:name="_Toc242540442"/>
       <w:r>
         <w:t>2. Test Edilecek Sistem</w:t>
       </w:r>
@@ -5431,7 +5431,7 @@
       <w:pPr>
         <w:pStyle w:val="Balk2"/>
       </w:pPr>
-      <w:bookmarkStart w:id="8" w:name="_Toc242531998"/>
+      <w:bookmarkStart w:id="8" w:name="_Toc242540443"/>
       <w:r>
         <w:t>2.1 Uygulama Tanımı</w:t>
       </w:r>
@@ -5450,7 +5450,7 @@
       <w:pPr>
         <w:pStyle w:val="Balk2"/>
       </w:pPr>
-      <w:bookmarkStart w:id="9" w:name="_Toc242531999"/>
+      <w:bookmarkStart w:id="9" w:name="_Toc242540444"/>
       <w:r>
         <w:t>2.2 Mimari ve Bileşenler</w:t>
       </w:r>
@@ -5906,7 +5906,7 @@
       <w:pPr>
         <w:pStyle w:val="Balk2"/>
       </w:pPr>
-      <w:bookmarkStart w:id="10" w:name="_Toc242532000"/>
+      <w:bookmarkStart w:id="10" w:name="_Toc242540445"/>
       <w:r>
         <w:t>2.3 Kullanıcı Rolleri</w:t>
       </w:r>
@@ -6167,7 +6167,7 @@
       <w:pPr>
         <w:pStyle w:val="Balk2"/>
       </w:pPr>
-      <w:bookmarkStart w:id="11" w:name="_Toc242532001"/>
+      <w:bookmarkStart w:id="11" w:name="_Toc242540446"/>
       <w:r>
         <w:t>2.4 Uygulama Modülleri (Site Analizi Sonucu)</w:t>
       </w:r>
@@ -7121,7 +7121,7 @@
       <w:pPr>
         <w:pStyle w:val="Balk1"/>
       </w:pPr>
-      <w:bookmarkStart w:id="12" w:name="_Toc242532002"/>
+      <w:bookmarkStart w:id="12" w:name="_Toc242540447"/>
       <w:r>
         <w:t>3. Test Kapsamı</w:t>
       </w:r>
@@ -7131,7 +7131,7 @@
       <w:pPr>
         <w:pStyle w:val="Balk2"/>
       </w:pPr>
-      <w:bookmarkStart w:id="13" w:name="_Toc242532003"/>
+      <w:bookmarkStart w:id="13" w:name="_Toc242540448"/>
       <w:r>
         <w:t>3.1 Test Edilecek Özellikler (In Scope)</w:t>
       </w:r>
@@ -10223,7 +10223,7 @@
       <w:pPr>
         <w:pStyle w:val="Balk2"/>
       </w:pPr>
-      <w:bookmarkStart w:id="14" w:name="_Toc242532004"/>
+      <w:bookmarkStart w:id="14" w:name="_Toc242540449"/>
       <w:r>
         <w:t>3.2 Test Edilmeyecek Özellikler (Out of Scope)</w:t>
       </w:r>
@@ -10324,7 +10324,7 @@
       <w:pPr>
         <w:pStyle w:val="Balk1"/>
       </w:pPr>
-      <w:bookmarkStart w:id="15" w:name="_Toc242532005"/>
+      <w:bookmarkStart w:id="15" w:name="_Toc242540450"/>
       <w:r>
         <w:t>4. Test Yaklaşımı ve Stratejisi</w:t>
       </w:r>
@@ -10334,7 +10334,7 @@
       <w:pPr>
         <w:pStyle w:val="Balk2"/>
       </w:pPr>
-      <w:bookmarkStart w:id="16" w:name="_Toc242532006"/>
+      <w:bookmarkStart w:id="16" w:name="_Toc242540451"/>
       <w:r>
         <w:t>4.1 Test Seviyeleri</w:t>
       </w:r>
@@ -10956,7 +10956,7 @@
       <w:pPr>
         <w:pStyle w:val="Balk2"/>
       </w:pPr>
-      <w:bookmarkStart w:id="17" w:name="_Toc242532007"/>
+      <w:bookmarkStart w:id="17" w:name="_Toc242540452"/>
       <w:r>
         <w:t>4.2 Test Türleri</w:t>
       </w:r>
@@ -11086,7 +11086,7 @@
       <w:pPr>
         <w:pStyle w:val="Balk2"/>
       </w:pPr>
-      <w:bookmarkStart w:id="18" w:name="_Toc242532008"/>
+      <w:bookmarkStart w:id="18" w:name="_Toc242540453"/>
       <w:r>
         <w:t>4.3 Test Tasarım Teknikleri</w:t>
       </w:r>
@@ -11515,7 +11515,7 @@
       <w:pPr>
         <w:pStyle w:val="Balk2"/>
       </w:pPr>
-      <w:bookmarkStart w:id="19" w:name="_Toc242532009"/>
+      <w:bookmarkStart w:id="19" w:name="_Toc242540454"/>
       <w:r>
         <w:t>4.4 Sipariş Statü Geçiş Kuralları</w:t>
       </w:r>
@@ -12110,7 +12110,7 @@
       <w:pPr>
         <w:pStyle w:val="Balk1"/>
       </w:pPr>
-      <w:bookmarkStart w:id="20" w:name="_Toc242532010"/>
+      <w:bookmarkStart w:id="20" w:name="_Toc242540455"/>
       <w:r>
         <w:t>5. Test Süreci ve Fazlar</w:t>
       </w:r>
@@ -13814,7 +13814,7 @@
       <w:pPr>
         <w:pStyle w:val="Balk1"/>
       </w:pPr>
-      <w:bookmarkStart w:id="21" w:name="_Toc242532011"/>
+      <w:bookmarkStart w:id="21" w:name="_Toc242540456"/>
       <w:r>
         <w:t>6. Test Ortamı</w:t>
       </w:r>
@@ -13824,7 +13824,7 @@
       <w:pPr>
         <w:pStyle w:val="Balk2"/>
       </w:pPr>
-      <w:bookmarkStart w:id="22" w:name="_Toc242532012"/>
+      <w:bookmarkStart w:id="22" w:name="_Toc242540457"/>
       <w:r>
         <w:t>6.1 Ortam Bilgileri</w:t>
       </w:r>
@@ -14309,7 +14309,7 @@
       <w:pPr>
         <w:pStyle w:val="Balk2"/>
       </w:pPr>
-      <w:bookmarkStart w:id="23" w:name="_Toc242532013"/>
+      <w:bookmarkStart w:id="23" w:name="_Toc242540458"/>
       <w:r>
         <w:t>6.2 Araçlar ve Kütüphaneler</w:t>
       </w:r>
@@ -15595,7 +15595,7 @@
       <w:pPr>
         <w:pStyle w:val="Balk2"/>
       </w:pPr>
-      <w:bookmarkStart w:id="24" w:name="_Toc242532014"/>
+      <w:bookmarkStart w:id="24" w:name="_Toc242540459"/>
       <w:r>
         <w:t>6.3 Test Verisi Yönetimi</w:t>
       </w:r>
@@ -15657,7 +15657,7 @@
       <w:pPr>
         <w:pStyle w:val="Balk1"/>
       </w:pPr>
-      <w:bookmarkStart w:id="25" w:name="_Toc242532015"/>
+      <w:bookmarkStart w:id="25" w:name="_Toc242540460"/>
       <w:r>
         <w:t>7. Test Otomasyon Mimarisi</w:t>
       </w:r>
@@ -15667,7 +15667,7 @@
       <w:pPr>
         <w:pStyle w:val="Balk2"/>
       </w:pPr>
-      <w:bookmarkStart w:id="26" w:name="_Toc242532016"/>
+      <w:bookmarkStart w:id="26" w:name="_Toc242540461"/>
       <w:r>
         <w:t>7.1 Selenium + TestNG (POM)</w:t>
       </w:r>
@@ -15795,7 +15795,7 @@
       <w:pPr>
         <w:pStyle w:val="Balk2"/>
       </w:pPr>
-      <w:bookmarkStart w:id="27" w:name="_Toc242532017"/>
+      <w:bookmarkStart w:id="27" w:name="_Toc242540462"/>
       <w:r>
         <w:t>7.2 Selenium + Cucumber (BDD + POM)</w:t>
       </w:r>
@@ -15884,7 +15884,7 @@
       <w:pPr>
         <w:pStyle w:val="Balk2"/>
       </w:pPr>
-      <w:bookmarkStart w:id="28" w:name="_Toc242532018"/>
+      <w:bookmarkStart w:id="28" w:name="_Toc242540463"/>
       <w:r>
         <w:t>7.3 API Otomasyonu (Rest Assured + POJO)</w:t>
       </w:r>
@@ -15973,7 +15973,7 @@
       <w:pPr>
         <w:pStyle w:val="Balk2"/>
       </w:pPr>
-      <w:bookmarkStart w:id="29" w:name="_Toc242532019"/>
+      <w:bookmarkStart w:id="29" w:name="_Toc242540464"/>
       <w:r>
         <w:t>7.4 Veritabanı ve E2E Otomasyonu</w:t>
       </w:r>
@@ -15992,7 +15992,7 @@
       <w:pPr>
         <w:pStyle w:val="Balk1"/>
       </w:pPr>
-      <w:bookmarkStart w:id="30" w:name="_Toc242532020"/>
+      <w:bookmarkStart w:id="30" w:name="_Toc242540465"/>
       <w:r>
         <w:t>8. Giriş, Çıkış ve Askıya Alma Kriterleri</w:t>
       </w:r>
@@ -16002,7 +16002,7 @@
       <w:pPr>
         <w:pStyle w:val="Balk2"/>
       </w:pPr>
-      <w:bookmarkStart w:id="31" w:name="_Toc242532021"/>
+      <w:bookmarkStart w:id="31" w:name="_Toc242540466"/>
       <w:r>
         <w:t>8.1 Giriş Kriterleri (Entry Criteria)</w:t>
       </w:r>
@@ -16090,7 +16090,7 @@
       <w:pPr>
         <w:pStyle w:val="Balk2"/>
       </w:pPr>
-      <w:bookmarkStart w:id="32" w:name="_Toc242532022"/>
+      <w:bookmarkStart w:id="32" w:name="_Toc242540467"/>
       <w:r>
         <w:t>8.2 Çıkış Kriterleri (Exit Criteria)</w:t>
       </w:r>
@@ -16178,7 +16178,7 @@
       <w:pPr>
         <w:pStyle w:val="Balk2"/>
       </w:pPr>
-      <w:bookmarkStart w:id="33" w:name="_Toc242532023"/>
+      <w:bookmarkStart w:id="33" w:name="_Toc242540468"/>
       <w:r>
         <w:t>8.3 Askıya Alma ve Devam Kriterleri</w:t>
       </w:r>
@@ -16439,7 +16439,7 @@
       <w:pPr>
         <w:pStyle w:val="Balk1"/>
       </w:pPr>
-      <w:bookmarkStart w:id="34" w:name="_Toc242532024"/>
+      <w:bookmarkStart w:id="34" w:name="_Toc242540469"/>
       <w:r>
         <w:t>9. Test Case Yazım Standartları</w:t>
       </w:r>
@@ -17174,7 +17174,7 @@
       <w:pPr>
         <w:pStyle w:val="Balk1"/>
       </w:pPr>
-      <w:bookmarkStart w:id="35" w:name="_Toc242532025"/>
+      <w:bookmarkStart w:id="35" w:name="_Toc242540470"/>
       <w:r>
         <w:t>10. JIRA ve Xray Yapılandırması</w:t>
       </w:r>
@@ -17893,7 +17893,7 @@
       <w:pPr>
         <w:pStyle w:val="Balk1"/>
       </w:pPr>
-      <w:bookmarkStart w:id="36" w:name="_Toc242532026"/>
+      <w:bookmarkStart w:id="36" w:name="_Toc242540471"/>
       <w:r>
         <w:t>11. Hata Yönetimi</w:t>
       </w:r>
@@ -17903,7 +17903,7 @@
       <w:pPr>
         <w:pStyle w:val="Balk2"/>
       </w:pPr>
-      <w:bookmarkStart w:id="37" w:name="_Toc242532027"/>
+      <w:bookmarkStart w:id="37" w:name="_Toc242540472"/>
       <w:r>
         <w:t>11.1 Hata Yaşam Döngüsü</w:t>
       </w:r>
@@ -17922,7 +17922,7 @@
       <w:pPr>
         <w:pStyle w:val="Balk2"/>
       </w:pPr>
-      <w:bookmarkStart w:id="38" w:name="_Toc242532028"/>
+      <w:bookmarkStart w:id="38" w:name="_Toc242540473"/>
       <w:r>
         <w:t>11.2 Severity (Ciddiyet) Tanımları</w:t>
       </w:r>
@@ -18461,7 +18461,7 @@
       <w:pPr>
         <w:pStyle w:val="Balk2"/>
       </w:pPr>
-      <w:bookmarkStart w:id="39" w:name="_Toc242532029"/>
+      <w:bookmarkStart w:id="39" w:name="_Toc242540474"/>
       <w:r>
         <w:t>11.3 Priority (Öncelik) Tanımları</w:t>
       </w:r>
@@ -18722,7 +18722,7 @@
       <w:pPr>
         <w:pStyle w:val="Balk2"/>
       </w:pPr>
-      <w:bookmarkStart w:id="40" w:name="_Toc242532030"/>
+      <w:bookmarkStart w:id="40" w:name="_Toc242540475"/>
       <w:r>
         <w:t>11.4 Bug Ticket Şablonu</w:t>
       </w:r>
@@ -19375,7 +19375,7 @@
       <w:pPr>
         <w:pStyle w:val="Balk1"/>
       </w:pPr>
-      <w:bookmarkStart w:id="41" w:name="_Toc242532031"/>
+      <w:bookmarkStart w:id="41" w:name="_Toc242540476"/>
       <w:r>
         <w:t>12. Ön Analiz Bulguları</w:t>
       </w:r>
@@ -20309,7 +20309,7 @@
       <w:pPr>
         <w:pStyle w:val="Balk1"/>
       </w:pPr>
-      <w:bookmarkStart w:id="42" w:name="_Toc242532032"/>
+      <w:bookmarkStart w:id="42" w:name="_Toc242540477"/>
       <w:r>
         <w:t>13. Takvim ve Sprint Planı</w:t>
       </w:r>
@@ -20913,7 +20913,7 @@
       <w:pPr>
         <w:pStyle w:val="Balk1"/>
       </w:pPr>
-      <w:bookmarkStart w:id="43" w:name="_Toc242532033"/>
+      <w:bookmarkStart w:id="43" w:name="_Toc242540478"/>
       <w:r>
         <w:t>14. Roller ve Sorumluluklar</w:t>
       </w:r>
@@ -21286,7 +21286,7 @@
       <w:pPr>
         <w:pStyle w:val="Balk1"/>
       </w:pPr>
-      <w:bookmarkStart w:id="44" w:name="_Toc242532034"/>
+      <w:bookmarkStart w:id="44" w:name="_Toc242540479"/>
       <w:r>
         <w:t>15. Riskler ve Önlemler</w:t>
       </w:r>
@@ -22101,7 +22101,7 @@
       <w:pPr>
         <w:pStyle w:val="Balk1"/>
       </w:pPr>
-      <w:bookmarkStart w:id="45" w:name="_Toc242532035"/>
+      <w:bookmarkStart w:id="45" w:name="_Toc242540480"/>
       <w:r>
         <w:t>16. Teslimatlar</w:t>
       </w:r>
@@ -23055,7 +23055,7 @@
       <w:pPr>
         <w:pStyle w:val="Balk1"/>
       </w:pPr>
-      <w:bookmarkStart w:id="46" w:name="_Toc242532036"/>
+      <w:bookmarkStart w:id="46" w:name="_Toc242540481"/>
       <w:r>
         <w:t>17. Test Özet Raporu (Koşum Sonuçları)</w:t>
       </w:r>
@@ -23074,7 +23074,7 @@
       <w:pPr>
         <w:pStyle w:val="Balk2"/>
       </w:pPr>
-      <w:bookmarkStart w:id="47" w:name="_Toc242532037"/>
+      <w:bookmarkStart w:id="47" w:name="_Toc242540482"/>
       <w:r>
         <w:t>17.1 Manuel Koşum Özeti</w:t>
       </w:r>
@@ -26948,7 +26948,7 @@
       <w:pPr>
         <w:pStyle w:val="Balk2"/>
       </w:pPr>
-      <w:bookmarkStart w:id="48" w:name="_Toc242532038"/>
+      <w:bookmarkStart w:id="48" w:name="_Toc242540483"/>
       <w:r>
         <w:t>17.2 Otomasyon Koşum Özeti</w:t>
       </w:r>
@@ -27228,7 +27228,7 @@
                 <w:sz w:val="19"/>
                 <w:szCs w:val="19"/>
               </w:rPr>
-              <w:t>29 PASS / 4 FAIL / 1 SKIP</w:t>
+              <w:t>30 PASS / 4 FAIL</w:t>
             </w:r>
           </w:p>
         </w:tc>
@@ -27533,7 +27533,7 @@
                 <w:sz w:val="19"/>
                 <w:szCs w:val="19"/>
               </w:rPr>
-              <w:t>20 istek; Products, Category, Contact klasörleri (13 istek, 31 assertion) Newman ile koşuldu. Auth/Cart klasörleri kullanıcı şifresi ile koşulur.</w:t>
+              <w:t>5 klasör, 20 istek, 47 assertion (ürün, kategori, iletişim, auth, sipariş, sepet)</w:t>
             </w:r>
           </w:p>
         </w:tc>
@@ -27560,7 +27560,7 @@
                 <w:sz w:val="19"/>
                 <w:szCs w:val="19"/>
               </w:rPr>
-              <w:t>25 PASS / 6 FAIL</w:t>
+              <w:t>39 PASS / 8 FAIL</w:t>
             </w:r>
           </w:p>
         </w:tc>
@@ -27579,7 +27579,7 @@
       <w:pPr>
         <w:pStyle w:val="Balk2"/>
       </w:pPr>
-      <w:bookmarkStart w:id="49" w:name="_Toc242532039"/>
+      <w:bookmarkStart w:id="49" w:name="_Toc242540484"/>
       <w:r>
         <w:t>17.3 Bulunan Hatalar (JIRA – SCRUM)</w:t>
       </w:r>
@@ -31483,7 +31483,7 @@
       <w:pPr>
         <w:pStyle w:val="Balk2"/>
       </w:pPr>
-      <w:bookmarkStart w:id="50" w:name="_Toc242532040"/>
+      <w:bookmarkStart w:id="50" w:name="_Toc242540485"/>
       <w:r>
         <w:t>17.4 Teslimat Konumları</w:t>
       </w:r>
@@ -31800,7 +31800,7 @@
       <w:pPr>
         <w:pStyle w:val="Balk2"/>
       </w:pPr>
-      <w:bookmarkStart w:id="51" w:name="_Toc242532041"/>
+      <w:bookmarkStart w:id="51" w:name="_Toc242540486"/>
       <w:r>
         <w:t>17.5 Sonuç ve Öneriler</w:t>
       </w:r>
@@ -31875,7 +31875,7 @@
       <w:pPr>
         <w:pStyle w:val="Balk1"/>
       </w:pPr>
-      <w:bookmarkStart w:id="52" w:name="_Toc242532042"/>
+      <w:bookmarkStart w:id="52" w:name="_Toc242540487"/>
       <w:r>
         <w:t>18. Onay</w:t>
       </w:r>
@@ -32397,10 +32397,64 @@
 <file path=word/numbering.xml><?xml version="1.0" encoding="utf-8"?>
 <w:numbering xmlns:wpc="http://schemas.microsoft.com/office/word/2010/wordprocessingCanvas" xmlns:cx="http://schemas.microsoft.com/office/drawing/2014/chartex" xmlns:cx1="http://schemas.microsoft.com/office/drawing/2015/9/8/chartex" xmlns:cx2="http://schemas.microsoft.com/office/drawing/2015/10/21/chartex" xmlns:cx3="http://schemas.microsoft.com/office/drawing/2016/5/9/chartex" xmlns:cx4="http://schemas.microsoft.com/office/drawing/2016/5/10/chartex" xmlns:cx5="http://schemas.microsoft.com/office/drawing/2016/5/11/chartex" xmlns:cx6="http://schemas.microsoft.com/office/drawing/2016/5/12/chartex" xmlns:cx7="http://schemas.microsoft.com/office/drawing/2016/5/13/chartex" xmlns:cx8="http://schemas.microsoft.com/office/drawing/2016/5/14/chartex" xmlns:mc="http://schemas.openxmlformats.org/markup-compatibility/2006" xmlns:aink="http://schemas.microsoft.com/office/drawing/2016/ink" xmlns:am3d="http://schemas.microsoft.com/office/drawing/2017/model3d" xmlns:o="urn:schemas-microsoft-com:office:office" xmlns:oel="http://schemas.microsoft.com/office/2019/extlst" xmlns:r="http://schemas.openxmlformats.org/officeDocument/2006/relationships" xmlns:m="http://schemas.openxmlformats.org/officeDocument/2006/math" xmlns:v="urn:schemas-microsoft-com:vml" xmlns:wp14="http://schemas.microsoft.com/office/word/2010/wordprocessingDrawing" xmlns:wp="http://schemas.openxmlformats.org/drawingml/2006/wordprocessingDrawing" xmlns:w10="urn:schemas-microsoft-com:office:word" xmlns:w="http://schemas.openxmlformats.org/wordprocessingml/2006/main" xmlns:w14="http://schemas.microsoft.com/office/word/2010/wordml" xmlns:w15="http://schemas.microsoft.com/office/word/2012/wordml" xmlns:w16cex="http://schemas.microsoft.com/office/word/2018/wordml/cex" xmlns:w16cid="http://schemas.microsoft.com/office/word/2016/wordml/cid" xmlns:w16="http://schemas.microsoft.com/office/word/2018/wordml" xmlns:w16du="http://schemas.microsoft.com/office/word/2023/wordml/word16du" xmlns:w16sdtdh="http://schemas.microsoft.com/office/word/2020/wordml/sdtdatahash" xmlns:w16sdtfl="http://schemas.microsoft.com/office/word/2024/wordml/sdtformatlock" xmlns:w16se="http://schemas.microsoft.com/office/word/2015/wordml/symex" xmlns:wpg="http://schemas.microsoft.com/office/word/2010/wordprocessingGroup" xmlns:wpi="http://schemas.microsoft.com/office/word/2010/wordprocessingInk" xmlns:wne="http://schemas.microsoft.com/office/word/2006/wordml" xmlns:wps="http://schemas.microsoft.com/office/word/2010/wordprocessingShape" mc:Ignorable="w14 w15 w16se w16cid w16 w16cex w16sdtdh w16sdtfl w16du wp14">
   <w:abstractNum w:abstractNumId="0" w15:restartNumberingAfterBreak="0">
-    <w:nsid w:val="07D411B8"/>
+    <w:nsid w:val="02DB34C5"/>
     <w:multiLevelType w:val="hybridMultilevel"/>
-    <w:tmpl w:val="F81A864A"/>
-    <w:lvl w:ilvl="0" w:tplc="3F90C98A">
+    <w:tmpl w:val="4CD6FF62"/>
+    <w:lvl w:ilvl="0" w:tplc="08DEAD40" w:tentative="1">
+      <w:start w:val="1"/>
+      <w:numFmt w:val="decimal"/>
+      <w:lvlText w:val="%1."/>
+      <w:lvlJc w:val="left"/>
+      <w:pPr>
+        <w:ind w:left="720" w:hanging="360"/>
+      </w:pPr>
+    </w:lvl>
+    <w:lvl w:ilvl="1" w:tplc="1832B5F2">
+      <w:numFmt w:val="decimal"/>
+      <w:lvlText w:val=""/>
+      <w:lvlJc w:val="left"/>
+    </w:lvl>
+    <w:lvl w:ilvl="2" w:tplc="A49ECDD4">
+      <w:numFmt w:val="decimal"/>
+      <w:lvlText w:val=""/>
+      <w:lvlJc w:val="left"/>
+    </w:lvl>
+    <w:lvl w:ilvl="3" w:tplc="FBACB6D6">
+      <w:numFmt w:val="decimal"/>
+      <w:lvlText w:val=""/>
+      <w:lvlJc w:val="left"/>
+    </w:lvl>
+    <w:lvl w:ilvl="4" w:tplc="A7DC37F6">
+      <w:numFmt w:val="decimal"/>
+      <w:lvlText w:val=""/>
+      <w:lvlJc w:val="left"/>
+    </w:lvl>
+    <w:lvl w:ilvl="5" w:tplc="39F265D8">
+      <w:numFmt w:val="decimal"/>
+      <w:lvlText w:val=""/>
+      <w:lvlJc w:val="left"/>
+    </w:lvl>
+    <w:lvl w:ilvl="6" w:tplc="7C7414DE">
+      <w:numFmt w:val="decimal"/>
+      <w:lvlText w:val=""/>
+      <w:lvlJc w:val="left"/>
+    </w:lvl>
+    <w:lvl w:ilvl="7" w:tplc="CF06A948">
+      <w:numFmt w:val="decimal"/>
+      <w:lvlText w:val=""/>
+      <w:lvlJc w:val="left"/>
+    </w:lvl>
+    <w:lvl w:ilvl="8" w:tplc="CC0C8E6C">
+      <w:numFmt w:val="decimal"/>
+      <w:lvlText w:val=""/>
+      <w:lvlJc w:val="left"/>
+    </w:lvl>
+  </w:abstractNum>
+  <w:abstractNum w:abstractNumId="1" w15:restartNumberingAfterBreak="0">
+    <w:nsid w:val="16E32C49"/>
+    <w:multiLevelType w:val="hybridMultilevel"/>
+    <w:tmpl w:val="2D662A28"/>
+    <w:lvl w:ilvl="0" w:tplc="88EAFE1A">
       <w:start w:val="1"/>
       <w:numFmt w:val="bullet"/>
       <w:lvlText w:val="•"/>
@@ -32409,7 +32463,7 @@
         <w:ind w:left="720" w:hanging="360"/>
       </w:pPr>
     </w:lvl>
-    <w:lvl w:ilvl="1" w:tplc="44C6C3B6" w:tentative="1">
+    <w:lvl w:ilvl="1" w:tplc="AEC8AE88" w:tentative="1">
       <w:start w:val="1"/>
       <w:numFmt w:val="bullet"/>
       <w:lvlText w:val="◦"/>
@@ -32418,47 +32472,47 @@
         <w:ind w:left="1440" w:hanging="360"/>
       </w:pPr>
     </w:lvl>
-    <w:lvl w:ilvl="2" w:tplc="9448F48C">
+    <w:lvl w:ilvl="2" w:tplc="41A49A94">
       <w:numFmt w:val="decimal"/>
       <w:lvlText w:val=""/>
       <w:lvlJc w:val="left"/>
     </w:lvl>
-    <w:lvl w:ilvl="3" w:tplc="6998705A">
+    <w:lvl w:ilvl="3" w:tplc="C142A340">
       <w:numFmt w:val="decimal"/>
       <w:lvlText w:val=""/>
       <w:lvlJc w:val="left"/>
     </w:lvl>
-    <w:lvl w:ilvl="4" w:tplc="B31A876E">
+    <w:lvl w:ilvl="4" w:tplc="65FE46CA">
       <w:numFmt w:val="decimal"/>
       <w:lvlText w:val=""/>
       <w:lvlJc w:val="left"/>
     </w:lvl>
-    <w:lvl w:ilvl="5" w:tplc="1A1606B6">
+    <w:lvl w:ilvl="5" w:tplc="201AC66C">
       <w:numFmt w:val="decimal"/>
       <w:lvlText w:val=""/>
       <w:lvlJc w:val="left"/>
     </w:lvl>
-    <w:lvl w:ilvl="6" w:tplc="EEB40756">
+    <w:lvl w:ilvl="6" w:tplc="A4A4CCC8">
       <w:numFmt w:val="decimal"/>
       <w:lvlText w:val=""/>
       <w:lvlJc w:val="left"/>
     </w:lvl>
-    <w:lvl w:ilvl="7" w:tplc="B498A4FE">
+    <w:lvl w:ilvl="7" w:tplc="C2108CCA">
       <w:numFmt w:val="decimal"/>
       <w:lvlText w:val=""/>
       <w:lvlJc w:val="left"/>
     </w:lvl>
-    <w:lvl w:ilvl="8" w:tplc="4F0012C0">
+    <w:lvl w:ilvl="8" w:tplc="9BB284E4">
       <w:numFmt w:val="decimal"/>
       <w:lvlText w:val=""/>
       <w:lvlJc w:val="left"/>
     </w:lvl>
   </w:abstractNum>
-  <w:abstractNum w:abstractNumId="1" w15:restartNumberingAfterBreak="0">
-    <w:nsid w:val="1C191E52"/>
+  <w:abstractNum w:abstractNumId="2" w15:restartNumberingAfterBreak="0">
+    <w:nsid w:val="2489465E"/>
     <w:multiLevelType w:val="hybridMultilevel"/>
-    <w:tmpl w:val="9D8CA542"/>
-    <w:lvl w:ilvl="0" w:tplc="658AD8FC" w:tentative="1">
+    <w:tmpl w:val="BA7E28E6"/>
+    <w:lvl w:ilvl="0" w:tplc="5002BDF4" w:tentative="1">
       <w:start w:val="1"/>
       <w:numFmt w:val="bullet"/>
       <w:lvlText w:val="●"/>
@@ -32467,7 +32521,7 @@
         <w:ind w:left="720" w:hanging="360"/>
       </w:pPr>
     </w:lvl>
-    <w:lvl w:ilvl="1" w:tplc="C15A120A" w:tentative="1">
+    <w:lvl w:ilvl="1" w:tplc="BB568850" w:tentative="1">
       <w:start w:val="1"/>
       <w:numFmt w:val="bullet"/>
       <w:lvlText w:val="○"/>
@@ -32476,7 +32530,7 @@
         <w:ind w:left="1440" w:hanging="360"/>
       </w:pPr>
     </w:lvl>
-    <w:lvl w:ilvl="2" w:tplc="6788291E" w:tentative="1">
+    <w:lvl w:ilvl="2" w:tplc="DE8C3A36" w:tentative="1">
       <w:start w:val="1"/>
       <w:numFmt w:val="bullet"/>
       <w:lvlText w:val="■"/>
@@ -32485,7 +32539,7 @@
         <w:ind w:left="2160" w:hanging="360"/>
       </w:pPr>
     </w:lvl>
-    <w:lvl w:ilvl="3" w:tplc="CBCCCA3C" w:tentative="1">
+    <w:lvl w:ilvl="3" w:tplc="76644E76" w:tentative="1">
       <w:start w:val="1"/>
       <w:numFmt w:val="bullet"/>
       <w:lvlText w:val="●"/>
@@ -32494,7 +32548,7 @@
         <w:ind w:left="2880" w:hanging="360"/>
       </w:pPr>
     </w:lvl>
-    <w:lvl w:ilvl="4" w:tplc="07E4244A" w:tentative="1">
+    <w:lvl w:ilvl="4" w:tplc="6B38C620" w:tentative="1">
       <w:start w:val="1"/>
       <w:numFmt w:val="bullet"/>
       <w:lvlText w:val="○"/>
@@ -32503,7 +32557,7 @@
         <w:ind w:left="3600" w:hanging="360"/>
       </w:pPr>
     </w:lvl>
-    <w:lvl w:ilvl="5" w:tplc="AB929E10" w:tentative="1">
+    <w:lvl w:ilvl="5" w:tplc="473E7B94" w:tentative="1">
       <w:start w:val="1"/>
       <w:numFmt w:val="bullet"/>
       <w:lvlText w:val="■"/>
@@ -32512,7 +32566,7 @@
         <w:ind w:left="4320" w:hanging="360"/>
       </w:pPr>
     </w:lvl>
-    <w:lvl w:ilvl="6" w:tplc="7A90792A" w:tentative="1">
+    <w:lvl w:ilvl="6" w:tplc="4762E258" w:tentative="1">
       <w:start w:val="1"/>
       <w:numFmt w:val="bullet"/>
       <w:lvlText w:val="●"/>
@@ -32521,7 +32575,7 @@
         <w:ind w:left="5040" w:hanging="360"/>
       </w:pPr>
     </w:lvl>
-    <w:lvl w:ilvl="7" w:tplc="CB2E21CC" w:tentative="1">
+    <w:lvl w:ilvl="7" w:tplc="0E6CA664" w:tentative="1">
       <w:start w:val="1"/>
       <w:numFmt w:val="bullet"/>
       <w:lvlText w:val="●"/>
@@ -32530,7 +32584,7 @@
         <w:ind w:left="5760" w:hanging="360"/>
       </w:pPr>
     </w:lvl>
-    <w:lvl w:ilvl="8" w:tplc="FDC61940" w:tentative="1">
+    <w:lvl w:ilvl="8" w:tplc="F618B382" w:tentative="1">
       <w:start w:val="1"/>
       <w:numFmt w:val="bullet"/>
       <w:lvlText w:val="●"/>
@@ -32540,11 +32594,11 @@
       </w:pPr>
     </w:lvl>
   </w:abstractNum>
-  <w:abstractNum w:abstractNumId="2" w15:restartNumberingAfterBreak="0">
-    <w:nsid w:val="55C950C6"/>
+  <w:abstractNum w:abstractNumId="3" w15:restartNumberingAfterBreak="0">
+    <w:nsid w:val="5D142131"/>
     <w:multiLevelType w:val="hybridMultilevel"/>
-    <w:tmpl w:val="1406A034"/>
-    <w:lvl w:ilvl="0" w:tplc="65CE239E" w:tentative="1">
+    <w:tmpl w:val="0FFC9D6E"/>
+    <w:lvl w:ilvl="0" w:tplc="FD5EB268" w:tentative="1">
       <w:start w:val="1"/>
       <w:numFmt w:val="decimal"/>
       <w:lvlText w:val="%1."/>
@@ -32553,109 +32607,55 @@
         <w:ind w:left="720" w:hanging="360"/>
       </w:pPr>
     </w:lvl>
-    <w:lvl w:ilvl="1" w:tplc="D8EA491C">
+    <w:lvl w:ilvl="1" w:tplc="C486BA24">
       <w:numFmt w:val="decimal"/>
       <w:lvlText w:val=""/>
       <w:lvlJc w:val="left"/>
     </w:lvl>
-    <w:lvl w:ilvl="2" w:tplc="4606A7D8">
+    <w:lvl w:ilvl="2" w:tplc="72E2CF50">
       <w:numFmt w:val="decimal"/>
       <w:lvlText w:val=""/>
       <w:lvlJc w:val="left"/>
     </w:lvl>
-    <w:lvl w:ilvl="3" w:tplc="83EC66FA">
+    <w:lvl w:ilvl="3" w:tplc="E9306CF8">
       <w:numFmt w:val="decimal"/>
       <w:lvlText w:val=""/>
       <w:lvlJc w:val="left"/>
     </w:lvl>
-    <w:lvl w:ilvl="4" w:tplc="E3560C5E">
+    <w:lvl w:ilvl="4" w:tplc="D7BCC56A">
       <w:numFmt w:val="decimal"/>
       <w:lvlText w:val=""/>
       <w:lvlJc w:val="left"/>
     </w:lvl>
-    <w:lvl w:ilvl="5" w:tplc="F4E45866">
+    <w:lvl w:ilvl="5" w:tplc="2AAEBA1C">
       <w:numFmt w:val="decimal"/>
       <w:lvlText w:val=""/>
       <w:lvlJc w:val="left"/>
     </w:lvl>
-    <w:lvl w:ilvl="6" w:tplc="D4D4534A">
+    <w:lvl w:ilvl="6" w:tplc="6504D6D4">
       <w:numFmt w:val="decimal"/>
       <w:lvlText w:val=""/>
       <w:lvlJc w:val="left"/>
     </w:lvl>
-    <w:lvl w:ilvl="7" w:tplc="C36A68A0">
+    <w:lvl w:ilvl="7" w:tplc="1130D500">
       <w:numFmt w:val="decimal"/>
       <w:lvlText w:val=""/>
       <w:lvlJc w:val="left"/>
     </w:lvl>
-    <w:lvl w:ilvl="8" w:tplc="1A743478">
+    <w:lvl w:ilvl="8" w:tplc="0B8A2114">
       <w:numFmt w:val="decimal"/>
       <w:lvlText w:val=""/>
       <w:lvlJc w:val="left"/>
     </w:lvl>
   </w:abstractNum>
-  <w:abstractNum w:abstractNumId="3" w15:restartNumberingAfterBreak="0">
-    <w:nsid w:val="5F992B6E"/>
-    <w:multiLevelType w:val="hybridMultilevel"/>
-    <w:tmpl w:val="941804B4"/>
-    <w:lvl w:ilvl="0" w:tplc="EA24020C" w:tentative="1">
-      <w:start w:val="1"/>
-      <w:numFmt w:val="decimal"/>
-      <w:lvlText w:val="%1."/>
-      <w:lvlJc w:val="left"/>
-      <w:pPr>
-        <w:ind w:left="720" w:hanging="360"/>
-      </w:pPr>
-    </w:lvl>
-    <w:lvl w:ilvl="1" w:tplc="DC88F8F4">
-      <w:numFmt w:val="decimal"/>
-      <w:lvlText w:val=""/>
-      <w:lvlJc w:val="left"/>
-    </w:lvl>
-    <w:lvl w:ilvl="2" w:tplc="3F68E62C">
-      <w:numFmt w:val="decimal"/>
-      <w:lvlText w:val=""/>
-      <w:lvlJc w:val="left"/>
-    </w:lvl>
-    <w:lvl w:ilvl="3" w:tplc="D9122B86">
-      <w:numFmt w:val="decimal"/>
-      <w:lvlText w:val=""/>
-      <w:lvlJc w:val="left"/>
-    </w:lvl>
-    <w:lvl w:ilvl="4" w:tplc="26A63A4E">
-      <w:numFmt w:val="decimal"/>
-      <w:lvlText w:val=""/>
-      <w:lvlJc w:val="left"/>
-    </w:lvl>
-    <w:lvl w:ilvl="5" w:tplc="41640B22">
-      <w:numFmt w:val="decimal"/>
-      <w:lvlText w:val=""/>
-      <w:lvlJc w:val="left"/>
-    </w:lvl>
-    <w:lvl w:ilvl="6" w:tplc="5AEA4FB4">
-      <w:numFmt w:val="decimal"/>
-      <w:lvlText w:val=""/>
-      <w:lvlJc w:val="left"/>
-    </w:lvl>
-    <w:lvl w:ilvl="7" w:tplc="1DF00096">
-      <w:numFmt w:val="decimal"/>
-      <w:lvlText w:val=""/>
-      <w:lvlJc w:val="left"/>
-    </w:lvl>
-    <w:lvl w:ilvl="8" w:tplc="DE16AE42">
-      <w:numFmt w:val="decimal"/>
-      <w:lvlText w:val=""/>
-      <w:lvlJc w:val="left"/>
-    </w:lvl>
-  </w:abstractNum>
-  <w:num w:numId="1" w16cid:durableId="529563062">
-    <w:abstractNumId w:val="1"/>
+  <w:num w:numId="1" w16cid:durableId="153300953">
+    <w:abstractNumId w:val="2"/>
     <w:lvlOverride w:ilvl="0">
       <w:startOverride w:val="1"/>
     </w:lvlOverride>
   </w:num>
-  <w:num w:numId="2" w16cid:durableId="1125662117">
-    <w:abstractNumId w:val="0"/>
+  <w:num w:numId="2" w16cid:durableId="1211960509">
+    <w:abstractNumId w:val="1"/>
     <w:lvlOverride w:ilvl="0">
       <w:startOverride w:val="1"/>
     </w:lvlOverride>
@@ -33300,7 +33300,7 @@
     <w:autoRedefine/>
     <w:uiPriority w:val="39"/>
     <w:unhideWhenUsed/>
-    <w:rsid w:val="00E44D32"/>
+    <w:rsid w:val="00D95A99"/>
     <w:pPr>
       <w:spacing w:after="100"/>
     </w:pPr>
@@ -33312,7 +33312,7 @@
     <w:autoRedefine/>
     <w:uiPriority w:val="39"/>
     <w:unhideWhenUsed/>
-    <w:rsid w:val="00E44D32"/>
+    <w:rsid w:val="00D95A99"/>
     <w:pPr>
       <w:spacing w:after="100"/>
       <w:ind w:left="220"/>

</xml_diff>

<commit_message>
Admin paneli manuel koşum sonuçları eklendi; SCRUM-257..269 bug kayıtları
Test case dosyası, Test Planı v1.1 (Test Özet Raporu) ve Xray execution
sonuç dosyası güncellendi.

Co-Authored-By: Claude Opus 5.5 <noreply@anthropic.com>
</commit_message>
<xml_diff>
--- a/docs/Snack_Attack_Test_Plani.docx
+++ b/docs/Snack_Attack_Test_Plani.docx
@@ -615,7 +615,7 @@
       <w:pPr>
         <w:pStyle w:val="Balk1"/>
       </w:pPr>
-      <w:bookmarkStart w:id="0" w:name="_Toc242540435"/>
+      <w:bookmarkStart w:id="0" w:name="_Toc242922273"/>
       <w:r>
         <w:t>Revizyon Geçmişi</w:t>
       </w:r>
@@ -875,6 +875,116 @@
           </w:p>
         </w:tc>
       </w:tr>
+      <w:tr>
+        <w:tc>
+          <w:tcPr>
+            <w:tcW w:w="1200" w:type="dxa"/>
+            <w:tcBorders>
+              <w:top w:val="single" w:sz="4" w:space="0" w:color="8EA9DB"/>
+              <w:left w:val="single" w:sz="4" w:space="0" w:color="8EA9DB"/>
+              <w:bottom w:val="single" w:sz="4" w:space="0" w:color="8EA9DB"/>
+              <w:right w:val="single" w:sz="4" w:space="0" w:color="8EA9DB"/>
+            </w:tcBorders>
+            <w:tcMar>
+              <w:top w:w="60" w:type="dxa"/>
+              <w:left w:w="100" w:type="dxa"/>
+              <w:bottom w:w="60" w:type="dxa"/>
+              <w:right w:w="100" w:type="dxa"/>
+            </w:tcMar>
+            <w:vAlign w:val="center"/>
+          </w:tcPr>
+          <w:p>
+            <w:r>
+              <w:rPr>
+                <w:sz w:val="19"/>
+                <w:szCs w:val="19"/>
+              </w:rPr>
+              <w:t>1.1</w:t>
+            </w:r>
+          </w:p>
+        </w:tc>
+        <w:tc>
+          <w:tcPr>
+            <w:tcW w:w="1600" w:type="dxa"/>
+            <w:tcBorders>
+              <w:top w:val="single" w:sz="4" w:space="0" w:color="8EA9DB"/>
+              <w:left w:val="single" w:sz="4" w:space="0" w:color="8EA9DB"/>
+              <w:bottom w:val="single" w:sz="4" w:space="0" w:color="8EA9DB"/>
+              <w:right w:val="single" w:sz="4" w:space="0" w:color="8EA9DB"/>
+            </w:tcBorders>
+            <w:tcMar>
+              <w:top w:w="60" w:type="dxa"/>
+              <w:left w:w="100" w:type="dxa"/>
+              <w:bottom w:w="60" w:type="dxa"/>
+              <w:right w:w="100" w:type="dxa"/>
+            </w:tcMar>
+            <w:vAlign w:val="center"/>
+          </w:tcPr>
+          <w:p>
+            <w:r>
+              <w:rPr>
+                <w:sz w:val="19"/>
+                <w:szCs w:val="19"/>
+              </w:rPr>
+              <w:t>15.10.2026</w:t>
+            </w:r>
+          </w:p>
+        </w:tc>
+        <w:tc>
+          <w:tcPr>
+            <w:tcW w:w="2600" w:type="dxa"/>
+            <w:tcBorders>
+              <w:top w:val="single" w:sz="4" w:space="0" w:color="8EA9DB"/>
+              <w:left w:val="single" w:sz="4" w:space="0" w:color="8EA9DB"/>
+              <w:bottom w:val="single" w:sz="4" w:space="0" w:color="8EA9DB"/>
+              <w:right w:val="single" w:sz="4" w:space="0" w:color="8EA9DB"/>
+            </w:tcBorders>
+            <w:tcMar>
+              <w:top w:w="60" w:type="dxa"/>
+              <w:left w:w="100" w:type="dxa"/>
+              <w:bottom w:w="60" w:type="dxa"/>
+              <w:right w:w="100" w:type="dxa"/>
+            </w:tcMar>
+            <w:vAlign w:val="center"/>
+          </w:tcPr>
+          <w:p>
+            <w:r>
+              <w:rPr>
+                <w:sz w:val="19"/>
+                <w:szCs w:val="19"/>
+              </w:rPr>
+              <w:t>Yıldıray Kösedağ</w:t>
+            </w:r>
+          </w:p>
+        </w:tc>
+        <w:tc>
+          <w:tcPr>
+            <w:tcW w:w="4238" w:type="dxa"/>
+            <w:tcBorders>
+              <w:top w:val="single" w:sz="4" w:space="0" w:color="8EA9DB"/>
+              <w:left w:val="single" w:sz="4" w:space="0" w:color="8EA9DB"/>
+              <w:bottom w:val="single" w:sz="4" w:space="0" w:color="8EA9DB"/>
+              <w:right w:val="single" w:sz="4" w:space="0" w:color="8EA9DB"/>
+            </w:tcBorders>
+            <w:tcMar>
+              <w:top w:w="60" w:type="dxa"/>
+              <w:left w:w="100" w:type="dxa"/>
+              <w:bottom w:w="60" w:type="dxa"/>
+              <w:right w:w="100" w:type="dxa"/>
+            </w:tcMar>
+            <w:vAlign w:val="center"/>
+          </w:tcPr>
+          <w:p>
+            <w:r>
+              <w:rPr>
+                <w:sz w:val="19"/>
+                <w:szCs w:val="19"/>
+              </w:rPr>
+              <w:t>Admin hesabı ile admin paneli test case’leri koşuldu; Test Özet Raporu ve bug listesi (SCRUM-257 – 269) güncellendi.</w:t>
+            </w:r>
+          </w:p>
+        </w:tc>
+      </w:tr>
     </w:tbl>
     <w:p>
       <w:pPr>
@@ -885,7 +995,7 @@
       <w:pPr>
         <w:pStyle w:val="Balk1"/>
       </w:pPr>
-      <w:bookmarkStart w:id="1" w:name="_Toc242540436"/>
+      <w:bookmarkStart w:id="1" w:name="_Toc242922274"/>
       <w:r>
         <w:t>İçindekiler</w:t>
       </w:r>
@@ -894,7 +1004,7 @@
     <w:sdt>
       <w:sdtPr>
         <w:alias w:val="İçindekiler"/>
-        <w:id w:val="-537049328"/>
+        <w:id w:val="-579368062"/>
       </w:sdtPr>
       <w:sdtEndPr/>
       <w:sdtContent>
@@ -917,7 +1027,7 @@
           <w:r>
             <w:fldChar w:fldCharType="separate"/>
           </w:r>
-          <w:hyperlink w:anchor="_Toc242540435" w:history="1">
+          <w:hyperlink w:anchor="_Toc242922273" w:history="1">
             <w:r>
               <w:rPr>
                 <w:rStyle w:val="Kpr"/>
@@ -941,7 +1051,7 @@
               <w:rPr>
                 <w:noProof/>
               </w:rPr>
-              <w:instrText xml:space="preserve"> PAGEREF _Toc242540435 \h </w:instrText>
+              <w:instrText xml:space="preserve"> PAGEREF _Toc242922273 \h </w:instrText>
             </w:r>
             <w:r>
               <w:rPr>
@@ -978,7 +1088,7 @@
               <w:noProof/>
             </w:rPr>
           </w:pPr>
-          <w:hyperlink w:anchor="_Toc242540436" w:history="1">
+          <w:hyperlink w:anchor="_Toc242922274" w:history="1">
             <w:r>
               <w:rPr>
                 <w:rStyle w:val="Kpr"/>
@@ -1002,7 +1112,7 @@
               <w:rPr>
                 <w:noProof/>
               </w:rPr>
-              <w:instrText xml:space="preserve"> PAGEREF _Toc242540436 \h </w:instrText>
+              <w:instrText xml:space="preserve"> PAGEREF _Toc242922274 \h </w:instrText>
             </w:r>
             <w:r>
               <w:rPr>
@@ -1039,7 +1149,7 @@
               <w:noProof/>
             </w:rPr>
           </w:pPr>
-          <w:hyperlink w:anchor="_Toc242540437" w:history="1">
+          <w:hyperlink w:anchor="_Toc242922275" w:history="1">
             <w:r>
               <w:rPr>
                 <w:rStyle w:val="Kpr"/>
@@ -1063,7 +1173,7 @@
               <w:rPr>
                 <w:noProof/>
               </w:rPr>
-              <w:instrText xml:space="preserve"> PAGEREF _Toc242540437 \h </w:instrText>
+              <w:instrText xml:space="preserve"> PAGEREF _Toc242922275 \h </w:instrText>
             </w:r>
             <w:r>
               <w:rPr>
@@ -1100,7 +1210,7 @@
               <w:noProof/>
             </w:rPr>
           </w:pPr>
-          <w:hyperlink w:anchor="_Toc242540438" w:history="1">
+          <w:hyperlink w:anchor="_Toc242922276" w:history="1">
             <w:r>
               <w:rPr>
                 <w:rStyle w:val="Kpr"/>
@@ -1124,7 +1234,7 @@
               <w:rPr>
                 <w:noProof/>
               </w:rPr>
-              <w:instrText xml:space="preserve"> PAGEREF _Toc242540438 \h </w:instrText>
+              <w:instrText xml:space="preserve"> PAGEREF _Toc242922276 \h </w:instrText>
             </w:r>
             <w:r>
               <w:rPr>
@@ -1161,7 +1271,7 @@
               <w:noProof/>
             </w:rPr>
           </w:pPr>
-          <w:hyperlink w:anchor="_Toc242540439" w:history="1">
+          <w:hyperlink w:anchor="_Toc242922277" w:history="1">
             <w:r>
               <w:rPr>
                 <w:rStyle w:val="Kpr"/>
@@ -1185,7 +1295,7 @@
               <w:rPr>
                 <w:noProof/>
               </w:rPr>
-              <w:instrText xml:space="preserve"> PAGEREF _Toc242540439 \h </w:instrText>
+              <w:instrText xml:space="preserve"> PAGEREF _Toc242922277 \h </w:instrText>
             </w:r>
             <w:r>
               <w:rPr>
@@ -1222,7 +1332,7 @@
               <w:noProof/>
             </w:rPr>
           </w:pPr>
-          <w:hyperlink w:anchor="_Toc242540440" w:history="1">
+          <w:hyperlink w:anchor="_Toc242922278" w:history="1">
             <w:r>
               <w:rPr>
                 <w:rStyle w:val="Kpr"/>
@@ -1246,7 +1356,7 @@
               <w:rPr>
                 <w:noProof/>
               </w:rPr>
-              <w:instrText xml:space="preserve"> PAGEREF _Toc242540440 \h </w:instrText>
+              <w:instrText xml:space="preserve"> PAGEREF _Toc242922278 \h </w:instrText>
             </w:r>
             <w:r>
               <w:rPr>
@@ -1283,7 +1393,7 @@
               <w:noProof/>
             </w:rPr>
           </w:pPr>
-          <w:hyperlink w:anchor="_Toc242540441" w:history="1">
+          <w:hyperlink w:anchor="_Toc242922279" w:history="1">
             <w:r>
               <w:rPr>
                 <w:rStyle w:val="Kpr"/>
@@ -1307,7 +1417,7 @@
               <w:rPr>
                 <w:noProof/>
               </w:rPr>
-              <w:instrText xml:space="preserve"> PAGEREF _Toc242540441 \h </w:instrText>
+              <w:instrText xml:space="preserve"> PAGEREF _Toc242922279 \h </w:instrText>
             </w:r>
             <w:r>
               <w:rPr>
@@ -1344,7 +1454,7 @@
               <w:noProof/>
             </w:rPr>
           </w:pPr>
-          <w:hyperlink w:anchor="_Toc242540442" w:history="1">
+          <w:hyperlink w:anchor="_Toc242922280" w:history="1">
             <w:r>
               <w:rPr>
                 <w:rStyle w:val="Kpr"/>
@@ -1368,7 +1478,7 @@
               <w:rPr>
                 <w:noProof/>
               </w:rPr>
-              <w:instrText xml:space="preserve"> PAGEREF _Toc242540442 \h </w:instrText>
+              <w:instrText xml:space="preserve"> PAGEREF _Toc242922280 \h </w:instrText>
             </w:r>
             <w:r>
               <w:rPr>
@@ -1405,7 +1515,7 @@
               <w:noProof/>
             </w:rPr>
           </w:pPr>
-          <w:hyperlink w:anchor="_Toc242540443" w:history="1">
+          <w:hyperlink w:anchor="_Toc242922281" w:history="1">
             <w:r>
               <w:rPr>
                 <w:rStyle w:val="Kpr"/>
@@ -1429,7 +1539,7 @@
               <w:rPr>
                 <w:noProof/>
               </w:rPr>
-              <w:instrText xml:space="preserve"> PAGEREF _Toc242540443 \h </w:instrText>
+              <w:instrText xml:space="preserve"> PAGEREF _Toc242922281 \h </w:instrText>
             </w:r>
             <w:r>
               <w:rPr>
@@ -1466,7 +1576,7 @@
               <w:noProof/>
             </w:rPr>
           </w:pPr>
-          <w:hyperlink w:anchor="_Toc242540444" w:history="1">
+          <w:hyperlink w:anchor="_Toc242922282" w:history="1">
             <w:r>
               <w:rPr>
                 <w:rStyle w:val="Kpr"/>
@@ -1490,7 +1600,7 @@
               <w:rPr>
                 <w:noProof/>
               </w:rPr>
-              <w:instrText xml:space="preserve"> PAGEREF _Toc242540444 \h </w:instrText>
+              <w:instrText xml:space="preserve"> PAGEREF _Toc242922282 \h </w:instrText>
             </w:r>
             <w:r>
               <w:rPr>
@@ -1527,7 +1637,7 @@
               <w:noProof/>
             </w:rPr>
           </w:pPr>
-          <w:hyperlink w:anchor="_Toc242540445" w:history="1">
+          <w:hyperlink w:anchor="_Toc242922283" w:history="1">
             <w:r>
               <w:rPr>
                 <w:rStyle w:val="Kpr"/>
@@ -1551,7 +1661,7 @@
               <w:rPr>
                 <w:noProof/>
               </w:rPr>
-              <w:instrText xml:space="preserve"> PAGEREF _Toc242540445 \h </w:instrText>
+              <w:instrText xml:space="preserve"> PAGEREF _Toc242922283 \h </w:instrText>
             </w:r>
             <w:r>
               <w:rPr>
@@ -1588,7 +1698,7 @@
               <w:noProof/>
             </w:rPr>
           </w:pPr>
-          <w:hyperlink w:anchor="_Toc242540446" w:history="1">
+          <w:hyperlink w:anchor="_Toc242922284" w:history="1">
             <w:r>
               <w:rPr>
                 <w:rStyle w:val="Kpr"/>
@@ -1612,7 +1722,7 @@
               <w:rPr>
                 <w:noProof/>
               </w:rPr>
-              <w:instrText xml:space="preserve"> PAGEREF _Toc242540446 \h </w:instrText>
+              <w:instrText xml:space="preserve"> PAGEREF _Toc242922284 \h </w:instrText>
             </w:r>
             <w:r>
               <w:rPr>
@@ -1649,7 +1759,7 @@
               <w:noProof/>
             </w:rPr>
           </w:pPr>
-          <w:hyperlink w:anchor="_Toc242540447" w:history="1">
+          <w:hyperlink w:anchor="_Toc242922285" w:history="1">
             <w:r>
               <w:rPr>
                 <w:rStyle w:val="Kpr"/>
@@ -1673,7 +1783,7 @@
               <w:rPr>
                 <w:noProof/>
               </w:rPr>
-              <w:instrText xml:space="preserve"> PAGEREF _Toc242540447 \h </w:instrText>
+              <w:instrText xml:space="preserve"> PAGEREF _Toc242922285 \h </w:instrText>
             </w:r>
             <w:r>
               <w:rPr>
@@ -1710,7 +1820,7 @@
               <w:noProof/>
             </w:rPr>
           </w:pPr>
-          <w:hyperlink w:anchor="_Toc242540448" w:history="1">
+          <w:hyperlink w:anchor="_Toc242922286" w:history="1">
             <w:r>
               <w:rPr>
                 <w:rStyle w:val="Kpr"/>
@@ -1734,7 +1844,7 @@
               <w:rPr>
                 <w:noProof/>
               </w:rPr>
-              <w:instrText xml:space="preserve"> PAGEREF _Toc242540448 \h </w:instrText>
+              <w:instrText xml:space="preserve"> PAGEREF _Toc242922286 \h </w:instrText>
             </w:r>
             <w:r>
               <w:rPr>
@@ -1771,7 +1881,7 @@
               <w:noProof/>
             </w:rPr>
           </w:pPr>
-          <w:hyperlink w:anchor="_Toc242540449" w:history="1">
+          <w:hyperlink w:anchor="_Toc242922287" w:history="1">
             <w:r>
               <w:rPr>
                 <w:rStyle w:val="Kpr"/>
@@ -1795,7 +1905,7 @@
               <w:rPr>
                 <w:noProof/>
               </w:rPr>
-              <w:instrText xml:space="preserve"> PAGEREF _Toc242540449 \h </w:instrText>
+              <w:instrText xml:space="preserve"> PAGEREF _Toc242922287 \h </w:instrText>
             </w:r>
             <w:r>
               <w:rPr>
@@ -1832,7 +1942,7 @@
               <w:noProof/>
             </w:rPr>
           </w:pPr>
-          <w:hyperlink w:anchor="_Toc242540450" w:history="1">
+          <w:hyperlink w:anchor="_Toc242922288" w:history="1">
             <w:r>
               <w:rPr>
                 <w:rStyle w:val="Kpr"/>
@@ -1856,7 +1966,7 @@
               <w:rPr>
                 <w:noProof/>
               </w:rPr>
-              <w:instrText xml:space="preserve"> PAGEREF _Toc242540450 \h </w:instrText>
+              <w:instrText xml:space="preserve"> PAGEREF _Toc242922288 \h </w:instrText>
             </w:r>
             <w:r>
               <w:rPr>
@@ -1893,7 +2003,7 @@
               <w:noProof/>
             </w:rPr>
           </w:pPr>
-          <w:hyperlink w:anchor="_Toc242540451" w:history="1">
+          <w:hyperlink w:anchor="_Toc242922289" w:history="1">
             <w:r>
               <w:rPr>
                 <w:rStyle w:val="Kpr"/>
@@ -1917,7 +2027,7 @@
               <w:rPr>
                 <w:noProof/>
               </w:rPr>
-              <w:instrText xml:space="preserve"> PAGEREF _Toc242540451 \h </w:instrText>
+              <w:instrText xml:space="preserve"> PAGEREF _Toc242922289 \h </w:instrText>
             </w:r>
             <w:r>
               <w:rPr>
@@ -1954,7 +2064,7 @@
               <w:noProof/>
             </w:rPr>
           </w:pPr>
-          <w:hyperlink w:anchor="_Toc242540452" w:history="1">
+          <w:hyperlink w:anchor="_Toc242922290" w:history="1">
             <w:r>
               <w:rPr>
                 <w:rStyle w:val="Kpr"/>
@@ -1978,7 +2088,7 @@
               <w:rPr>
                 <w:noProof/>
               </w:rPr>
-              <w:instrText xml:space="preserve"> PAGEREF _Toc242540452 \h </w:instrText>
+              <w:instrText xml:space="preserve"> PAGEREF _Toc242922290 \h </w:instrText>
             </w:r>
             <w:r>
               <w:rPr>
@@ -2015,7 +2125,7 @@
               <w:noProof/>
             </w:rPr>
           </w:pPr>
-          <w:hyperlink w:anchor="_Toc242540453" w:history="1">
+          <w:hyperlink w:anchor="_Toc242922291" w:history="1">
             <w:r>
               <w:rPr>
                 <w:rStyle w:val="Kpr"/>
@@ -2039,7 +2149,7 @@
               <w:rPr>
                 <w:noProof/>
               </w:rPr>
-              <w:instrText xml:space="preserve"> PAGEREF _Toc242540453 \h </w:instrText>
+              <w:instrText xml:space="preserve"> PAGEREF _Toc242922291 \h </w:instrText>
             </w:r>
             <w:r>
               <w:rPr>
@@ -2076,7 +2186,7 @@
               <w:noProof/>
             </w:rPr>
           </w:pPr>
-          <w:hyperlink w:anchor="_Toc242540454" w:history="1">
+          <w:hyperlink w:anchor="_Toc242922292" w:history="1">
             <w:r>
               <w:rPr>
                 <w:rStyle w:val="Kpr"/>
@@ -2100,7 +2210,7 @@
               <w:rPr>
                 <w:noProof/>
               </w:rPr>
-              <w:instrText xml:space="preserve"> PAGEREF _Toc242540454 \h </w:instrText>
+              <w:instrText xml:space="preserve"> PAGEREF _Toc242922292 \h </w:instrText>
             </w:r>
             <w:r>
               <w:rPr>
@@ -2137,7 +2247,7 @@
               <w:noProof/>
             </w:rPr>
           </w:pPr>
-          <w:hyperlink w:anchor="_Toc242540455" w:history="1">
+          <w:hyperlink w:anchor="_Toc242922293" w:history="1">
             <w:r>
               <w:rPr>
                 <w:rStyle w:val="Kpr"/>
@@ -2161,7 +2271,7 @@
               <w:rPr>
                 <w:noProof/>
               </w:rPr>
-              <w:instrText xml:space="preserve"> PAGEREF _Toc242540455 \h </w:instrText>
+              <w:instrText xml:space="preserve"> PAGEREF _Toc242922293 \h </w:instrText>
             </w:r>
             <w:r>
               <w:rPr>
@@ -2198,7 +2308,7 @@
               <w:noProof/>
             </w:rPr>
           </w:pPr>
-          <w:hyperlink w:anchor="_Toc242540456" w:history="1">
+          <w:hyperlink w:anchor="_Toc242922294" w:history="1">
             <w:r>
               <w:rPr>
                 <w:rStyle w:val="Kpr"/>
@@ -2222,7 +2332,7 @@
               <w:rPr>
                 <w:noProof/>
               </w:rPr>
-              <w:instrText xml:space="preserve"> PAGEREF _Toc242540456 \h </w:instrText>
+              <w:instrText xml:space="preserve"> PAGEREF _Toc242922294 \h </w:instrText>
             </w:r>
             <w:r>
               <w:rPr>
@@ -2259,7 +2369,7 @@
               <w:noProof/>
             </w:rPr>
           </w:pPr>
-          <w:hyperlink w:anchor="_Toc242540457" w:history="1">
+          <w:hyperlink w:anchor="_Toc242922295" w:history="1">
             <w:r>
               <w:rPr>
                 <w:rStyle w:val="Kpr"/>
@@ -2283,7 +2393,7 @@
               <w:rPr>
                 <w:noProof/>
               </w:rPr>
-              <w:instrText xml:space="preserve"> PAGEREF _Toc242540457 \h </w:instrText>
+              <w:instrText xml:space="preserve"> PAGEREF _Toc242922295 \h </w:instrText>
             </w:r>
             <w:r>
               <w:rPr>
@@ -2320,7 +2430,7 @@
               <w:noProof/>
             </w:rPr>
           </w:pPr>
-          <w:hyperlink w:anchor="_Toc242540458" w:history="1">
+          <w:hyperlink w:anchor="_Toc242922296" w:history="1">
             <w:r>
               <w:rPr>
                 <w:rStyle w:val="Kpr"/>
@@ -2344,7 +2454,7 @@
               <w:rPr>
                 <w:noProof/>
               </w:rPr>
-              <w:instrText xml:space="preserve"> PAGEREF _Toc242540458 \h </w:instrText>
+              <w:instrText xml:space="preserve"> PAGEREF _Toc242922296 \h </w:instrText>
             </w:r>
             <w:r>
               <w:rPr>
@@ -2381,7 +2491,7 @@
               <w:noProof/>
             </w:rPr>
           </w:pPr>
-          <w:hyperlink w:anchor="_Toc242540459" w:history="1">
+          <w:hyperlink w:anchor="_Toc242922297" w:history="1">
             <w:r>
               <w:rPr>
                 <w:rStyle w:val="Kpr"/>
@@ -2405,7 +2515,7 @@
               <w:rPr>
                 <w:noProof/>
               </w:rPr>
-              <w:instrText xml:space="preserve"> PAGEREF _Toc242540459 \h </w:instrText>
+              <w:instrText xml:space="preserve"> PAGEREF _Toc242922297 \h </w:instrText>
             </w:r>
             <w:r>
               <w:rPr>
@@ -2442,7 +2552,7 @@
               <w:noProof/>
             </w:rPr>
           </w:pPr>
-          <w:hyperlink w:anchor="_Toc242540460" w:history="1">
+          <w:hyperlink w:anchor="_Toc242922298" w:history="1">
             <w:r>
               <w:rPr>
                 <w:rStyle w:val="Kpr"/>
@@ -2466,7 +2576,7 @@
               <w:rPr>
                 <w:noProof/>
               </w:rPr>
-              <w:instrText xml:space="preserve"> PAGEREF _Toc242540460 \h </w:instrText>
+              <w:instrText xml:space="preserve"> PAGEREF _Toc242922298 \h </w:instrText>
             </w:r>
             <w:r>
               <w:rPr>
@@ -2503,7 +2613,7 @@
               <w:noProof/>
             </w:rPr>
           </w:pPr>
-          <w:hyperlink w:anchor="_Toc242540461" w:history="1">
+          <w:hyperlink w:anchor="_Toc242922299" w:history="1">
             <w:r>
               <w:rPr>
                 <w:rStyle w:val="Kpr"/>
@@ -2527,7 +2637,7 @@
               <w:rPr>
                 <w:noProof/>
               </w:rPr>
-              <w:instrText xml:space="preserve"> PAGEREF _Toc242540461 \h </w:instrText>
+              <w:instrText xml:space="preserve"> PAGEREF _Toc242922299 \h </w:instrText>
             </w:r>
             <w:r>
               <w:rPr>
@@ -2564,7 +2674,7 @@
               <w:noProof/>
             </w:rPr>
           </w:pPr>
-          <w:hyperlink w:anchor="_Toc242540462" w:history="1">
+          <w:hyperlink w:anchor="_Toc242922300" w:history="1">
             <w:r>
               <w:rPr>
                 <w:rStyle w:val="Kpr"/>
@@ -2588,7 +2698,7 @@
               <w:rPr>
                 <w:noProof/>
               </w:rPr>
-              <w:instrText xml:space="preserve"> PAGEREF _Toc242540462 \h </w:instrText>
+              <w:instrText xml:space="preserve"> PAGEREF _Toc242922300 \h </w:instrText>
             </w:r>
             <w:r>
               <w:rPr>
@@ -2625,7 +2735,7 @@
               <w:noProof/>
             </w:rPr>
           </w:pPr>
-          <w:hyperlink w:anchor="_Toc242540463" w:history="1">
+          <w:hyperlink w:anchor="_Toc242922301" w:history="1">
             <w:r>
               <w:rPr>
                 <w:rStyle w:val="Kpr"/>
@@ -2649,7 +2759,7 @@
               <w:rPr>
                 <w:noProof/>
               </w:rPr>
-              <w:instrText xml:space="preserve"> PAGEREF _Toc242540463 \h </w:instrText>
+              <w:instrText xml:space="preserve"> PAGEREF _Toc242922301 \h </w:instrText>
             </w:r>
             <w:r>
               <w:rPr>
@@ -2686,7 +2796,7 @@
               <w:noProof/>
             </w:rPr>
           </w:pPr>
-          <w:hyperlink w:anchor="_Toc242540464" w:history="1">
+          <w:hyperlink w:anchor="_Toc242922302" w:history="1">
             <w:r>
               <w:rPr>
                 <w:rStyle w:val="Kpr"/>
@@ -2710,7 +2820,7 @@
               <w:rPr>
                 <w:noProof/>
               </w:rPr>
-              <w:instrText xml:space="preserve"> PAGEREF _Toc242540464 \h </w:instrText>
+              <w:instrText xml:space="preserve"> PAGEREF _Toc242922302 \h </w:instrText>
             </w:r>
             <w:r>
               <w:rPr>
@@ -2747,7 +2857,7 @@
               <w:noProof/>
             </w:rPr>
           </w:pPr>
-          <w:hyperlink w:anchor="_Toc242540465" w:history="1">
+          <w:hyperlink w:anchor="_Toc242922303" w:history="1">
             <w:r>
               <w:rPr>
                 <w:rStyle w:val="Kpr"/>
@@ -2771,7 +2881,7 @@
               <w:rPr>
                 <w:noProof/>
               </w:rPr>
-              <w:instrText xml:space="preserve"> PAGEREF _Toc242540465 \h </w:instrText>
+              <w:instrText xml:space="preserve"> PAGEREF _Toc242922303 \h </w:instrText>
             </w:r>
             <w:r>
               <w:rPr>
@@ -2808,7 +2918,7 @@
               <w:noProof/>
             </w:rPr>
           </w:pPr>
-          <w:hyperlink w:anchor="_Toc242540466" w:history="1">
+          <w:hyperlink w:anchor="_Toc242922304" w:history="1">
             <w:r>
               <w:rPr>
                 <w:rStyle w:val="Kpr"/>
@@ -2832,7 +2942,7 @@
               <w:rPr>
                 <w:noProof/>
               </w:rPr>
-              <w:instrText xml:space="preserve"> PAGEREF _Toc242540466 \h </w:instrText>
+              <w:instrText xml:space="preserve"> PAGEREF _Toc242922304 \h </w:instrText>
             </w:r>
             <w:r>
               <w:rPr>
@@ -2869,7 +2979,7 @@
               <w:noProof/>
             </w:rPr>
           </w:pPr>
-          <w:hyperlink w:anchor="_Toc242540467" w:history="1">
+          <w:hyperlink w:anchor="_Toc242922305" w:history="1">
             <w:r>
               <w:rPr>
                 <w:rStyle w:val="Kpr"/>
@@ -2893,7 +3003,7 @@
               <w:rPr>
                 <w:noProof/>
               </w:rPr>
-              <w:instrText xml:space="preserve"> PAGEREF _Toc242540467 \h </w:instrText>
+              <w:instrText xml:space="preserve"> PAGEREF _Toc242922305 \h </w:instrText>
             </w:r>
             <w:r>
               <w:rPr>
@@ -2930,7 +3040,7 @@
               <w:noProof/>
             </w:rPr>
           </w:pPr>
-          <w:hyperlink w:anchor="_Toc242540468" w:history="1">
+          <w:hyperlink w:anchor="_Toc242922306" w:history="1">
             <w:r>
               <w:rPr>
                 <w:rStyle w:val="Kpr"/>
@@ -2954,7 +3064,7 @@
               <w:rPr>
                 <w:noProof/>
               </w:rPr>
-              <w:instrText xml:space="preserve"> PAGEREF _Toc242540468 \h </w:instrText>
+              <w:instrText xml:space="preserve"> PAGEREF _Toc242922306 \h </w:instrText>
             </w:r>
             <w:r>
               <w:rPr>
@@ -2991,7 +3101,7 @@
               <w:noProof/>
             </w:rPr>
           </w:pPr>
-          <w:hyperlink w:anchor="_Toc242540469" w:history="1">
+          <w:hyperlink w:anchor="_Toc242922307" w:history="1">
             <w:r>
               <w:rPr>
                 <w:rStyle w:val="Kpr"/>
@@ -3015,7 +3125,7 @@
               <w:rPr>
                 <w:noProof/>
               </w:rPr>
-              <w:instrText xml:space="preserve"> PAGEREF _Toc242540469 \h </w:instrText>
+              <w:instrText xml:space="preserve"> PAGEREF _Toc242922307 \h </w:instrText>
             </w:r>
             <w:r>
               <w:rPr>
@@ -3052,7 +3162,7 @@
               <w:noProof/>
             </w:rPr>
           </w:pPr>
-          <w:hyperlink w:anchor="_Toc242540470" w:history="1">
+          <w:hyperlink w:anchor="_Toc242922308" w:history="1">
             <w:r>
               <w:rPr>
                 <w:rStyle w:val="Kpr"/>
@@ -3076,7 +3186,7 @@
               <w:rPr>
                 <w:noProof/>
               </w:rPr>
-              <w:instrText xml:space="preserve"> PAGEREF _Toc242540470 \h </w:instrText>
+              <w:instrText xml:space="preserve"> PAGEREF _Toc242922308 \h </w:instrText>
             </w:r>
             <w:r>
               <w:rPr>
@@ -3113,7 +3223,7 @@
               <w:noProof/>
             </w:rPr>
           </w:pPr>
-          <w:hyperlink w:anchor="_Toc242540471" w:history="1">
+          <w:hyperlink w:anchor="_Toc242922309" w:history="1">
             <w:r>
               <w:rPr>
                 <w:rStyle w:val="Kpr"/>
@@ -3137,7 +3247,7 @@
               <w:rPr>
                 <w:noProof/>
               </w:rPr>
-              <w:instrText xml:space="preserve"> PAGEREF _Toc242540471 \h </w:instrText>
+              <w:instrText xml:space="preserve"> PAGEREF _Toc242922309 \h </w:instrText>
             </w:r>
             <w:r>
               <w:rPr>
@@ -3174,7 +3284,7 @@
               <w:noProof/>
             </w:rPr>
           </w:pPr>
-          <w:hyperlink w:anchor="_Toc242540472" w:history="1">
+          <w:hyperlink w:anchor="_Toc242922310" w:history="1">
             <w:r>
               <w:rPr>
                 <w:rStyle w:val="Kpr"/>
@@ -3198,7 +3308,7 @@
               <w:rPr>
                 <w:noProof/>
               </w:rPr>
-              <w:instrText xml:space="preserve"> PAGEREF _Toc242540472 \h </w:instrText>
+              <w:instrText xml:space="preserve"> PAGEREF _Toc242922310 \h </w:instrText>
             </w:r>
             <w:r>
               <w:rPr>
@@ -3235,7 +3345,7 @@
               <w:noProof/>
             </w:rPr>
           </w:pPr>
-          <w:hyperlink w:anchor="_Toc242540473" w:history="1">
+          <w:hyperlink w:anchor="_Toc242922311" w:history="1">
             <w:r>
               <w:rPr>
                 <w:rStyle w:val="Kpr"/>
@@ -3259,7 +3369,7 @@
               <w:rPr>
                 <w:noProof/>
               </w:rPr>
-              <w:instrText xml:space="preserve"> PAGEREF _Toc242540473 \h </w:instrText>
+              <w:instrText xml:space="preserve"> PAGEREF _Toc242922311 \h </w:instrText>
             </w:r>
             <w:r>
               <w:rPr>
@@ -3296,7 +3406,7 @@
               <w:noProof/>
             </w:rPr>
           </w:pPr>
-          <w:hyperlink w:anchor="_Toc242540474" w:history="1">
+          <w:hyperlink w:anchor="_Toc242922312" w:history="1">
             <w:r>
               <w:rPr>
                 <w:rStyle w:val="Kpr"/>
@@ -3320,7 +3430,7 @@
               <w:rPr>
                 <w:noProof/>
               </w:rPr>
-              <w:instrText xml:space="preserve"> PAGEREF _Toc242540474 \h </w:instrText>
+              <w:instrText xml:space="preserve"> PAGEREF _Toc242922312 \h </w:instrText>
             </w:r>
             <w:r>
               <w:rPr>
@@ -3357,7 +3467,7 @@
               <w:noProof/>
             </w:rPr>
           </w:pPr>
-          <w:hyperlink w:anchor="_Toc242540475" w:history="1">
+          <w:hyperlink w:anchor="_Toc242922313" w:history="1">
             <w:r>
               <w:rPr>
                 <w:rStyle w:val="Kpr"/>
@@ -3381,7 +3491,7 @@
               <w:rPr>
                 <w:noProof/>
               </w:rPr>
-              <w:instrText xml:space="preserve"> PAGEREF _Toc242540475 \h </w:instrText>
+              <w:instrText xml:space="preserve"> PAGEREF _Toc242922313 \h </w:instrText>
             </w:r>
             <w:r>
               <w:rPr>
@@ -3418,7 +3528,7 @@
               <w:noProof/>
             </w:rPr>
           </w:pPr>
-          <w:hyperlink w:anchor="_Toc242540476" w:history="1">
+          <w:hyperlink w:anchor="_Toc242922314" w:history="1">
             <w:r>
               <w:rPr>
                 <w:rStyle w:val="Kpr"/>
@@ -3442,7 +3552,7 @@
               <w:rPr>
                 <w:noProof/>
               </w:rPr>
-              <w:instrText xml:space="preserve"> PAGEREF _Toc242540476 \h </w:instrText>
+              <w:instrText xml:space="preserve"> PAGEREF _Toc242922314 \h </w:instrText>
             </w:r>
             <w:r>
               <w:rPr>
@@ -3479,7 +3589,7 @@
               <w:noProof/>
             </w:rPr>
           </w:pPr>
-          <w:hyperlink w:anchor="_Toc242540477" w:history="1">
+          <w:hyperlink w:anchor="_Toc242922315" w:history="1">
             <w:r>
               <w:rPr>
                 <w:rStyle w:val="Kpr"/>
@@ -3503,7 +3613,7 @@
               <w:rPr>
                 <w:noProof/>
               </w:rPr>
-              <w:instrText xml:space="preserve"> PAGEREF _Toc242540477 \h </w:instrText>
+              <w:instrText xml:space="preserve"> PAGEREF _Toc242922315 \h </w:instrText>
             </w:r>
             <w:r>
               <w:rPr>
@@ -3540,7 +3650,7 @@
               <w:noProof/>
             </w:rPr>
           </w:pPr>
-          <w:hyperlink w:anchor="_Toc242540478" w:history="1">
+          <w:hyperlink w:anchor="_Toc242922316" w:history="1">
             <w:r>
               <w:rPr>
                 <w:rStyle w:val="Kpr"/>
@@ -3564,7 +3674,7 @@
               <w:rPr>
                 <w:noProof/>
               </w:rPr>
-              <w:instrText xml:space="preserve"> PAGEREF _Toc242540478 \h </w:instrText>
+              <w:instrText xml:space="preserve"> PAGEREF _Toc242922316 \h </w:instrText>
             </w:r>
             <w:r>
               <w:rPr>
@@ -3601,7 +3711,7 @@
               <w:noProof/>
             </w:rPr>
           </w:pPr>
-          <w:hyperlink w:anchor="_Toc242540479" w:history="1">
+          <w:hyperlink w:anchor="_Toc242922317" w:history="1">
             <w:r>
               <w:rPr>
                 <w:rStyle w:val="Kpr"/>
@@ -3625,7 +3735,7 @@
               <w:rPr>
                 <w:noProof/>
               </w:rPr>
-              <w:instrText xml:space="preserve"> PAGEREF _Toc242540479 \h </w:instrText>
+              <w:instrText xml:space="preserve"> PAGEREF _Toc242922317 \h </w:instrText>
             </w:r>
             <w:r>
               <w:rPr>
@@ -3662,7 +3772,7 @@
               <w:noProof/>
             </w:rPr>
           </w:pPr>
-          <w:hyperlink w:anchor="_Toc242540480" w:history="1">
+          <w:hyperlink w:anchor="_Toc242922318" w:history="1">
             <w:r>
               <w:rPr>
                 <w:rStyle w:val="Kpr"/>
@@ -3686,7 +3796,7 @@
               <w:rPr>
                 <w:noProof/>
               </w:rPr>
-              <w:instrText xml:space="preserve"> PAGEREF _Toc242540480 \h </w:instrText>
+              <w:instrText xml:space="preserve"> PAGEREF _Toc242922318 \h </w:instrText>
             </w:r>
             <w:r>
               <w:rPr>
@@ -3723,7 +3833,7 @@
               <w:noProof/>
             </w:rPr>
           </w:pPr>
-          <w:hyperlink w:anchor="_Toc242540481" w:history="1">
+          <w:hyperlink w:anchor="_Toc242922319" w:history="1">
             <w:r>
               <w:rPr>
                 <w:rStyle w:val="Kpr"/>
@@ -3747,7 +3857,7 @@
               <w:rPr>
                 <w:noProof/>
               </w:rPr>
-              <w:instrText xml:space="preserve"> PAGEREF _Toc242540481 \h </w:instrText>
+              <w:instrText xml:space="preserve"> PAGEREF _Toc242922319 \h </w:instrText>
             </w:r>
             <w:r>
               <w:rPr>
@@ -3764,7 +3874,7 @@
               <w:rPr>
                 <w:noProof/>
               </w:rPr>
-              <w:t>15</w:t>
+              <w:t>14</w:t>
             </w:r>
             <w:r>
               <w:rPr>
@@ -3784,7 +3894,7 @@
               <w:noProof/>
             </w:rPr>
           </w:pPr>
-          <w:hyperlink w:anchor="_Toc242540482" w:history="1">
+          <w:hyperlink w:anchor="_Toc242922320" w:history="1">
             <w:r>
               <w:rPr>
                 <w:rStyle w:val="Kpr"/>
@@ -3808,7 +3918,7 @@
               <w:rPr>
                 <w:noProof/>
               </w:rPr>
-              <w:instrText xml:space="preserve"> PAGEREF _Toc242540482 \h </w:instrText>
+              <w:instrText xml:space="preserve"> PAGEREF _Toc242922320 \h </w:instrText>
             </w:r>
             <w:r>
               <w:rPr>
@@ -3845,7 +3955,7 @@
               <w:noProof/>
             </w:rPr>
           </w:pPr>
-          <w:hyperlink w:anchor="_Toc242540483" w:history="1">
+          <w:hyperlink w:anchor="_Toc242922321" w:history="1">
             <w:r>
               <w:rPr>
                 <w:rStyle w:val="Kpr"/>
@@ -3869,7 +3979,7 @@
               <w:rPr>
                 <w:noProof/>
               </w:rPr>
-              <w:instrText xml:space="preserve"> PAGEREF _Toc242540483 \h </w:instrText>
+              <w:instrText xml:space="preserve"> PAGEREF _Toc242922321 \h </w:instrText>
             </w:r>
             <w:r>
               <w:rPr>
@@ -3906,7 +4016,7 @@
               <w:noProof/>
             </w:rPr>
           </w:pPr>
-          <w:hyperlink w:anchor="_Toc242540484" w:history="1">
+          <w:hyperlink w:anchor="_Toc242922322" w:history="1">
             <w:r>
               <w:rPr>
                 <w:rStyle w:val="Kpr"/>
@@ -3930,7 +4040,7 @@
               <w:rPr>
                 <w:noProof/>
               </w:rPr>
-              <w:instrText xml:space="preserve"> PAGEREF _Toc242540484 \h </w:instrText>
+              <w:instrText xml:space="preserve"> PAGEREF _Toc242922322 \h </w:instrText>
             </w:r>
             <w:r>
               <w:rPr>
@@ -3967,7 +4077,7 @@
               <w:noProof/>
             </w:rPr>
           </w:pPr>
-          <w:hyperlink w:anchor="_Toc242540485" w:history="1">
+          <w:hyperlink w:anchor="_Toc242922323" w:history="1">
             <w:r>
               <w:rPr>
                 <w:rStyle w:val="Kpr"/>
@@ -3991,7 +4101,7 @@
               <w:rPr>
                 <w:noProof/>
               </w:rPr>
-              <w:instrText xml:space="preserve"> PAGEREF _Toc242540485 \h </w:instrText>
+              <w:instrText xml:space="preserve"> PAGEREF _Toc242922323 \h </w:instrText>
             </w:r>
             <w:r>
               <w:rPr>
@@ -4028,7 +4138,7 @@
               <w:noProof/>
             </w:rPr>
           </w:pPr>
-          <w:hyperlink w:anchor="_Toc242540486" w:history="1">
+          <w:hyperlink w:anchor="_Toc242922324" w:history="1">
             <w:r>
               <w:rPr>
                 <w:rStyle w:val="Kpr"/>
@@ -4052,7 +4162,7 @@
               <w:rPr>
                 <w:noProof/>
               </w:rPr>
-              <w:instrText xml:space="preserve"> PAGEREF _Toc242540486 \h </w:instrText>
+              <w:instrText xml:space="preserve"> PAGEREF _Toc242922324 \h </w:instrText>
             </w:r>
             <w:r>
               <w:rPr>
@@ -4089,7 +4199,7 @@
               <w:noProof/>
             </w:rPr>
           </w:pPr>
-          <w:hyperlink w:anchor="_Toc242540487" w:history="1">
+          <w:hyperlink w:anchor="_Toc242922325" w:history="1">
             <w:r>
               <w:rPr>
                 <w:rStyle w:val="Kpr"/>
@@ -4113,7 +4223,7 @@
               <w:rPr>
                 <w:noProof/>
               </w:rPr>
-              <w:instrText xml:space="preserve"> PAGEREF _Toc242540487 \h </w:instrText>
+              <w:instrText xml:space="preserve"> PAGEREF _Toc242922325 \h </w:instrText>
             </w:r>
             <w:r>
               <w:rPr>
@@ -4130,7 +4240,7 @@
               <w:rPr>
                 <w:noProof/>
               </w:rPr>
-              <w:t>17</w:t>
+              <w:t>18</w:t>
             </w:r>
             <w:r>
               <w:rPr>
@@ -4172,7 +4282,7 @@
       <w:pPr>
         <w:pStyle w:val="Balk1"/>
       </w:pPr>
-      <w:bookmarkStart w:id="2" w:name="_Toc242540437"/>
+      <w:bookmarkStart w:id="2" w:name="_Toc242922275"/>
       <w:r>
         <w:t>1. Giriş</w:t>
       </w:r>
@@ -4182,7 +4292,7 @@
       <w:pPr>
         <w:pStyle w:val="Balk2"/>
       </w:pPr>
-      <w:bookmarkStart w:id="3" w:name="_Toc242540438"/>
+      <w:bookmarkStart w:id="3" w:name="_Toc242922276"/>
       <w:r>
         <w:t>1.1 Amaç</w:t>
       </w:r>
@@ -4210,7 +4320,7 @@
       <w:pPr>
         <w:pStyle w:val="Balk2"/>
       </w:pPr>
-      <w:bookmarkStart w:id="4" w:name="_Toc242540439"/>
+      <w:bookmarkStart w:id="4" w:name="_Toc242922277"/>
       <w:r>
         <w:t>1.2 Kapsam Özeti</w:t>
       </w:r>
@@ -4229,7 +4339,7 @@
       <w:pPr>
         <w:pStyle w:val="Balk2"/>
       </w:pPr>
-      <w:bookmarkStart w:id="5" w:name="_Toc242540440"/>
+      <w:bookmarkStart w:id="5" w:name="_Toc242922278"/>
       <w:r>
         <w:t>1.3 Referans Dokümanlar</w:t>
       </w:r>
@@ -4768,7 +4878,7 @@
       <w:pPr>
         <w:pStyle w:val="Balk2"/>
       </w:pPr>
-      <w:bookmarkStart w:id="6" w:name="_Toc242540441"/>
+      <w:bookmarkStart w:id="6" w:name="_Toc242922279"/>
       <w:r>
         <w:t>1.4 Kısaltmalar</w:t>
       </w:r>
@@ -5421,7 +5531,7 @@
       <w:pPr>
         <w:pStyle w:val="Balk1"/>
       </w:pPr>
-      <w:bookmarkStart w:id="7" w:name="_Toc242540442"/>
+      <w:bookmarkStart w:id="7" w:name="_Toc242922280"/>
       <w:r>
         <w:t>2. Test Edilecek Sistem</w:t>
       </w:r>
@@ -5431,7 +5541,7 @@
       <w:pPr>
         <w:pStyle w:val="Balk2"/>
       </w:pPr>
-      <w:bookmarkStart w:id="8" w:name="_Toc242540443"/>
+      <w:bookmarkStart w:id="8" w:name="_Toc242922281"/>
       <w:r>
         <w:t>2.1 Uygulama Tanımı</w:t>
       </w:r>
@@ -5450,7 +5560,7 @@
       <w:pPr>
         <w:pStyle w:val="Balk2"/>
       </w:pPr>
-      <w:bookmarkStart w:id="9" w:name="_Toc242540444"/>
+      <w:bookmarkStart w:id="9" w:name="_Toc242922282"/>
       <w:r>
         <w:t>2.2 Mimari ve Bileşenler</w:t>
       </w:r>
@@ -5906,7 +6016,7 @@
       <w:pPr>
         <w:pStyle w:val="Balk2"/>
       </w:pPr>
-      <w:bookmarkStart w:id="10" w:name="_Toc242540445"/>
+      <w:bookmarkStart w:id="10" w:name="_Toc242922283"/>
       <w:r>
         <w:t>2.3 Kullanıcı Rolleri</w:t>
       </w:r>
@@ -6167,7 +6277,7 @@
       <w:pPr>
         <w:pStyle w:val="Balk2"/>
       </w:pPr>
-      <w:bookmarkStart w:id="11" w:name="_Toc242540446"/>
+      <w:bookmarkStart w:id="11" w:name="_Toc242922284"/>
       <w:r>
         <w:t>2.4 Uygulama Modülleri (Site Analizi Sonucu)</w:t>
       </w:r>
@@ -7121,7 +7231,7 @@
       <w:pPr>
         <w:pStyle w:val="Balk1"/>
       </w:pPr>
-      <w:bookmarkStart w:id="12" w:name="_Toc242540447"/>
+      <w:bookmarkStart w:id="12" w:name="_Toc242922285"/>
       <w:r>
         <w:t>3. Test Kapsamı</w:t>
       </w:r>
@@ -7131,7 +7241,7 @@
       <w:pPr>
         <w:pStyle w:val="Balk2"/>
       </w:pPr>
-      <w:bookmarkStart w:id="13" w:name="_Toc242540448"/>
+      <w:bookmarkStart w:id="13" w:name="_Toc242922286"/>
       <w:r>
         <w:t>3.1 Test Edilecek Özellikler (In Scope)</w:t>
       </w:r>
@@ -10223,7 +10333,7 @@
       <w:pPr>
         <w:pStyle w:val="Balk2"/>
       </w:pPr>
-      <w:bookmarkStart w:id="14" w:name="_Toc242540449"/>
+      <w:bookmarkStart w:id="14" w:name="_Toc242922287"/>
       <w:r>
         <w:t>3.2 Test Edilmeyecek Özellikler (Out of Scope)</w:t>
       </w:r>
@@ -10324,7 +10434,7 @@
       <w:pPr>
         <w:pStyle w:val="Balk1"/>
       </w:pPr>
-      <w:bookmarkStart w:id="15" w:name="_Toc242540450"/>
+      <w:bookmarkStart w:id="15" w:name="_Toc242922288"/>
       <w:r>
         <w:t>4. Test Yaklaşımı ve Stratejisi</w:t>
       </w:r>
@@ -10334,7 +10444,7 @@
       <w:pPr>
         <w:pStyle w:val="Balk2"/>
       </w:pPr>
-      <w:bookmarkStart w:id="16" w:name="_Toc242540451"/>
+      <w:bookmarkStart w:id="16" w:name="_Toc242922289"/>
       <w:r>
         <w:t>4.1 Test Seviyeleri</w:t>
       </w:r>
@@ -10956,7 +11066,7 @@
       <w:pPr>
         <w:pStyle w:val="Balk2"/>
       </w:pPr>
-      <w:bookmarkStart w:id="17" w:name="_Toc242540452"/>
+      <w:bookmarkStart w:id="17" w:name="_Toc242922290"/>
       <w:r>
         <w:t>4.2 Test Türleri</w:t>
       </w:r>
@@ -11086,7 +11196,7 @@
       <w:pPr>
         <w:pStyle w:val="Balk2"/>
       </w:pPr>
-      <w:bookmarkStart w:id="18" w:name="_Toc242540453"/>
+      <w:bookmarkStart w:id="18" w:name="_Toc242922291"/>
       <w:r>
         <w:t>4.3 Test Tasarım Teknikleri</w:t>
       </w:r>
@@ -11515,7 +11625,7 @@
       <w:pPr>
         <w:pStyle w:val="Balk2"/>
       </w:pPr>
-      <w:bookmarkStart w:id="19" w:name="_Toc242540454"/>
+      <w:bookmarkStart w:id="19" w:name="_Toc242922292"/>
       <w:r>
         <w:t>4.4 Sipariş Statü Geçiş Kuralları</w:t>
       </w:r>
@@ -12110,7 +12220,7 @@
       <w:pPr>
         <w:pStyle w:val="Balk1"/>
       </w:pPr>
-      <w:bookmarkStart w:id="20" w:name="_Toc242540455"/>
+      <w:bookmarkStart w:id="20" w:name="_Toc242922293"/>
       <w:r>
         <w:t>5. Test Süreci ve Fazlar</w:t>
       </w:r>
@@ -13814,7 +13924,7 @@
       <w:pPr>
         <w:pStyle w:val="Balk1"/>
       </w:pPr>
-      <w:bookmarkStart w:id="21" w:name="_Toc242540456"/>
+      <w:bookmarkStart w:id="21" w:name="_Toc242922294"/>
       <w:r>
         <w:t>6. Test Ortamı</w:t>
       </w:r>
@@ -13824,7 +13934,7 @@
       <w:pPr>
         <w:pStyle w:val="Balk2"/>
       </w:pPr>
-      <w:bookmarkStart w:id="22" w:name="_Toc242540457"/>
+      <w:bookmarkStart w:id="22" w:name="_Toc242922295"/>
       <w:r>
         <w:t>6.1 Ortam Bilgileri</w:t>
       </w:r>
@@ -14309,7 +14419,7 @@
       <w:pPr>
         <w:pStyle w:val="Balk2"/>
       </w:pPr>
-      <w:bookmarkStart w:id="23" w:name="_Toc242540458"/>
+      <w:bookmarkStart w:id="23" w:name="_Toc242922296"/>
       <w:r>
         <w:t>6.2 Araçlar ve Kütüphaneler</w:t>
       </w:r>
@@ -15595,7 +15705,7 @@
       <w:pPr>
         <w:pStyle w:val="Balk2"/>
       </w:pPr>
-      <w:bookmarkStart w:id="24" w:name="_Toc242540459"/>
+      <w:bookmarkStart w:id="24" w:name="_Toc242922297"/>
       <w:r>
         <w:t>6.3 Test Verisi Yönetimi</w:t>
       </w:r>
@@ -15657,7 +15767,7 @@
       <w:pPr>
         <w:pStyle w:val="Balk1"/>
       </w:pPr>
-      <w:bookmarkStart w:id="25" w:name="_Toc242540460"/>
+      <w:bookmarkStart w:id="25" w:name="_Toc242922298"/>
       <w:r>
         <w:t>7. Test Otomasyon Mimarisi</w:t>
       </w:r>
@@ -15667,7 +15777,7 @@
       <w:pPr>
         <w:pStyle w:val="Balk2"/>
       </w:pPr>
-      <w:bookmarkStart w:id="26" w:name="_Toc242540461"/>
+      <w:bookmarkStart w:id="26" w:name="_Toc242922299"/>
       <w:r>
         <w:t>7.1 Selenium + TestNG (POM)</w:t>
       </w:r>
@@ -15795,7 +15905,7 @@
       <w:pPr>
         <w:pStyle w:val="Balk2"/>
       </w:pPr>
-      <w:bookmarkStart w:id="27" w:name="_Toc242540462"/>
+      <w:bookmarkStart w:id="27" w:name="_Toc242922300"/>
       <w:r>
         <w:t>7.2 Selenium + Cucumber (BDD + POM)</w:t>
       </w:r>
@@ -15884,7 +15994,7 @@
       <w:pPr>
         <w:pStyle w:val="Balk2"/>
       </w:pPr>
-      <w:bookmarkStart w:id="28" w:name="_Toc242540463"/>
+      <w:bookmarkStart w:id="28" w:name="_Toc242922301"/>
       <w:r>
         <w:t>7.3 API Otomasyonu (Rest Assured + POJO)</w:t>
       </w:r>
@@ -15973,7 +16083,7 @@
       <w:pPr>
         <w:pStyle w:val="Balk2"/>
       </w:pPr>
-      <w:bookmarkStart w:id="29" w:name="_Toc242540464"/>
+      <w:bookmarkStart w:id="29" w:name="_Toc242922302"/>
       <w:r>
         <w:t>7.4 Veritabanı ve E2E Otomasyonu</w:t>
       </w:r>
@@ -15992,7 +16102,7 @@
       <w:pPr>
         <w:pStyle w:val="Balk1"/>
       </w:pPr>
-      <w:bookmarkStart w:id="30" w:name="_Toc242540465"/>
+      <w:bookmarkStart w:id="30" w:name="_Toc242922303"/>
       <w:r>
         <w:t>8. Giriş, Çıkış ve Askıya Alma Kriterleri</w:t>
       </w:r>
@@ -16002,7 +16112,7 @@
       <w:pPr>
         <w:pStyle w:val="Balk2"/>
       </w:pPr>
-      <w:bookmarkStart w:id="31" w:name="_Toc242540466"/>
+      <w:bookmarkStart w:id="31" w:name="_Toc242922304"/>
       <w:r>
         <w:t>8.1 Giriş Kriterleri (Entry Criteria)</w:t>
       </w:r>
@@ -16090,7 +16200,7 @@
       <w:pPr>
         <w:pStyle w:val="Balk2"/>
       </w:pPr>
-      <w:bookmarkStart w:id="32" w:name="_Toc242540467"/>
+      <w:bookmarkStart w:id="32" w:name="_Toc242922305"/>
       <w:r>
         <w:t>8.2 Çıkış Kriterleri (Exit Criteria)</w:t>
       </w:r>
@@ -16178,7 +16288,7 @@
       <w:pPr>
         <w:pStyle w:val="Balk2"/>
       </w:pPr>
-      <w:bookmarkStart w:id="33" w:name="_Toc242540468"/>
+      <w:bookmarkStart w:id="33" w:name="_Toc242922306"/>
       <w:r>
         <w:t>8.3 Askıya Alma ve Devam Kriterleri</w:t>
       </w:r>
@@ -16439,7 +16549,7 @@
       <w:pPr>
         <w:pStyle w:val="Balk1"/>
       </w:pPr>
-      <w:bookmarkStart w:id="34" w:name="_Toc242540469"/>
+      <w:bookmarkStart w:id="34" w:name="_Toc242922307"/>
       <w:r>
         <w:t>9. Test Case Yazım Standartları</w:t>
       </w:r>
@@ -17174,7 +17284,7 @@
       <w:pPr>
         <w:pStyle w:val="Balk1"/>
       </w:pPr>
-      <w:bookmarkStart w:id="35" w:name="_Toc242540470"/>
+      <w:bookmarkStart w:id="35" w:name="_Toc242922308"/>
       <w:r>
         <w:t>10. JIRA ve Xray Yapılandırması</w:t>
       </w:r>
@@ -17893,7 +18003,7 @@
       <w:pPr>
         <w:pStyle w:val="Balk1"/>
       </w:pPr>
-      <w:bookmarkStart w:id="36" w:name="_Toc242540471"/>
+      <w:bookmarkStart w:id="36" w:name="_Toc242922309"/>
       <w:r>
         <w:t>11. Hata Yönetimi</w:t>
       </w:r>
@@ -17903,7 +18013,7 @@
       <w:pPr>
         <w:pStyle w:val="Balk2"/>
       </w:pPr>
-      <w:bookmarkStart w:id="37" w:name="_Toc242540472"/>
+      <w:bookmarkStart w:id="37" w:name="_Toc242922310"/>
       <w:r>
         <w:t>11.1 Hata Yaşam Döngüsü</w:t>
       </w:r>
@@ -17922,7 +18032,7 @@
       <w:pPr>
         <w:pStyle w:val="Balk2"/>
       </w:pPr>
-      <w:bookmarkStart w:id="38" w:name="_Toc242540473"/>
+      <w:bookmarkStart w:id="38" w:name="_Toc242922311"/>
       <w:r>
         <w:t>11.2 Severity (Ciddiyet) Tanımları</w:t>
       </w:r>
@@ -18461,7 +18571,7 @@
       <w:pPr>
         <w:pStyle w:val="Balk2"/>
       </w:pPr>
-      <w:bookmarkStart w:id="39" w:name="_Toc242540474"/>
+      <w:bookmarkStart w:id="39" w:name="_Toc242922312"/>
       <w:r>
         <w:t>11.3 Priority (Öncelik) Tanımları</w:t>
       </w:r>
@@ -18722,7 +18832,7 @@
       <w:pPr>
         <w:pStyle w:val="Balk2"/>
       </w:pPr>
-      <w:bookmarkStart w:id="40" w:name="_Toc242540475"/>
+      <w:bookmarkStart w:id="40" w:name="_Toc242922313"/>
       <w:r>
         <w:t>11.4 Bug Ticket Şablonu</w:t>
       </w:r>
@@ -19375,7 +19485,7 @@
       <w:pPr>
         <w:pStyle w:val="Balk1"/>
       </w:pPr>
-      <w:bookmarkStart w:id="41" w:name="_Toc242540476"/>
+      <w:bookmarkStart w:id="41" w:name="_Toc242922314"/>
       <w:r>
         <w:t>12. Ön Analiz Bulguları</w:t>
       </w:r>
@@ -20309,7 +20419,7 @@
       <w:pPr>
         <w:pStyle w:val="Balk1"/>
       </w:pPr>
-      <w:bookmarkStart w:id="42" w:name="_Toc242540477"/>
+      <w:bookmarkStart w:id="42" w:name="_Toc242922315"/>
       <w:r>
         <w:t>13. Takvim ve Sprint Planı</w:t>
       </w:r>
@@ -20913,7 +21023,7 @@
       <w:pPr>
         <w:pStyle w:val="Balk1"/>
       </w:pPr>
-      <w:bookmarkStart w:id="43" w:name="_Toc242540478"/>
+      <w:bookmarkStart w:id="43" w:name="_Toc242922316"/>
       <w:r>
         <w:t>14. Roller ve Sorumluluklar</w:t>
       </w:r>
@@ -21286,7 +21396,7 @@
       <w:pPr>
         <w:pStyle w:val="Balk1"/>
       </w:pPr>
-      <w:bookmarkStart w:id="44" w:name="_Toc242540479"/>
+      <w:bookmarkStart w:id="44" w:name="_Toc242922317"/>
       <w:r>
         <w:t>15. Riskler ve Önlemler</w:t>
       </w:r>
@@ -22101,7 +22211,7 @@
       <w:pPr>
         <w:pStyle w:val="Balk1"/>
       </w:pPr>
-      <w:bookmarkStart w:id="45" w:name="_Toc242540480"/>
+      <w:bookmarkStart w:id="45" w:name="_Toc242922318"/>
       <w:r>
         <w:t>16. Teslimatlar</w:t>
       </w:r>
@@ -23055,7 +23165,7 @@
       <w:pPr>
         <w:pStyle w:val="Balk1"/>
       </w:pPr>
-      <w:bookmarkStart w:id="46" w:name="_Toc242540481"/>
+      <w:bookmarkStart w:id="46" w:name="_Toc242922319"/>
       <w:r>
         <w:t>17. Test Özet Raporu (Koşum Sonuçları)</w:t>
       </w:r>
@@ -23067,14 +23177,14 @@
         <w:jc w:val="both"/>
       </w:pPr>
       <w:r>
-        <w:t>Bu bölüm, Sprint 1 kapsamında 10.10.2026 tarihinde gerçekleştirilen manuel ve otomasyon koşumlarının sonuçlarını özetler. Manuel koşum sonuçları JIRA Xray Test Execution SCRUM-243’e, test case dokümanına (Google Sheets) ve Excel çıktısına işlenmiştir.</w:t>
+        <w:t>Bu bölüm, Sprint 1 kapsamında 10.10.2026 (kullanıcı akışları, otomasyon) ve 15.10.2026 (admin paneli, mehmet@admin.com) tarihlerinde gerçekleştirilen manuel ve otomasyon koşumlarının sonuçlarını özetler. Manuel koşum sonuçları JIRA Xray Test Execution SCRUM-243’e, test case dokümanına (Google Sheets) ve Excel çıktısına işlenmiştir.</w:t>
       </w:r>
     </w:p>
     <w:p>
       <w:pPr>
         <w:pStyle w:val="Balk2"/>
       </w:pPr>
-      <w:bookmarkStart w:id="47" w:name="_Toc242540482"/>
+      <w:bookmarkStart w:id="47" w:name="_Toc242922320"/>
       <w:r>
         <w:t>17.1 Manuel Koşum Özeti</w:t>
       </w:r>
@@ -24840,6 +24950,33 @@
                 <w:sz w:val="19"/>
                 <w:szCs w:val="19"/>
               </w:rPr>
+              <w:t>2</w:t>
+            </w:r>
+          </w:p>
+        </w:tc>
+        <w:tc>
+          <w:tcPr>
+            <w:tcW w:w="1500" w:type="dxa"/>
+            <w:tcBorders>
+              <w:top w:val="single" w:sz="4" w:space="0" w:color="8EA9DB"/>
+              <w:left w:val="single" w:sz="4" w:space="0" w:color="8EA9DB"/>
+              <w:bottom w:val="single" w:sz="4" w:space="0" w:color="8EA9DB"/>
+              <w:right w:val="single" w:sz="4" w:space="0" w:color="8EA9DB"/>
+            </w:tcBorders>
+            <w:tcMar>
+              <w:top w:w="60" w:type="dxa"/>
+              <w:left w:w="100" w:type="dxa"/>
+              <w:bottom w:w="60" w:type="dxa"/>
+              <w:right w:w="100" w:type="dxa"/>
+            </w:tcMar>
+            <w:vAlign w:val="center"/>
+          </w:tcPr>
+          <w:p>
+            <w:r>
+              <w:rPr>
+                <w:sz w:val="19"/>
+                <w:szCs w:val="19"/>
+              </w:rPr>
               <w:t>0</w:t>
             </w:r>
           </w:p>
@@ -24867,34 +25004,7 @@
                 <w:sz w:val="19"/>
                 <w:szCs w:val="19"/>
               </w:rPr>
-              <w:t>0</w:t>
-            </w:r>
-          </w:p>
-        </w:tc>
-        <w:tc>
-          <w:tcPr>
-            <w:tcW w:w="1500" w:type="dxa"/>
-            <w:tcBorders>
-              <w:top w:val="single" w:sz="4" w:space="0" w:color="8EA9DB"/>
-              <w:left w:val="single" w:sz="4" w:space="0" w:color="8EA9DB"/>
-              <w:bottom w:val="single" w:sz="4" w:space="0" w:color="8EA9DB"/>
-              <w:right w:val="single" w:sz="4" w:space="0" w:color="8EA9DB"/>
-            </w:tcBorders>
-            <w:tcMar>
-              <w:top w:w="60" w:type="dxa"/>
-              <w:left w:w="100" w:type="dxa"/>
-              <w:bottom w:w="60" w:type="dxa"/>
-              <w:right w:w="100" w:type="dxa"/>
-            </w:tcMar>
-            <w:vAlign w:val="center"/>
-          </w:tcPr>
-          <w:p>
-            <w:r>
-              <w:rPr>
-                <w:sz w:val="19"/>
-                <w:szCs w:val="19"/>
-              </w:rPr>
-              <w:t>5</w:t>
+              <w:t>3</w:t>
             </w:r>
           </w:p>
         </w:tc>
@@ -25004,6 +25114,33 @@
                 <w:sz w:val="19"/>
                 <w:szCs w:val="19"/>
               </w:rPr>
+              <w:t>2</w:t>
+            </w:r>
+          </w:p>
+        </w:tc>
+        <w:tc>
+          <w:tcPr>
+            <w:tcW w:w="1500" w:type="dxa"/>
+            <w:tcBorders>
+              <w:top w:val="single" w:sz="4" w:space="0" w:color="8EA9DB"/>
+              <w:left w:val="single" w:sz="4" w:space="0" w:color="8EA9DB"/>
+              <w:bottom w:val="single" w:sz="4" w:space="0" w:color="8EA9DB"/>
+              <w:right w:val="single" w:sz="4" w:space="0" w:color="8EA9DB"/>
+            </w:tcBorders>
+            <w:tcMar>
+              <w:top w:w="60" w:type="dxa"/>
+              <w:left w:w="100" w:type="dxa"/>
+              <w:bottom w:w="60" w:type="dxa"/>
+              <w:right w:w="100" w:type="dxa"/>
+            </w:tcMar>
+            <w:vAlign w:val="center"/>
+          </w:tcPr>
+          <w:p>
+            <w:r>
+              <w:rPr>
+                <w:sz w:val="19"/>
+                <w:szCs w:val="19"/>
+              </w:rPr>
               <w:t>0</w:t>
             </w:r>
           </w:p>
@@ -25031,34 +25168,7 @@
                 <w:sz w:val="19"/>
                 <w:szCs w:val="19"/>
               </w:rPr>
-              <w:t>0</w:t>
-            </w:r>
-          </w:p>
-        </w:tc>
-        <w:tc>
-          <w:tcPr>
-            <w:tcW w:w="1500" w:type="dxa"/>
-            <w:tcBorders>
-              <w:top w:val="single" w:sz="4" w:space="0" w:color="8EA9DB"/>
-              <w:left w:val="single" w:sz="4" w:space="0" w:color="8EA9DB"/>
-              <w:bottom w:val="single" w:sz="4" w:space="0" w:color="8EA9DB"/>
-              <w:right w:val="single" w:sz="4" w:space="0" w:color="8EA9DB"/>
-            </w:tcBorders>
-            <w:tcMar>
-              <w:top w:w="60" w:type="dxa"/>
-              <w:left w:w="100" w:type="dxa"/>
-              <w:bottom w:w="60" w:type="dxa"/>
-              <w:right w:w="100" w:type="dxa"/>
-            </w:tcMar>
-            <w:vAlign w:val="center"/>
-          </w:tcPr>
-          <w:p>
-            <w:r>
-              <w:rPr>
-                <w:sz w:val="19"/>
-                <w:szCs w:val="19"/>
-              </w:rPr>
-              <w:t>5</w:t>
+              <w:t>3</w:t>
             </w:r>
           </w:p>
         </w:tc>
@@ -25168,7 +25278,7 @@
                 <w:sz w:val="19"/>
                 <w:szCs w:val="19"/>
               </w:rPr>
-              <w:t>0</w:t>
+              <w:t>1</w:t>
             </w:r>
           </w:p>
         </w:tc>
@@ -25195,7 +25305,7 @@
                 <w:sz w:val="19"/>
                 <w:szCs w:val="19"/>
               </w:rPr>
-              <w:t>0</w:t>
+              <w:t>2</w:t>
             </w:r>
           </w:p>
         </w:tc>
@@ -25222,7 +25332,7 @@
                 <w:sz w:val="19"/>
                 <w:szCs w:val="19"/>
               </w:rPr>
-              <w:t>6</w:t>
+              <w:t>3</w:t>
             </w:r>
           </w:p>
         </w:tc>
@@ -25332,6 +25442,33 @@
                 <w:sz w:val="19"/>
                 <w:szCs w:val="19"/>
               </w:rPr>
+              <w:t>4</w:t>
+            </w:r>
+          </w:p>
+        </w:tc>
+        <w:tc>
+          <w:tcPr>
+            <w:tcW w:w="1500" w:type="dxa"/>
+            <w:tcBorders>
+              <w:top w:val="single" w:sz="4" w:space="0" w:color="8EA9DB"/>
+              <w:left w:val="single" w:sz="4" w:space="0" w:color="8EA9DB"/>
+              <w:bottom w:val="single" w:sz="4" w:space="0" w:color="8EA9DB"/>
+              <w:right w:val="single" w:sz="4" w:space="0" w:color="8EA9DB"/>
+            </w:tcBorders>
+            <w:tcMar>
+              <w:top w:w="60" w:type="dxa"/>
+              <w:left w:w="100" w:type="dxa"/>
+              <w:bottom w:w="60" w:type="dxa"/>
+              <w:right w:w="100" w:type="dxa"/>
+            </w:tcMar>
+            <w:vAlign w:val="center"/>
+          </w:tcPr>
+          <w:p>
+            <w:r>
+              <w:rPr>
+                <w:sz w:val="19"/>
+                <w:szCs w:val="19"/>
+              </w:rPr>
               <w:t>0</w:t>
             </w:r>
           </w:p>
@@ -25360,33 +25497,6 @@
                 <w:szCs w:val="19"/>
               </w:rPr>
               <w:t>0</w:t>
-            </w:r>
-          </w:p>
-        </w:tc>
-        <w:tc>
-          <w:tcPr>
-            <w:tcW w:w="1500" w:type="dxa"/>
-            <w:tcBorders>
-              <w:top w:val="single" w:sz="4" w:space="0" w:color="8EA9DB"/>
-              <w:left w:val="single" w:sz="4" w:space="0" w:color="8EA9DB"/>
-              <w:bottom w:val="single" w:sz="4" w:space="0" w:color="8EA9DB"/>
-              <w:right w:val="single" w:sz="4" w:space="0" w:color="8EA9DB"/>
-            </w:tcBorders>
-            <w:tcMar>
-              <w:top w:w="60" w:type="dxa"/>
-              <w:left w:w="100" w:type="dxa"/>
-              <w:bottom w:w="60" w:type="dxa"/>
-              <w:right w:w="100" w:type="dxa"/>
-            </w:tcMar>
-            <w:vAlign w:val="center"/>
-          </w:tcPr>
-          <w:p>
-            <w:r>
-              <w:rPr>
-                <w:sz w:val="19"/>
-                <w:szCs w:val="19"/>
-              </w:rPr>
-              <w:t>4</w:t>
             </w:r>
           </w:p>
         </w:tc>
@@ -25496,61 +25606,61 @@
                 <w:sz w:val="19"/>
                 <w:szCs w:val="19"/>
               </w:rPr>
+              <w:t>10</w:t>
+            </w:r>
+          </w:p>
+        </w:tc>
+        <w:tc>
+          <w:tcPr>
+            <w:tcW w:w="1500" w:type="dxa"/>
+            <w:tcBorders>
+              <w:top w:val="single" w:sz="4" w:space="0" w:color="8EA9DB"/>
+              <w:left w:val="single" w:sz="4" w:space="0" w:color="8EA9DB"/>
+              <w:bottom w:val="single" w:sz="4" w:space="0" w:color="8EA9DB"/>
+              <w:right w:val="single" w:sz="4" w:space="0" w:color="8EA9DB"/>
+            </w:tcBorders>
+            <w:tcMar>
+              <w:top w:w="60" w:type="dxa"/>
+              <w:left w:w="100" w:type="dxa"/>
+              <w:bottom w:w="60" w:type="dxa"/>
+              <w:right w:w="100" w:type="dxa"/>
+            </w:tcMar>
+            <w:vAlign w:val="center"/>
+          </w:tcPr>
+          <w:p>
+            <w:r>
+              <w:rPr>
+                <w:sz w:val="19"/>
+                <w:szCs w:val="19"/>
+              </w:rPr>
+              <w:t>2</w:t>
+            </w:r>
+          </w:p>
+        </w:tc>
+        <w:tc>
+          <w:tcPr>
+            <w:tcW w:w="1500" w:type="dxa"/>
+            <w:tcBorders>
+              <w:top w:val="single" w:sz="4" w:space="0" w:color="8EA9DB"/>
+              <w:left w:val="single" w:sz="4" w:space="0" w:color="8EA9DB"/>
+              <w:bottom w:val="single" w:sz="4" w:space="0" w:color="8EA9DB"/>
+              <w:right w:val="single" w:sz="4" w:space="0" w:color="8EA9DB"/>
+            </w:tcBorders>
+            <w:tcMar>
+              <w:top w:w="60" w:type="dxa"/>
+              <w:left w:w="100" w:type="dxa"/>
+              <w:bottom w:w="60" w:type="dxa"/>
+              <w:right w:w="100" w:type="dxa"/>
+            </w:tcMar>
+            <w:vAlign w:val="center"/>
+          </w:tcPr>
+          <w:p>
+            <w:r>
+              <w:rPr>
+                <w:sz w:val="19"/>
+                <w:szCs w:val="19"/>
+              </w:rPr>
               <w:t>0</w:t>
-            </w:r>
-          </w:p>
-        </w:tc>
-        <w:tc>
-          <w:tcPr>
-            <w:tcW w:w="1500" w:type="dxa"/>
-            <w:tcBorders>
-              <w:top w:val="single" w:sz="4" w:space="0" w:color="8EA9DB"/>
-              <w:left w:val="single" w:sz="4" w:space="0" w:color="8EA9DB"/>
-              <w:bottom w:val="single" w:sz="4" w:space="0" w:color="8EA9DB"/>
-              <w:right w:val="single" w:sz="4" w:space="0" w:color="8EA9DB"/>
-            </w:tcBorders>
-            <w:tcMar>
-              <w:top w:w="60" w:type="dxa"/>
-              <w:left w:w="100" w:type="dxa"/>
-              <w:bottom w:w="60" w:type="dxa"/>
-              <w:right w:w="100" w:type="dxa"/>
-            </w:tcMar>
-            <w:vAlign w:val="center"/>
-          </w:tcPr>
-          <w:p>
-            <w:r>
-              <w:rPr>
-                <w:sz w:val="19"/>
-                <w:szCs w:val="19"/>
-              </w:rPr>
-              <w:t>0</w:t>
-            </w:r>
-          </w:p>
-        </w:tc>
-        <w:tc>
-          <w:tcPr>
-            <w:tcW w:w="1500" w:type="dxa"/>
-            <w:tcBorders>
-              <w:top w:val="single" w:sz="4" w:space="0" w:color="8EA9DB"/>
-              <w:left w:val="single" w:sz="4" w:space="0" w:color="8EA9DB"/>
-              <w:bottom w:val="single" w:sz="4" w:space="0" w:color="8EA9DB"/>
-              <w:right w:val="single" w:sz="4" w:space="0" w:color="8EA9DB"/>
-            </w:tcBorders>
-            <w:tcMar>
-              <w:top w:w="60" w:type="dxa"/>
-              <w:left w:w="100" w:type="dxa"/>
-              <w:bottom w:w="60" w:type="dxa"/>
-              <w:right w:w="100" w:type="dxa"/>
-            </w:tcMar>
-            <w:vAlign w:val="center"/>
-          </w:tcPr>
-          <w:p>
-            <w:r>
-              <w:rPr>
-                <w:sz w:val="19"/>
-                <w:szCs w:val="19"/>
-              </w:rPr>
-              <w:t>12</w:t>
             </w:r>
           </w:p>
         </w:tc>
@@ -25660,61 +25770,61 @@
                 <w:sz w:val="19"/>
                 <w:szCs w:val="19"/>
               </w:rPr>
+              <w:t>7</w:t>
+            </w:r>
+          </w:p>
+        </w:tc>
+        <w:tc>
+          <w:tcPr>
+            <w:tcW w:w="1500" w:type="dxa"/>
+            <w:tcBorders>
+              <w:top w:val="single" w:sz="4" w:space="0" w:color="8EA9DB"/>
+              <w:left w:val="single" w:sz="4" w:space="0" w:color="8EA9DB"/>
+              <w:bottom w:val="single" w:sz="4" w:space="0" w:color="8EA9DB"/>
+              <w:right w:val="single" w:sz="4" w:space="0" w:color="8EA9DB"/>
+            </w:tcBorders>
+            <w:tcMar>
+              <w:top w:w="60" w:type="dxa"/>
+              <w:left w:w="100" w:type="dxa"/>
+              <w:bottom w:w="60" w:type="dxa"/>
+              <w:right w:w="100" w:type="dxa"/>
+            </w:tcMar>
+            <w:vAlign w:val="center"/>
+          </w:tcPr>
+          <w:p>
+            <w:r>
+              <w:rPr>
+                <w:sz w:val="19"/>
+                <w:szCs w:val="19"/>
+              </w:rPr>
+              <w:t>1</w:t>
+            </w:r>
+          </w:p>
+        </w:tc>
+        <w:tc>
+          <w:tcPr>
+            <w:tcW w:w="1500" w:type="dxa"/>
+            <w:tcBorders>
+              <w:top w:val="single" w:sz="4" w:space="0" w:color="8EA9DB"/>
+              <w:left w:val="single" w:sz="4" w:space="0" w:color="8EA9DB"/>
+              <w:bottom w:val="single" w:sz="4" w:space="0" w:color="8EA9DB"/>
+              <w:right w:val="single" w:sz="4" w:space="0" w:color="8EA9DB"/>
+            </w:tcBorders>
+            <w:tcMar>
+              <w:top w:w="60" w:type="dxa"/>
+              <w:left w:w="100" w:type="dxa"/>
+              <w:bottom w:w="60" w:type="dxa"/>
+              <w:right w:w="100" w:type="dxa"/>
+            </w:tcMar>
+            <w:vAlign w:val="center"/>
+          </w:tcPr>
+          <w:p>
+            <w:r>
+              <w:rPr>
+                <w:sz w:val="19"/>
+                <w:szCs w:val="19"/>
+              </w:rPr>
               <w:t>0</w:t>
-            </w:r>
-          </w:p>
-        </w:tc>
-        <w:tc>
-          <w:tcPr>
-            <w:tcW w:w="1500" w:type="dxa"/>
-            <w:tcBorders>
-              <w:top w:val="single" w:sz="4" w:space="0" w:color="8EA9DB"/>
-              <w:left w:val="single" w:sz="4" w:space="0" w:color="8EA9DB"/>
-              <w:bottom w:val="single" w:sz="4" w:space="0" w:color="8EA9DB"/>
-              <w:right w:val="single" w:sz="4" w:space="0" w:color="8EA9DB"/>
-            </w:tcBorders>
-            <w:tcMar>
-              <w:top w:w="60" w:type="dxa"/>
-              <w:left w:w="100" w:type="dxa"/>
-              <w:bottom w:w="60" w:type="dxa"/>
-              <w:right w:w="100" w:type="dxa"/>
-            </w:tcMar>
-            <w:vAlign w:val="center"/>
-          </w:tcPr>
-          <w:p>
-            <w:r>
-              <w:rPr>
-                <w:sz w:val="19"/>
-                <w:szCs w:val="19"/>
-              </w:rPr>
-              <w:t>0</w:t>
-            </w:r>
-          </w:p>
-        </w:tc>
-        <w:tc>
-          <w:tcPr>
-            <w:tcW w:w="1500" w:type="dxa"/>
-            <w:tcBorders>
-              <w:top w:val="single" w:sz="4" w:space="0" w:color="8EA9DB"/>
-              <w:left w:val="single" w:sz="4" w:space="0" w:color="8EA9DB"/>
-              <w:bottom w:val="single" w:sz="4" w:space="0" w:color="8EA9DB"/>
-              <w:right w:val="single" w:sz="4" w:space="0" w:color="8EA9DB"/>
-            </w:tcBorders>
-            <w:tcMar>
-              <w:top w:w="60" w:type="dxa"/>
-              <w:left w:w="100" w:type="dxa"/>
-              <w:bottom w:w="60" w:type="dxa"/>
-              <w:right w:w="100" w:type="dxa"/>
-            </w:tcMar>
-            <w:vAlign w:val="center"/>
-          </w:tcPr>
-          <w:p>
-            <w:r>
-              <w:rPr>
-                <w:sz w:val="19"/>
-                <w:szCs w:val="19"/>
-              </w:rPr>
-              <w:t>8</w:t>
             </w:r>
           </w:p>
         </w:tc>
@@ -25824,61 +25934,61 @@
                 <w:sz w:val="19"/>
                 <w:szCs w:val="19"/>
               </w:rPr>
+              <w:t>3</w:t>
+            </w:r>
+          </w:p>
+        </w:tc>
+        <w:tc>
+          <w:tcPr>
+            <w:tcW w:w="1500" w:type="dxa"/>
+            <w:tcBorders>
+              <w:top w:val="single" w:sz="4" w:space="0" w:color="8EA9DB"/>
+              <w:left w:val="single" w:sz="4" w:space="0" w:color="8EA9DB"/>
+              <w:bottom w:val="single" w:sz="4" w:space="0" w:color="8EA9DB"/>
+              <w:right w:val="single" w:sz="4" w:space="0" w:color="8EA9DB"/>
+            </w:tcBorders>
+            <w:tcMar>
+              <w:top w:w="60" w:type="dxa"/>
+              <w:left w:w="100" w:type="dxa"/>
+              <w:bottom w:w="60" w:type="dxa"/>
+              <w:right w:w="100" w:type="dxa"/>
+            </w:tcMar>
+            <w:vAlign w:val="center"/>
+          </w:tcPr>
+          <w:p>
+            <w:r>
+              <w:rPr>
+                <w:sz w:val="19"/>
+                <w:szCs w:val="19"/>
+              </w:rPr>
+              <w:t>1</w:t>
+            </w:r>
+          </w:p>
+        </w:tc>
+        <w:tc>
+          <w:tcPr>
+            <w:tcW w:w="1500" w:type="dxa"/>
+            <w:tcBorders>
+              <w:top w:val="single" w:sz="4" w:space="0" w:color="8EA9DB"/>
+              <w:left w:val="single" w:sz="4" w:space="0" w:color="8EA9DB"/>
+              <w:bottom w:val="single" w:sz="4" w:space="0" w:color="8EA9DB"/>
+              <w:right w:val="single" w:sz="4" w:space="0" w:color="8EA9DB"/>
+            </w:tcBorders>
+            <w:tcMar>
+              <w:top w:w="60" w:type="dxa"/>
+              <w:left w:w="100" w:type="dxa"/>
+              <w:bottom w:w="60" w:type="dxa"/>
+              <w:right w:w="100" w:type="dxa"/>
+            </w:tcMar>
+            <w:vAlign w:val="center"/>
+          </w:tcPr>
+          <w:p>
+            <w:r>
+              <w:rPr>
+                <w:sz w:val="19"/>
+                <w:szCs w:val="19"/>
+              </w:rPr>
               <w:t>0</w:t>
-            </w:r>
-          </w:p>
-        </w:tc>
-        <w:tc>
-          <w:tcPr>
-            <w:tcW w:w="1500" w:type="dxa"/>
-            <w:tcBorders>
-              <w:top w:val="single" w:sz="4" w:space="0" w:color="8EA9DB"/>
-              <w:left w:val="single" w:sz="4" w:space="0" w:color="8EA9DB"/>
-              <w:bottom w:val="single" w:sz="4" w:space="0" w:color="8EA9DB"/>
-              <w:right w:val="single" w:sz="4" w:space="0" w:color="8EA9DB"/>
-            </w:tcBorders>
-            <w:tcMar>
-              <w:top w:w="60" w:type="dxa"/>
-              <w:left w:w="100" w:type="dxa"/>
-              <w:bottom w:w="60" w:type="dxa"/>
-              <w:right w:w="100" w:type="dxa"/>
-            </w:tcMar>
-            <w:vAlign w:val="center"/>
-          </w:tcPr>
-          <w:p>
-            <w:r>
-              <w:rPr>
-                <w:sz w:val="19"/>
-                <w:szCs w:val="19"/>
-              </w:rPr>
-              <w:t>0</w:t>
-            </w:r>
-          </w:p>
-        </w:tc>
-        <w:tc>
-          <w:tcPr>
-            <w:tcW w:w="1500" w:type="dxa"/>
-            <w:tcBorders>
-              <w:top w:val="single" w:sz="4" w:space="0" w:color="8EA9DB"/>
-              <w:left w:val="single" w:sz="4" w:space="0" w:color="8EA9DB"/>
-              <w:bottom w:val="single" w:sz="4" w:space="0" w:color="8EA9DB"/>
-              <w:right w:val="single" w:sz="4" w:space="0" w:color="8EA9DB"/>
-            </w:tcBorders>
-            <w:tcMar>
-              <w:top w:w="60" w:type="dxa"/>
-              <w:left w:w="100" w:type="dxa"/>
-              <w:bottom w:w="60" w:type="dxa"/>
-              <w:right w:w="100" w:type="dxa"/>
-            </w:tcMar>
-            <w:vAlign w:val="center"/>
-          </w:tcPr>
-          <w:p>
-            <w:r>
-              <w:rPr>
-                <w:sz w:val="19"/>
-                <w:szCs w:val="19"/>
-              </w:rPr>
-              <w:t>4</w:t>
             </w:r>
           </w:p>
         </w:tc>
@@ -25988,61 +26098,61 @@
                 <w:sz w:val="19"/>
                 <w:szCs w:val="19"/>
               </w:rPr>
+              <w:t>5</w:t>
+            </w:r>
+          </w:p>
+        </w:tc>
+        <w:tc>
+          <w:tcPr>
+            <w:tcW w:w="1500" w:type="dxa"/>
+            <w:tcBorders>
+              <w:top w:val="single" w:sz="4" w:space="0" w:color="8EA9DB"/>
+              <w:left w:val="single" w:sz="4" w:space="0" w:color="8EA9DB"/>
+              <w:bottom w:val="single" w:sz="4" w:space="0" w:color="8EA9DB"/>
+              <w:right w:val="single" w:sz="4" w:space="0" w:color="8EA9DB"/>
+            </w:tcBorders>
+            <w:tcMar>
+              <w:top w:w="60" w:type="dxa"/>
+              <w:left w:w="100" w:type="dxa"/>
+              <w:bottom w:w="60" w:type="dxa"/>
+              <w:right w:w="100" w:type="dxa"/>
+            </w:tcMar>
+            <w:vAlign w:val="center"/>
+          </w:tcPr>
+          <w:p>
+            <w:r>
+              <w:rPr>
+                <w:sz w:val="19"/>
+                <w:szCs w:val="19"/>
+              </w:rPr>
+              <w:t>1</w:t>
+            </w:r>
+          </w:p>
+        </w:tc>
+        <w:tc>
+          <w:tcPr>
+            <w:tcW w:w="1500" w:type="dxa"/>
+            <w:tcBorders>
+              <w:top w:val="single" w:sz="4" w:space="0" w:color="8EA9DB"/>
+              <w:left w:val="single" w:sz="4" w:space="0" w:color="8EA9DB"/>
+              <w:bottom w:val="single" w:sz="4" w:space="0" w:color="8EA9DB"/>
+              <w:right w:val="single" w:sz="4" w:space="0" w:color="8EA9DB"/>
+            </w:tcBorders>
+            <w:tcMar>
+              <w:top w:w="60" w:type="dxa"/>
+              <w:left w:w="100" w:type="dxa"/>
+              <w:bottom w:w="60" w:type="dxa"/>
+              <w:right w:w="100" w:type="dxa"/>
+            </w:tcMar>
+            <w:vAlign w:val="center"/>
+          </w:tcPr>
+          <w:p>
+            <w:r>
+              <w:rPr>
+                <w:sz w:val="19"/>
+                <w:szCs w:val="19"/>
+              </w:rPr>
               <w:t>0</w:t>
-            </w:r>
-          </w:p>
-        </w:tc>
-        <w:tc>
-          <w:tcPr>
-            <w:tcW w:w="1500" w:type="dxa"/>
-            <w:tcBorders>
-              <w:top w:val="single" w:sz="4" w:space="0" w:color="8EA9DB"/>
-              <w:left w:val="single" w:sz="4" w:space="0" w:color="8EA9DB"/>
-              <w:bottom w:val="single" w:sz="4" w:space="0" w:color="8EA9DB"/>
-              <w:right w:val="single" w:sz="4" w:space="0" w:color="8EA9DB"/>
-            </w:tcBorders>
-            <w:tcMar>
-              <w:top w:w="60" w:type="dxa"/>
-              <w:left w:w="100" w:type="dxa"/>
-              <w:bottom w:w="60" w:type="dxa"/>
-              <w:right w:w="100" w:type="dxa"/>
-            </w:tcMar>
-            <w:vAlign w:val="center"/>
-          </w:tcPr>
-          <w:p>
-            <w:r>
-              <w:rPr>
-                <w:sz w:val="19"/>
-                <w:szCs w:val="19"/>
-              </w:rPr>
-              <w:t>0</w:t>
-            </w:r>
-          </w:p>
-        </w:tc>
-        <w:tc>
-          <w:tcPr>
-            <w:tcW w:w="1500" w:type="dxa"/>
-            <w:tcBorders>
-              <w:top w:val="single" w:sz="4" w:space="0" w:color="8EA9DB"/>
-              <w:left w:val="single" w:sz="4" w:space="0" w:color="8EA9DB"/>
-              <w:bottom w:val="single" w:sz="4" w:space="0" w:color="8EA9DB"/>
-              <w:right w:val="single" w:sz="4" w:space="0" w:color="8EA9DB"/>
-            </w:tcBorders>
-            <w:tcMar>
-              <w:top w:w="60" w:type="dxa"/>
-              <w:left w:w="100" w:type="dxa"/>
-              <w:bottom w:w="60" w:type="dxa"/>
-              <w:right w:w="100" w:type="dxa"/>
-            </w:tcMar>
-            <w:vAlign w:val="center"/>
-          </w:tcPr>
-          <w:p>
-            <w:r>
-              <w:rPr>
-                <w:sz w:val="19"/>
-                <w:szCs w:val="19"/>
-              </w:rPr>
-              <w:t>6</w:t>
             </w:r>
           </w:p>
         </w:tc>
@@ -26152,61 +26262,61 @@
                 <w:sz w:val="19"/>
                 <w:szCs w:val="19"/>
               </w:rPr>
+              <w:t>1</w:t>
+            </w:r>
+          </w:p>
+        </w:tc>
+        <w:tc>
+          <w:tcPr>
+            <w:tcW w:w="1500" w:type="dxa"/>
+            <w:tcBorders>
+              <w:top w:val="single" w:sz="4" w:space="0" w:color="8EA9DB"/>
+              <w:left w:val="single" w:sz="4" w:space="0" w:color="8EA9DB"/>
+              <w:bottom w:val="single" w:sz="4" w:space="0" w:color="8EA9DB"/>
+              <w:right w:val="single" w:sz="4" w:space="0" w:color="8EA9DB"/>
+            </w:tcBorders>
+            <w:tcMar>
+              <w:top w:w="60" w:type="dxa"/>
+              <w:left w:w="100" w:type="dxa"/>
+              <w:bottom w:w="60" w:type="dxa"/>
+              <w:right w:w="100" w:type="dxa"/>
+            </w:tcMar>
+            <w:vAlign w:val="center"/>
+          </w:tcPr>
+          <w:p>
+            <w:r>
+              <w:rPr>
+                <w:sz w:val="19"/>
+                <w:szCs w:val="19"/>
+              </w:rPr>
+              <w:t>3</w:t>
+            </w:r>
+          </w:p>
+        </w:tc>
+        <w:tc>
+          <w:tcPr>
+            <w:tcW w:w="1500" w:type="dxa"/>
+            <w:tcBorders>
+              <w:top w:val="single" w:sz="4" w:space="0" w:color="8EA9DB"/>
+              <w:left w:val="single" w:sz="4" w:space="0" w:color="8EA9DB"/>
+              <w:bottom w:val="single" w:sz="4" w:space="0" w:color="8EA9DB"/>
+              <w:right w:val="single" w:sz="4" w:space="0" w:color="8EA9DB"/>
+            </w:tcBorders>
+            <w:tcMar>
+              <w:top w:w="60" w:type="dxa"/>
+              <w:left w:w="100" w:type="dxa"/>
+              <w:bottom w:w="60" w:type="dxa"/>
+              <w:right w:w="100" w:type="dxa"/>
+            </w:tcMar>
+            <w:vAlign w:val="center"/>
+          </w:tcPr>
+          <w:p>
+            <w:r>
+              <w:rPr>
+                <w:sz w:val="19"/>
+                <w:szCs w:val="19"/>
+              </w:rPr>
               <w:t>0</w:t>
-            </w:r>
-          </w:p>
-        </w:tc>
-        <w:tc>
-          <w:tcPr>
-            <w:tcW w:w="1500" w:type="dxa"/>
-            <w:tcBorders>
-              <w:top w:val="single" w:sz="4" w:space="0" w:color="8EA9DB"/>
-              <w:left w:val="single" w:sz="4" w:space="0" w:color="8EA9DB"/>
-              <w:bottom w:val="single" w:sz="4" w:space="0" w:color="8EA9DB"/>
-              <w:right w:val="single" w:sz="4" w:space="0" w:color="8EA9DB"/>
-            </w:tcBorders>
-            <w:tcMar>
-              <w:top w:w="60" w:type="dxa"/>
-              <w:left w:w="100" w:type="dxa"/>
-              <w:bottom w:w="60" w:type="dxa"/>
-              <w:right w:w="100" w:type="dxa"/>
-            </w:tcMar>
-            <w:vAlign w:val="center"/>
-          </w:tcPr>
-          <w:p>
-            <w:r>
-              <w:rPr>
-                <w:sz w:val="19"/>
-                <w:szCs w:val="19"/>
-              </w:rPr>
-              <w:t>0</w:t>
-            </w:r>
-          </w:p>
-        </w:tc>
-        <w:tc>
-          <w:tcPr>
-            <w:tcW w:w="1500" w:type="dxa"/>
-            <w:tcBorders>
-              <w:top w:val="single" w:sz="4" w:space="0" w:color="8EA9DB"/>
-              <w:left w:val="single" w:sz="4" w:space="0" w:color="8EA9DB"/>
-              <w:bottom w:val="single" w:sz="4" w:space="0" w:color="8EA9DB"/>
-              <w:right w:val="single" w:sz="4" w:space="0" w:color="8EA9DB"/>
-            </w:tcBorders>
-            <w:tcMar>
-              <w:top w:w="60" w:type="dxa"/>
-              <w:left w:w="100" w:type="dxa"/>
-              <w:bottom w:w="60" w:type="dxa"/>
-              <w:right w:w="100" w:type="dxa"/>
-            </w:tcMar>
-            <w:vAlign w:val="center"/>
-          </w:tcPr>
-          <w:p>
-            <w:r>
-              <w:rPr>
-                <w:sz w:val="19"/>
-                <w:szCs w:val="19"/>
-              </w:rPr>
-              <w:t>4</w:t>
             </w:r>
           </w:p>
         </w:tc>
@@ -26316,61 +26426,61 @@
                 <w:sz w:val="19"/>
                 <w:szCs w:val="19"/>
               </w:rPr>
+              <w:t>5</w:t>
+            </w:r>
+          </w:p>
+        </w:tc>
+        <w:tc>
+          <w:tcPr>
+            <w:tcW w:w="1500" w:type="dxa"/>
+            <w:tcBorders>
+              <w:top w:val="single" w:sz="4" w:space="0" w:color="8EA9DB"/>
+              <w:left w:val="single" w:sz="4" w:space="0" w:color="8EA9DB"/>
+              <w:bottom w:val="single" w:sz="4" w:space="0" w:color="8EA9DB"/>
+              <w:right w:val="single" w:sz="4" w:space="0" w:color="8EA9DB"/>
+            </w:tcBorders>
+            <w:tcMar>
+              <w:top w:w="60" w:type="dxa"/>
+              <w:left w:w="100" w:type="dxa"/>
+              <w:bottom w:w="60" w:type="dxa"/>
+              <w:right w:w="100" w:type="dxa"/>
+            </w:tcMar>
+            <w:vAlign w:val="center"/>
+          </w:tcPr>
+          <w:p>
+            <w:r>
+              <w:rPr>
+                <w:sz w:val="19"/>
+                <w:szCs w:val="19"/>
+              </w:rPr>
+              <w:t>5</w:t>
+            </w:r>
+          </w:p>
+        </w:tc>
+        <w:tc>
+          <w:tcPr>
+            <w:tcW w:w="1500" w:type="dxa"/>
+            <w:tcBorders>
+              <w:top w:val="single" w:sz="4" w:space="0" w:color="8EA9DB"/>
+              <w:left w:val="single" w:sz="4" w:space="0" w:color="8EA9DB"/>
+              <w:bottom w:val="single" w:sz="4" w:space="0" w:color="8EA9DB"/>
+              <w:right w:val="single" w:sz="4" w:space="0" w:color="8EA9DB"/>
+            </w:tcBorders>
+            <w:tcMar>
+              <w:top w:w="60" w:type="dxa"/>
+              <w:left w:w="100" w:type="dxa"/>
+              <w:bottom w:w="60" w:type="dxa"/>
+              <w:right w:w="100" w:type="dxa"/>
+            </w:tcMar>
+            <w:vAlign w:val="center"/>
+          </w:tcPr>
+          <w:p>
+            <w:r>
+              <w:rPr>
+                <w:sz w:val="19"/>
+                <w:szCs w:val="19"/>
+              </w:rPr>
               <w:t>0</w:t>
-            </w:r>
-          </w:p>
-        </w:tc>
-        <w:tc>
-          <w:tcPr>
-            <w:tcW w:w="1500" w:type="dxa"/>
-            <w:tcBorders>
-              <w:top w:val="single" w:sz="4" w:space="0" w:color="8EA9DB"/>
-              <w:left w:val="single" w:sz="4" w:space="0" w:color="8EA9DB"/>
-              <w:bottom w:val="single" w:sz="4" w:space="0" w:color="8EA9DB"/>
-              <w:right w:val="single" w:sz="4" w:space="0" w:color="8EA9DB"/>
-            </w:tcBorders>
-            <w:tcMar>
-              <w:top w:w="60" w:type="dxa"/>
-              <w:left w:w="100" w:type="dxa"/>
-              <w:bottom w:w="60" w:type="dxa"/>
-              <w:right w:w="100" w:type="dxa"/>
-            </w:tcMar>
-            <w:vAlign w:val="center"/>
-          </w:tcPr>
-          <w:p>
-            <w:r>
-              <w:rPr>
-                <w:sz w:val="19"/>
-                <w:szCs w:val="19"/>
-              </w:rPr>
-              <w:t>0</w:t>
-            </w:r>
-          </w:p>
-        </w:tc>
-        <w:tc>
-          <w:tcPr>
-            <w:tcW w:w="1500" w:type="dxa"/>
-            <w:tcBorders>
-              <w:top w:val="single" w:sz="4" w:space="0" w:color="8EA9DB"/>
-              <w:left w:val="single" w:sz="4" w:space="0" w:color="8EA9DB"/>
-              <w:bottom w:val="single" w:sz="4" w:space="0" w:color="8EA9DB"/>
-              <w:right w:val="single" w:sz="4" w:space="0" w:color="8EA9DB"/>
-            </w:tcBorders>
-            <w:tcMar>
-              <w:top w:w="60" w:type="dxa"/>
-              <w:left w:w="100" w:type="dxa"/>
-              <w:bottom w:w="60" w:type="dxa"/>
-              <w:right w:w="100" w:type="dxa"/>
-            </w:tcMar>
-            <w:vAlign w:val="center"/>
-          </w:tcPr>
-          <w:p>
-            <w:r>
-              <w:rPr>
-                <w:sz w:val="19"/>
-                <w:szCs w:val="19"/>
-              </w:rPr>
-              <w:t>10</w:t>
             </w:r>
           </w:p>
         </w:tc>
@@ -26480,7 +26590,7 @@
                 <w:sz w:val="19"/>
                 <w:szCs w:val="19"/>
               </w:rPr>
-              <w:t>7</w:t>
+              <w:t>8</w:t>
             </w:r>
           </w:p>
         </w:tc>
@@ -26534,7 +26644,7 @@
                 <w:sz w:val="19"/>
                 <w:szCs w:val="19"/>
               </w:rPr>
-              <w:t>1</w:t>
+              <w:t>0</w:t>
             </w:r>
           </w:p>
         </w:tc>
@@ -26644,7 +26754,7 @@
                 <w:sz w:val="19"/>
                 <w:szCs w:val="19"/>
               </w:rPr>
-              <w:t>0</w:t>
+              <w:t>5</w:t>
             </w:r>
           </w:p>
         </w:tc>
@@ -26671,7 +26781,7 @@
                 <w:sz w:val="19"/>
                 <w:szCs w:val="19"/>
               </w:rPr>
-              <w:t>0</w:t>
+              <w:t>3</w:t>
             </w:r>
           </w:p>
         </w:tc>
@@ -26698,7 +26808,7 @@
                 <w:sz w:val="19"/>
                 <w:szCs w:val="19"/>
               </w:rPr>
-              <w:t>9</w:t>
+              <w:t>1</w:t>
             </w:r>
           </w:p>
         </w:tc>
@@ -26808,7 +26918,7 @@
                 <w:sz w:val="19"/>
                 <w:szCs w:val="19"/>
               </w:rPr>
-              <w:t>53</w:t>
+              <w:t>99</w:t>
             </w:r>
           </w:p>
         </w:tc>
@@ -26835,7 +26945,7 @@
                 <w:sz w:val="19"/>
                 <w:szCs w:val="19"/>
               </w:rPr>
-              <w:t>29</w:t>
+              <w:t>47</w:t>
             </w:r>
           </w:p>
         </w:tc>
@@ -26862,7 +26972,7 @@
                 <w:sz w:val="19"/>
                 <w:szCs w:val="19"/>
               </w:rPr>
-              <w:t>107</w:t>
+              <w:t>43</w:t>
             </w:r>
           </w:p>
         </w:tc>
@@ -26901,7 +27011,27 @@
         <w:jc w:val="both"/>
       </w:pPr>
       <w:r>
-        <w:t>Koşulan test case oranı: %43 — Başarı oranı (PASSED / koşulan): %65.</w:t>
+        <w:t>Koşulan test case oranı: %76 — Başarı oranı (PASSED / koşulan): %68.</w:t>
+      </w:r>
+    </w:p>
+    <w:p>
+      <w:pPr>
+        <w:pStyle w:val="ListeParagraf"/>
+        <w:numPr>
+          <w:ilvl w:val="0"/>
+          <w:numId w:val="2"/>
+        </w:numPr>
+        <w:spacing w:after="60"/>
+      </w:pPr>
+      <w:r>
+        <w:rPr>
+          <w:b/>
+          <w:bCs/>
+        </w:rPr>
+        <w:t xml:space="preserve">Admin koşumu: </w:t>
+      </w:r>
+      <w:r>
+        <w:t>Eğitmen tarafından paylaşılan admin hesabı (mehmet@admin.com) ile 15.10.2026’da admin paneli test case’leri koşulmuştur. Ortak test ortamını korumak için oluşturma / güncelleme / silme senaryoları yalnızca bu koşum için oluşturulan test verisi (“QA YK …” ürünleri, QAYKTEST / QAYKBAGLI kategorileri, “QA YK Ek” ilaveleri) üzerinde yapılmış; mevcut kayıtlara dokunulmamıştır.</w:t>
       </w:r>
     </w:p>
     <w:p>
@@ -26921,7 +27051,7 @@
         <w:t xml:space="preserve">BLOCKED nedeni: </w:t>
       </w:r>
       <w:r>
-        <w:t>Admin paneli User Story’leri (US_03, US_04, US_10–US_19, US_21) ve Admin onayı gerektiren sipariş durumları (CONFIRMED / DELIVERED) için test ortamında Admin hesabı paylaşılmamıştır. Swagger’daki POST /auth/registerAdmin uç noktası yetki istemektedir (401 Unauthorized), bu nedenle Admin hesabı oluşturulamamıştır. Admin bilgisi eğitmenden talep edilmiştir; bilgi geldiğinde bu test case’ler aynı Test Execution içinde koşulacaktır.</w:t>
+        <w:t>Kalan BLOCKED test case’ler (US_03, US_04, US_10/US_11 silme, US_12 statü değişimi, US_21 mesaj silme ve CONFIRMED / DELIVERED sipariş gerektiren US_08 / US_09 senaryoları) şifre girişi, yeni hesap oluşturma veya paylaşımlı veride kalıcı değişiklik gerektirdiğinden test eden tarafından ayrıca manuel koşulacaktır.</w:t>
       </w:r>
     </w:p>
     <w:p>
@@ -26948,7 +27078,7 @@
       <w:pPr>
         <w:pStyle w:val="Balk2"/>
       </w:pPr>
-      <w:bookmarkStart w:id="48" w:name="_Toc242540483"/>
+      <w:bookmarkStart w:id="48" w:name="_Toc242922321"/>
       <w:r>
         <w:t>17.2 Otomasyon Koşum Özeti</w:t>
       </w:r>
@@ -27579,7 +27709,7 @@
       <w:pPr>
         <w:pStyle w:val="Balk2"/>
       </w:pPr>
-      <w:bookmarkStart w:id="49" w:name="_Toc242540484"/>
+      <w:bookmarkStart w:id="49" w:name="_Toc242922322"/>
       <w:r>
         <w:t>17.3 Bulunan Hatalar (JIRA – SCRUM)</w:t>
       </w:r>
@@ -31469,6 +31599,1436 @@
           </w:p>
         </w:tc>
       </w:tr>
+      <w:tr>
+        <w:tc>
+          <w:tcPr>
+            <w:tcW w:w="1300" w:type="dxa"/>
+            <w:tcBorders>
+              <w:top w:val="single" w:sz="4" w:space="0" w:color="8EA9DB"/>
+              <w:left w:val="single" w:sz="4" w:space="0" w:color="8EA9DB"/>
+              <w:bottom w:val="single" w:sz="4" w:space="0" w:color="8EA9DB"/>
+              <w:right w:val="single" w:sz="4" w:space="0" w:color="8EA9DB"/>
+            </w:tcBorders>
+            <w:tcMar>
+              <w:top w:w="60" w:type="dxa"/>
+              <w:left w:w="100" w:type="dxa"/>
+              <w:bottom w:w="60" w:type="dxa"/>
+              <w:right w:w="100" w:type="dxa"/>
+            </w:tcMar>
+            <w:vAlign w:val="center"/>
+          </w:tcPr>
+          <w:p>
+            <w:r>
+              <w:rPr>
+                <w:sz w:val="19"/>
+                <w:szCs w:val="19"/>
+              </w:rPr>
+              <w:t>SCRUM-257</w:t>
+            </w:r>
+          </w:p>
+        </w:tc>
+        <w:tc>
+          <w:tcPr>
+            <w:tcW w:w="1100" w:type="dxa"/>
+            <w:tcBorders>
+              <w:top w:val="single" w:sz="4" w:space="0" w:color="8EA9DB"/>
+              <w:left w:val="single" w:sz="4" w:space="0" w:color="8EA9DB"/>
+              <w:bottom w:val="single" w:sz="4" w:space="0" w:color="8EA9DB"/>
+              <w:right w:val="single" w:sz="4" w:space="0" w:color="8EA9DB"/>
+            </w:tcBorders>
+            <w:tcMar>
+              <w:top w:w="60" w:type="dxa"/>
+              <w:left w:w="100" w:type="dxa"/>
+              <w:bottom w:w="60" w:type="dxa"/>
+              <w:right w:w="100" w:type="dxa"/>
+            </w:tcMar>
+            <w:vAlign w:val="center"/>
+          </w:tcPr>
+          <w:p>
+            <w:r>
+              <w:rPr>
+                <w:sz w:val="19"/>
+                <w:szCs w:val="19"/>
+              </w:rPr>
+              <w:t>High</w:t>
+            </w:r>
+          </w:p>
+        </w:tc>
+        <w:tc>
+          <w:tcPr>
+            <w:tcW w:w="1100" w:type="dxa"/>
+            <w:tcBorders>
+              <w:top w:val="single" w:sz="4" w:space="0" w:color="8EA9DB"/>
+              <w:left w:val="single" w:sz="4" w:space="0" w:color="8EA9DB"/>
+              <w:bottom w:val="single" w:sz="4" w:space="0" w:color="8EA9DB"/>
+              <w:right w:val="single" w:sz="4" w:space="0" w:color="8EA9DB"/>
+            </w:tcBorders>
+            <w:tcMar>
+              <w:top w:w="60" w:type="dxa"/>
+              <w:left w:w="100" w:type="dxa"/>
+              <w:bottom w:w="60" w:type="dxa"/>
+              <w:right w:w="100" w:type="dxa"/>
+            </w:tcMar>
+            <w:vAlign w:val="center"/>
+          </w:tcPr>
+          <w:p>
+            <w:r>
+              <w:rPr>
+                <w:sz w:val="19"/>
+                <w:szCs w:val="19"/>
+              </w:rPr>
+              <w:t>US_16</w:t>
+            </w:r>
+          </w:p>
+        </w:tc>
+        <w:tc>
+          <w:tcPr>
+            <w:tcW w:w="6138" w:type="dxa"/>
+            <w:tcBorders>
+              <w:top w:val="single" w:sz="4" w:space="0" w:color="8EA9DB"/>
+              <w:left w:val="single" w:sz="4" w:space="0" w:color="8EA9DB"/>
+              <w:bottom w:val="single" w:sz="4" w:space="0" w:color="8EA9DB"/>
+              <w:right w:val="single" w:sz="4" w:space="0" w:color="8EA9DB"/>
+            </w:tcBorders>
+            <w:tcMar>
+              <w:top w:w="60" w:type="dxa"/>
+              <w:left w:w="100" w:type="dxa"/>
+              <w:bottom w:w="60" w:type="dxa"/>
+              <w:right w:w="100" w:type="dxa"/>
+            </w:tcMar>
+            <w:vAlign w:val="center"/>
+          </w:tcPr>
+          <w:p>
+            <w:r>
+              <w:rPr>
+                <w:sz w:val="19"/>
+                <w:szCs w:val="19"/>
+              </w:rPr>
+              <w:t>Admin ürün silme isteği yanlış sunucuya gidiyor (DELETE /api/products/{id} → 404)</w:t>
+            </w:r>
+          </w:p>
+        </w:tc>
+      </w:tr>
+      <w:tr>
+        <w:tc>
+          <w:tcPr>
+            <w:tcW w:w="1300" w:type="dxa"/>
+            <w:tcBorders>
+              <w:top w:val="single" w:sz="4" w:space="0" w:color="8EA9DB"/>
+              <w:left w:val="single" w:sz="4" w:space="0" w:color="8EA9DB"/>
+              <w:bottom w:val="single" w:sz="4" w:space="0" w:color="8EA9DB"/>
+              <w:right w:val="single" w:sz="4" w:space="0" w:color="8EA9DB"/>
+            </w:tcBorders>
+            <w:tcMar>
+              <w:top w:w="60" w:type="dxa"/>
+              <w:left w:w="100" w:type="dxa"/>
+              <w:bottom w:w="60" w:type="dxa"/>
+              <w:right w:w="100" w:type="dxa"/>
+            </w:tcMar>
+            <w:vAlign w:val="center"/>
+          </w:tcPr>
+          <w:p>
+            <w:r>
+              <w:rPr>
+                <w:sz w:val="19"/>
+                <w:szCs w:val="19"/>
+              </w:rPr>
+              <w:t>SCRUM-258</w:t>
+            </w:r>
+          </w:p>
+        </w:tc>
+        <w:tc>
+          <w:tcPr>
+            <w:tcW w:w="1100" w:type="dxa"/>
+            <w:tcBorders>
+              <w:top w:val="single" w:sz="4" w:space="0" w:color="8EA9DB"/>
+              <w:left w:val="single" w:sz="4" w:space="0" w:color="8EA9DB"/>
+              <w:bottom w:val="single" w:sz="4" w:space="0" w:color="8EA9DB"/>
+              <w:right w:val="single" w:sz="4" w:space="0" w:color="8EA9DB"/>
+            </w:tcBorders>
+            <w:tcMar>
+              <w:top w:w="60" w:type="dxa"/>
+              <w:left w:w="100" w:type="dxa"/>
+              <w:bottom w:w="60" w:type="dxa"/>
+              <w:right w:w="100" w:type="dxa"/>
+            </w:tcMar>
+            <w:vAlign w:val="center"/>
+          </w:tcPr>
+          <w:p>
+            <w:r>
+              <w:rPr>
+                <w:sz w:val="19"/>
+                <w:szCs w:val="19"/>
+              </w:rPr>
+              <w:t>Medium</w:t>
+            </w:r>
+          </w:p>
+        </w:tc>
+        <w:tc>
+          <w:tcPr>
+            <w:tcW w:w="1100" w:type="dxa"/>
+            <w:tcBorders>
+              <w:top w:val="single" w:sz="4" w:space="0" w:color="8EA9DB"/>
+              <w:left w:val="single" w:sz="4" w:space="0" w:color="8EA9DB"/>
+              <w:bottom w:val="single" w:sz="4" w:space="0" w:color="8EA9DB"/>
+              <w:right w:val="single" w:sz="4" w:space="0" w:color="8EA9DB"/>
+            </w:tcBorders>
+            <w:tcMar>
+              <w:top w:w="60" w:type="dxa"/>
+              <w:left w:w="100" w:type="dxa"/>
+              <w:bottom w:w="60" w:type="dxa"/>
+              <w:right w:w="100" w:type="dxa"/>
+            </w:tcMar>
+            <w:vAlign w:val="center"/>
+          </w:tcPr>
+          <w:p>
+            <w:r>
+              <w:rPr>
+                <w:sz w:val="19"/>
+                <w:szCs w:val="19"/>
+              </w:rPr>
+              <w:t>US_14</w:t>
+            </w:r>
+          </w:p>
+        </w:tc>
+        <w:tc>
+          <w:tcPr>
+            <w:tcW w:w="6138" w:type="dxa"/>
+            <w:tcBorders>
+              <w:top w:val="single" w:sz="4" w:space="0" w:color="8EA9DB"/>
+              <w:left w:val="single" w:sz="4" w:space="0" w:color="8EA9DB"/>
+              <w:bottom w:val="single" w:sz="4" w:space="0" w:color="8EA9DB"/>
+              <w:right w:val="single" w:sz="4" w:space="0" w:color="8EA9DB"/>
+            </w:tcBorders>
+            <w:tcMar>
+              <w:top w:w="60" w:type="dxa"/>
+              <w:left w:w="100" w:type="dxa"/>
+              <w:bottom w:w="60" w:type="dxa"/>
+              <w:right w:w="100" w:type="dxa"/>
+            </w:tcMar>
+            <w:vAlign w:val="center"/>
+          </w:tcPr>
+          <w:p>
+            <w:r>
+              <w:rPr>
+                <w:sz w:val="19"/>
+                <w:szCs w:val="19"/>
+              </w:rPr>
+              <w:t>Kategori seçilmeden yeni ürün eklenebiliyor</w:t>
+            </w:r>
+          </w:p>
+        </w:tc>
+      </w:tr>
+      <w:tr>
+        <w:tc>
+          <w:tcPr>
+            <w:tcW w:w="1300" w:type="dxa"/>
+            <w:tcBorders>
+              <w:top w:val="single" w:sz="4" w:space="0" w:color="8EA9DB"/>
+              <w:left w:val="single" w:sz="4" w:space="0" w:color="8EA9DB"/>
+              <w:bottom w:val="single" w:sz="4" w:space="0" w:color="8EA9DB"/>
+              <w:right w:val="single" w:sz="4" w:space="0" w:color="8EA9DB"/>
+            </w:tcBorders>
+            <w:tcMar>
+              <w:top w:w="60" w:type="dxa"/>
+              <w:left w:w="100" w:type="dxa"/>
+              <w:bottom w:w="60" w:type="dxa"/>
+              <w:right w:w="100" w:type="dxa"/>
+            </w:tcMar>
+            <w:vAlign w:val="center"/>
+          </w:tcPr>
+          <w:p>
+            <w:r>
+              <w:rPr>
+                <w:sz w:val="19"/>
+                <w:szCs w:val="19"/>
+              </w:rPr>
+              <w:t>SCRUM-259</w:t>
+            </w:r>
+          </w:p>
+        </w:tc>
+        <w:tc>
+          <w:tcPr>
+            <w:tcW w:w="1100" w:type="dxa"/>
+            <w:tcBorders>
+              <w:top w:val="single" w:sz="4" w:space="0" w:color="8EA9DB"/>
+              <w:left w:val="single" w:sz="4" w:space="0" w:color="8EA9DB"/>
+              <w:bottom w:val="single" w:sz="4" w:space="0" w:color="8EA9DB"/>
+              <w:right w:val="single" w:sz="4" w:space="0" w:color="8EA9DB"/>
+            </w:tcBorders>
+            <w:tcMar>
+              <w:top w:w="60" w:type="dxa"/>
+              <w:left w:w="100" w:type="dxa"/>
+              <w:bottom w:w="60" w:type="dxa"/>
+              <w:right w:w="100" w:type="dxa"/>
+            </w:tcMar>
+            <w:vAlign w:val="center"/>
+          </w:tcPr>
+          <w:p>
+            <w:r>
+              <w:rPr>
+                <w:sz w:val="19"/>
+                <w:szCs w:val="19"/>
+              </w:rPr>
+              <w:t>Medium</w:t>
+            </w:r>
+          </w:p>
+        </w:tc>
+        <w:tc>
+          <w:tcPr>
+            <w:tcW w:w="1100" w:type="dxa"/>
+            <w:tcBorders>
+              <w:top w:val="single" w:sz="4" w:space="0" w:color="8EA9DB"/>
+              <w:left w:val="single" w:sz="4" w:space="0" w:color="8EA9DB"/>
+              <w:bottom w:val="single" w:sz="4" w:space="0" w:color="8EA9DB"/>
+              <w:right w:val="single" w:sz="4" w:space="0" w:color="8EA9DB"/>
+            </w:tcBorders>
+            <w:tcMar>
+              <w:top w:w="60" w:type="dxa"/>
+              <w:left w:w="100" w:type="dxa"/>
+              <w:bottom w:w="60" w:type="dxa"/>
+              <w:right w:w="100" w:type="dxa"/>
+            </w:tcMar>
+            <w:vAlign w:val="center"/>
+          </w:tcPr>
+          <w:p>
+            <w:r>
+              <w:rPr>
+                <w:sz w:val="19"/>
+                <w:szCs w:val="19"/>
+              </w:rPr>
+              <w:t>US_14</w:t>
+            </w:r>
+          </w:p>
+        </w:tc>
+        <w:tc>
+          <w:tcPr>
+            <w:tcW w:w="6138" w:type="dxa"/>
+            <w:tcBorders>
+              <w:top w:val="single" w:sz="4" w:space="0" w:color="8EA9DB"/>
+              <w:left w:val="single" w:sz="4" w:space="0" w:color="8EA9DB"/>
+              <w:bottom w:val="single" w:sz="4" w:space="0" w:color="8EA9DB"/>
+              <w:right w:val="single" w:sz="4" w:space="0" w:color="8EA9DB"/>
+            </w:tcBorders>
+            <w:tcMar>
+              <w:top w:w="60" w:type="dxa"/>
+              <w:left w:w="100" w:type="dxa"/>
+              <w:bottom w:w="60" w:type="dxa"/>
+              <w:right w:w="100" w:type="dxa"/>
+            </w:tcMar>
+            <w:vAlign w:val="center"/>
+          </w:tcPr>
+          <w:p>
+            <w:r>
+              <w:rPr>
+                <w:sz w:val="19"/>
+                <w:szCs w:val="19"/>
+              </w:rPr>
+              <w:t>İndirim fiyattan büyük girilebiliyor; indirim fiyata yansımıyor</w:t>
+            </w:r>
+          </w:p>
+        </w:tc>
+      </w:tr>
+      <w:tr>
+        <w:tc>
+          <w:tcPr>
+            <w:tcW w:w="1300" w:type="dxa"/>
+            <w:tcBorders>
+              <w:top w:val="single" w:sz="4" w:space="0" w:color="8EA9DB"/>
+              <w:left w:val="single" w:sz="4" w:space="0" w:color="8EA9DB"/>
+              <w:bottom w:val="single" w:sz="4" w:space="0" w:color="8EA9DB"/>
+              <w:right w:val="single" w:sz="4" w:space="0" w:color="8EA9DB"/>
+            </w:tcBorders>
+            <w:tcMar>
+              <w:top w:w="60" w:type="dxa"/>
+              <w:left w:w="100" w:type="dxa"/>
+              <w:bottom w:w="60" w:type="dxa"/>
+              <w:right w:w="100" w:type="dxa"/>
+            </w:tcMar>
+            <w:vAlign w:val="center"/>
+          </w:tcPr>
+          <w:p>
+            <w:r>
+              <w:rPr>
+                <w:sz w:val="19"/>
+                <w:szCs w:val="19"/>
+              </w:rPr>
+              <w:t>SCRUM-260</w:t>
+            </w:r>
+          </w:p>
+        </w:tc>
+        <w:tc>
+          <w:tcPr>
+            <w:tcW w:w="1100" w:type="dxa"/>
+            <w:tcBorders>
+              <w:top w:val="single" w:sz="4" w:space="0" w:color="8EA9DB"/>
+              <w:left w:val="single" w:sz="4" w:space="0" w:color="8EA9DB"/>
+              <w:bottom w:val="single" w:sz="4" w:space="0" w:color="8EA9DB"/>
+              <w:right w:val="single" w:sz="4" w:space="0" w:color="8EA9DB"/>
+            </w:tcBorders>
+            <w:tcMar>
+              <w:top w:w="60" w:type="dxa"/>
+              <w:left w:w="100" w:type="dxa"/>
+              <w:bottom w:w="60" w:type="dxa"/>
+              <w:right w:w="100" w:type="dxa"/>
+            </w:tcMar>
+            <w:vAlign w:val="center"/>
+          </w:tcPr>
+          <w:p>
+            <w:r>
+              <w:rPr>
+                <w:sz w:val="19"/>
+                <w:szCs w:val="19"/>
+              </w:rPr>
+              <w:t>Low</w:t>
+            </w:r>
+          </w:p>
+        </w:tc>
+        <w:tc>
+          <w:tcPr>
+            <w:tcW w:w="1100" w:type="dxa"/>
+            <w:tcBorders>
+              <w:top w:val="single" w:sz="4" w:space="0" w:color="8EA9DB"/>
+              <w:left w:val="single" w:sz="4" w:space="0" w:color="8EA9DB"/>
+              <w:bottom w:val="single" w:sz="4" w:space="0" w:color="8EA9DB"/>
+              <w:right w:val="single" w:sz="4" w:space="0" w:color="8EA9DB"/>
+            </w:tcBorders>
+            <w:tcMar>
+              <w:top w:w="60" w:type="dxa"/>
+              <w:left w:w="100" w:type="dxa"/>
+              <w:bottom w:w="60" w:type="dxa"/>
+              <w:right w:w="100" w:type="dxa"/>
+            </w:tcMar>
+            <w:vAlign w:val="center"/>
+          </w:tcPr>
+          <w:p>
+            <w:r>
+              <w:rPr>
+                <w:sz w:val="19"/>
+                <w:szCs w:val="19"/>
+              </w:rPr>
+              <w:t>US_15</w:t>
+            </w:r>
+          </w:p>
+        </w:tc>
+        <w:tc>
+          <w:tcPr>
+            <w:tcW w:w="6138" w:type="dxa"/>
+            <w:tcBorders>
+              <w:top w:val="single" w:sz="4" w:space="0" w:color="8EA9DB"/>
+              <w:left w:val="single" w:sz="4" w:space="0" w:color="8EA9DB"/>
+              <w:bottom w:val="single" w:sz="4" w:space="0" w:color="8EA9DB"/>
+              <w:right w:val="single" w:sz="4" w:space="0" w:color="8EA9DB"/>
+            </w:tcBorders>
+            <w:tcMar>
+              <w:top w:w="60" w:type="dxa"/>
+              <w:left w:w="100" w:type="dxa"/>
+              <w:bottom w:w="60" w:type="dxa"/>
+              <w:right w:w="100" w:type="dxa"/>
+            </w:tcMar>
+            <w:vAlign w:val="center"/>
+          </w:tcPr>
+          <w:p>
+            <w:r>
+              <w:rPr>
+                <w:sz w:val="19"/>
+                <w:szCs w:val="19"/>
+              </w:rPr>
+              <w:t>Ürün Düzenleme formunda “Active” seçeneği yok</w:t>
+            </w:r>
+          </w:p>
+        </w:tc>
+      </w:tr>
+      <w:tr>
+        <w:tc>
+          <w:tcPr>
+            <w:tcW w:w="1300" w:type="dxa"/>
+            <w:tcBorders>
+              <w:top w:val="single" w:sz="4" w:space="0" w:color="8EA9DB"/>
+              <w:left w:val="single" w:sz="4" w:space="0" w:color="8EA9DB"/>
+              <w:bottom w:val="single" w:sz="4" w:space="0" w:color="8EA9DB"/>
+              <w:right w:val="single" w:sz="4" w:space="0" w:color="8EA9DB"/>
+            </w:tcBorders>
+            <w:tcMar>
+              <w:top w:w="60" w:type="dxa"/>
+              <w:left w:w="100" w:type="dxa"/>
+              <w:bottom w:w="60" w:type="dxa"/>
+              <w:right w:w="100" w:type="dxa"/>
+            </w:tcMar>
+            <w:vAlign w:val="center"/>
+          </w:tcPr>
+          <w:p>
+            <w:r>
+              <w:rPr>
+                <w:sz w:val="19"/>
+                <w:szCs w:val="19"/>
+              </w:rPr>
+              <w:t>SCRUM-261</w:t>
+            </w:r>
+          </w:p>
+        </w:tc>
+        <w:tc>
+          <w:tcPr>
+            <w:tcW w:w="1100" w:type="dxa"/>
+            <w:tcBorders>
+              <w:top w:val="single" w:sz="4" w:space="0" w:color="8EA9DB"/>
+              <w:left w:val="single" w:sz="4" w:space="0" w:color="8EA9DB"/>
+              <w:bottom w:val="single" w:sz="4" w:space="0" w:color="8EA9DB"/>
+              <w:right w:val="single" w:sz="4" w:space="0" w:color="8EA9DB"/>
+            </w:tcBorders>
+            <w:tcMar>
+              <w:top w:w="60" w:type="dxa"/>
+              <w:left w:w="100" w:type="dxa"/>
+              <w:bottom w:w="60" w:type="dxa"/>
+              <w:right w:w="100" w:type="dxa"/>
+            </w:tcMar>
+            <w:vAlign w:val="center"/>
+          </w:tcPr>
+          <w:p>
+            <w:r>
+              <w:rPr>
+                <w:sz w:val="19"/>
+                <w:szCs w:val="19"/>
+              </w:rPr>
+              <w:t>Medium</w:t>
+            </w:r>
+          </w:p>
+        </w:tc>
+        <w:tc>
+          <w:tcPr>
+            <w:tcW w:w="1100" w:type="dxa"/>
+            <w:tcBorders>
+              <w:top w:val="single" w:sz="4" w:space="0" w:color="8EA9DB"/>
+              <w:left w:val="single" w:sz="4" w:space="0" w:color="8EA9DB"/>
+              <w:bottom w:val="single" w:sz="4" w:space="0" w:color="8EA9DB"/>
+              <w:right w:val="single" w:sz="4" w:space="0" w:color="8EA9DB"/>
+            </w:tcBorders>
+            <w:tcMar>
+              <w:top w:w="60" w:type="dxa"/>
+              <w:left w:w="100" w:type="dxa"/>
+              <w:bottom w:w="60" w:type="dxa"/>
+              <w:right w:w="100" w:type="dxa"/>
+            </w:tcMar>
+            <w:vAlign w:val="center"/>
+          </w:tcPr>
+          <w:p>
+            <w:r>
+              <w:rPr>
+                <w:sz w:val="19"/>
+                <w:szCs w:val="19"/>
+              </w:rPr>
+              <w:t>US_19</w:t>
+            </w:r>
+          </w:p>
+        </w:tc>
+        <w:tc>
+          <w:tcPr>
+            <w:tcW w:w="6138" w:type="dxa"/>
+            <w:tcBorders>
+              <w:top w:val="single" w:sz="4" w:space="0" w:color="8EA9DB"/>
+              <w:left w:val="single" w:sz="4" w:space="0" w:color="8EA9DB"/>
+              <w:bottom w:val="single" w:sz="4" w:space="0" w:color="8EA9DB"/>
+              <w:right w:val="single" w:sz="4" w:space="0" w:color="8EA9DB"/>
+            </w:tcBorders>
+            <w:tcMar>
+              <w:top w:w="60" w:type="dxa"/>
+              <w:left w:w="100" w:type="dxa"/>
+              <w:bottom w:w="60" w:type="dxa"/>
+              <w:right w:w="100" w:type="dxa"/>
+            </w:tcMar>
+            <w:vAlign w:val="center"/>
+          </w:tcPr>
+          <w:p>
+            <w:r>
+              <w:rPr>
+                <w:sz w:val="19"/>
+                <w:szCs w:val="19"/>
+              </w:rPr>
+              <w:t>Name / Description boş ilave (addition) kaydedilebiliyor</w:t>
+            </w:r>
+          </w:p>
+        </w:tc>
+      </w:tr>
+      <w:tr>
+        <w:tc>
+          <w:tcPr>
+            <w:tcW w:w="1300" w:type="dxa"/>
+            <w:tcBorders>
+              <w:top w:val="single" w:sz="4" w:space="0" w:color="8EA9DB"/>
+              <w:left w:val="single" w:sz="4" w:space="0" w:color="8EA9DB"/>
+              <w:bottom w:val="single" w:sz="4" w:space="0" w:color="8EA9DB"/>
+              <w:right w:val="single" w:sz="4" w:space="0" w:color="8EA9DB"/>
+            </w:tcBorders>
+            <w:tcMar>
+              <w:top w:w="60" w:type="dxa"/>
+              <w:left w:w="100" w:type="dxa"/>
+              <w:bottom w:w="60" w:type="dxa"/>
+              <w:right w:w="100" w:type="dxa"/>
+            </w:tcMar>
+            <w:vAlign w:val="center"/>
+          </w:tcPr>
+          <w:p>
+            <w:r>
+              <w:rPr>
+                <w:sz w:val="19"/>
+                <w:szCs w:val="19"/>
+              </w:rPr>
+              <w:t>SCRUM-262</w:t>
+            </w:r>
+          </w:p>
+        </w:tc>
+        <w:tc>
+          <w:tcPr>
+            <w:tcW w:w="1100" w:type="dxa"/>
+            <w:tcBorders>
+              <w:top w:val="single" w:sz="4" w:space="0" w:color="8EA9DB"/>
+              <w:left w:val="single" w:sz="4" w:space="0" w:color="8EA9DB"/>
+              <w:bottom w:val="single" w:sz="4" w:space="0" w:color="8EA9DB"/>
+              <w:right w:val="single" w:sz="4" w:space="0" w:color="8EA9DB"/>
+            </w:tcBorders>
+            <w:tcMar>
+              <w:top w:w="60" w:type="dxa"/>
+              <w:left w:w="100" w:type="dxa"/>
+              <w:bottom w:w="60" w:type="dxa"/>
+              <w:right w:w="100" w:type="dxa"/>
+            </w:tcMar>
+            <w:vAlign w:val="center"/>
+          </w:tcPr>
+          <w:p>
+            <w:r>
+              <w:rPr>
+                <w:sz w:val="19"/>
+                <w:szCs w:val="19"/>
+              </w:rPr>
+              <w:t>Low</w:t>
+            </w:r>
+          </w:p>
+        </w:tc>
+        <w:tc>
+          <w:tcPr>
+            <w:tcW w:w="1100" w:type="dxa"/>
+            <w:tcBorders>
+              <w:top w:val="single" w:sz="4" w:space="0" w:color="8EA9DB"/>
+              <w:left w:val="single" w:sz="4" w:space="0" w:color="8EA9DB"/>
+              <w:bottom w:val="single" w:sz="4" w:space="0" w:color="8EA9DB"/>
+              <w:right w:val="single" w:sz="4" w:space="0" w:color="8EA9DB"/>
+            </w:tcBorders>
+            <w:tcMar>
+              <w:top w:w="60" w:type="dxa"/>
+              <w:left w:w="100" w:type="dxa"/>
+              <w:bottom w:w="60" w:type="dxa"/>
+              <w:right w:w="100" w:type="dxa"/>
+            </w:tcMar>
+            <w:vAlign w:val="center"/>
+          </w:tcPr>
+          <w:p>
+            <w:r>
+              <w:rPr>
+                <w:sz w:val="19"/>
+                <w:szCs w:val="19"/>
+              </w:rPr>
+              <w:t>US_19</w:t>
+            </w:r>
+          </w:p>
+        </w:tc>
+        <w:tc>
+          <w:tcPr>
+            <w:tcW w:w="6138" w:type="dxa"/>
+            <w:tcBorders>
+              <w:top w:val="single" w:sz="4" w:space="0" w:color="8EA9DB"/>
+              <w:left w:val="single" w:sz="4" w:space="0" w:color="8EA9DB"/>
+              <w:bottom w:val="single" w:sz="4" w:space="0" w:color="8EA9DB"/>
+              <w:right w:val="single" w:sz="4" w:space="0" w:color="8EA9DB"/>
+            </w:tcBorders>
+            <w:tcMar>
+              <w:top w:w="60" w:type="dxa"/>
+              <w:left w:w="100" w:type="dxa"/>
+              <w:bottom w:w="60" w:type="dxa"/>
+              <w:right w:w="100" w:type="dxa"/>
+            </w:tcMar>
+            <w:vAlign w:val="center"/>
+          </w:tcPr>
+          <w:p>
+            <w:r>
+              <w:rPr>
+                <w:sz w:val="19"/>
+                <w:szCs w:val="19"/>
+              </w:rPr>
+              <w:t>Price / Category eksik ilave eklemede uyarı yok (sessiz hata)</w:t>
+            </w:r>
+          </w:p>
+        </w:tc>
+      </w:tr>
+      <w:tr>
+        <w:tc>
+          <w:tcPr>
+            <w:tcW w:w="1300" w:type="dxa"/>
+            <w:tcBorders>
+              <w:top w:val="single" w:sz="4" w:space="0" w:color="8EA9DB"/>
+              <w:left w:val="single" w:sz="4" w:space="0" w:color="8EA9DB"/>
+              <w:bottom w:val="single" w:sz="4" w:space="0" w:color="8EA9DB"/>
+              <w:right w:val="single" w:sz="4" w:space="0" w:color="8EA9DB"/>
+            </w:tcBorders>
+            <w:tcMar>
+              <w:top w:w="60" w:type="dxa"/>
+              <w:left w:w="100" w:type="dxa"/>
+              <w:bottom w:w="60" w:type="dxa"/>
+              <w:right w:w="100" w:type="dxa"/>
+            </w:tcMar>
+            <w:vAlign w:val="center"/>
+          </w:tcPr>
+          <w:p>
+            <w:r>
+              <w:rPr>
+                <w:sz w:val="19"/>
+                <w:szCs w:val="19"/>
+              </w:rPr>
+              <w:t>SCRUM-263</w:t>
+            </w:r>
+          </w:p>
+        </w:tc>
+        <w:tc>
+          <w:tcPr>
+            <w:tcW w:w="1100" w:type="dxa"/>
+            <w:tcBorders>
+              <w:top w:val="single" w:sz="4" w:space="0" w:color="8EA9DB"/>
+              <w:left w:val="single" w:sz="4" w:space="0" w:color="8EA9DB"/>
+              <w:bottom w:val="single" w:sz="4" w:space="0" w:color="8EA9DB"/>
+              <w:right w:val="single" w:sz="4" w:space="0" w:color="8EA9DB"/>
+            </w:tcBorders>
+            <w:tcMar>
+              <w:top w:w="60" w:type="dxa"/>
+              <w:left w:w="100" w:type="dxa"/>
+              <w:bottom w:w="60" w:type="dxa"/>
+              <w:right w:w="100" w:type="dxa"/>
+            </w:tcMar>
+            <w:vAlign w:val="center"/>
+          </w:tcPr>
+          <w:p>
+            <w:r>
+              <w:rPr>
+                <w:sz w:val="19"/>
+                <w:szCs w:val="19"/>
+              </w:rPr>
+              <w:t>Medium</w:t>
+            </w:r>
+          </w:p>
+        </w:tc>
+        <w:tc>
+          <w:tcPr>
+            <w:tcW w:w="1100" w:type="dxa"/>
+            <w:tcBorders>
+              <w:top w:val="single" w:sz="4" w:space="0" w:color="8EA9DB"/>
+              <w:left w:val="single" w:sz="4" w:space="0" w:color="8EA9DB"/>
+              <w:bottom w:val="single" w:sz="4" w:space="0" w:color="8EA9DB"/>
+              <w:right w:val="single" w:sz="4" w:space="0" w:color="8EA9DB"/>
+            </w:tcBorders>
+            <w:tcMar>
+              <w:top w:w="60" w:type="dxa"/>
+              <w:left w:w="100" w:type="dxa"/>
+              <w:bottom w:w="60" w:type="dxa"/>
+              <w:right w:w="100" w:type="dxa"/>
+            </w:tcMar>
+            <w:vAlign w:val="center"/>
+          </w:tcPr>
+          <w:p>
+            <w:r>
+              <w:rPr>
+                <w:sz w:val="19"/>
+                <w:szCs w:val="19"/>
+              </w:rPr>
+              <w:t>US_21</w:t>
+            </w:r>
+          </w:p>
+        </w:tc>
+        <w:tc>
+          <w:tcPr>
+            <w:tcW w:w="6138" w:type="dxa"/>
+            <w:tcBorders>
+              <w:top w:val="single" w:sz="4" w:space="0" w:color="8EA9DB"/>
+              <w:left w:val="single" w:sz="4" w:space="0" w:color="8EA9DB"/>
+              <w:bottom w:val="single" w:sz="4" w:space="0" w:color="8EA9DB"/>
+              <w:right w:val="single" w:sz="4" w:space="0" w:color="8EA9DB"/>
+            </w:tcBorders>
+            <w:tcMar>
+              <w:top w:w="60" w:type="dxa"/>
+              <w:left w:w="100" w:type="dxa"/>
+              <w:bottom w:w="60" w:type="dxa"/>
+              <w:right w:w="100" w:type="dxa"/>
+            </w:tcMar>
+            <w:vAlign w:val="center"/>
+          </w:tcPr>
+          <w:p>
+            <w:r>
+              <w:rPr>
+                <w:sz w:val="19"/>
+                <w:szCs w:val="19"/>
+              </w:rPr>
+              <w:t>Support Requests “Email” filtresi çalışmıyor</w:t>
+            </w:r>
+          </w:p>
+        </w:tc>
+      </w:tr>
+      <w:tr>
+        <w:tc>
+          <w:tcPr>
+            <w:tcW w:w="1300" w:type="dxa"/>
+            <w:tcBorders>
+              <w:top w:val="single" w:sz="4" w:space="0" w:color="8EA9DB"/>
+              <w:left w:val="single" w:sz="4" w:space="0" w:color="8EA9DB"/>
+              <w:bottom w:val="single" w:sz="4" w:space="0" w:color="8EA9DB"/>
+              <w:right w:val="single" w:sz="4" w:space="0" w:color="8EA9DB"/>
+            </w:tcBorders>
+            <w:tcMar>
+              <w:top w:w="60" w:type="dxa"/>
+              <w:left w:w="100" w:type="dxa"/>
+              <w:bottom w:w="60" w:type="dxa"/>
+              <w:right w:w="100" w:type="dxa"/>
+            </w:tcMar>
+            <w:vAlign w:val="center"/>
+          </w:tcPr>
+          <w:p>
+            <w:r>
+              <w:rPr>
+                <w:sz w:val="19"/>
+                <w:szCs w:val="19"/>
+              </w:rPr>
+              <w:t>SCRUM-264</w:t>
+            </w:r>
+          </w:p>
+        </w:tc>
+        <w:tc>
+          <w:tcPr>
+            <w:tcW w:w="1100" w:type="dxa"/>
+            <w:tcBorders>
+              <w:top w:val="single" w:sz="4" w:space="0" w:color="8EA9DB"/>
+              <w:left w:val="single" w:sz="4" w:space="0" w:color="8EA9DB"/>
+              <w:bottom w:val="single" w:sz="4" w:space="0" w:color="8EA9DB"/>
+              <w:right w:val="single" w:sz="4" w:space="0" w:color="8EA9DB"/>
+            </w:tcBorders>
+            <w:tcMar>
+              <w:top w:w="60" w:type="dxa"/>
+              <w:left w:w="100" w:type="dxa"/>
+              <w:bottom w:w="60" w:type="dxa"/>
+              <w:right w:w="100" w:type="dxa"/>
+            </w:tcMar>
+            <w:vAlign w:val="center"/>
+          </w:tcPr>
+          <w:p>
+            <w:r>
+              <w:rPr>
+                <w:sz w:val="19"/>
+                <w:szCs w:val="19"/>
+              </w:rPr>
+              <w:t>Medium</w:t>
+            </w:r>
+          </w:p>
+        </w:tc>
+        <w:tc>
+          <w:tcPr>
+            <w:tcW w:w="1100" w:type="dxa"/>
+            <w:tcBorders>
+              <w:top w:val="single" w:sz="4" w:space="0" w:color="8EA9DB"/>
+              <w:left w:val="single" w:sz="4" w:space="0" w:color="8EA9DB"/>
+              <w:bottom w:val="single" w:sz="4" w:space="0" w:color="8EA9DB"/>
+              <w:right w:val="single" w:sz="4" w:space="0" w:color="8EA9DB"/>
+            </w:tcBorders>
+            <w:tcMar>
+              <w:top w:w="60" w:type="dxa"/>
+              <w:left w:w="100" w:type="dxa"/>
+              <w:bottom w:w="60" w:type="dxa"/>
+              <w:right w:w="100" w:type="dxa"/>
+            </w:tcMar>
+            <w:vAlign w:val="center"/>
+          </w:tcPr>
+          <w:p>
+            <w:r>
+              <w:rPr>
+                <w:sz w:val="19"/>
+                <w:szCs w:val="19"/>
+              </w:rPr>
+              <w:t>US_12</w:t>
+            </w:r>
+          </w:p>
+        </w:tc>
+        <w:tc>
+          <w:tcPr>
+            <w:tcW w:w="6138" w:type="dxa"/>
+            <w:tcBorders>
+              <w:top w:val="single" w:sz="4" w:space="0" w:color="8EA9DB"/>
+              <w:left w:val="single" w:sz="4" w:space="0" w:color="8EA9DB"/>
+              <w:bottom w:val="single" w:sz="4" w:space="0" w:color="8EA9DB"/>
+              <w:right w:val="single" w:sz="4" w:space="0" w:color="8EA9DB"/>
+            </w:tcBorders>
+            <w:tcMar>
+              <w:top w:w="60" w:type="dxa"/>
+              <w:left w:w="100" w:type="dxa"/>
+              <w:bottom w:w="60" w:type="dxa"/>
+              <w:right w:w="100" w:type="dxa"/>
+            </w:tcMar>
+            <w:vAlign w:val="center"/>
+          </w:tcPr>
+          <w:p>
+            <w:r>
+              <w:rPr>
+                <w:sz w:val="19"/>
+                <w:szCs w:val="19"/>
+              </w:rPr>
+              <w:t>CANCELED sipariş admin panelinde PENDING görünüyor, CANCELED seçeneği yok</w:t>
+            </w:r>
+          </w:p>
+        </w:tc>
+      </w:tr>
+      <w:tr>
+        <w:tc>
+          <w:tcPr>
+            <w:tcW w:w="1300" w:type="dxa"/>
+            <w:tcBorders>
+              <w:top w:val="single" w:sz="4" w:space="0" w:color="8EA9DB"/>
+              <w:left w:val="single" w:sz="4" w:space="0" w:color="8EA9DB"/>
+              <w:bottom w:val="single" w:sz="4" w:space="0" w:color="8EA9DB"/>
+              <w:right w:val="single" w:sz="4" w:space="0" w:color="8EA9DB"/>
+            </w:tcBorders>
+            <w:tcMar>
+              <w:top w:w="60" w:type="dxa"/>
+              <w:left w:w="100" w:type="dxa"/>
+              <w:bottom w:w="60" w:type="dxa"/>
+              <w:right w:w="100" w:type="dxa"/>
+            </w:tcMar>
+            <w:vAlign w:val="center"/>
+          </w:tcPr>
+          <w:p>
+            <w:r>
+              <w:rPr>
+                <w:sz w:val="19"/>
+                <w:szCs w:val="19"/>
+              </w:rPr>
+              <w:t>SCRUM-265</w:t>
+            </w:r>
+          </w:p>
+        </w:tc>
+        <w:tc>
+          <w:tcPr>
+            <w:tcW w:w="1100" w:type="dxa"/>
+            <w:tcBorders>
+              <w:top w:val="single" w:sz="4" w:space="0" w:color="8EA9DB"/>
+              <w:left w:val="single" w:sz="4" w:space="0" w:color="8EA9DB"/>
+              <w:bottom w:val="single" w:sz="4" w:space="0" w:color="8EA9DB"/>
+              <w:right w:val="single" w:sz="4" w:space="0" w:color="8EA9DB"/>
+            </w:tcBorders>
+            <w:tcMar>
+              <w:top w:w="60" w:type="dxa"/>
+              <w:left w:w="100" w:type="dxa"/>
+              <w:bottom w:w="60" w:type="dxa"/>
+              <w:right w:w="100" w:type="dxa"/>
+            </w:tcMar>
+            <w:vAlign w:val="center"/>
+          </w:tcPr>
+          <w:p>
+            <w:r>
+              <w:rPr>
+                <w:sz w:val="19"/>
+                <w:szCs w:val="19"/>
+              </w:rPr>
+              <w:t>Medium</w:t>
+            </w:r>
+          </w:p>
+        </w:tc>
+        <w:tc>
+          <w:tcPr>
+            <w:tcW w:w="1100" w:type="dxa"/>
+            <w:tcBorders>
+              <w:top w:val="single" w:sz="4" w:space="0" w:color="8EA9DB"/>
+              <w:left w:val="single" w:sz="4" w:space="0" w:color="8EA9DB"/>
+              <w:bottom w:val="single" w:sz="4" w:space="0" w:color="8EA9DB"/>
+              <w:right w:val="single" w:sz="4" w:space="0" w:color="8EA9DB"/>
+            </w:tcBorders>
+            <w:tcMar>
+              <w:top w:w="60" w:type="dxa"/>
+              <w:left w:w="100" w:type="dxa"/>
+              <w:bottom w:w="60" w:type="dxa"/>
+              <w:right w:w="100" w:type="dxa"/>
+            </w:tcMar>
+            <w:vAlign w:val="center"/>
+          </w:tcPr>
+          <w:p>
+            <w:r>
+              <w:rPr>
+                <w:sz w:val="19"/>
+                <w:szCs w:val="19"/>
+              </w:rPr>
+              <w:t>US_18</w:t>
+            </w:r>
+          </w:p>
+        </w:tc>
+        <w:tc>
+          <w:tcPr>
+            <w:tcW w:w="6138" w:type="dxa"/>
+            <w:tcBorders>
+              <w:top w:val="single" w:sz="4" w:space="0" w:color="8EA9DB"/>
+              <w:left w:val="single" w:sz="4" w:space="0" w:color="8EA9DB"/>
+              <w:bottom w:val="single" w:sz="4" w:space="0" w:color="8EA9DB"/>
+              <w:right w:val="single" w:sz="4" w:space="0" w:color="8EA9DB"/>
+            </w:tcBorders>
+            <w:tcMar>
+              <w:top w:w="60" w:type="dxa"/>
+              <w:left w:w="100" w:type="dxa"/>
+              <w:bottom w:w="60" w:type="dxa"/>
+              <w:right w:w="100" w:type="dxa"/>
+            </w:tcMar>
+            <w:vAlign w:val="center"/>
+          </w:tcPr>
+          <w:p>
+            <w:r>
+              <w:rPr>
+                <w:sz w:val="19"/>
+                <w:szCs w:val="19"/>
+              </w:rPr>
+              <w:t>Payment Management’ta ödemeler listelenmiyor (“No payments found”)</w:t>
+            </w:r>
+          </w:p>
+        </w:tc>
+      </w:tr>
+      <w:tr>
+        <w:tc>
+          <w:tcPr>
+            <w:tcW w:w="1300" w:type="dxa"/>
+            <w:tcBorders>
+              <w:top w:val="single" w:sz="4" w:space="0" w:color="8EA9DB"/>
+              <w:left w:val="single" w:sz="4" w:space="0" w:color="8EA9DB"/>
+              <w:bottom w:val="single" w:sz="4" w:space="0" w:color="8EA9DB"/>
+              <w:right w:val="single" w:sz="4" w:space="0" w:color="8EA9DB"/>
+            </w:tcBorders>
+            <w:tcMar>
+              <w:top w:w="60" w:type="dxa"/>
+              <w:left w:w="100" w:type="dxa"/>
+              <w:bottom w:w="60" w:type="dxa"/>
+              <w:right w:w="100" w:type="dxa"/>
+            </w:tcMar>
+            <w:vAlign w:val="center"/>
+          </w:tcPr>
+          <w:p>
+            <w:r>
+              <w:rPr>
+                <w:sz w:val="19"/>
+                <w:szCs w:val="19"/>
+              </w:rPr>
+              <w:t>SCRUM-266</w:t>
+            </w:r>
+          </w:p>
+        </w:tc>
+        <w:tc>
+          <w:tcPr>
+            <w:tcW w:w="1100" w:type="dxa"/>
+            <w:tcBorders>
+              <w:top w:val="single" w:sz="4" w:space="0" w:color="8EA9DB"/>
+              <w:left w:val="single" w:sz="4" w:space="0" w:color="8EA9DB"/>
+              <w:bottom w:val="single" w:sz="4" w:space="0" w:color="8EA9DB"/>
+              <w:right w:val="single" w:sz="4" w:space="0" w:color="8EA9DB"/>
+            </w:tcBorders>
+            <w:tcMar>
+              <w:top w:w="60" w:type="dxa"/>
+              <w:left w:w="100" w:type="dxa"/>
+              <w:bottom w:w="60" w:type="dxa"/>
+              <w:right w:w="100" w:type="dxa"/>
+            </w:tcMar>
+            <w:vAlign w:val="center"/>
+          </w:tcPr>
+          <w:p>
+            <w:r>
+              <w:rPr>
+                <w:sz w:val="19"/>
+                <w:szCs w:val="19"/>
+              </w:rPr>
+              <w:t>Medium</w:t>
+            </w:r>
+          </w:p>
+        </w:tc>
+        <w:tc>
+          <w:tcPr>
+            <w:tcW w:w="1100" w:type="dxa"/>
+            <w:tcBorders>
+              <w:top w:val="single" w:sz="4" w:space="0" w:color="8EA9DB"/>
+              <w:left w:val="single" w:sz="4" w:space="0" w:color="8EA9DB"/>
+              <w:bottom w:val="single" w:sz="4" w:space="0" w:color="8EA9DB"/>
+              <w:right w:val="single" w:sz="4" w:space="0" w:color="8EA9DB"/>
+            </w:tcBorders>
+            <w:tcMar>
+              <w:top w:w="60" w:type="dxa"/>
+              <w:left w:w="100" w:type="dxa"/>
+              <w:bottom w:w="60" w:type="dxa"/>
+              <w:right w:w="100" w:type="dxa"/>
+            </w:tcMar>
+            <w:vAlign w:val="center"/>
+          </w:tcPr>
+          <w:p>
+            <w:r>
+              <w:rPr>
+                <w:sz w:val="19"/>
+                <w:szCs w:val="19"/>
+              </w:rPr>
+              <w:t>US_17</w:t>
+            </w:r>
+          </w:p>
+        </w:tc>
+        <w:tc>
+          <w:tcPr>
+            <w:tcW w:w="6138" w:type="dxa"/>
+            <w:tcBorders>
+              <w:top w:val="single" w:sz="4" w:space="0" w:color="8EA9DB"/>
+              <w:left w:val="single" w:sz="4" w:space="0" w:color="8EA9DB"/>
+              <w:bottom w:val="single" w:sz="4" w:space="0" w:color="8EA9DB"/>
+              <w:right w:val="single" w:sz="4" w:space="0" w:color="8EA9DB"/>
+            </w:tcBorders>
+            <w:tcMar>
+              <w:top w:w="60" w:type="dxa"/>
+              <w:left w:w="100" w:type="dxa"/>
+              <w:bottom w:w="60" w:type="dxa"/>
+              <w:right w:w="100" w:type="dxa"/>
+            </w:tcMar>
+            <w:vAlign w:val="center"/>
+          </w:tcPr>
+          <w:p>
+            <w:r>
+              <w:rPr>
+                <w:sz w:val="19"/>
+                <w:szCs w:val="19"/>
+              </w:rPr>
+              <w:t>Ürünü olan kategori silinirken 500, kullanıcıya uyarı yok</w:t>
+            </w:r>
+          </w:p>
+        </w:tc>
+      </w:tr>
+      <w:tr>
+        <w:tc>
+          <w:tcPr>
+            <w:tcW w:w="1300" w:type="dxa"/>
+            <w:tcBorders>
+              <w:top w:val="single" w:sz="4" w:space="0" w:color="8EA9DB"/>
+              <w:left w:val="single" w:sz="4" w:space="0" w:color="8EA9DB"/>
+              <w:bottom w:val="single" w:sz="4" w:space="0" w:color="8EA9DB"/>
+              <w:right w:val="single" w:sz="4" w:space="0" w:color="8EA9DB"/>
+            </w:tcBorders>
+            <w:tcMar>
+              <w:top w:w="60" w:type="dxa"/>
+              <w:left w:w="100" w:type="dxa"/>
+              <w:bottom w:w="60" w:type="dxa"/>
+              <w:right w:w="100" w:type="dxa"/>
+            </w:tcMar>
+            <w:vAlign w:val="center"/>
+          </w:tcPr>
+          <w:p>
+            <w:r>
+              <w:rPr>
+                <w:sz w:val="19"/>
+                <w:szCs w:val="19"/>
+              </w:rPr>
+              <w:t>SCRUM-267</w:t>
+            </w:r>
+          </w:p>
+        </w:tc>
+        <w:tc>
+          <w:tcPr>
+            <w:tcW w:w="1100" w:type="dxa"/>
+            <w:tcBorders>
+              <w:top w:val="single" w:sz="4" w:space="0" w:color="8EA9DB"/>
+              <w:left w:val="single" w:sz="4" w:space="0" w:color="8EA9DB"/>
+              <w:bottom w:val="single" w:sz="4" w:space="0" w:color="8EA9DB"/>
+              <w:right w:val="single" w:sz="4" w:space="0" w:color="8EA9DB"/>
+            </w:tcBorders>
+            <w:tcMar>
+              <w:top w:w="60" w:type="dxa"/>
+              <w:left w:w="100" w:type="dxa"/>
+              <w:bottom w:w="60" w:type="dxa"/>
+              <w:right w:w="100" w:type="dxa"/>
+            </w:tcMar>
+            <w:vAlign w:val="center"/>
+          </w:tcPr>
+          <w:p>
+            <w:r>
+              <w:rPr>
+                <w:sz w:val="19"/>
+                <w:szCs w:val="19"/>
+              </w:rPr>
+              <w:t>Medium</w:t>
+            </w:r>
+          </w:p>
+        </w:tc>
+        <w:tc>
+          <w:tcPr>
+            <w:tcW w:w="1100" w:type="dxa"/>
+            <w:tcBorders>
+              <w:top w:val="single" w:sz="4" w:space="0" w:color="8EA9DB"/>
+              <w:left w:val="single" w:sz="4" w:space="0" w:color="8EA9DB"/>
+              <w:bottom w:val="single" w:sz="4" w:space="0" w:color="8EA9DB"/>
+              <w:right w:val="single" w:sz="4" w:space="0" w:color="8EA9DB"/>
+            </w:tcBorders>
+            <w:tcMar>
+              <w:top w:w="60" w:type="dxa"/>
+              <w:left w:w="100" w:type="dxa"/>
+              <w:bottom w:w="60" w:type="dxa"/>
+              <w:right w:w="100" w:type="dxa"/>
+            </w:tcMar>
+            <w:vAlign w:val="center"/>
+          </w:tcPr>
+          <w:p>
+            <w:r>
+              <w:rPr>
+                <w:sz w:val="19"/>
+                <w:szCs w:val="19"/>
+              </w:rPr>
+              <w:t>US_12</w:t>
+            </w:r>
+          </w:p>
+        </w:tc>
+        <w:tc>
+          <w:tcPr>
+            <w:tcW w:w="6138" w:type="dxa"/>
+            <w:tcBorders>
+              <w:top w:val="single" w:sz="4" w:space="0" w:color="8EA9DB"/>
+              <w:left w:val="single" w:sz="4" w:space="0" w:color="8EA9DB"/>
+              <w:bottom w:val="single" w:sz="4" w:space="0" w:color="8EA9DB"/>
+              <w:right w:val="single" w:sz="4" w:space="0" w:color="8EA9DB"/>
+            </w:tcBorders>
+            <w:tcMar>
+              <w:top w:w="60" w:type="dxa"/>
+              <w:left w:w="100" w:type="dxa"/>
+              <w:bottom w:w="60" w:type="dxa"/>
+              <w:right w:w="100" w:type="dxa"/>
+            </w:tcMar>
+            <w:vAlign w:val="center"/>
+          </w:tcPr>
+          <w:p>
+            <w:r>
+              <w:rPr>
+                <w:sz w:val="19"/>
+                <w:szCs w:val="19"/>
+              </w:rPr>
+              <w:t>Order Management’ta sipariş detayı görüntülenemiyor</w:t>
+            </w:r>
+          </w:p>
+        </w:tc>
+      </w:tr>
+      <w:tr>
+        <w:tc>
+          <w:tcPr>
+            <w:tcW w:w="1300" w:type="dxa"/>
+            <w:tcBorders>
+              <w:top w:val="single" w:sz="4" w:space="0" w:color="8EA9DB"/>
+              <w:left w:val="single" w:sz="4" w:space="0" w:color="8EA9DB"/>
+              <w:bottom w:val="single" w:sz="4" w:space="0" w:color="8EA9DB"/>
+              <w:right w:val="single" w:sz="4" w:space="0" w:color="8EA9DB"/>
+            </w:tcBorders>
+            <w:tcMar>
+              <w:top w:w="60" w:type="dxa"/>
+              <w:left w:w="100" w:type="dxa"/>
+              <w:bottom w:w="60" w:type="dxa"/>
+              <w:right w:w="100" w:type="dxa"/>
+            </w:tcMar>
+            <w:vAlign w:val="center"/>
+          </w:tcPr>
+          <w:p>
+            <w:r>
+              <w:rPr>
+                <w:sz w:val="19"/>
+                <w:szCs w:val="19"/>
+              </w:rPr>
+              <w:t>SCRUM-268</w:t>
+            </w:r>
+          </w:p>
+        </w:tc>
+        <w:tc>
+          <w:tcPr>
+            <w:tcW w:w="1100" w:type="dxa"/>
+            <w:tcBorders>
+              <w:top w:val="single" w:sz="4" w:space="0" w:color="8EA9DB"/>
+              <w:left w:val="single" w:sz="4" w:space="0" w:color="8EA9DB"/>
+              <w:bottom w:val="single" w:sz="4" w:space="0" w:color="8EA9DB"/>
+              <w:right w:val="single" w:sz="4" w:space="0" w:color="8EA9DB"/>
+            </w:tcBorders>
+            <w:tcMar>
+              <w:top w:w="60" w:type="dxa"/>
+              <w:left w:w="100" w:type="dxa"/>
+              <w:bottom w:w="60" w:type="dxa"/>
+              <w:right w:w="100" w:type="dxa"/>
+            </w:tcMar>
+            <w:vAlign w:val="center"/>
+          </w:tcPr>
+          <w:p>
+            <w:r>
+              <w:rPr>
+                <w:sz w:val="19"/>
+                <w:szCs w:val="19"/>
+              </w:rPr>
+              <w:t>Low</w:t>
+            </w:r>
+          </w:p>
+        </w:tc>
+        <w:tc>
+          <w:tcPr>
+            <w:tcW w:w="1100" w:type="dxa"/>
+            <w:tcBorders>
+              <w:top w:val="single" w:sz="4" w:space="0" w:color="8EA9DB"/>
+              <w:left w:val="single" w:sz="4" w:space="0" w:color="8EA9DB"/>
+              <w:bottom w:val="single" w:sz="4" w:space="0" w:color="8EA9DB"/>
+              <w:right w:val="single" w:sz="4" w:space="0" w:color="8EA9DB"/>
+            </w:tcBorders>
+            <w:tcMar>
+              <w:top w:w="60" w:type="dxa"/>
+              <w:left w:w="100" w:type="dxa"/>
+              <w:bottom w:w="60" w:type="dxa"/>
+              <w:right w:w="100" w:type="dxa"/>
+            </w:tcMar>
+            <w:vAlign w:val="center"/>
+          </w:tcPr>
+          <w:p>
+            <w:r>
+              <w:rPr>
+                <w:sz w:val="19"/>
+                <w:szCs w:val="19"/>
+              </w:rPr>
+              <w:t>US_21</w:t>
+            </w:r>
+          </w:p>
+        </w:tc>
+        <w:tc>
+          <w:tcPr>
+            <w:tcW w:w="6138" w:type="dxa"/>
+            <w:tcBorders>
+              <w:top w:val="single" w:sz="4" w:space="0" w:color="8EA9DB"/>
+              <w:left w:val="single" w:sz="4" w:space="0" w:color="8EA9DB"/>
+              <w:bottom w:val="single" w:sz="4" w:space="0" w:color="8EA9DB"/>
+              <w:right w:val="single" w:sz="4" w:space="0" w:color="8EA9DB"/>
+            </w:tcBorders>
+            <w:tcMar>
+              <w:top w:w="60" w:type="dxa"/>
+              <w:left w:w="100" w:type="dxa"/>
+              <w:bottom w:w="60" w:type="dxa"/>
+              <w:right w:w="100" w:type="dxa"/>
+            </w:tcMar>
+            <w:vAlign w:val="center"/>
+          </w:tcPr>
+          <w:p>
+            <w:r>
+              <w:rPr>
+                <w:sz w:val="19"/>
+                <w:szCs w:val="19"/>
+              </w:rPr>
+              <w:t>Support Requests “Time” filtresi aralık dışı mesajları listeliyor</w:t>
+            </w:r>
+          </w:p>
+        </w:tc>
+      </w:tr>
+      <w:tr>
+        <w:tc>
+          <w:tcPr>
+            <w:tcW w:w="1300" w:type="dxa"/>
+            <w:tcBorders>
+              <w:top w:val="single" w:sz="4" w:space="0" w:color="8EA9DB"/>
+              <w:left w:val="single" w:sz="4" w:space="0" w:color="8EA9DB"/>
+              <w:bottom w:val="single" w:sz="4" w:space="0" w:color="8EA9DB"/>
+              <w:right w:val="single" w:sz="4" w:space="0" w:color="8EA9DB"/>
+            </w:tcBorders>
+            <w:tcMar>
+              <w:top w:w="60" w:type="dxa"/>
+              <w:left w:w="100" w:type="dxa"/>
+              <w:bottom w:w="60" w:type="dxa"/>
+              <w:right w:w="100" w:type="dxa"/>
+            </w:tcMar>
+            <w:vAlign w:val="center"/>
+          </w:tcPr>
+          <w:p>
+            <w:r>
+              <w:rPr>
+                <w:sz w:val="19"/>
+                <w:szCs w:val="19"/>
+              </w:rPr>
+              <w:t>SCRUM-269</w:t>
+            </w:r>
+          </w:p>
+        </w:tc>
+        <w:tc>
+          <w:tcPr>
+            <w:tcW w:w="1100" w:type="dxa"/>
+            <w:tcBorders>
+              <w:top w:val="single" w:sz="4" w:space="0" w:color="8EA9DB"/>
+              <w:left w:val="single" w:sz="4" w:space="0" w:color="8EA9DB"/>
+              <w:bottom w:val="single" w:sz="4" w:space="0" w:color="8EA9DB"/>
+              <w:right w:val="single" w:sz="4" w:space="0" w:color="8EA9DB"/>
+            </w:tcBorders>
+            <w:tcMar>
+              <w:top w:w="60" w:type="dxa"/>
+              <w:left w:w="100" w:type="dxa"/>
+              <w:bottom w:w="60" w:type="dxa"/>
+              <w:right w:w="100" w:type="dxa"/>
+            </w:tcMar>
+            <w:vAlign w:val="center"/>
+          </w:tcPr>
+          <w:p>
+            <w:r>
+              <w:rPr>
+                <w:sz w:val="19"/>
+                <w:szCs w:val="19"/>
+              </w:rPr>
+              <w:t>Low</w:t>
+            </w:r>
+          </w:p>
+        </w:tc>
+        <w:tc>
+          <w:tcPr>
+            <w:tcW w:w="1100" w:type="dxa"/>
+            <w:tcBorders>
+              <w:top w:val="single" w:sz="4" w:space="0" w:color="8EA9DB"/>
+              <w:left w:val="single" w:sz="4" w:space="0" w:color="8EA9DB"/>
+              <w:bottom w:val="single" w:sz="4" w:space="0" w:color="8EA9DB"/>
+              <w:right w:val="single" w:sz="4" w:space="0" w:color="8EA9DB"/>
+            </w:tcBorders>
+            <w:tcMar>
+              <w:top w:w="60" w:type="dxa"/>
+              <w:left w:w="100" w:type="dxa"/>
+              <w:bottom w:w="60" w:type="dxa"/>
+              <w:right w:w="100" w:type="dxa"/>
+            </w:tcMar>
+            <w:vAlign w:val="center"/>
+          </w:tcPr>
+          <w:p>
+            <w:r>
+              <w:rPr>
+                <w:sz w:val="19"/>
+                <w:szCs w:val="19"/>
+              </w:rPr>
+              <w:t>US_21</w:t>
+            </w:r>
+          </w:p>
+        </w:tc>
+        <w:tc>
+          <w:tcPr>
+            <w:tcW w:w="6138" w:type="dxa"/>
+            <w:tcBorders>
+              <w:top w:val="single" w:sz="4" w:space="0" w:color="8EA9DB"/>
+              <w:left w:val="single" w:sz="4" w:space="0" w:color="8EA9DB"/>
+              <w:bottom w:val="single" w:sz="4" w:space="0" w:color="8EA9DB"/>
+              <w:right w:val="single" w:sz="4" w:space="0" w:color="8EA9DB"/>
+            </w:tcBorders>
+            <w:tcMar>
+              <w:top w:w="60" w:type="dxa"/>
+              <w:left w:w="100" w:type="dxa"/>
+              <w:bottom w:w="60" w:type="dxa"/>
+              <w:right w:w="100" w:type="dxa"/>
+            </w:tcMar>
+            <w:vAlign w:val="center"/>
+          </w:tcPr>
+          <w:p>
+            <w:r>
+              <w:rPr>
+                <w:sz w:val="19"/>
+                <w:szCs w:val="19"/>
+              </w:rPr>
+              <w:t>Boş filtre sonucunda bilgilendirme yok, sayfalama güncellenmiyor</w:t>
+            </w:r>
+          </w:p>
+        </w:tc>
+      </w:tr>
     </w:tbl>
     <w:p>
       <w:pPr>
@@ -31476,14 +33036,14 @@
         <w:jc w:val="both"/>
       </w:pPr>
       <w:r>
-        <w:t>Toplam 34 bug kaydı açılmıştır. Kritik (Highest) bulgular: arayüzden sipariş oluşturulamaması (SCRUM-232), admin uç noktalarının kimlik doğrulamasız erişilebilmesi (SCRUM-244) ve kullanıcı yanıtında şifre hash’inin dönmesi (SCRUM-248).</w:t>
+        <w:t>Toplam 47 bug kaydı açılmıştır. Kritik (Highest) bulgular: arayüzden sipariş oluşturulamaması (SCRUM-232), admin uç noktalarının kimlik doğrulamasız erişilebilmesi (SCRUM-244) ve kullanıcı yanıtında şifre hash’inin dönmesi (SCRUM-248).</w:t>
       </w:r>
     </w:p>
     <w:p>
       <w:pPr>
         <w:pStyle w:val="Balk2"/>
       </w:pPr>
-      <w:bookmarkStart w:id="50" w:name="_Toc242540485"/>
+      <w:bookmarkStart w:id="50" w:name="_Toc242922323"/>
       <w:r>
         <w:t>17.4 Teslimat Konumları</w:t>
       </w:r>
@@ -31800,7 +33360,7 @@
       <w:pPr>
         <w:pStyle w:val="Balk2"/>
       </w:pPr>
-      <w:bookmarkStart w:id="51" w:name="_Toc242540486"/>
+      <w:bookmarkStart w:id="51" w:name="_Toc242922324"/>
       <w:r>
         <w:t>17.5 Sonuç ve Öneriler</w:t>
       </w:r>
@@ -31868,14 +33428,40 @@
         <w:spacing w:after="60"/>
       </w:pPr>
       <w:r>
-        <w:t>Admin hesabı sağlandığında BLOCKED durumdaki test case’ler koşularak rapor güncellenecektir.</w:t>
+        <w:t>Admin panelinde ürün silme işlemi hiç çalışmamaktadır (SCRUM-257); ürün ve ilave formlarında sunucu/istemci doğrulamaları eksiktir (SCRUM-258, 259, 261, 262). Order / Payment Management sipariş durumu ve ödeme bilgisini doğru göstermemektedir (SCRUM-264, 265, 267).</w:t>
+      </w:r>
+    </w:p>
+    <w:p>
+      <w:pPr>
+        <w:pStyle w:val="ListeParagraf"/>
+        <w:numPr>
+          <w:ilvl w:val="0"/>
+          <w:numId w:val="2"/>
+        </w:numPr>
+        <w:spacing w:after="60"/>
+      </w:pPr>
+      <w:r>
+        <w:t>Support Requests filtrelerinden Email ve Time filtreleri hatalıdır (SCRUM-263, 268); Subject ve Date filtreleri doğru çalışmaktadır.</w:t>
+      </w:r>
+    </w:p>
+    <w:p>
+      <w:pPr>
+        <w:pStyle w:val="ListeParagraf"/>
+        <w:numPr>
+          <w:ilvl w:val="0"/>
+          <w:numId w:val="2"/>
+        </w:numPr>
+        <w:spacing w:after="60"/>
+      </w:pPr>
+      <w:r>
+        <w:t>Kalan BLOCKED test case’ler koşulduğunda rapor güncellenecektir.</w:t>
       </w:r>
     </w:p>
     <w:p>
       <w:pPr>
         <w:pStyle w:val="Balk1"/>
       </w:pPr>
-      <w:bookmarkStart w:id="52" w:name="_Toc242540487"/>
+      <w:bookmarkStart w:id="52" w:name="_Toc242922325"/>
       <w:r>
         <w:t>18. Onay</w:t>
       </w:r>
@@ -32388,7 +33974,7 @@
         <w:sz w:val="18"/>
         <w:szCs w:val="18"/>
       </w:rPr>
-      <w:t>Snack Attack – Test Planı v1.0</w:t>
+      <w:t>Snack Attack – Test Planı v1.1</w:t>
     </w:r>
   </w:p>
 </w:hdr>
@@ -32397,10 +33983,10 @@
 <file path=word/numbering.xml><?xml version="1.0" encoding="utf-8"?>
 <w:numbering xmlns:wpc="http://schemas.microsoft.com/office/word/2010/wordprocessingCanvas" xmlns:cx="http://schemas.microsoft.com/office/drawing/2014/chartex" xmlns:cx1="http://schemas.microsoft.com/office/drawing/2015/9/8/chartex" xmlns:cx2="http://schemas.microsoft.com/office/drawing/2015/10/21/chartex" xmlns:cx3="http://schemas.microsoft.com/office/drawing/2016/5/9/chartex" xmlns:cx4="http://schemas.microsoft.com/office/drawing/2016/5/10/chartex" xmlns:cx5="http://schemas.microsoft.com/office/drawing/2016/5/11/chartex" xmlns:cx6="http://schemas.microsoft.com/office/drawing/2016/5/12/chartex" xmlns:cx7="http://schemas.microsoft.com/office/drawing/2016/5/13/chartex" xmlns:cx8="http://schemas.microsoft.com/office/drawing/2016/5/14/chartex" xmlns:mc="http://schemas.openxmlformats.org/markup-compatibility/2006" xmlns:aink="http://schemas.microsoft.com/office/drawing/2016/ink" xmlns:am3d="http://schemas.microsoft.com/office/drawing/2017/model3d" xmlns:o="urn:schemas-microsoft-com:office:office" xmlns:oel="http://schemas.microsoft.com/office/2019/extlst" xmlns:r="http://schemas.openxmlformats.org/officeDocument/2006/relationships" xmlns:m="http://schemas.openxmlformats.org/officeDocument/2006/math" xmlns:v="urn:schemas-microsoft-com:vml" xmlns:wp14="http://schemas.microsoft.com/office/word/2010/wordprocessingDrawing" xmlns:wp="http://schemas.openxmlformats.org/drawingml/2006/wordprocessingDrawing" xmlns:w10="urn:schemas-microsoft-com:office:word" xmlns:w="http://schemas.openxmlformats.org/wordprocessingml/2006/main" xmlns:w14="http://schemas.microsoft.com/office/word/2010/wordml" xmlns:w15="http://schemas.microsoft.com/office/word/2012/wordml" xmlns:w16cex="http://schemas.microsoft.com/office/word/2018/wordml/cex" xmlns:w16cid="http://schemas.microsoft.com/office/word/2016/wordml/cid" xmlns:w16="http://schemas.microsoft.com/office/word/2018/wordml" xmlns:w16du="http://schemas.microsoft.com/office/word/2023/wordml/word16du" xmlns:w16sdtdh="http://schemas.microsoft.com/office/word/2020/wordml/sdtdatahash" xmlns:w16sdtfl="http://schemas.microsoft.com/office/word/2024/wordml/sdtformatlock" xmlns:w16se="http://schemas.microsoft.com/office/word/2015/wordml/symex" xmlns:wpg="http://schemas.microsoft.com/office/word/2010/wordprocessingGroup" xmlns:wpi="http://schemas.microsoft.com/office/word/2010/wordprocessingInk" xmlns:wne="http://schemas.microsoft.com/office/word/2006/wordml" xmlns:wps="http://schemas.microsoft.com/office/word/2010/wordprocessingShape" mc:Ignorable="w14 w15 w16se w16cid w16 w16cex w16sdtdh w16sdtfl w16du wp14">
   <w:abstractNum w:abstractNumId="0" w15:restartNumberingAfterBreak="0">
-    <w:nsid w:val="02DB34C5"/>
+    <w:nsid w:val="0B1B362A"/>
     <w:multiLevelType w:val="hybridMultilevel"/>
-    <w:tmpl w:val="4CD6FF62"/>
-    <w:lvl w:ilvl="0" w:tplc="08DEAD40" w:tentative="1">
+    <w:tmpl w:val="6602B3EC"/>
+    <w:lvl w:ilvl="0" w:tplc="F314EC1E" w:tentative="1">
       <w:start w:val="1"/>
       <w:numFmt w:val="decimal"/>
       <w:lvlText w:val="%1."/>
@@ -32409,52 +33995,52 @@
         <w:ind w:left="720" w:hanging="360"/>
       </w:pPr>
     </w:lvl>
-    <w:lvl w:ilvl="1" w:tplc="1832B5F2">
+    <w:lvl w:ilvl="1" w:tplc="EC446BEE">
       <w:numFmt w:val="decimal"/>
       <w:lvlText w:val=""/>
       <w:lvlJc w:val="left"/>
     </w:lvl>
-    <w:lvl w:ilvl="2" w:tplc="A49ECDD4">
+    <w:lvl w:ilvl="2" w:tplc="E3280B3E">
       <w:numFmt w:val="decimal"/>
       <w:lvlText w:val=""/>
       <w:lvlJc w:val="left"/>
     </w:lvl>
-    <w:lvl w:ilvl="3" w:tplc="FBACB6D6">
+    <w:lvl w:ilvl="3" w:tplc="85904B40">
       <w:numFmt w:val="decimal"/>
       <w:lvlText w:val=""/>
       <w:lvlJc w:val="left"/>
     </w:lvl>
-    <w:lvl w:ilvl="4" w:tplc="A7DC37F6">
+    <w:lvl w:ilvl="4" w:tplc="4836A56E">
       <w:numFmt w:val="decimal"/>
       <w:lvlText w:val=""/>
       <w:lvlJc w:val="left"/>
     </w:lvl>
-    <w:lvl w:ilvl="5" w:tplc="39F265D8">
+    <w:lvl w:ilvl="5" w:tplc="D9CAA51E">
       <w:numFmt w:val="decimal"/>
       <w:lvlText w:val=""/>
       <w:lvlJc w:val="left"/>
     </w:lvl>
-    <w:lvl w:ilvl="6" w:tplc="7C7414DE">
+    <w:lvl w:ilvl="6" w:tplc="21A6268E">
       <w:numFmt w:val="decimal"/>
       <w:lvlText w:val=""/>
       <w:lvlJc w:val="left"/>
     </w:lvl>
-    <w:lvl w:ilvl="7" w:tplc="CF06A948">
+    <w:lvl w:ilvl="7" w:tplc="8D36EE3A">
       <w:numFmt w:val="decimal"/>
       <w:lvlText w:val=""/>
       <w:lvlJc w:val="left"/>
     </w:lvl>
-    <w:lvl w:ilvl="8" w:tplc="CC0C8E6C">
+    <w:lvl w:ilvl="8" w:tplc="B2725DAA">
       <w:numFmt w:val="decimal"/>
       <w:lvlText w:val=""/>
       <w:lvlJc w:val="left"/>
     </w:lvl>
   </w:abstractNum>
   <w:abstractNum w:abstractNumId="1" w15:restartNumberingAfterBreak="0">
-    <w:nsid w:val="16E32C49"/>
+    <w:nsid w:val="11A10CA9"/>
     <w:multiLevelType w:val="hybridMultilevel"/>
-    <w:tmpl w:val="2D662A28"/>
-    <w:lvl w:ilvl="0" w:tplc="88EAFE1A">
+    <w:tmpl w:val="9CD65610"/>
+    <w:lvl w:ilvl="0" w:tplc="3EE09A76">
       <w:start w:val="1"/>
       <w:numFmt w:val="bullet"/>
       <w:lvlText w:val="•"/>
@@ -32463,7 +34049,7 @@
         <w:ind w:left="720" w:hanging="360"/>
       </w:pPr>
     </w:lvl>
-    <w:lvl w:ilvl="1" w:tplc="AEC8AE88" w:tentative="1">
+    <w:lvl w:ilvl="1" w:tplc="17AEE38A" w:tentative="1">
       <w:start w:val="1"/>
       <w:numFmt w:val="bullet"/>
       <w:lvlText w:val="◦"/>
@@ -32472,47 +34058,47 @@
         <w:ind w:left="1440" w:hanging="360"/>
       </w:pPr>
     </w:lvl>
-    <w:lvl w:ilvl="2" w:tplc="41A49A94">
+    <w:lvl w:ilvl="2" w:tplc="CFF0A3FC">
       <w:numFmt w:val="decimal"/>
       <w:lvlText w:val=""/>
       <w:lvlJc w:val="left"/>
     </w:lvl>
-    <w:lvl w:ilvl="3" w:tplc="C142A340">
+    <w:lvl w:ilvl="3" w:tplc="64382466">
       <w:numFmt w:val="decimal"/>
       <w:lvlText w:val=""/>
       <w:lvlJc w:val="left"/>
     </w:lvl>
-    <w:lvl w:ilvl="4" w:tplc="65FE46CA">
+    <w:lvl w:ilvl="4" w:tplc="CB145E52">
       <w:numFmt w:val="decimal"/>
       <w:lvlText w:val=""/>
       <w:lvlJc w:val="left"/>
     </w:lvl>
-    <w:lvl w:ilvl="5" w:tplc="201AC66C">
+    <w:lvl w:ilvl="5" w:tplc="ED382B1A">
       <w:numFmt w:val="decimal"/>
       <w:lvlText w:val=""/>
       <w:lvlJc w:val="left"/>
     </w:lvl>
-    <w:lvl w:ilvl="6" w:tplc="A4A4CCC8">
+    <w:lvl w:ilvl="6" w:tplc="F0EC273C">
       <w:numFmt w:val="decimal"/>
       <w:lvlText w:val=""/>
       <w:lvlJc w:val="left"/>
     </w:lvl>
-    <w:lvl w:ilvl="7" w:tplc="C2108CCA">
+    <w:lvl w:ilvl="7" w:tplc="6E32E80A">
       <w:numFmt w:val="decimal"/>
       <w:lvlText w:val=""/>
       <w:lvlJc w:val="left"/>
     </w:lvl>
-    <w:lvl w:ilvl="8" w:tplc="9BB284E4">
+    <w:lvl w:ilvl="8" w:tplc="5BA8CCA8">
       <w:numFmt w:val="decimal"/>
       <w:lvlText w:val=""/>
       <w:lvlJc w:val="left"/>
     </w:lvl>
   </w:abstractNum>
   <w:abstractNum w:abstractNumId="2" w15:restartNumberingAfterBreak="0">
-    <w:nsid w:val="2489465E"/>
+    <w:nsid w:val="2DA251DB"/>
     <w:multiLevelType w:val="hybridMultilevel"/>
-    <w:tmpl w:val="BA7E28E6"/>
-    <w:lvl w:ilvl="0" w:tplc="5002BDF4" w:tentative="1">
+    <w:tmpl w:val="ABFC536C"/>
+    <w:lvl w:ilvl="0" w:tplc="EF8684DE" w:tentative="1">
       <w:start w:val="1"/>
       <w:numFmt w:val="bullet"/>
       <w:lvlText w:val="●"/>
@@ -32521,7 +34107,7 @@
         <w:ind w:left="720" w:hanging="360"/>
       </w:pPr>
     </w:lvl>
-    <w:lvl w:ilvl="1" w:tplc="BB568850" w:tentative="1">
+    <w:lvl w:ilvl="1" w:tplc="ACAE18AA" w:tentative="1">
       <w:start w:val="1"/>
       <w:numFmt w:val="bullet"/>
       <w:lvlText w:val="○"/>
@@ -32530,7 +34116,7 @@
         <w:ind w:left="1440" w:hanging="360"/>
       </w:pPr>
     </w:lvl>
-    <w:lvl w:ilvl="2" w:tplc="DE8C3A36" w:tentative="1">
+    <w:lvl w:ilvl="2" w:tplc="7CCC03FE" w:tentative="1">
       <w:start w:val="1"/>
       <w:numFmt w:val="bullet"/>
       <w:lvlText w:val="■"/>
@@ -32539,7 +34125,7 @@
         <w:ind w:left="2160" w:hanging="360"/>
       </w:pPr>
     </w:lvl>
-    <w:lvl w:ilvl="3" w:tplc="76644E76" w:tentative="1">
+    <w:lvl w:ilvl="3" w:tplc="669E4550" w:tentative="1">
       <w:start w:val="1"/>
       <w:numFmt w:val="bullet"/>
       <w:lvlText w:val="●"/>
@@ -32548,7 +34134,7 @@
         <w:ind w:left="2880" w:hanging="360"/>
       </w:pPr>
     </w:lvl>
-    <w:lvl w:ilvl="4" w:tplc="6B38C620" w:tentative="1">
+    <w:lvl w:ilvl="4" w:tplc="87487210" w:tentative="1">
       <w:start w:val="1"/>
       <w:numFmt w:val="bullet"/>
       <w:lvlText w:val="○"/>
@@ -32557,7 +34143,7 @@
         <w:ind w:left="3600" w:hanging="360"/>
       </w:pPr>
     </w:lvl>
-    <w:lvl w:ilvl="5" w:tplc="473E7B94" w:tentative="1">
+    <w:lvl w:ilvl="5" w:tplc="37BC8CF0" w:tentative="1">
       <w:start w:val="1"/>
       <w:numFmt w:val="bullet"/>
       <w:lvlText w:val="■"/>
@@ -32566,7 +34152,7 @@
         <w:ind w:left="4320" w:hanging="360"/>
       </w:pPr>
     </w:lvl>
-    <w:lvl w:ilvl="6" w:tplc="4762E258" w:tentative="1">
+    <w:lvl w:ilvl="6" w:tplc="55B8CD62" w:tentative="1">
       <w:start w:val="1"/>
       <w:numFmt w:val="bullet"/>
       <w:lvlText w:val="●"/>
@@ -32575,7 +34161,7 @@
         <w:ind w:left="5040" w:hanging="360"/>
       </w:pPr>
     </w:lvl>
-    <w:lvl w:ilvl="7" w:tplc="0E6CA664" w:tentative="1">
+    <w:lvl w:ilvl="7" w:tplc="C0C60524" w:tentative="1">
       <w:start w:val="1"/>
       <w:numFmt w:val="bullet"/>
       <w:lvlText w:val="●"/>
@@ -32584,7 +34170,7 @@
         <w:ind w:left="5760" w:hanging="360"/>
       </w:pPr>
     </w:lvl>
-    <w:lvl w:ilvl="8" w:tplc="F618B382" w:tentative="1">
+    <w:lvl w:ilvl="8" w:tplc="995E4A54" w:tentative="1">
       <w:start w:val="1"/>
       <w:numFmt w:val="bullet"/>
       <w:lvlText w:val="●"/>
@@ -32595,10 +34181,10 @@
     </w:lvl>
   </w:abstractNum>
   <w:abstractNum w:abstractNumId="3" w15:restartNumberingAfterBreak="0">
-    <w:nsid w:val="5D142131"/>
+    <w:nsid w:val="5EE83E9A"/>
     <w:multiLevelType w:val="hybridMultilevel"/>
-    <w:tmpl w:val="0FFC9D6E"/>
-    <w:lvl w:ilvl="0" w:tplc="FD5EB268" w:tentative="1">
+    <w:tmpl w:val="D542E522"/>
+    <w:lvl w:ilvl="0" w:tplc="C748B3A2" w:tentative="1">
       <w:start w:val="1"/>
       <w:numFmt w:val="decimal"/>
       <w:lvlText w:val="%1."/>
@@ -32607,54 +34193,54 @@
         <w:ind w:left="720" w:hanging="360"/>
       </w:pPr>
     </w:lvl>
-    <w:lvl w:ilvl="1" w:tplc="C486BA24">
+    <w:lvl w:ilvl="1" w:tplc="C44E835C">
       <w:numFmt w:val="decimal"/>
       <w:lvlText w:val=""/>
       <w:lvlJc w:val="left"/>
     </w:lvl>
-    <w:lvl w:ilvl="2" w:tplc="72E2CF50">
+    <w:lvl w:ilvl="2" w:tplc="FE663140">
       <w:numFmt w:val="decimal"/>
       <w:lvlText w:val=""/>
       <w:lvlJc w:val="left"/>
     </w:lvl>
-    <w:lvl w:ilvl="3" w:tplc="E9306CF8">
+    <w:lvl w:ilvl="3" w:tplc="AB6A9FCA">
       <w:numFmt w:val="decimal"/>
       <w:lvlText w:val=""/>
       <w:lvlJc w:val="left"/>
     </w:lvl>
-    <w:lvl w:ilvl="4" w:tplc="D7BCC56A">
+    <w:lvl w:ilvl="4" w:tplc="9A30CEB4">
       <w:numFmt w:val="decimal"/>
       <w:lvlText w:val=""/>
       <w:lvlJc w:val="left"/>
     </w:lvl>
-    <w:lvl w:ilvl="5" w:tplc="2AAEBA1C">
+    <w:lvl w:ilvl="5" w:tplc="781C5916">
       <w:numFmt w:val="decimal"/>
       <w:lvlText w:val=""/>
       <w:lvlJc w:val="left"/>
     </w:lvl>
-    <w:lvl w:ilvl="6" w:tplc="6504D6D4">
+    <w:lvl w:ilvl="6" w:tplc="0058750A">
       <w:numFmt w:val="decimal"/>
       <w:lvlText w:val=""/>
       <w:lvlJc w:val="left"/>
     </w:lvl>
-    <w:lvl w:ilvl="7" w:tplc="1130D500">
+    <w:lvl w:ilvl="7" w:tplc="71DEB9A8">
       <w:numFmt w:val="decimal"/>
       <w:lvlText w:val=""/>
       <w:lvlJc w:val="left"/>
     </w:lvl>
-    <w:lvl w:ilvl="8" w:tplc="0B8A2114">
+    <w:lvl w:ilvl="8" w:tplc="E3E8DAE0">
       <w:numFmt w:val="decimal"/>
       <w:lvlText w:val=""/>
       <w:lvlJc w:val="left"/>
     </w:lvl>
   </w:abstractNum>
-  <w:num w:numId="1" w16cid:durableId="153300953">
+  <w:num w:numId="1" w16cid:durableId="1805535233">
     <w:abstractNumId w:val="2"/>
     <w:lvlOverride w:ilvl="0">
       <w:startOverride w:val="1"/>
     </w:lvlOverride>
   </w:num>
-  <w:num w:numId="2" w16cid:durableId="1211960509">
+  <w:num w:numId="2" w16cid:durableId="2021423376">
     <w:abstractNumId w:val="1"/>
     <w:lvlOverride w:ilvl="0">
       <w:startOverride w:val="1"/>
@@ -33300,7 +34886,7 @@
     <w:autoRedefine/>
     <w:uiPriority w:val="39"/>
     <w:unhideWhenUsed/>
-    <w:rsid w:val="00D95A99"/>
+    <w:rsid w:val="0039533E"/>
     <w:pPr>
       <w:spacing w:after="100"/>
     </w:pPr>
@@ -33312,7 +34898,7 @@
     <w:autoRedefine/>
     <w:uiPriority w:val="39"/>
     <w:unhideWhenUsed/>
-    <w:rsid w:val="00D95A99"/>
+    <w:rsid w:val="0039533E"/>
     <w:pPr>
       <w:spacing w:after="100"/>
       <w:ind w:left="220"/>

</xml_diff>

<commit_message>
Manuel koşum tamamlandı: 192 test case (128 PASSED / 64 FAILED); SCRUM-270..272
Kalan admin kayıt/giriş, silme ve sipariş statüsü test case'leri koşuldu.
Test case dosyası, Test Planı v1.2 ve Xray execution sonuç dosyası güncellendi.

Co-Authored-By: Claude Opus 5.5 <noreply@anthropic.com>
</commit_message>
<xml_diff>
--- a/docs/Snack_Attack_Test_Plani.docx
+++ b/docs/Snack_Attack_Test_Plani.docx
@@ -615,7 +615,7 @@
       <w:pPr>
         <w:pStyle w:val="Balk1"/>
       </w:pPr>
-      <w:bookmarkStart w:id="0" w:name="_Toc242922273"/>
+      <w:bookmarkStart w:id="0" w:name="_Toc242962092"/>
       <w:r>
         <w:t>Revizyon Geçmişi</w:t>
       </w:r>
@@ -985,6 +985,116 @@
           </w:p>
         </w:tc>
       </w:tr>
+      <w:tr>
+        <w:tc>
+          <w:tcPr>
+            <w:tcW w:w="1200" w:type="dxa"/>
+            <w:tcBorders>
+              <w:top w:val="single" w:sz="4" w:space="0" w:color="8EA9DB"/>
+              <w:left w:val="single" w:sz="4" w:space="0" w:color="8EA9DB"/>
+              <w:bottom w:val="single" w:sz="4" w:space="0" w:color="8EA9DB"/>
+              <w:right w:val="single" w:sz="4" w:space="0" w:color="8EA9DB"/>
+            </w:tcBorders>
+            <w:tcMar>
+              <w:top w:w="60" w:type="dxa"/>
+              <w:left w:w="100" w:type="dxa"/>
+              <w:bottom w:w="60" w:type="dxa"/>
+              <w:right w:w="100" w:type="dxa"/>
+            </w:tcMar>
+            <w:vAlign w:val="center"/>
+          </w:tcPr>
+          <w:p>
+            <w:r>
+              <w:rPr>
+                <w:sz w:val="19"/>
+                <w:szCs w:val="19"/>
+              </w:rPr>
+              <w:t>1.2</w:t>
+            </w:r>
+          </w:p>
+        </w:tc>
+        <w:tc>
+          <w:tcPr>
+            <w:tcW w:w="1600" w:type="dxa"/>
+            <w:tcBorders>
+              <w:top w:val="single" w:sz="4" w:space="0" w:color="8EA9DB"/>
+              <w:left w:val="single" w:sz="4" w:space="0" w:color="8EA9DB"/>
+              <w:bottom w:val="single" w:sz="4" w:space="0" w:color="8EA9DB"/>
+              <w:right w:val="single" w:sz="4" w:space="0" w:color="8EA9DB"/>
+            </w:tcBorders>
+            <w:tcMar>
+              <w:top w:w="60" w:type="dxa"/>
+              <w:left w:w="100" w:type="dxa"/>
+              <w:bottom w:w="60" w:type="dxa"/>
+              <w:right w:w="100" w:type="dxa"/>
+            </w:tcMar>
+            <w:vAlign w:val="center"/>
+          </w:tcPr>
+          <w:p>
+            <w:r>
+              <w:rPr>
+                <w:sz w:val="19"/>
+                <w:szCs w:val="19"/>
+              </w:rPr>
+              <w:t>15.10.2026</w:t>
+            </w:r>
+          </w:p>
+        </w:tc>
+        <w:tc>
+          <w:tcPr>
+            <w:tcW w:w="2600" w:type="dxa"/>
+            <w:tcBorders>
+              <w:top w:val="single" w:sz="4" w:space="0" w:color="8EA9DB"/>
+              <w:left w:val="single" w:sz="4" w:space="0" w:color="8EA9DB"/>
+              <w:bottom w:val="single" w:sz="4" w:space="0" w:color="8EA9DB"/>
+              <w:right w:val="single" w:sz="4" w:space="0" w:color="8EA9DB"/>
+            </w:tcBorders>
+            <w:tcMar>
+              <w:top w:w="60" w:type="dxa"/>
+              <w:left w:w="100" w:type="dxa"/>
+              <w:bottom w:w="60" w:type="dxa"/>
+              <w:right w:w="100" w:type="dxa"/>
+            </w:tcMar>
+            <w:vAlign w:val="center"/>
+          </w:tcPr>
+          <w:p>
+            <w:r>
+              <w:rPr>
+                <w:sz w:val="19"/>
+                <w:szCs w:val="19"/>
+              </w:rPr>
+              <w:t>Yıldıray Kösedağ</w:t>
+            </w:r>
+          </w:p>
+        </w:tc>
+        <w:tc>
+          <w:tcPr>
+            <w:tcW w:w="4238" w:type="dxa"/>
+            <w:tcBorders>
+              <w:top w:val="single" w:sz="4" w:space="0" w:color="8EA9DB"/>
+              <w:left w:val="single" w:sz="4" w:space="0" w:color="8EA9DB"/>
+              <w:bottom w:val="single" w:sz="4" w:space="0" w:color="8EA9DB"/>
+              <w:right w:val="single" w:sz="4" w:space="0" w:color="8EA9DB"/>
+            </w:tcBorders>
+            <w:tcMar>
+              <w:top w:w="60" w:type="dxa"/>
+              <w:left w:w="100" w:type="dxa"/>
+              <w:bottom w:w="60" w:type="dxa"/>
+              <w:right w:w="100" w:type="dxa"/>
+            </w:tcMar>
+            <w:vAlign w:val="center"/>
+          </w:tcPr>
+          <w:p>
+            <w:r>
+              <w:rPr>
+                <w:sz w:val="19"/>
+                <w:szCs w:val="19"/>
+              </w:rPr>
+              <w:t>Kalan 46 test case (admin kayıt/giriş, silme, sipariş statüleri) koşuldu; 192 test case’in tamamı koşulmuş durumda. SCRUM-270 – 272 eklendi.</w:t>
+            </w:r>
+          </w:p>
+        </w:tc>
+      </w:tr>
     </w:tbl>
     <w:p>
       <w:pPr>
@@ -995,7 +1105,7 @@
       <w:pPr>
         <w:pStyle w:val="Balk1"/>
       </w:pPr>
-      <w:bookmarkStart w:id="1" w:name="_Toc242922274"/>
+      <w:bookmarkStart w:id="1" w:name="_Toc242962093"/>
       <w:r>
         <w:t>İçindekiler</w:t>
       </w:r>
@@ -1004,7 +1114,7 @@
     <w:sdt>
       <w:sdtPr>
         <w:alias w:val="İçindekiler"/>
-        <w:id w:val="-579368062"/>
+        <w:id w:val="-1581901943"/>
       </w:sdtPr>
       <w:sdtEndPr/>
       <w:sdtContent>
@@ -1027,7 +1137,7 @@
           <w:r>
             <w:fldChar w:fldCharType="separate"/>
           </w:r>
-          <w:hyperlink w:anchor="_Toc242922273" w:history="1">
+          <w:hyperlink w:anchor="_Toc242962092" w:history="1">
             <w:r>
               <w:rPr>
                 <w:rStyle w:val="Kpr"/>
@@ -1051,7 +1161,7 @@
               <w:rPr>
                 <w:noProof/>
               </w:rPr>
-              <w:instrText xml:space="preserve"> PAGEREF _Toc242922273 \h </w:instrText>
+              <w:instrText xml:space="preserve"> PAGEREF _Toc242962092 \h </w:instrText>
             </w:r>
             <w:r>
               <w:rPr>
@@ -1088,7 +1198,7 @@
               <w:noProof/>
             </w:rPr>
           </w:pPr>
-          <w:hyperlink w:anchor="_Toc242922274" w:history="1">
+          <w:hyperlink w:anchor="_Toc242962093" w:history="1">
             <w:r>
               <w:rPr>
                 <w:rStyle w:val="Kpr"/>
@@ -1112,7 +1222,7 @@
               <w:rPr>
                 <w:noProof/>
               </w:rPr>
-              <w:instrText xml:space="preserve"> PAGEREF _Toc242922274 \h </w:instrText>
+              <w:instrText xml:space="preserve"> PAGEREF _Toc242962093 \h </w:instrText>
             </w:r>
             <w:r>
               <w:rPr>
@@ -1149,7 +1259,7 @@
               <w:noProof/>
             </w:rPr>
           </w:pPr>
-          <w:hyperlink w:anchor="_Toc242922275" w:history="1">
+          <w:hyperlink w:anchor="_Toc242962094" w:history="1">
             <w:r>
               <w:rPr>
                 <w:rStyle w:val="Kpr"/>
@@ -1173,7 +1283,7 @@
               <w:rPr>
                 <w:noProof/>
               </w:rPr>
-              <w:instrText xml:space="preserve"> PAGEREF _Toc242922275 \h </w:instrText>
+              <w:instrText xml:space="preserve"> PAGEREF _Toc242962094 \h </w:instrText>
             </w:r>
             <w:r>
               <w:rPr>
@@ -1210,7 +1320,7 @@
               <w:noProof/>
             </w:rPr>
           </w:pPr>
-          <w:hyperlink w:anchor="_Toc242922276" w:history="1">
+          <w:hyperlink w:anchor="_Toc242962095" w:history="1">
             <w:r>
               <w:rPr>
                 <w:rStyle w:val="Kpr"/>
@@ -1234,7 +1344,7 @@
               <w:rPr>
                 <w:noProof/>
               </w:rPr>
-              <w:instrText xml:space="preserve"> PAGEREF _Toc242922276 \h </w:instrText>
+              <w:instrText xml:space="preserve"> PAGEREF _Toc242962095 \h </w:instrText>
             </w:r>
             <w:r>
               <w:rPr>
@@ -1271,7 +1381,7 @@
               <w:noProof/>
             </w:rPr>
           </w:pPr>
-          <w:hyperlink w:anchor="_Toc242922277" w:history="1">
+          <w:hyperlink w:anchor="_Toc242962096" w:history="1">
             <w:r>
               <w:rPr>
                 <w:rStyle w:val="Kpr"/>
@@ -1295,7 +1405,7 @@
               <w:rPr>
                 <w:noProof/>
               </w:rPr>
-              <w:instrText xml:space="preserve"> PAGEREF _Toc242922277 \h </w:instrText>
+              <w:instrText xml:space="preserve"> PAGEREF _Toc242962096 \h </w:instrText>
             </w:r>
             <w:r>
               <w:rPr>
@@ -1332,7 +1442,7 @@
               <w:noProof/>
             </w:rPr>
           </w:pPr>
-          <w:hyperlink w:anchor="_Toc242922278" w:history="1">
+          <w:hyperlink w:anchor="_Toc242962097" w:history="1">
             <w:r>
               <w:rPr>
                 <w:rStyle w:val="Kpr"/>
@@ -1356,7 +1466,7 @@
               <w:rPr>
                 <w:noProof/>
               </w:rPr>
-              <w:instrText xml:space="preserve"> PAGEREF _Toc242922278 \h </w:instrText>
+              <w:instrText xml:space="preserve"> PAGEREF _Toc242962097 \h </w:instrText>
             </w:r>
             <w:r>
               <w:rPr>
@@ -1393,7 +1503,7 @@
               <w:noProof/>
             </w:rPr>
           </w:pPr>
-          <w:hyperlink w:anchor="_Toc242922279" w:history="1">
+          <w:hyperlink w:anchor="_Toc242962098" w:history="1">
             <w:r>
               <w:rPr>
                 <w:rStyle w:val="Kpr"/>
@@ -1417,7 +1527,7 @@
               <w:rPr>
                 <w:noProof/>
               </w:rPr>
-              <w:instrText xml:space="preserve"> PAGEREF _Toc242922279 \h </w:instrText>
+              <w:instrText xml:space="preserve"> PAGEREF _Toc242962098 \h </w:instrText>
             </w:r>
             <w:r>
               <w:rPr>
@@ -1454,7 +1564,7 @@
               <w:noProof/>
             </w:rPr>
           </w:pPr>
-          <w:hyperlink w:anchor="_Toc242922280" w:history="1">
+          <w:hyperlink w:anchor="_Toc242962099" w:history="1">
             <w:r>
               <w:rPr>
                 <w:rStyle w:val="Kpr"/>
@@ -1478,7 +1588,7 @@
               <w:rPr>
                 <w:noProof/>
               </w:rPr>
-              <w:instrText xml:space="preserve"> PAGEREF _Toc242922280 \h </w:instrText>
+              <w:instrText xml:space="preserve"> PAGEREF _Toc242962099 \h </w:instrText>
             </w:r>
             <w:r>
               <w:rPr>
@@ -1515,7 +1625,7 @@
               <w:noProof/>
             </w:rPr>
           </w:pPr>
-          <w:hyperlink w:anchor="_Toc242922281" w:history="1">
+          <w:hyperlink w:anchor="_Toc242962100" w:history="1">
             <w:r>
               <w:rPr>
                 <w:rStyle w:val="Kpr"/>
@@ -1539,7 +1649,7 @@
               <w:rPr>
                 <w:noProof/>
               </w:rPr>
-              <w:instrText xml:space="preserve"> PAGEREF _Toc242922281 \h </w:instrText>
+              <w:instrText xml:space="preserve"> PAGEREF _Toc242962100 \h </w:instrText>
             </w:r>
             <w:r>
               <w:rPr>
@@ -1576,7 +1686,7 @@
               <w:noProof/>
             </w:rPr>
           </w:pPr>
-          <w:hyperlink w:anchor="_Toc242922282" w:history="1">
+          <w:hyperlink w:anchor="_Toc242962101" w:history="1">
             <w:r>
               <w:rPr>
                 <w:rStyle w:val="Kpr"/>
@@ -1600,7 +1710,7 @@
               <w:rPr>
                 <w:noProof/>
               </w:rPr>
-              <w:instrText xml:space="preserve"> PAGEREF _Toc242922282 \h </w:instrText>
+              <w:instrText xml:space="preserve"> PAGEREF _Toc242962101 \h </w:instrText>
             </w:r>
             <w:r>
               <w:rPr>
@@ -1637,7 +1747,7 @@
               <w:noProof/>
             </w:rPr>
           </w:pPr>
-          <w:hyperlink w:anchor="_Toc242922283" w:history="1">
+          <w:hyperlink w:anchor="_Toc242962102" w:history="1">
             <w:r>
               <w:rPr>
                 <w:rStyle w:val="Kpr"/>
@@ -1661,7 +1771,7 @@
               <w:rPr>
                 <w:noProof/>
               </w:rPr>
-              <w:instrText xml:space="preserve"> PAGEREF _Toc242922283 \h </w:instrText>
+              <w:instrText xml:space="preserve"> PAGEREF _Toc242962102 \h </w:instrText>
             </w:r>
             <w:r>
               <w:rPr>
@@ -1698,7 +1808,7 @@
               <w:noProof/>
             </w:rPr>
           </w:pPr>
-          <w:hyperlink w:anchor="_Toc242922284" w:history="1">
+          <w:hyperlink w:anchor="_Toc242962103" w:history="1">
             <w:r>
               <w:rPr>
                 <w:rStyle w:val="Kpr"/>
@@ -1722,7 +1832,7 @@
               <w:rPr>
                 <w:noProof/>
               </w:rPr>
-              <w:instrText xml:space="preserve"> PAGEREF _Toc242922284 \h </w:instrText>
+              <w:instrText xml:space="preserve"> PAGEREF _Toc242962103 \h </w:instrText>
             </w:r>
             <w:r>
               <w:rPr>
@@ -1759,7 +1869,7 @@
               <w:noProof/>
             </w:rPr>
           </w:pPr>
-          <w:hyperlink w:anchor="_Toc242922285" w:history="1">
+          <w:hyperlink w:anchor="_Toc242962104" w:history="1">
             <w:r>
               <w:rPr>
                 <w:rStyle w:val="Kpr"/>
@@ -1783,7 +1893,7 @@
               <w:rPr>
                 <w:noProof/>
               </w:rPr>
-              <w:instrText xml:space="preserve"> PAGEREF _Toc242922285 \h </w:instrText>
+              <w:instrText xml:space="preserve"> PAGEREF _Toc242962104 \h </w:instrText>
             </w:r>
             <w:r>
               <w:rPr>
@@ -1820,7 +1930,7 @@
               <w:noProof/>
             </w:rPr>
           </w:pPr>
-          <w:hyperlink w:anchor="_Toc242922286" w:history="1">
+          <w:hyperlink w:anchor="_Toc242962105" w:history="1">
             <w:r>
               <w:rPr>
                 <w:rStyle w:val="Kpr"/>
@@ -1844,7 +1954,7 @@
               <w:rPr>
                 <w:noProof/>
               </w:rPr>
-              <w:instrText xml:space="preserve"> PAGEREF _Toc242922286 \h </w:instrText>
+              <w:instrText xml:space="preserve"> PAGEREF _Toc242962105 \h </w:instrText>
             </w:r>
             <w:r>
               <w:rPr>
@@ -1881,7 +1991,7 @@
               <w:noProof/>
             </w:rPr>
           </w:pPr>
-          <w:hyperlink w:anchor="_Toc242922287" w:history="1">
+          <w:hyperlink w:anchor="_Toc242962106" w:history="1">
             <w:r>
               <w:rPr>
                 <w:rStyle w:val="Kpr"/>
@@ -1905,7 +2015,7 @@
               <w:rPr>
                 <w:noProof/>
               </w:rPr>
-              <w:instrText xml:space="preserve"> PAGEREF _Toc242922287 \h </w:instrText>
+              <w:instrText xml:space="preserve"> PAGEREF _Toc242962106 \h </w:instrText>
             </w:r>
             <w:r>
               <w:rPr>
@@ -1942,7 +2052,7 @@
               <w:noProof/>
             </w:rPr>
           </w:pPr>
-          <w:hyperlink w:anchor="_Toc242922288" w:history="1">
+          <w:hyperlink w:anchor="_Toc242962107" w:history="1">
             <w:r>
               <w:rPr>
                 <w:rStyle w:val="Kpr"/>
@@ -1966,7 +2076,7 @@
               <w:rPr>
                 <w:noProof/>
               </w:rPr>
-              <w:instrText xml:space="preserve"> PAGEREF _Toc242922288 \h </w:instrText>
+              <w:instrText xml:space="preserve"> PAGEREF _Toc242962107 \h </w:instrText>
             </w:r>
             <w:r>
               <w:rPr>
@@ -2003,7 +2113,7 @@
               <w:noProof/>
             </w:rPr>
           </w:pPr>
-          <w:hyperlink w:anchor="_Toc242922289" w:history="1">
+          <w:hyperlink w:anchor="_Toc242962108" w:history="1">
             <w:r>
               <w:rPr>
                 <w:rStyle w:val="Kpr"/>
@@ -2027,7 +2137,7 @@
               <w:rPr>
                 <w:noProof/>
               </w:rPr>
-              <w:instrText xml:space="preserve"> PAGEREF _Toc242922289 \h </w:instrText>
+              <w:instrText xml:space="preserve"> PAGEREF _Toc242962108 \h </w:instrText>
             </w:r>
             <w:r>
               <w:rPr>
@@ -2064,7 +2174,7 @@
               <w:noProof/>
             </w:rPr>
           </w:pPr>
-          <w:hyperlink w:anchor="_Toc242922290" w:history="1">
+          <w:hyperlink w:anchor="_Toc242962109" w:history="1">
             <w:r>
               <w:rPr>
                 <w:rStyle w:val="Kpr"/>
@@ -2088,7 +2198,7 @@
               <w:rPr>
                 <w:noProof/>
               </w:rPr>
-              <w:instrText xml:space="preserve"> PAGEREF _Toc242922290 \h </w:instrText>
+              <w:instrText xml:space="preserve"> PAGEREF _Toc242962109 \h </w:instrText>
             </w:r>
             <w:r>
               <w:rPr>
@@ -2125,7 +2235,7 @@
               <w:noProof/>
             </w:rPr>
           </w:pPr>
-          <w:hyperlink w:anchor="_Toc242922291" w:history="1">
+          <w:hyperlink w:anchor="_Toc242962110" w:history="1">
             <w:r>
               <w:rPr>
                 <w:rStyle w:val="Kpr"/>
@@ -2149,7 +2259,7 @@
               <w:rPr>
                 <w:noProof/>
               </w:rPr>
-              <w:instrText xml:space="preserve"> PAGEREF _Toc242922291 \h </w:instrText>
+              <w:instrText xml:space="preserve"> PAGEREF _Toc242962110 \h </w:instrText>
             </w:r>
             <w:r>
               <w:rPr>
@@ -2186,7 +2296,7 @@
               <w:noProof/>
             </w:rPr>
           </w:pPr>
-          <w:hyperlink w:anchor="_Toc242922292" w:history="1">
+          <w:hyperlink w:anchor="_Toc242962111" w:history="1">
             <w:r>
               <w:rPr>
                 <w:rStyle w:val="Kpr"/>
@@ -2210,7 +2320,7 @@
               <w:rPr>
                 <w:noProof/>
               </w:rPr>
-              <w:instrText xml:space="preserve"> PAGEREF _Toc242922292 \h </w:instrText>
+              <w:instrText xml:space="preserve"> PAGEREF _Toc242962111 \h </w:instrText>
             </w:r>
             <w:r>
               <w:rPr>
@@ -2247,7 +2357,7 @@
               <w:noProof/>
             </w:rPr>
           </w:pPr>
-          <w:hyperlink w:anchor="_Toc242922293" w:history="1">
+          <w:hyperlink w:anchor="_Toc242962112" w:history="1">
             <w:r>
               <w:rPr>
                 <w:rStyle w:val="Kpr"/>
@@ -2271,7 +2381,7 @@
               <w:rPr>
                 <w:noProof/>
               </w:rPr>
-              <w:instrText xml:space="preserve"> PAGEREF _Toc242922293 \h </w:instrText>
+              <w:instrText xml:space="preserve"> PAGEREF _Toc242962112 \h </w:instrText>
             </w:r>
             <w:r>
               <w:rPr>
@@ -2308,7 +2418,7 @@
               <w:noProof/>
             </w:rPr>
           </w:pPr>
-          <w:hyperlink w:anchor="_Toc242922294" w:history="1">
+          <w:hyperlink w:anchor="_Toc242962113" w:history="1">
             <w:r>
               <w:rPr>
                 <w:rStyle w:val="Kpr"/>
@@ -2332,7 +2442,7 @@
               <w:rPr>
                 <w:noProof/>
               </w:rPr>
-              <w:instrText xml:space="preserve"> PAGEREF _Toc242922294 \h </w:instrText>
+              <w:instrText xml:space="preserve"> PAGEREF _Toc242962113 \h </w:instrText>
             </w:r>
             <w:r>
               <w:rPr>
@@ -2369,7 +2479,7 @@
               <w:noProof/>
             </w:rPr>
           </w:pPr>
-          <w:hyperlink w:anchor="_Toc242922295" w:history="1">
+          <w:hyperlink w:anchor="_Toc242962114" w:history="1">
             <w:r>
               <w:rPr>
                 <w:rStyle w:val="Kpr"/>
@@ -2393,7 +2503,7 @@
               <w:rPr>
                 <w:noProof/>
               </w:rPr>
-              <w:instrText xml:space="preserve"> PAGEREF _Toc242922295 \h </w:instrText>
+              <w:instrText xml:space="preserve"> PAGEREF _Toc242962114 \h </w:instrText>
             </w:r>
             <w:r>
               <w:rPr>
@@ -2430,7 +2540,7 @@
               <w:noProof/>
             </w:rPr>
           </w:pPr>
-          <w:hyperlink w:anchor="_Toc242922296" w:history="1">
+          <w:hyperlink w:anchor="_Toc242962115" w:history="1">
             <w:r>
               <w:rPr>
                 <w:rStyle w:val="Kpr"/>
@@ -2454,7 +2564,7 @@
               <w:rPr>
                 <w:noProof/>
               </w:rPr>
-              <w:instrText xml:space="preserve"> PAGEREF _Toc242922296 \h </w:instrText>
+              <w:instrText xml:space="preserve"> PAGEREF _Toc242962115 \h </w:instrText>
             </w:r>
             <w:r>
               <w:rPr>
@@ -2491,7 +2601,7 @@
               <w:noProof/>
             </w:rPr>
           </w:pPr>
-          <w:hyperlink w:anchor="_Toc242922297" w:history="1">
+          <w:hyperlink w:anchor="_Toc242962116" w:history="1">
             <w:r>
               <w:rPr>
                 <w:rStyle w:val="Kpr"/>
@@ -2515,7 +2625,7 @@
               <w:rPr>
                 <w:noProof/>
               </w:rPr>
-              <w:instrText xml:space="preserve"> PAGEREF _Toc242922297 \h </w:instrText>
+              <w:instrText xml:space="preserve"> PAGEREF _Toc242962116 \h </w:instrText>
             </w:r>
             <w:r>
               <w:rPr>
@@ -2552,7 +2662,7 @@
               <w:noProof/>
             </w:rPr>
           </w:pPr>
-          <w:hyperlink w:anchor="_Toc242922298" w:history="1">
+          <w:hyperlink w:anchor="_Toc242962117" w:history="1">
             <w:r>
               <w:rPr>
                 <w:rStyle w:val="Kpr"/>
@@ -2576,7 +2686,7 @@
               <w:rPr>
                 <w:noProof/>
               </w:rPr>
-              <w:instrText xml:space="preserve"> PAGEREF _Toc242922298 \h </w:instrText>
+              <w:instrText xml:space="preserve"> PAGEREF _Toc242962117 \h </w:instrText>
             </w:r>
             <w:r>
               <w:rPr>
@@ -2613,7 +2723,7 @@
               <w:noProof/>
             </w:rPr>
           </w:pPr>
-          <w:hyperlink w:anchor="_Toc242922299" w:history="1">
+          <w:hyperlink w:anchor="_Toc242962118" w:history="1">
             <w:r>
               <w:rPr>
                 <w:rStyle w:val="Kpr"/>
@@ -2637,7 +2747,7 @@
               <w:rPr>
                 <w:noProof/>
               </w:rPr>
-              <w:instrText xml:space="preserve"> PAGEREF _Toc242922299 \h </w:instrText>
+              <w:instrText xml:space="preserve"> PAGEREF _Toc242962118 \h </w:instrText>
             </w:r>
             <w:r>
               <w:rPr>
@@ -2674,7 +2784,7 @@
               <w:noProof/>
             </w:rPr>
           </w:pPr>
-          <w:hyperlink w:anchor="_Toc242922300" w:history="1">
+          <w:hyperlink w:anchor="_Toc242962119" w:history="1">
             <w:r>
               <w:rPr>
                 <w:rStyle w:val="Kpr"/>
@@ -2698,7 +2808,7 @@
               <w:rPr>
                 <w:noProof/>
               </w:rPr>
-              <w:instrText xml:space="preserve"> PAGEREF _Toc242922300 \h </w:instrText>
+              <w:instrText xml:space="preserve"> PAGEREF _Toc242962119 \h </w:instrText>
             </w:r>
             <w:r>
               <w:rPr>
@@ -2735,7 +2845,7 @@
               <w:noProof/>
             </w:rPr>
           </w:pPr>
-          <w:hyperlink w:anchor="_Toc242922301" w:history="1">
+          <w:hyperlink w:anchor="_Toc242962120" w:history="1">
             <w:r>
               <w:rPr>
                 <w:rStyle w:val="Kpr"/>
@@ -2759,7 +2869,7 @@
               <w:rPr>
                 <w:noProof/>
               </w:rPr>
-              <w:instrText xml:space="preserve"> PAGEREF _Toc242922301 \h </w:instrText>
+              <w:instrText xml:space="preserve"> PAGEREF _Toc242962120 \h </w:instrText>
             </w:r>
             <w:r>
               <w:rPr>
@@ -2796,7 +2906,7 @@
               <w:noProof/>
             </w:rPr>
           </w:pPr>
-          <w:hyperlink w:anchor="_Toc242922302" w:history="1">
+          <w:hyperlink w:anchor="_Toc242962121" w:history="1">
             <w:r>
               <w:rPr>
                 <w:rStyle w:val="Kpr"/>
@@ -2820,7 +2930,7 @@
               <w:rPr>
                 <w:noProof/>
               </w:rPr>
-              <w:instrText xml:space="preserve"> PAGEREF _Toc242922302 \h </w:instrText>
+              <w:instrText xml:space="preserve"> PAGEREF _Toc242962121 \h </w:instrText>
             </w:r>
             <w:r>
               <w:rPr>
@@ -2857,7 +2967,7 @@
               <w:noProof/>
             </w:rPr>
           </w:pPr>
-          <w:hyperlink w:anchor="_Toc242922303" w:history="1">
+          <w:hyperlink w:anchor="_Toc242962122" w:history="1">
             <w:r>
               <w:rPr>
                 <w:rStyle w:val="Kpr"/>
@@ -2881,7 +2991,7 @@
               <w:rPr>
                 <w:noProof/>
               </w:rPr>
-              <w:instrText xml:space="preserve"> PAGEREF _Toc242922303 \h </w:instrText>
+              <w:instrText xml:space="preserve"> PAGEREF _Toc242962122 \h </w:instrText>
             </w:r>
             <w:r>
               <w:rPr>
@@ -2918,7 +3028,7 @@
               <w:noProof/>
             </w:rPr>
           </w:pPr>
-          <w:hyperlink w:anchor="_Toc242922304" w:history="1">
+          <w:hyperlink w:anchor="_Toc242962123" w:history="1">
             <w:r>
               <w:rPr>
                 <w:rStyle w:val="Kpr"/>
@@ -2942,7 +3052,7 @@
               <w:rPr>
                 <w:noProof/>
               </w:rPr>
-              <w:instrText xml:space="preserve"> PAGEREF _Toc242922304 \h </w:instrText>
+              <w:instrText xml:space="preserve"> PAGEREF _Toc242962123 \h </w:instrText>
             </w:r>
             <w:r>
               <w:rPr>
@@ -2979,7 +3089,7 @@
               <w:noProof/>
             </w:rPr>
           </w:pPr>
-          <w:hyperlink w:anchor="_Toc242922305" w:history="1">
+          <w:hyperlink w:anchor="_Toc242962124" w:history="1">
             <w:r>
               <w:rPr>
                 <w:rStyle w:val="Kpr"/>
@@ -3003,7 +3113,7 @@
               <w:rPr>
                 <w:noProof/>
               </w:rPr>
-              <w:instrText xml:space="preserve"> PAGEREF _Toc242922305 \h </w:instrText>
+              <w:instrText xml:space="preserve"> PAGEREF _Toc242962124 \h </w:instrText>
             </w:r>
             <w:r>
               <w:rPr>
@@ -3040,7 +3150,7 @@
               <w:noProof/>
             </w:rPr>
           </w:pPr>
-          <w:hyperlink w:anchor="_Toc242922306" w:history="1">
+          <w:hyperlink w:anchor="_Toc242962125" w:history="1">
             <w:r>
               <w:rPr>
                 <w:rStyle w:val="Kpr"/>
@@ -3064,7 +3174,7 @@
               <w:rPr>
                 <w:noProof/>
               </w:rPr>
-              <w:instrText xml:space="preserve"> PAGEREF _Toc242922306 \h </w:instrText>
+              <w:instrText xml:space="preserve"> PAGEREF _Toc242962125 \h </w:instrText>
             </w:r>
             <w:r>
               <w:rPr>
@@ -3101,7 +3211,7 @@
               <w:noProof/>
             </w:rPr>
           </w:pPr>
-          <w:hyperlink w:anchor="_Toc242922307" w:history="1">
+          <w:hyperlink w:anchor="_Toc242962126" w:history="1">
             <w:r>
               <w:rPr>
                 <w:rStyle w:val="Kpr"/>
@@ -3125,7 +3235,7 @@
               <w:rPr>
                 <w:noProof/>
               </w:rPr>
-              <w:instrText xml:space="preserve"> PAGEREF _Toc242922307 \h </w:instrText>
+              <w:instrText xml:space="preserve"> PAGEREF _Toc242962126 \h </w:instrText>
             </w:r>
             <w:r>
               <w:rPr>
@@ -3162,7 +3272,7 @@
               <w:noProof/>
             </w:rPr>
           </w:pPr>
-          <w:hyperlink w:anchor="_Toc242922308" w:history="1">
+          <w:hyperlink w:anchor="_Toc242962127" w:history="1">
             <w:r>
               <w:rPr>
                 <w:rStyle w:val="Kpr"/>
@@ -3186,7 +3296,7 @@
               <w:rPr>
                 <w:noProof/>
               </w:rPr>
-              <w:instrText xml:space="preserve"> PAGEREF _Toc242922308 \h </w:instrText>
+              <w:instrText xml:space="preserve"> PAGEREF _Toc242962127 \h </w:instrText>
             </w:r>
             <w:r>
               <w:rPr>
@@ -3223,7 +3333,7 @@
               <w:noProof/>
             </w:rPr>
           </w:pPr>
-          <w:hyperlink w:anchor="_Toc242922309" w:history="1">
+          <w:hyperlink w:anchor="_Toc242962128" w:history="1">
             <w:r>
               <w:rPr>
                 <w:rStyle w:val="Kpr"/>
@@ -3247,7 +3357,7 @@
               <w:rPr>
                 <w:noProof/>
               </w:rPr>
-              <w:instrText xml:space="preserve"> PAGEREF _Toc242922309 \h </w:instrText>
+              <w:instrText xml:space="preserve"> PAGEREF _Toc242962128 \h </w:instrText>
             </w:r>
             <w:r>
               <w:rPr>
@@ -3284,7 +3394,7 @@
               <w:noProof/>
             </w:rPr>
           </w:pPr>
-          <w:hyperlink w:anchor="_Toc242922310" w:history="1">
+          <w:hyperlink w:anchor="_Toc242962129" w:history="1">
             <w:r>
               <w:rPr>
                 <w:rStyle w:val="Kpr"/>
@@ -3308,7 +3418,7 @@
               <w:rPr>
                 <w:noProof/>
               </w:rPr>
-              <w:instrText xml:space="preserve"> PAGEREF _Toc242922310 \h </w:instrText>
+              <w:instrText xml:space="preserve"> PAGEREF _Toc242962129 \h </w:instrText>
             </w:r>
             <w:r>
               <w:rPr>
@@ -3345,7 +3455,7 @@
               <w:noProof/>
             </w:rPr>
           </w:pPr>
-          <w:hyperlink w:anchor="_Toc242922311" w:history="1">
+          <w:hyperlink w:anchor="_Toc242962130" w:history="1">
             <w:r>
               <w:rPr>
                 <w:rStyle w:val="Kpr"/>
@@ -3369,7 +3479,7 @@
               <w:rPr>
                 <w:noProof/>
               </w:rPr>
-              <w:instrText xml:space="preserve"> PAGEREF _Toc242922311 \h </w:instrText>
+              <w:instrText xml:space="preserve"> PAGEREF _Toc242962130 \h </w:instrText>
             </w:r>
             <w:r>
               <w:rPr>
@@ -3406,7 +3516,7 @@
               <w:noProof/>
             </w:rPr>
           </w:pPr>
-          <w:hyperlink w:anchor="_Toc242922312" w:history="1">
+          <w:hyperlink w:anchor="_Toc242962131" w:history="1">
             <w:r>
               <w:rPr>
                 <w:rStyle w:val="Kpr"/>
@@ -3430,7 +3540,7 @@
               <w:rPr>
                 <w:noProof/>
               </w:rPr>
-              <w:instrText xml:space="preserve"> PAGEREF _Toc242922312 \h </w:instrText>
+              <w:instrText xml:space="preserve"> PAGEREF _Toc242962131 \h </w:instrText>
             </w:r>
             <w:r>
               <w:rPr>
@@ -3467,7 +3577,7 @@
               <w:noProof/>
             </w:rPr>
           </w:pPr>
-          <w:hyperlink w:anchor="_Toc242922313" w:history="1">
+          <w:hyperlink w:anchor="_Toc242962132" w:history="1">
             <w:r>
               <w:rPr>
                 <w:rStyle w:val="Kpr"/>
@@ -3491,7 +3601,7 @@
               <w:rPr>
                 <w:noProof/>
               </w:rPr>
-              <w:instrText xml:space="preserve"> PAGEREF _Toc242922313 \h </w:instrText>
+              <w:instrText xml:space="preserve"> PAGEREF _Toc242962132 \h </w:instrText>
             </w:r>
             <w:r>
               <w:rPr>
@@ -3528,7 +3638,7 @@
               <w:noProof/>
             </w:rPr>
           </w:pPr>
-          <w:hyperlink w:anchor="_Toc242922314" w:history="1">
+          <w:hyperlink w:anchor="_Toc242962133" w:history="1">
             <w:r>
               <w:rPr>
                 <w:rStyle w:val="Kpr"/>
@@ -3552,7 +3662,7 @@
               <w:rPr>
                 <w:noProof/>
               </w:rPr>
-              <w:instrText xml:space="preserve"> PAGEREF _Toc242922314 \h </w:instrText>
+              <w:instrText xml:space="preserve"> PAGEREF _Toc242962133 \h </w:instrText>
             </w:r>
             <w:r>
               <w:rPr>
@@ -3589,7 +3699,7 @@
               <w:noProof/>
             </w:rPr>
           </w:pPr>
-          <w:hyperlink w:anchor="_Toc242922315" w:history="1">
+          <w:hyperlink w:anchor="_Toc242962134" w:history="1">
             <w:r>
               <w:rPr>
                 <w:rStyle w:val="Kpr"/>
@@ -3613,7 +3723,7 @@
               <w:rPr>
                 <w:noProof/>
               </w:rPr>
-              <w:instrText xml:space="preserve"> PAGEREF _Toc242922315 \h </w:instrText>
+              <w:instrText xml:space="preserve"> PAGEREF _Toc242962134 \h </w:instrText>
             </w:r>
             <w:r>
               <w:rPr>
@@ -3650,7 +3760,7 @@
               <w:noProof/>
             </w:rPr>
           </w:pPr>
-          <w:hyperlink w:anchor="_Toc242922316" w:history="1">
+          <w:hyperlink w:anchor="_Toc242962135" w:history="1">
             <w:r>
               <w:rPr>
                 <w:rStyle w:val="Kpr"/>
@@ -3674,7 +3784,7 @@
               <w:rPr>
                 <w:noProof/>
               </w:rPr>
-              <w:instrText xml:space="preserve"> PAGEREF _Toc242922316 \h </w:instrText>
+              <w:instrText xml:space="preserve"> PAGEREF _Toc242962135 \h </w:instrText>
             </w:r>
             <w:r>
               <w:rPr>
@@ -3711,7 +3821,7 @@
               <w:noProof/>
             </w:rPr>
           </w:pPr>
-          <w:hyperlink w:anchor="_Toc242922317" w:history="1">
+          <w:hyperlink w:anchor="_Toc242962136" w:history="1">
             <w:r>
               <w:rPr>
                 <w:rStyle w:val="Kpr"/>
@@ -3735,7 +3845,7 @@
               <w:rPr>
                 <w:noProof/>
               </w:rPr>
-              <w:instrText xml:space="preserve"> PAGEREF _Toc242922317 \h </w:instrText>
+              <w:instrText xml:space="preserve"> PAGEREF _Toc242962136 \h </w:instrText>
             </w:r>
             <w:r>
               <w:rPr>
@@ -3772,7 +3882,7 @@
               <w:noProof/>
             </w:rPr>
           </w:pPr>
-          <w:hyperlink w:anchor="_Toc242922318" w:history="1">
+          <w:hyperlink w:anchor="_Toc242962137" w:history="1">
             <w:r>
               <w:rPr>
                 <w:rStyle w:val="Kpr"/>
@@ -3796,7 +3906,7 @@
               <w:rPr>
                 <w:noProof/>
               </w:rPr>
-              <w:instrText xml:space="preserve"> PAGEREF _Toc242922318 \h </w:instrText>
+              <w:instrText xml:space="preserve"> PAGEREF _Toc242962137 \h </w:instrText>
             </w:r>
             <w:r>
               <w:rPr>
@@ -3833,7 +3943,7 @@
               <w:noProof/>
             </w:rPr>
           </w:pPr>
-          <w:hyperlink w:anchor="_Toc242922319" w:history="1">
+          <w:hyperlink w:anchor="_Toc242962138" w:history="1">
             <w:r>
               <w:rPr>
                 <w:rStyle w:val="Kpr"/>
@@ -3857,7 +3967,7 @@
               <w:rPr>
                 <w:noProof/>
               </w:rPr>
-              <w:instrText xml:space="preserve"> PAGEREF _Toc242922319 \h </w:instrText>
+              <w:instrText xml:space="preserve"> PAGEREF _Toc242962138 \h </w:instrText>
             </w:r>
             <w:r>
               <w:rPr>
@@ -3894,7 +4004,7 @@
               <w:noProof/>
             </w:rPr>
           </w:pPr>
-          <w:hyperlink w:anchor="_Toc242922320" w:history="1">
+          <w:hyperlink w:anchor="_Toc242962139" w:history="1">
             <w:r>
               <w:rPr>
                 <w:rStyle w:val="Kpr"/>
@@ -3918,7 +4028,7 @@
               <w:rPr>
                 <w:noProof/>
               </w:rPr>
-              <w:instrText xml:space="preserve"> PAGEREF _Toc242922320 \h </w:instrText>
+              <w:instrText xml:space="preserve"> PAGEREF _Toc242962139 \h </w:instrText>
             </w:r>
             <w:r>
               <w:rPr>
@@ -3955,7 +4065,7 @@
               <w:noProof/>
             </w:rPr>
           </w:pPr>
-          <w:hyperlink w:anchor="_Toc242922321" w:history="1">
+          <w:hyperlink w:anchor="_Toc242962140" w:history="1">
             <w:r>
               <w:rPr>
                 <w:rStyle w:val="Kpr"/>
@@ -3979,7 +4089,7 @@
               <w:rPr>
                 <w:noProof/>
               </w:rPr>
-              <w:instrText xml:space="preserve"> PAGEREF _Toc242922321 \h </w:instrText>
+              <w:instrText xml:space="preserve"> PAGEREF _Toc242962140 \h </w:instrText>
             </w:r>
             <w:r>
               <w:rPr>
@@ -4016,7 +4126,7 @@
               <w:noProof/>
             </w:rPr>
           </w:pPr>
-          <w:hyperlink w:anchor="_Toc242922322" w:history="1">
+          <w:hyperlink w:anchor="_Toc242962141" w:history="1">
             <w:r>
               <w:rPr>
                 <w:rStyle w:val="Kpr"/>
@@ -4040,7 +4150,7 @@
               <w:rPr>
                 <w:noProof/>
               </w:rPr>
-              <w:instrText xml:space="preserve"> PAGEREF _Toc242922322 \h </w:instrText>
+              <w:instrText xml:space="preserve"> PAGEREF _Toc242962141 \h </w:instrText>
             </w:r>
             <w:r>
               <w:rPr>
@@ -4077,7 +4187,7 @@
               <w:noProof/>
             </w:rPr>
           </w:pPr>
-          <w:hyperlink w:anchor="_Toc242922323" w:history="1">
+          <w:hyperlink w:anchor="_Toc242962142" w:history="1">
             <w:r>
               <w:rPr>
                 <w:rStyle w:val="Kpr"/>
@@ -4101,7 +4211,7 @@
               <w:rPr>
                 <w:noProof/>
               </w:rPr>
-              <w:instrText xml:space="preserve"> PAGEREF _Toc242922323 \h </w:instrText>
+              <w:instrText xml:space="preserve"> PAGEREF _Toc242962142 \h </w:instrText>
             </w:r>
             <w:r>
               <w:rPr>
@@ -4138,7 +4248,7 @@
               <w:noProof/>
             </w:rPr>
           </w:pPr>
-          <w:hyperlink w:anchor="_Toc242922324" w:history="1">
+          <w:hyperlink w:anchor="_Toc242962143" w:history="1">
             <w:r>
               <w:rPr>
                 <w:rStyle w:val="Kpr"/>
@@ -4162,7 +4272,7 @@
               <w:rPr>
                 <w:noProof/>
               </w:rPr>
-              <w:instrText xml:space="preserve"> PAGEREF _Toc242922324 \h </w:instrText>
+              <w:instrText xml:space="preserve"> PAGEREF _Toc242962143 \h </w:instrText>
             </w:r>
             <w:r>
               <w:rPr>
@@ -4179,7 +4289,7 @@
               <w:rPr>
                 <w:noProof/>
               </w:rPr>
-              <w:t>17</w:t>
+              <w:t>18</w:t>
             </w:r>
             <w:r>
               <w:rPr>
@@ -4199,7 +4309,7 @@
               <w:noProof/>
             </w:rPr>
           </w:pPr>
-          <w:hyperlink w:anchor="_Toc242922325" w:history="1">
+          <w:hyperlink w:anchor="_Toc242962144" w:history="1">
             <w:r>
               <w:rPr>
                 <w:rStyle w:val="Kpr"/>
@@ -4223,7 +4333,7 @@
               <w:rPr>
                 <w:noProof/>
               </w:rPr>
-              <w:instrText xml:space="preserve"> PAGEREF _Toc242922325 \h </w:instrText>
+              <w:instrText xml:space="preserve"> PAGEREF _Toc242962144 \h </w:instrText>
             </w:r>
             <w:r>
               <w:rPr>
@@ -4282,7 +4392,7 @@
       <w:pPr>
         <w:pStyle w:val="Balk1"/>
       </w:pPr>
-      <w:bookmarkStart w:id="2" w:name="_Toc242922275"/>
+      <w:bookmarkStart w:id="2" w:name="_Toc242962094"/>
       <w:r>
         <w:t>1. Giriş</w:t>
       </w:r>
@@ -4292,7 +4402,7 @@
       <w:pPr>
         <w:pStyle w:val="Balk2"/>
       </w:pPr>
-      <w:bookmarkStart w:id="3" w:name="_Toc242922276"/>
+      <w:bookmarkStart w:id="3" w:name="_Toc242962095"/>
       <w:r>
         <w:t>1.1 Amaç</w:t>
       </w:r>
@@ -4320,7 +4430,7 @@
       <w:pPr>
         <w:pStyle w:val="Balk2"/>
       </w:pPr>
-      <w:bookmarkStart w:id="4" w:name="_Toc242922277"/>
+      <w:bookmarkStart w:id="4" w:name="_Toc242962096"/>
       <w:r>
         <w:t>1.2 Kapsam Özeti</w:t>
       </w:r>
@@ -4339,7 +4449,7 @@
       <w:pPr>
         <w:pStyle w:val="Balk2"/>
       </w:pPr>
-      <w:bookmarkStart w:id="5" w:name="_Toc242922278"/>
+      <w:bookmarkStart w:id="5" w:name="_Toc242962097"/>
       <w:r>
         <w:t>1.3 Referans Dokümanlar</w:t>
       </w:r>
@@ -4878,7 +4988,7 @@
       <w:pPr>
         <w:pStyle w:val="Balk2"/>
       </w:pPr>
-      <w:bookmarkStart w:id="6" w:name="_Toc242922279"/>
+      <w:bookmarkStart w:id="6" w:name="_Toc242962098"/>
       <w:r>
         <w:t>1.4 Kısaltmalar</w:t>
       </w:r>
@@ -5531,7 +5641,7 @@
       <w:pPr>
         <w:pStyle w:val="Balk1"/>
       </w:pPr>
-      <w:bookmarkStart w:id="7" w:name="_Toc242922280"/>
+      <w:bookmarkStart w:id="7" w:name="_Toc242962099"/>
       <w:r>
         <w:t>2. Test Edilecek Sistem</w:t>
       </w:r>
@@ -5541,7 +5651,7 @@
       <w:pPr>
         <w:pStyle w:val="Balk2"/>
       </w:pPr>
-      <w:bookmarkStart w:id="8" w:name="_Toc242922281"/>
+      <w:bookmarkStart w:id="8" w:name="_Toc242962100"/>
       <w:r>
         <w:t>2.1 Uygulama Tanımı</w:t>
       </w:r>
@@ -5560,7 +5670,7 @@
       <w:pPr>
         <w:pStyle w:val="Balk2"/>
       </w:pPr>
-      <w:bookmarkStart w:id="9" w:name="_Toc242922282"/>
+      <w:bookmarkStart w:id="9" w:name="_Toc242962101"/>
       <w:r>
         <w:t>2.2 Mimari ve Bileşenler</w:t>
       </w:r>
@@ -6016,7 +6126,7 @@
       <w:pPr>
         <w:pStyle w:val="Balk2"/>
       </w:pPr>
-      <w:bookmarkStart w:id="10" w:name="_Toc242922283"/>
+      <w:bookmarkStart w:id="10" w:name="_Toc242962102"/>
       <w:r>
         <w:t>2.3 Kullanıcı Rolleri</w:t>
       </w:r>
@@ -6277,7 +6387,7 @@
       <w:pPr>
         <w:pStyle w:val="Balk2"/>
       </w:pPr>
-      <w:bookmarkStart w:id="11" w:name="_Toc242922284"/>
+      <w:bookmarkStart w:id="11" w:name="_Toc242962103"/>
       <w:r>
         <w:t>2.4 Uygulama Modülleri (Site Analizi Sonucu)</w:t>
       </w:r>
@@ -7231,7 +7341,7 @@
       <w:pPr>
         <w:pStyle w:val="Balk1"/>
       </w:pPr>
-      <w:bookmarkStart w:id="12" w:name="_Toc242922285"/>
+      <w:bookmarkStart w:id="12" w:name="_Toc242962104"/>
       <w:r>
         <w:t>3. Test Kapsamı</w:t>
       </w:r>
@@ -7241,7 +7351,7 @@
       <w:pPr>
         <w:pStyle w:val="Balk2"/>
       </w:pPr>
-      <w:bookmarkStart w:id="13" w:name="_Toc242922286"/>
+      <w:bookmarkStart w:id="13" w:name="_Toc242962105"/>
       <w:r>
         <w:t>3.1 Test Edilecek Özellikler (In Scope)</w:t>
       </w:r>
@@ -10333,7 +10443,7 @@
       <w:pPr>
         <w:pStyle w:val="Balk2"/>
       </w:pPr>
-      <w:bookmarkStart w:id="14" w:name="_Toc242922287"/>
+      <w:bookmarkStart w:id="14" w:name="_Toc242962106"/>
       <w:r>
         <w:t>3.2 Test Edilmeyecek Özellikler (Out of Scope)</w:t>
       </w:r>
@@ -10434,7 +10544,7 @@
       <w:pPr>
         <w:pStyle w:val="Balk1"/>
       </w:pPr>
-      <w:bookmarkStart w:id="15" w:name="_Toc242922288"/>
+      <w:bookmarkStart w:id="15" w:name="_Toc242962107"/>
       <w:r>
         <w:t>4. Test Yaklaşımı ve Stratejisi</w:t>
       </w:r>
@@ -10444,7 +10554,7 @@
       <w:pPr>
         <w:pStyle w:val="Balk2"/>
       </w:pPr>
-      <w:bookmarkStart w:id="16" w:name="_Toc242922289"/>
+      <w:bookmarkStart w:id="16" w:name="_Toc242962108"/>
       <w:r>
         <w:t>4.1 Test Seviyeleri</w:t>
       </w:r>
@@ -11066,7 +11176,7 @@
       <w:pPr>
         <w:pStyle w:val="Balk2"/>
       </w:pPr>
-      <w:bookmarkStart w:id="17" w:name="_Toc242922290"/>
+      <w:bookmarkStart w:id="17" w:name="_Toc242962109"/>
       <w:r>
         <w:t>4.2 Test Türleri</w:t>
       </w:r>
@@ -11196,7 +11306,7 @@
       <w:pPr>
         <w:pStyle w:val="Balk2"/>
       </w:pPr>
-      <w:bookmarkStart w:id="18" w:name="_Toc242922291"/>
+      <w:bookmarkStart w:id="18" w:name="_Toc242962110"/>
       <w:r>
         <w:t>4.3 Test Tasarım Teknikleri</w:t>
       </w:r>
@@ -11625,7 +11735,7 @@
       <w:pPr>
         <w:pStyle w:val="Balk2"/>
       </w:pPr>
-      <w:bookmarkStart w:id="19" w:name="_Toc242922292"/>
+      <w:bookmarkStart w:id="19" w:name="_Toc242962111"/>
       <w:r>
         <w:t>4.4 Sipariş Statü Geçiş Kuralları</w:t>
       </w:r>
@@ -12220,7 +12330,7 @@
       <w:pPr>
         <w:pStyle w:val="Balk1"/>
       </w:pPr>
-      <w:bookmarkStart w:id="20" w:name="_Toc242922293"/>
+      <w:bookmarkStart w:id="20" w:name="_Toc242962112"/>
       <w:r>
         <w:t>5. Test Süreci ve Fazlar</w:t>
       </w:r>
@@ -13924,7 +14034,7 @@
       <w:pPr>
         <w:pStyle w:val="Balk1"/>
       </w:pPr>
-      <w:bookmarkStart w:id="21" w:name="_Toc242922294"/>
+      <w:bookmarkStart w:id="21" w:name="_Toc242962113"/>
       <w:r>
         <w:t>6. Test Ortamı</w:t>
       </w:r>
@@ -13934,7 +14044,7 @@
       <w:pPr>
         <w:pStyle w:val="Balk2"/>
       </w:pPr>
-      <w:bookmarkStart w:id="22" w:name="_Toc242922295"/>
+      <w:bookmarkStart w:id="22" w:name="_Toc242962114"/>
       <w:r>
         <w:t>6.1 Ortam Bilgileri</w:t>
       </w:r>
@@ -14419,7 +14529,7 @@
       <w:pPr>
         <w:pStyle w:val="Balk2"/>
       </w:pPr>
-      <w:bookmarkStart w:id="23" w:name="_Toc242922296"/>
+      <w:bookmarkStart w:id="23" w:name="_Toc242962115"/>
       <w:r>
         <w:t>6.2 Araçlar ve Kütüphaneler</w:t>
       </w:r>
@@ -15705,7 +15815,7 @@
       <w:pPr>
         <w:pStyle w:val="Balk2"/>
       </w:pPr>
-      <w:bookmarkStart w:id="24" w:name="_Toc242922297"/>
+      <w:bookmarkStart w:id="24" w:name="_Toc242962116"/>
       <w:r>
         <w:t>6.3 Test Verisi Yönetimi</w:t>
       </w:r>
@@ -15767,7 +15877,7 @@
       <w:pPr>
         <w:pStyle w:val="Balk1"/>
       </w:pPr>
-      <w:bookmarkStart w:id="25" w:name="_Toc242922298"/>
+      <w:bookmarkStart w:id="25" w:name="_Toc242962117"/>
       <w:r>
         <w:t>7. Test Otomasyon Mimarisi</w:t>
       </w:r>
@@ -15777,7 +15887,7 @@
       <w:pPr>
         <w:pStyle w:val="Balk2"/>
       </w:pPr>
-      <w:bookmarkStart w:id="26" w:name="_Toc242922299"/>
+      <w:bookmarkStart w:id="26" w:name="_Toc242962118"/>
       <w:r>
         <w:t>7.1 Selenium + TestNG (POM)</w:t>
       </w:r>
@@ -15905,7 +16015,7 @@
       <w:pPr>
         <w:pStyle w:val="Balk2"/>
       </w:pPr>
-      <w:bookmarkStart w:id="27" w:name="_Toc242922300"/>
+      <w:bookmarkStart w:id="27" w:name="_Toc242962119"/>
       <w:r>
         <w:t>7.2 Selenium + Cucumber (BDD + POM)</w:t>
       </w:r>
@@ -15994,7 +16104,7 @@
       <w:pPr>
         <w:pStyle w:val="Balk2"/>
       </w:pPr>
-      <w:bookmarkStart w:id="28" w:name="_Toc242922301"/>
+      <w:bookmarkStart w:id="28" w:name="_Toc242962120"/>
       <w:r>
         <w:t>7.3 API Otomasyonu (Rest Assured + POJO)</w:t>
       </w:r>
@@ -16083,7 +16193,7 @@
       <w:pPr>
         <w:pStyle w:val="Balk2"/>
       </w:pPr>
-      <w:bookmarkStart w:id="29" w:name="_Toc242922302"/>
+      <w:bookmarkStart w:id="29" w:name="_Toc242962121"/>
       <w:r>
         <w:t>7.4 Veritabanı ve E2E Otomasyonu</w:t>
       </w:r>
@@ -16102,7 +16212,7 @@
       <w:pPr>
         <w:pStyle w:val="Balk1"/>
       </w:pPr>
-      <w:bookmarkStart w:id="30" w:name="_Toc242922303"/>
+      <w:bookmarkStart w:id="30" w:name="_Toc242962122"/>
       <w:r>
         <w:t>8. Giriş, Çıkış ve Askıya Alma Kriterleri</w:t>
       </w:r>
@@ -16112,7 +16222,7 @@
       <w:pPr>
         <w:pStyle w:val="Balk2"/>
       </w:pPr>
-      <w:bookmarkStart w:id="31" w:name="_Toc242922304"/>
+      <w:bookmarkStart w:id="31" w:name="_Toc242962123"/>
       <w:r>
         <w:t>8.1 Giriş Kriterleri (Entry Criteria)</w:t>
       </w:r>
@@ -16200,7 +16310,7 @@
       <w:pPr>
         <w:pStyle w:val="Balk2"/>
       </w:pPr>
-      <w:bookmarkStart w:id="32" w:name="_Toc242922305"/>
+      <w:bookmarkStart w:id="32" w:name="_Toc242962124"/>
       <w:r>
         <w:t>8.2 Çıkış Kriterleri (Exit Criteria)</w:t>
       </w:r>
@@ -16288,7 +16398,7 @@
       <w:pPr>
         <w:pStyle w:val="Balk2"/>
       </w:pPr>
-      <w:bookmarkStart w:id="33" w:name="_Toc242922306"/>
+      <w:bookmarkStart w:id="33" w:name="_Toc242962125"/>
       <w:r>
         <w:t>8.3 Askıya Alma ve Devam Kriterleri</w:t>
       </w:r>
@@ -16549,7 +16659,7 @@
       <w:pPr>
         <w:pStyle w:val="Balk1"/>
       </w:pPr>
-      <w:bookmarkStart w:id="34" w:name="_Toc242922307"/>
+      <w:bookmarkStart w:id="34" w:name="_Toc242962126"/>
       <w:r>
         <w:t>9. Test Case Yazım Standartları</w:t>
       </w:r>
@@ -17284,7 +17394,7 @@
       <w:pPr>
         <w:pStyle w:val="Balk1"/>
       </w:pPr>
-      <w:bookmarkStart w:id="35" w:name="_Toc242922308"/>
+      <w:bookmarkStart w:id="35" w:name="_Toc242962127"/>
       <w:r>
         <w:t>10. JIRA ve Xray Yapılandırması</w:t>
       </w:r>
@@ -18003,7 +18113,7 @@
       <w:pPr>
         <w:pStyle w:val="Balk1"/>
       </w:pPr>
-      <w:bookmarkStart w:id="36" w:name="_Toc242922309"/>
+      <w:bookmarkStart w:id="36" w:name="_Toc242962128"/>
       <w:r>
         <w:t>11. Hata Yönetimi</w:t>
       </w:r>
@@ -18013,7 +18123,7 @@
       <w:pPr>
         <w:pStyle w:val="Balk2"/>
       </w:pPr>
-      <w:bookmarkStart w:id="37" w:name="_Toc242922310"/>
+      <w:bookmarkStart w:id="37" w:name="_Toc242962129"/>
       <w:r>
         <w:t>11.1 Hata Yaşam Döngüsü</w:t>
       </w:r>
@@ -18032,7 +18142,7 @@
       <w:pPr>
         <w:pStyle w:val="Balk2"/>
       </w:pPr>
-      <w:bookmarkStart w:id="38" w:name="_Toc242922311"/>
+      <w:bookmarkStart w:id="38" w:name="_Toc242962130"/>
       <w:r>
         <w:t>11.2 Severity (Ciddiyet) Tanımları</w:t>
       </w:r>
@@ -18571,7 +18681,7 @@
       <w:pPr>
         <w:pStyle w:val="Balk2"/>
       </w:pPr>
-      <w:bookmarkStart w:id="39" w:name="_Toc242922312"/>
+      <w:bookmarkStart w:id="39" w:name="_Toc242962131"/>
       <w:r>
         <w:t>11.3 Priority (Öncelik) Tanımları</w:t>
       </w:r>
@@ -18832,7 +18942,7 @@
       <w:pPr>
         <w:pStyle w:val="Balk2"/>
       </w:pPr>
-      <w:bookmarkStart w:id="40" w:name="_Toc242922313"/>
+      <w:bookmarkStart w:id="40" w:name="_Toc242962132"/>
       <w:r>
         <w:t>11.4 Bug Ticket Şablonu</w:t>
       </w:r>
@@ -19485,7 +19595,7 @@
       <w:pPr>
         <w:pStyle w:val="Balk1"/>
       </w:pPr>
-      <w:bookmarkStart w:id="41" w:name="_Toc242922314"/>
+      <w:bookmarkStart w:id="41" w:name="_Toc242962133"/>
       <w:r>
         <w:t>12. Ön Analiz Bulguları</w:t>
       </w:r>
@@ -20419,7 +20529,7 @@
       <w:pPr>
         <w:pStyle w:val="Balk1"/>
       </w:pPr>
-      <w:bookmarkStart w:id="42" w:name="_Toc242922315"/>
+      <w:bookmarkStart w:id="42" w:name="_Toc242962134"/>
       <w:r>
         <w:t>13. Takvim ve Sprint Planı</w:t>
       </w:r>
@@ -21023,7 +21133,7 @@
       <w:pPr>
         <w:pStyle w:val="Balk1"/>
       </w:pPr>
-      <w:bookmarkStart w:id="43" w:name="_Toc242922316"/>
+      <w:bookmarkStart w:id="43" w:name="_Toc242962135"/>
       <w:r>
         <w:t>14. Roller ve Sorumluluklar</w:t>
       </w:r>
@@ -21396,7 +21506,7 @@
       <w:pPr>
         <w:pStyle w:val="Balk1"/>
       </w:pPr>
-      <w:bookmarkStart w:id="44" w:name="_Toc242922317"/>
+      <w:bookmarkStart w:id="44" w:name="_Toc242962136"/>
       <w:r>
         <w:t>15. Riskler ve Önlemler</w:t>
       </w:r>
@@ -22211,7 +22321,7 @@
       <w:pPr>
         <w:pStyle w:val="Balk1"/>
       </w:pPr>
-      <w:bookmarkStart w:id="45" w:name="_Toc242922318"/>
+      <w:bookmarkStart w:id="45" w:name="_Toc242962137"/>
       <w:r>
         <w:t>16. Teslimatlar</w:t>
       </w:r>
@@ -23165,7 +23275,7 @@
       <w:pPr>
         <w:pStyle w:val="Balk1"/>
       </w:pPr>
-      <w:bookmarkStart w:id="46" w:name="_Toc242922319"/>
+      <w:bookmarkStart w:id="46" w:name="_Toc242962138"/>
       <w:r>
         <w:t>17. Test Özet Raporu (Koşum Sonuçları)</w:t>
       </w:r>
@@ -23177,14 +23287,14 @@
         <w:jc w:val="both"/>
       </w:pPr>
       <w:r>
-        <w:t>Bu bölüm, Sprint 1 kapsamında 10.10.2026 (kullanıcı akışları, otomasyon) ve 15.10.2026 (admin paneli, mehmet@admin.com) tarihlerinde gerçekleştirilen manuel ve otomasyon koşumlarının sonuçlarını özetler. Manuel koşum sonuçları JIRA Xray Test Execution SCRUM-243’e, test case dokümanına (Google Sheets) ve Excel çıktısına işlenmiştir.</w:t>
+        <w:t>Bu bölüm, Sprint 1 kapsamında 10.10.2026 (kullanıcı akışları, otomasyon) ve 15.10.2026 (admin paneli, mehmet@admin.com – kalan admin kayıt/giriş, silme ve sipariş statüsü senaryoları dahil) tarihlerinde gerçekleştirilen manuel ve otomasyon koşumlarının sonuçlarını özetler. Manuel koşum sonuçları JIRA Xray Test Execution SCRUM-243’e, test case dokümanına (Google Sheets) ve Excel çıktısına işlenmiştir.</w:t>
       </w:r>
     </w:p>
     <w:p>
       <w:pPr>
         <w:pStyle w:val="Balk2"/>
       </w:pPr>
-      <w:bookmarkStart w:id="47" w:name="_Toc242922320"/>
+      <w:bookmarkStart w:id="47" w:name="_Toc242962139"/>
       <w:r>
         <w:t>17.1 Manuel Koşum Özeti</w:t>
       </w:r>
@@ -23474,7 +23584,7 @@
                 <w:sz w:val="19"/>
                 <w:szCs w:val="19"/>
               </w:rPr>
-              <w:t>16</w:t>
+              <w:t>17</w:t>
             </w:r>
           </w:p>
         </w:tc>
@@ -23555,7 +23665,7 @@
                 <w:sz w:val="19"/>
                 <w:szCs w:val="19"/>
               </w:rPr>
-              <w:t>1</w:t>
+              <w:t>0</w:t>
             </w:r>
           </w:p>
         </w:tc>
@@ -23665,7 +23775,7 @@
                 <w:sz w:val="19"/>
                 <w:szCs w:val="19"/>
               </w:rPr>
-              <w:t>7</w:t>
+              <w:t>9</w:t>
             </w:r>
           </w:p>
         </w:tc>
@@ -23719,7 +23829,7 @@
                 <w:sz w:val="19"/>
                 <w:szCs w:val="19"/>
               </w:rPr>
-              <w:t>2</w:t>
+              <w:t>0</w:t>
             </w:r>
           </w:p>
         </w:tc>
@@ -23802,61 +23912,61 @@
                 <w:sz w:val="19"/>
                 <w:szCs w:val="19"/>
               </w:rPr>
+              <w:t>18</w:t>
+            </w:r>
+          </w:p>
+        </w:tc>
+        <w:tc>
+          <w:tcPr>
+            <w:tcW w:w="1500" w:type="dxa"/>
+            <w:tcBorders>
+              <w:top w:val="single" w:sz="4" w:space="0" w:color="8EA9DB"/>
+              <w:left w:val="single" w:sz="4" w:space="0" w:color="8EA9DB"/>
+              <w:bottom w:val="single" w:sz="4" w:space="0" w:color="8EA9DB"/>
+              <w:right w:val="single" w:sz="4" w:space="0" w:color="8EA9DB"/>
+            </w:tcBorders>
+            <w:tcMar>
+              <w:top w:w="60" w:type="dxa"/>
+              <w:left w:w="100" w:type="dxa"/>
+              <w:bottom w:w="60" w:type="dxa"/>
+              <w:right w:w="100" w:type="dxa"/>
+            </w:tcMar>
+            <w:vAlign w:val="center"/>
+          </w:tcPr>
+          <w:p>
+            <w:r>
+              <w:rPr>
+                <w:sz w:val="19"/>
+                <w:szCs w:val="19"/>
+              </w:rPr>
+              <w:t>1</w:t>
+            </w:r>
+          </w:p>
+        </w:tc>
+        <w:tc>
+          <w:tcPr>
+            <w:tcW w:w="1500" w:type="dxa"/>
+            <w:tcBorders>
+              <w:top w:val="single" w:sz="4" w:space="0" w:color="8EA9DB"/>
+              <w:left w:val="single" w:sz="4" w:space="0" w:color="8EA9DB"/>
+              <w:bottom w:val="single" w:sz="4" w:space="0" w:color="8EA9DB"/>
+              <w:right w:val="single" w:sz="4" w:space="0" w:color="8EA9DB"/>
+            </w:tcBorders>
+            <w:tcMar>
+              <w:top w:w="60" w:type="dxa"/>
+              <w:left w:w="100" w:type="dxa"/>
+              <w:bottom w:w="60" w:type="dxa"/>
+              <w:right w:w="100" w:type="dxa"/>
+            </w:tcMar>
+            <w:vAlign w:val="center"/>
+          </w:tcPr>
+          <w:p>
+            <w:r>
+              <w:rPr>
+                <w:sz w:val="19"/>
+                <w:szCs w:val="19"/>
+              </w:rPr>
               <w:t>0</w:t>
-            </w:r>
-          </w:p>
-        </w:tc>
-        <w:tc>
-          <w:tcPr>
-            <w:tcW w:w="1500" w:type="dxa"/>
-            <w:tcBorders>
-              <w:top w:val="single" w:sz="4" w:space="0" w:color="8EA9DB"/>
-              <w:left w:val="single" w:sz="4" w:space="0" w:color="8EA9DB"/>
-              <w:bottom w:val="single" w:sz="4" w:space="0" w:color="8EA9DB"/>
-              <w:right w:val="single" w:sz="4" w:space="0" w:color="8EA9DB"/>
-            </w:tcBorders>
-            <w:tcMar>
-              <w:top w:w="60" w:type="dxa"/>
-              <w:left w:w="100" w:type="dxa"/>
-              <w:bottom w:w="60" w:type="dxa"/>
-              <w:right w:w="100" w:type="dxa"/>
-            </w:tcMar>
-            <w:vAlign w:val="center"/>
-          </w:tcPr>
-          <w:p>
-            <w:r>
-              <w:rPr>
-                <w:sz w:val="19"/>
-                <w:szCs w:val="19"/>
-              </w:rPr>
-              <w:t>0</w:t>
-            </w:r>
-          </w:p>
-        </w:tc>
-        <w:tc>
-          <w:tcPr>
-            <w:tcW w:w="1500" w:type="dxa"/>
-            <w:tcBorders>
-              <w:top w:val="single" w:sz="4" w:space="0" w:color="8EA9DB"/>
-              <w:left w:val="single" w:sz="4" w:space="0" w:color="8EA9DB"/>
-              <w:bottom w:val="single" w:sz="4" w:space="0" w:color="8EA9DB"/>
-              <w:right w:val="single" w:sz="4" w:space="0" w:color="8EA9DB"/>
-            </w:tcBorders>
-            <w:tcMar>
-              <w:top w:w="60" w:type="dxa"/>
-              <w:left w:w="100" w:type="dxa"/>
-              <w:bottom w:w="60" w:type="dxa"/>
-              <w:right w:w="100" w:type="dxa"/>
-            </w:tcMar>
-            <w:vAlign w:val="center"/>
-          </w:tcPr>
-          <w:p>
-            <w:r>
-              <w:rPr>
-                <w:sz w:val="19"/>
-                <w:szCs w:val="19"/>
-              </w:rPr>
-              <w:t>19</w:t>
             </w:r>
           </w:p>
         </w:tc>
@@ -23966,61 +24076,61 @@
                 <w:sz w:val="19"/>
                 <w:szCs w:val="19"/>
               </w:rPr>
+              <w:t>2</w:t>
+            </w:r>
+          </w:p>
+        </w:tc>
+        <w:tc>
+          <w:tcPr>
+            <w:tcW w:w="1500" w:type="dxa"/>
+            <w:tcBorders>
+              <w:top w:val="single" w:sz="4" w:space="0" w:color="8EA9DB"/>
+              <w:left w:val="single" w:sz="4" w:space="0" w:color="8EA9DB"/>
+              <w:bottom w:val="single" w:sz="4" w:space="0" w:color="8EA9DB"/>
+              <w:right w:val="single" w:sz="4" w:space="0" w:color="8EA9DB"/>
+            </w:tcBorders>
+            <w:tcMar>
+              <w:top w:w="60" w:type="dxa"/>
+              <w:left w:w="100" w:type="dxa"/>
+              <w:bottom w:w="60" w:type="dxa"/>
+              <w:right w:w="100" w:type="dxa"/>
+            </w:tcMar>
+            <w:vAlign w:val="center"/>
+          </w:tcPr>
+          <w:p>
+            <w:r>
+              <w:rPr>
+                <w:sz w:val="19"/>
+                <w:szCs w:val="19"/>
+              </w:rPr>
+              <w:t>8</w:t>
+            </w:r>
+          </w:p>
+        </w:tc>
+        <w:tc>
+          <w:tcPr>
+            <w:tcW w:w="1500" w:type="dxa"/>
+            <w:tcBorders>
+              <w:top w:val="single" w:sz="4" w:space="0" w:color="8EA9DB"/>
+              <w:left w:val="single" w:sz="4" w:space="0" w:color="8EA9DB"/>
+              <w:bottom w:val="single" w:sz="4" w:space="0" w:color="8EA9DB"/>
+              <w:right w:val="single" w:sz="4" w:space="0" w:color="8EA9DB"/>
+            </w:tcBorders>
+            <w:tcMar>
+              <w:top w:w="60" w:type="dxa"/>
+              <w:left w:w="100" w:type="dxa"/>
+              <w:bottom w:w="60" w:type="dxa"/>
+              <w:right w:w="100" w:type="dxa"/>
+            </w:tcMar>
+            <w:vAlign w:val="center"/>
+          </w:tcPr>
+          <w:p>
+            <w:r>
+              <w:rPr>
+                <w:sz w:val="19"/>
+                <w:szCs w:val="19"/>
+              </w:rPr>
               <w:t>0</w:t>
-            </w:r>
-          </w:p>
-        </w:tc>
-        <w:tc>
-          <w:tcPr>
-            <w:tcW w:w="1500" w:type="dxa"/>
-            <w:tcBorders>
-              <w:top w:val="single" w:sz="4" w:space="0" w:color="8EA9DB"/>
-              <w:left w:val="single" w:sz="4" w:space="0" w:color="8EA9DB"/>
-              <w:bottom w:val="single" w:sz="4" w:space="0" w:color="8EA9DB"/>
-              <w:right w:val="single" w:sz="4" w:space="0" w:color="8EA9DB"/>
-            </w:tcBorders>
-            <w:tcMar>
-              <w:top w:w="60" w:type="dxa"/>
-              <w:left w:w="100" w:type="dxa"/>
-              <w:bottom w:w="60" w:type="dxa"/>
-              <w:right w:w="100" w:type="dxa"/>
-            </w:tcMar>
-            <w:vAlign w:val="center"/>
-          </w:tcPr>
-          <w:p>
-            <w:r>
-              <w:rPr>
-                <w:sz w:val="19"/>
-                <w:szCs w:val="19"/>
-              </w:rPr>
-              <w:t>0</w:t>
-            </w:r>
-          </w:p>
-        </w:tc>
-        <w:tc>
-          <w:tcPr>
-            <w:tcW w:w="1500" w:type="dxa"/>
-            <w:tcBorders>
-              <w:top w:val="single" w:sz="4" w:space="0" w:color="8EA9DB"/>
-              <w:left w:val="single" w:sz="4" w:space="0" w:color="8EA9DB"/>
-              <w:bottom w:val="single" w:sz="4" w:space="0" w:color="8EA9DB"/>
-              <w:right w:val="single" w:sz="4" w:space="0" w:color="8EA9DB"/>
-            </w:tcBorders>
-            <w:tcMar>
-              <w:top w:w="60" w:type="dxa"/>
-              <w:left w:w="100" w:type="dxa"/>
-              <w:bottom w:w="60" w:type="dxa"/>
-              <w:right w:w="100" w:type="dxa"/>
-            </w:tcMar>
-            <w:vAlign w:val="center"/>
-          </w:tcPr>
-          <w:p>
-            <w:r>
-              <w:rPr>
-                <w:sz w:val="19"/>
-                <w:szCs w:val="19"/>
-              </w:rPr>
-              <w:t>10</w:t>
             </w:r>
           </w:p>
         </w:tc>
@@ -24649,7 +24759,7 @@
                 <w:sz w:val="19"/>
                 <w:szCs w:val="19"/>
               </w:rPr>
-              <w:t>7</w:t>
+              <w:t>9</w:t>
             </w:r>
           </w:p>
         </w:tc>
@@ -24676,7 +24786,7 @@
                 <w:sz w:val="19"/>
                 <w:szCs w:val="19"/>
               </w:rPr>
-              <w:t>2</w:t>
+              <w:t>0</w:t>
             </w:r>
           </w:p>
         </w:tc>
@@ -24813,7 +24923,7 @@
                 <w:sz w:val="19"/>
                 <w:szCs w:val="19"/>
               </w:rPr>
-              <w:t>3</w:t>
+              <w:t>5</w:t>
             </w:r>
           </w:p>
         </w:tc>
@@ -24840,7 +24950,7 @@
                 <w:sz w:val="19"/>
                 <w:szCs w:val="19"/>
               </w:rPr>
-              <w:t>2</w:t>
+              <w:t>0</w:t>
             </w:r>
           </w:p>
         </w:tc>
@@ -24950,7 +25060,7 @@
                 <w:sz w:val="19"/>
                 <w:szCs w:val="19"/>
               </w:rPr>
-              <w:t>2</w:t>
+              <w:t>5</w:t>
             </w:r>
           </w:p>
         </w:tc>
@@ -25004,7 +25114,7 @@
                 <w:sz w:val="19"/>
                 <w:szCs w:val="19"/>
               </w:rPr>
-              <w:t>3</w:t>
+              <w:t>0</w:t>
             </w:r>
           </w:p>
         </w:tc>
@@ -25114,7 +25224,7 @@
                 <w:sz w:val="19"/>
                 <w:szCs w:val="19"/>
               </w:rPr>
-              <w:t>2</w:t>
+              <w:t>4</w:t>
             </w:r>
           </w:p>
         </w:tc>
@@ -25141,34 +25251,34 @@
                 <w:sz w:val="19"/>
                 <w:szCs w:val="19"/>
               </w:rPr>
+              <w:t>1</w:t>
+            </w:r>
+          </w:p>
+        </w:tc>
+        <w:tc>
+          <w:tcPr>
+            <w:tcW w:w="1500" w:type="dxa"/>
+            <w:tcBorders>
+              <w:top w:val="single" w:sz="4" w:space="0" w:color="8EA9DB"/>
+              <w:left w:val="single" w:sz="4" w:space="0" w:color="8EA9DB"/>
+              <w:bottom w:val="single" w:sz="4" w:space="0" w:color="8EA9DB"/>
+              <w:right w:val="single" w:sz="4" w:space="0" w:color="8EA9DB"/>
+            </w:tcBorders>
+            <w:tcMar>
+              <w:top w:w="60" w:type="dxa"/>
+              <w:left w:w="100" w:type="dxa"/>
+              <w:bottom w:w="60" w:type="dxa"/>
+              <w:right w:w="100" w:type="dxa"/>
+            </w:tcMar>
+            <w:vAlign w:val="center"/>
+          </w:tcPr>
+          <w:p>
+            <w:r>
+              <w:rPr>
+                <w:sz w:val="19"/>
+                <w:szCs w:val="19"/>
+              </w:rPr>
               <w:t>0</w:t>
-            </w:r>
-          </w:p>
-        </w:tc>
-        <w:tc>
-          <w:tcPr>
-            <w:tcW w:w="1500" w:type="dxa"/>
-            <w:tcBorders>
-              <w:top w:val="single" w:sz="4" w:space="0" w:color="8EA9DB"/>
-              <w:left w:val="single" w:sz="4" w:space="0" w:color="8EA9DB"/>
-              <w:bottom w:val="single" w:sz="4" w:space="0" w:color="8EA9DB"/>
-              <w:right w:val="single" w:sz="4" w:space="0" w:color="8EA9DB"/>
-            </w:tcBorders>
-            <w:tcMar>
-              <w:top w:w="60" w:type="dxa"/>
-              <w:left w:w="100" w:type="dxa"/>
-              <w:bottom w:w="60" w:type="dxa"/>
-              <w:right w:w="100" w:type="dxa"/>
-            </w:tcMar>
-            <w:vAlign w:val="center"/>
-          </w:tcPr>
-          <w:p>
-            <w:r>
-              <w:rPr>
-                <w:sz w:val="19"/>
-                <w:szCs w:val="19"/>
-              </w:rPr>
-              <w:t>3</w:t>
             </w:r>
           </w:p>
         </w:tc>
@@ -25278,7 +25388,7 @@
                 <w:sz w:val="19"/>
                 <w:szCs w:val="19"/>
               </w:rPr>
-              <w:t>1</w:t>
+              <w:t>3</w:t>
             </w:r>
           </w:p>
         </w:tc>
@@ -25305,7 +25415,7 @@
                 <w:sz w:val="19"/>
                 <w:szCs w:val="19"/>
               </w:rPr>
-              <w:t>2</w:t>
+              <w:t>3</w:t>
             </w:r>
           </w:p>
         </w:tc>
@@ -25332,7 +25442,7 @@
                 <w:sz w:val="19"/>
                 <w:szCs w:val="19"/>
               </w:rPr>
-              <w:t>3</w:t>
+              <w:t>0</w:t>
             </w:r>
           </w:p>
         </w:tc>
@@ -26754,7 +26864,7 @@
                 <w:sz w:val="19"/>
                 <w:szCs w:val="19"/>
               </w:rPr>
-              <w:t>5</w:t>
+              <w:t>6</w:t>
             </w:r>
           </w:p>
         </w:tc>
@@ -26808,7 +26918,7 @@
                 <w:sz w:val="19"/>
                 <w:szCs w:val="19"/>
               </w:rPr>
-              <w:t>1</w:t>
+              <w:t>0</w:t>
             </w:r>
           </w:p>
         </w:tc>
@@ -26918,7 +27028,7 @@
                 <w:sz w:val="19"/>
                 <w:szCs w:val="19"/>
               </w:rPr>
-              <w:t>99</w:t>
+              <w:t>128</w:t>
             </w:r>
           </w:p>
         </w:tc>
@@ -26945,7 +27055,7 @@
                 <w:sz w:val="19"/>
                 <w:szCs w:val="19"/>
               </w:rPr>
-              <w:t>47</w:t>
+              <w:t>64</w:t>
             </w:r>
           </w:p>
         </w:tc>
@@ -26972,7 +27082,7 @@
                 <w:sz w:val="19"/>
                 <w:szCs w:val="19"/>
               </w:rPr>
-              <w:t>43</w:t>
+              <w:t>0</w:t>
             </w:r>
           </w:p>
         </w:tc>
@@ -26999,7 +27109,7 @@
                 <w:sz w:val="19"/>
                 <w:szCs w:val="19"/>
               </w:rPr>
-              <w:t>3</w:t>
+              <w:t>0</w:t>
             </w:r>
           </w:p>
         </w:tc>
@@ -27011,7 +27121,7 @@
         <w:jc w:val="both"/>
       </w:pPr>
       <w:r>
-        <w:t>Koşulan test case oranı: %76 — Başarı oranı (PASSED / koşulan): %68.</w:t>
+        <w:t>Koşulan test case oranı: %100 — Başarı oranı (PASSED / koşulan): %67.</w:t>
       </w:r>
     </w:p>
     <w:p>
@@ -27048,10 +27158,10 @@
           <w:b/>
           <w:bCs/>
         </w:rPr>
-        <w:t xml:space="preserve">BLOCKED nedeni: </w:t>
+        <w:t xml:space="preserve">Kapsam: </w:t>
       </w:r>
       <w:r>
-        <w:t>Kalan BLOCKED test case’ler (US_03, US_04, US_10/US_11 silme, US_12 statü değişimi, US_21 mesaj silme ve CONFIRMED / DELIVERED sipariş gerektiren US_08 / US_09 senaryoları) şifre girişi, yeni hesap oluşturma veya paylaşımlı veride kalıcı değişiklik gerektirdiğinden test eden tarafından ayrıca manuel koşulacaktır.</w:t>
+        <w:t>192 test case’in tamamı koşulmuştur (BLOCKED / NOT RUN kalmamıştır). Şifre girişi ve paylaşımlı veride kalıcı değişiklik gerektiren senaryolar (admin kayıt/giriş, kullanıcı/admin silme, sipariş statüsü değişimi, mesaj silme) test eden tarafından koşulmuştur. Arayüzden sipariş oluşturulamadığı için (SCRUM-232) statü senaryoları mevcut Order #2 üzerinden yürütülmüştür.</w:t>
       </w:r>
     </w:p>
     <w:p>
@@ -27078,7 +27188,7 @@
       <w:pPr>
         <w:pStyle w:val="Balk2"/>
       </w:pPr>
-      <w:bookmarkStart w:id="48" w:name="_Toc242922321"/>
+      <w:bookmarkStart w:id="48" w:name="_Toc242962140"/>
       <w:r>
         <w:t>17.2 Otomasyon Koşum Özeti</w:t>
       </w:r>
@@ -27709,7 +27819,7 @@
       <w:pPr>
         <w:pStyle w:val="Balk2"/>
       </w:pPr>
-      <w:bookmarkStart w:id="49" w:name="_Toc242922322"/>
+      <w:bookmarkStart w:id="49" w:name="_Toc242962141"/>
       <w:r>
         <w:t>17.3 Bulunan Hatalar (JIRA – SCRUM)</w:t>
       </w:r>
@@ -33029,6 +33139,336 @@
           </w:p>
         </w:tc>
       </w:tr>
+      <w:tr>
+        <w:tc>
+          <w:tcPr>
+            <w:tcW w:w="1300" w:type="dxa"/>
+            <w:tcBorders>
+              <w:top w:val="single" w:sz="4" w:space="0" w:color="8EA9DB"/>
+              <w:left w:val="single" w:sz="4" w:space="0" w:color="8EA9DB"/>
+              <w:bottom w:val="single" w:sz="4" w:space="0" w:color="8EA9DB"/>
+              <w:right w:val="single" w:sz="4" w:space="0" w:color="8EA9DB"/>
+            </w:tcBorders>
+            <w:tcMar>
+              <w:top w:w="60" w:type="dxa"/>
+              <w:left w:w="100" w:type="dxa"/>
+              <w:bottom w:w="60" w:type="dxa"/>
+              <w:right w:w="100" w:type="dxa"/>
+            </w:tcMar>
+            <w:vAlign w:val="center"/>
+          </w:tcPr>
+          <w:p>
+            <w:r>
+              <w:rPr>
+                <w:sz w:val="19"/>
+                <w:szCs w:val="19"/>
+              </w:rPr>
+              <w:t>SCRUM-270</w:t>
+            </w:r>
+          </w:p>
+        </w:tc>
+        <w:tc>
+          <w:tcPr>
+            <w:tcW w:w="1100" w:type="dxa"/>
+            <w:tcBorders>
+              <w:top w:val="single" w:sz="4" w:space="0" w:color="8EA9DB"/>
+              <w:left w:val="single" w:sz="4" w:space="0" w:color="8EA9DB"/>
+              <w:bottom w:val="single" w:sz="4" w:space="0" w:color="8EA9DB"/>
+              <w:right w:val="single" w:sz="4" w:space="0" w:color="8EA9DB"/>
+            </w:tcBorders>
+            <w:tcMar>
+              <w:top w:w="60" w:type="dxa"/>
+              <w:left w:w="100" w:type="dxa"/>
+              <w:bottom w:w="60" w:type="dxa"/>
+              <w:right w:w="100" w:type="dxa"/>
+            </w:tcMar>
+            <w:vAlign w:val="center"/>
+          </w:tcPr>
+          <w:p>
+            <w:r>
+              <w:rPr>
+                <w:sz w:val="19"/>
+                <w:szCs w:val="19"/>
+              </w:rPr>
+              <w:t>Low</w:t>
+            </w:r>
+          </w:p>
+        </w:tc>
+        <w:tc>
+          <w:tcPr>
+            <w:tcW w:w="1100" w:type="dxa"/>
+            <w:tcBorders>
+              <w:top w:val="single" w:sz="4" w:space="0" w:color="8EA9DB"/>
+              <w:left w:val="single" w:sz="4" w:space="0" w:color="8EA9DB"/>
+              <w:bottom w:val="single" w:sz="4" w:space="0" w:color="8EA9DB"/>
+              <w:right w:val="single" w:sz="4" w:space="0" w:color="8EA9DB"/>
+            </w:tcBorders>
+            <w:tcMar>
+              <w:top w:w="60" w:type="dxa"/>
+              <w:left w:w="100" w:type="dxa"/>
+              <w:bottom w:w="60" w:type="dxa"/>
+              <w:right w:w="100" w:type="dxa"/>
+            </w:tcMar>
+            <w:vAlign w:val="center"/>
+          </w:tcPr>
+          <w:p>
+            <w:r>
+              <w:rPr>
+                <w:sz w:val="19"/>
+                <w:szCs w:val="19"/>
+              </w:rPr>
+              <w:t>US_03</w:t>
+            </w:r>
+          </w:p>
+        </w:tc>
+        <w:tc>
+          <w:tcPr>
+            <w:tcW w:w="6138" w:type="dxa"/>
+            <w:tcBorders>
+              <w:top w:val="single" w:sz="4" w:space="0" w:color="8EA9DB"/>
+              <w:left w:val="single" w:sz="4" w:space="0" w:color="8EA9DB"/>
+              <w:bottom w:val="single" w:sz="4" w:space="0" w:color="8EA9DB"/>
+              <w:right w:val="single" w:sz="4" w:space="0" w:color="8EA9DB"/>
+            </w:tcBorders>
+            <w:tcMar>
+              <w:top w:w="60" w:type="dxa"/>
+              <w:left w:w="100" w:type="dxa"/>
+              <w:bottom w:w="60" w:type="dxa"/>
+              <w:right w:w="100" w:type="dxa"/>
+            </w:tcMar>
+            <w:vAlign w:val="center"/>
+          </w:tcPr>
+          <w:p>
+            <w:r>
+              <w:rPr>
+                <w:sz w:val="19"/>
+                <w:szCs w:val="19"/>
+              </w:rPr>
+              <w:t>Admin kaydı sonrası “Success” yerine “Registration successful! You can now log in.”</w:t>
+            </w:r>
+          </w:p>
+        </w:tc>
+      </w:tr>
+      <w:tr>
+        <w:tc>
+          <w:tcPr>
+            <w:tcW w:w="1300" w:type="dxa"/>
+            <w:tcBorders>
+              <w:top w:val="single" w:sz="4" w:space="0" w:color="8EA9DB"/>
+              <w:left w:val="single" w:sz="4" w:space="0" w:color="8EA9DB"/>
+              <w:bottom w:val="single" w:sz="4" w:space="0" w:color="8EA9DB"/>
+              <w:right w:val="single" w:sz="4" w:space="0" w:color="8EA9DB"/>
+            </w:tcBorders>
+            <w:tcMar>
+              <w:top w:w="60" w:type="dxa"/>
+              <w:left w:w="100" w:type="dxa"/>
+              <w:bottom w:w="60" w:type="dxa"/>
+              <w:right w:w="100" w:type="dxa"/>
+            </w:tcMar>
+            <w:vAlign w:val="center"/>
+          </w:tcPr>
+          <w:p>
+            <w:r>
+              <w:rPr>
+                <w:sz w:val="19"/>
+                <w:szCs w:val="19"/>
+              </w:rPr>
+              <w:t>SCRUM-271</w:t>
+            </w:r>
+          </w:p>
+        </w:tc>
+        <w:tc>
+          <w:tcPr>
+            <w:tcW w:w="1100" w:type="dxa"/>
+            <w:tcBorders>
+              <w:top w:val="single" w:sz="4" w:space="0" w:color="8EA9DB"/>
+              <w:left w:val="single" w:sz="4" w:space="0" w:color="8EA9DB"/>
+              <w:bottom w:val="single" w:sz="4" w:space="0" w:color="8EA9DB"/>
+              <w:right w:val="single" w:sz="4" w:space="0" w:color="8EA9DB"/>
+            </w:tcBorders>
+            <w:tcMar>
+              <w:top w:w="60" w:type="dxa"/>
+              <w:left w:w="100" w:type="dxa"/>
+              <w:bottom w:w="60" w:type="dxa"/>
+              <w:right w:w="100" w:type="dxa"/>
+            </w:tcMar>
+            <w:vAlign w:val="center"/>
+          </w:tcPr>
+          <w:p>
+            <w:r>
+              <w:rPr>
+                <w:sz w:val="19"/>
+                <w:szCs w:val="19"/>
+              </w:rPr>
+              <w:t>Medium</w:t>
+            </w:r>
+          </w:p>
+        </w:tc>
+        <w:tc>
+          <w:tcPr>
+            <w:tcW w:w="1100" w:type="dxa"/>
+            <w:tcBorders>
+              <w:top w:val="single" w:sz="4" w:space="0" w:color="8EA9DB"/>
+              <w:left w:val="single" w:sz="4" w:space="0" w:color="8EA9DB"/>
+              <w:bottom w:val="single" w:sz="4" w:space="0" w:color="8EA9DB"/>
+              <w:right w:val="single" w:sz="4" w:space="0" w:color="8EA9DB"/>
+            </w:tcBorders>
+            <w:tcMar>
+              <w:top w:w="60" w:type="dxa"/>
+              <w:left w:w="100" w:type="dxa"/>
+              <w:bottom w:w="60" w:type="dxa"/>
+              <w:right w:w="100" w:type="dxa"/>
+            </w:tcMar>
+            <w:vAlign w:val="center"/>
+          </w:tcPr>
+          <w:p>
+            <w:r>
+              <w:rPr>
+                <w:sz w:val="19"/>
+                <w:szCs w:val="19"/>
+              </w:rPr>
+              <w:t>US_02/04</w:t>
+            </w:r>
+          </w:p>
+        </w:tc>
+        <w:tc>
+          <w:tcPr>
+            <w:tcW w:w="6138" w:type="dxa"/>
+            <w:tcBorders>
+              <w:top w:val="single" w:sz="4" w:space="0" w:color="8EA9DB"/>
+              <w:left w:val="single" w:sz="4" w:space="0" w:color="8EA9DB"/>
+              <w:bottom w:val="single" w:sz="4" w:space="0" w:color="8EA9DB"/>
+              <w:right w:val="single" w:sz="4" w:space="0" w:color="8EA9DB"/>
+            </w:tcBorders>
+            <w:tcMar>
+              <w:top w:w="60" w:type="dxa"/>
+              <w:left w:w="100" w:type="dxa"/>
+              <w:bottom w:w="60" w:type="dxa"/>
+              <w:right w:w="100" w:type="dxa"/>
+            </w:tcMar>
+            <w:vAlign w:val="center"/>
+          </w:tcPr>
+          <w:p>
+            <w:r>
+              <w:rPr>
+                <w:sz w:val="19"/>
+                <w:szCs w:val="19"/>
+              </w:rPr>
+              <w:t>Hatalı girişte anlaşılır mesaj yerine ham “CredentialsSignin” kodu</w:t>
+            </w:r>
+          </w:p>
+        </w:tc>
+      </w:tr>
+      <w:tr>
+        <w:tc>
+          <w:tcPr>
+            <w:tcW w:w="1300" w:type="dxa"/>
+            <w:tcBorders>
+              <w:top w:val="single" w:sz="4" w:space="0" w:color="8EA9DB"/>
+              <w:left w:val="single" w:sz="4" w:space="0" w:color="8EA9DB"/>
+              <w:bottom w:val="single" w:sz="4" w:space="0" w:color="8EA9DB"/>
+              <w:right w:val="single" w:sz="4" w:space="0" w:color="8EA9DB"/>
+            </w:tcBorders>
+            <w:tcMar>
+              <w:top w:w="60" w:type="dxa"/>
+              <w:left w:w="100" w:type="dxa"/>
+              <w:bottom w:w="60" w:type="dxa"/>
+              <w:right w:w="100" w:type="dxa"/>
+            </w:tcMar>
+            <w:vAlign w:val="center"/>
+          </w:tcPr>
+          <w:p>
+            <w:r>
+              <w:rPr>
+                <w:sz w:val="19"/>
+                <w:szCs w:val="19"/>
+              </w:rPr>
+              <w:t>SCRUM-272</w:t>
+            </w:r>
+          </w:p>
+        </w:tc>
+        <w:tc>
+          <w:tcPr>
+            <w:tcW w:w="1100" w:type="dxa"/>
+            <w:tcBorders>
+              <w:top w:val="single" w:sz="4" w:space="0" w:color="8EA9DB"/>
+              <w:left w:val="single" w:sz="4" w:space="0" w:color="8EA9DB"/>
+              <w:bottom w:val="single" w:sz="4" w:space="0" w:color="8EA9DB"/>
+              <w:right w:val="single" w:sz="4" w:space="0" w:color="8EA9DB"/>
+            </w:tcBorders>
+            <w:tcMar>
+              <w:top w:w="60" w:type="dxa"/>
+              <w:left w:w="100" w:type="dxa"/>
+              <w:bottom w:w="60" w:type="dxa"/>
+              <w:right w:w="100" w:type="dxa"/>
+            </w:tcMar>
+            <w:vAlign w:val="center"/>
+          </w:tcPr>
+          <w:p>
+            <w:r>
+              <w:rPr>
+                <w:sz w:val="19"/>
+                <w:szCs w:val="19"/>
+              </w:rPr>
+              <w:t>High</w:t>
+            </w:r>
+          </w:p>
+        </w:tc>
+        <w:tc>
+          <w:tcPr>
+            <w:tcW w:w="1100" w:type="dxa"/>
+            <w:tcBorders>
+              <w:top w:val="single" w:sz="4" w:space="0" w:color="8EA9DB"/>
+              <w:left w:val="single" w:sz="4" w:space="0" w:color="8EA9DB"/>
+              <w:bottom w:val="single" w:sz="4" w:space="0" w:color="8EA9DB"/>
+              <w:right w:val="single" w:sz="4" w:space="0" w:color="8EA9DB"/>
+            </w:tcBorders>
+            <w:tcMar>
+              <w:top w:w="60" w:type="dxa"/>
+              <w:left w:w="100" w:type="dxa"/>
+              <w:bottom w:w="60" w:type="dxa"/>
+              <w:right w:w="100" w:type="dxa"/>
+            </w:tcMar>
+            <w:vAlign w:val="center"/>
+          </w:tcPr>
+          <w:p>
+            <w:r>
+              <w:rPr>
+                <w:sz w:val="19"/>
+                <w:szCs w:val="19"/>
+              </w:rPr>
+              <w:t>US_11</w:t>
+            </w:r>
+          </w:p>
+        </w:tc>
+        <w:tc>
+          <w:tcPr>
+            <w:tcW w:w="6138" w:type="dxa"/>
+            <w:tcBorders>
+              <w:top w:val="single" w:sz="4" w:space="0" w:color="8EA9DB"/>
+              <w:left w:val="single" w:sz="4" w:space="0" w:color="8EA9DB"/>
+              <w:bottom w:val="single" w:sz="4" w:space="0" w:color="8EA9DB"/>
+              <w:right w:val="single" w:sz="4" w:space="0" w:color="8EA9DB"/>
+            </w:tcBorders>
+            <w:tcMar>
+              <w:top w:w="60" w:type="dxa"/>
+              <w:left w:w="100" w:type="dxa"/>
+              <w:bottom w:w="60" w:type="dxa"/>
+              <w:right w:w="100" w:type="dxa"/>
+            </w:tcMar>
+            <w:vAlign w:val="center"/>
+          </w:tcPr>
+          <w:p>
+            <w:r>
+              <w:rPr>
+                <w:sz w:val="19"/>
+                <w:szCs w:val="19"/>
+              </w:rPr>
+              <w:t>Ana admin (admin@example.com) silinmeye karşı korunmuyor</w:t>
+            </w:r>
+          </w:p>
+        </w:tc>
+      </w:tr>
     </w:tbl>
     <w:p>
       <w:pPr>
@@ -33036,14 +33476,14 @@
         <w:jc w:val="both"/>
       </w:pPr>
       <w:r>
-        <w:t>Toplam 47 bug kaydı açılmıştır. Kritik (Highest) bulgular: arayüzden sipariş oluşturulamaması (SCRUM-232), admin uç noktalarının kimlik doğrulamasız erişilebilmesi (SCRUM-244) ve kullanıcı yanıtında şifre hash’inin dönmesi (SCRUM-248).</w:t>
+        <w:t>Toplam 50 bug kaydı açılmıştır. Kritik (Highest) bulgular: arayüzden sipariş oluşturulamaması (SCRUM-232), admin uç noktalarının kimlik doğrulamasız erişilebilmesi (SCRUM-244) ve kullanıcı yanıtında şifre hash’inin dönmesi (SCRUM-248).</w:t>
       </w:r>
     </w:p>
     <w:p>
       <w:pPr>
         <w:pStyle w:val="Balk2"/>
       </w:pPr>
-      <w:bookmarkStart w:id="50" w:name="_Toc242922323"/>
+      <w:bookmarkStart w:id="50" w:name="_Toc242962142"/>
       <w:r>
         <w:t>17.4 Teslimat Konumları</w:t>
       </w:r>
@@ -33360,7 +33800,7 @@
       <w:pPr>
         <w:pStyle w:val="Balk2"/>
       </w:pPr>
-      <w:bookmarkStart w:id="51" w:name="_Toc242922324"/>
+      <w:bookmarkStart w:id="51" w:name="_Toc242962143"/>
       <w:r>
         <w:t>17.5 Sonuç ve Öneriler</w:t>
       </w:r>
@@ -33454,14 +33894,14 @@
         <w:spacing w:after="60"/>
       </w:pPr>
       <w:r>
-        <w:t>Kalan BLOCKED test case’ler koşulduğunda rapor güncellenecektir.</w:t>
+        <w:t>Giriş sayfası hatalı girişlerde ham “CredentialsSignin” kodunu göstermekte (SCRUM-271), ana admin hesabı silinmeye karşı korunmamaktadır (SCRUM-272); ikincisi yüksek risklidir ve öncelikle düzeltilmelidir.</w:t>
       </w:r>
     </w:p>
     <w:p>
       <w:pPr>
         <w:pStyle w:val="Balk1"/>
       </w:pPr>
-      <w:bookmarkStart w:id="52" w:name="_Toc242922325"/>
+      <w:bookmarkStart w:id="52" w:name="_Toc242962144"/>
       <w:r>
         <w:t>18. Onay</w:t>
       </w:r>
@@ -33974,7 +34414,7 @@
         <w:sz w:val="18"/>
         <w:szCs w:val="18"/>
       </w:rPr>
-      <w:t>Snack Attack – Test Planı v1.1</w:t>
+      <w:t>Snack Attack – Test Planı v1.2</w:t>
     </w:r>
   </w:p>
 </w:hdr>
@@ -33983,10 +34423,10 @@
 <file path=word/numbering.xml><?xml version="1.0" encoding="utf-8"?>
 <w:numbering xmlns:wpc="http://schemas.microsoft.com/office/word/2010/wordprocessingCanvas" xmlns:cx="http://schemas.microsoft.com/office/drawing/2014/chartex" xmlns:cx1="http://schemas.microsoft.com/office/drawing/2015/9/8/chartex" xmlns:cx2="http://schemas.microsoft.com/office/drawing/2015/10/21/chartex" xmlns:cx3="http://schemas.microsoft.com/office/drawing/2016/5/9/chartex" xmlns:cx4="http://schemas.microsoft.com/office/drawing/2016/5/10/chartex" xmlns:cx5="http://schemas.microsoft.com/office/drawing/2016/5/11/chartex" xmlns:cx6="http://schemas.microsoft.com/office/drawing/2016/5/12/chartex" xmlns:cx7="http://schemas.microsoft.com/office/drawing/2016/5/13/chartex" xmlns:cx8="http://schemas.microsoft.com/office/drawing/2016/5/14/chartex" xmlns:mc="http://schemas.openxmlformats.org/markup-compatibility/2006" xmlns:aink="http://schemas.microsoft.com/office/drawing/2016/ink" xmlns:am3d="http://schemas.microsoft.com/office/drawing/2017/model3d" xmlns:o="urn:schemas-microsoft-com:office:office" xmlns:oel="http://schemas.microsoft.com/office/2019/extlst" xmlns:r="http://schemas.openxmlformats.org/officeDocument/2006/relationships" xmlns:m="http://schemas.openxmlformats.org/officeDocument/2006/math" xmlns:v="urn:schemas-microsoft-com:vml" xmlns:wp14="http://schemas.microsoft.com/office/word/2010/wordprocessingDrawing" xmlns:wp="http://schemas.openxmlformats.org/drawingml/2006/wordprocessingDrawing" xmlns:w10="urn:schemas-microsoft-com:office:word" xmlns:w="http://schemas.openxmlformats.org/wordprocessingml/2006/main" xmlns:w14="http://schemas.microsoft.com/office/word/2010/wordml" xmlns:w15="http://schemas.microsoft.com/office/word/2012/wordml" xmlns:w16cex="http://schemas.microsoft.com/office/word/2018/wordml/cex" xmlns:w16cid="http://schemas.microsoft.com/office/word/2016/wordml/cid" xmlns:w16="http://schemas.microsoft.com/office/word/2018/wordml" xmlns:w16du="http://schemas.microsoft.com/office/word/2023/wordml/word16du" xmlns:w16sdtdh="http://schemas.microsoft.com/office/word/2020/wordml/sdtdatahash" xmlns:w16sdtfl="http://schemas.microsoft.com/office/word/2024/wordml/sdtformatlock" xmlns:w16se="http://schemas.microsoft.com/office/word/2015/wordml/symex" xmlns:wpg="http://schemas.microsoft.com/office/word/2010/wordprocessingGroup" xmlns:wpi="http://schemas.microsoft.com/office/word/2010/wordprocessingInk" xmlns:wne="http://schemas.microsoft.com/office/word/2006/wordml" xmlns:wps="http://schemas.microsoft.com/office/word/2010/wordprocessingShape" mc:Ignorable="w14 w15 w16se w16cid w16 w16cex w16sdtdh w16sdtfl w16du wp14">
   <w:abstractNum w:abstractNumId="0" w15:restartNumberingAfterBreak="0">
-    <w:nsid w:val="0B1B362A"/>
+    <w:nsid w:val="16F55899"/>
     <w:multiLevelType w:val="hybridMultilevel"/>
-    <w:tmpl w:val="6602B3EC"/>
-    <w:lvl w:ilvl="0" w:tplc="F314EC1E" w:tentative="1">
+    <w:tmpl w:val="3766A1EA"/>
+    <w:lvl w:ilvl="0" w:tplc="279A9476" w:tentative="1">
       <w:start w:val="1"/>
       <w:numFmt w:val="decimal"/>
       <w:lvlText w:val="%1."/>
@@ -33995,110 +34435,106 @@
         <w:ind w:left="720" w:hanging="360"/>
       </w:pPr>
     </w:lvl>
-    <w:lvl w:ilvl="1" w:tplc="EC446BEE">
+    <w:lvl w:ilvl="1" w:tplc="FDCAF298">
       <w:numFmt w:val="decimal"/>
       <w:lvlText w:val=""/>
       <w:lvlJc w:val="left"/>
     </w:lvl>
-    <w:lvl w:ilvl="2" w:tplc="E3280B3E">
+    <w:lvl w:ilvl="2" w:tplc="703E6E44">
       <w:numFmt w:val="decimal"/>
       <w:lvlText w:val=""/>
       <w:lvlJc w:val="left"/>
     </w:lvl>
-    <w:lvl w:ilvl="3" w:tplc="85904B40">
+    <w:lvl w:ilvl="3" w:tplc="7DFCC390">
       <w:numFmt w:val="decimal"/>
       <w:lvlText w:val=""/>
       <w:lvlJc w:val="left"/>
     </w:lvl>
-    <w:lvl w:ilvl="4" w:tplc="4836A56E">
+    <w:lvl w:ilvl="4" w:tplc="01BCF6F2">
       <w:numFmt w:val="decimal"/>
       <w:lvlText w:val=""/>
       <w:lvlJc w:val="left"/>
     </w:lvl>
-    <w:lvl w:ilvl="5" w:tplc="D9CAA51E">
+    <w:lvl w:ilvl="5" w:tplc="46A44E82">
       <w:numFmt w:val="decimal"/>
       <w:lvlText w:val=""/>
       <w:lvlJc w:val="left"/>
     </w:lvl>
-    <w:lvl w:ilvl="6" w:tplc="21A6268E">
+    <w:lvl w:ilvl="6" w:tplc="3B2A1D80">
       <w:numFmt w:val="decimal"/>
       <w:lvlText w:val=""/>
       <w:lvlJc w:val="left"/>
     </w:lvl>
-    <w:lvl w:ilvl="7" w:tplc="8D36EE3A">
+    <w:lvl w:ilvl="7" w:tplc="26A286B4">
       <w:numFmt w:val="decimal"/>
       <w:lvlText w:val=""/>
       <w:lvlJc w:val="left"/>
     </w:lvl>
-    <w:lvl w:ilvl="8" w:tplc="B2725DAA">
+    <w:lvl w:ilvl="8" w:tplc="4732BE62">
       <w:numFmt w:val="decimal"/>
       <w:lvlText w:val=""/>
       <w:lvlJc w:val="left"/>
     </w:lvl>
   </w:abstractNum>
   <w:abstractNum w:abstractNumId="1" w15:restartNumberingAfterBreak="0">
-    <w:nsid w:val="11A10CA9"/>
+    <w:nsid w:val="2FA51A1A"/>
     <w:multiLevelType w:val="hybridMultilevel"/>
-    <w:tmpl w:val="9CD65610"/>
-    <w:lvl w:ilvl="0" w:tplc="3EE09A76">
+    <w:tmpl w:val="37C607D0"/>
+    <w:lvl w:ilvl="0" w:tplc="39B09448" w:tentative="1">
       <w:start w:val="1"/>
-      <w:numFmt w:val="bullet"/>
-      <w:lvlText w:val="•"/>
+      <w:numFmt w:val="decimal"/>
+      <w:lvlText w:val="%1."/>
       <w:lvlJc w:val="left"/>
       <w:pPr>
         <w:ind w:left="720" w:hanging="360"/>
       </w:pPr>
     </w:lvl>
-    <w:lvl w:ilvl="1" w:tplc="17AEE38A" w:tentative="1">
-      <w:start w:val="1"/>
-      <w:numFmt w:val="bullet"/>
-      <w:lvlText w:val="◦"/>
-      <w:lvlJc w:val="left"/>
-      <w:pPr>
-        <w:ind w:left="1440" w:hanging="360"/>
-      </w:pPr>
-    </w:lvl>
-    <w:lvl w:ilvl="2" w:tplc="CFF0A3FC">
+    <w:lvl w:ilvl="1" w:tplc="1ABE6146">
       <w:numFmt w:val="decimal"/>
       <w:lvlText w:val=""/>
       <w:lvlJc w:val="left"/>
     </w:lvl>
-    <w:lvl w:ilvl="3" w:tplc="64382466">
+    <w:lvl w:ilvl="2" w:tplc="35B2731E">
       <w:numFmt w:val="decimal"/>
       <w:lvlText w:val=""/>
       <w:lvlJc w:val="left"/>
     </w:lvl>
-    <w:lvl w:ilvl="4" w:tplc="CB145E52">
+    <w:lvl w:ilvl="3" w:tplc="BC883806">
       <w:numFmt w:val="decimal"/>
       <w:lvlText w:val=""/>
       <w:lvlJc w:val="left"/>
     </w:lvl>
-    <w:lvl w:ilvl="5" w:tplc="ED382B1A">
+    <w:lvl w:ilvl="4" w:tplc="C03EC3EE">
       <w:numFmt w:val="decimal"/>
       <w:lvlText w:val=""/>
       <w:lvlJc w:val="left"/>
     </w:lvl>
-    <w:lvl w:ilvl="6" w:tplc="F0EC273C">
+    <w:lvl w:ilvl="5" w:tplc="2EFA8924">
       <w:numFmt w:val="decimal"/>
       <w:lvlText w:val=""/>
       <w:lvlJc w:val="left"/>
     </w:lvl>
-    <w:lvl w:ilvl="7" w:tplc="6E32E80A">
+    <w:lvl w:ilvl="6" w:tplc="CCB2834C">
       <w:numFmt w:val="decimal"/>
       <w:lvlText w:val=""/>
       <w:lvlJc w:val="left"/>
     </w:lvl>
-    <w:lvl w:ilvl="8" w:tplc="5BA8CCA8">
+    <w:lvl w:ilvl="7" w:tplc="6E94BE7A">
+      <w:numFmt w:val="decimal"/>
+      <w:lvlText w:val=""/>
+      <w:lvlJc w:val="left"/>
+    </w:lvl>
+    <w:lvl w:ilvl="8" w:tplc="DFE88866">
       <w:numFmt w:val="decimal"/>
       <w:lvlText w:val=""/>
       <w:lvlJc w:val="left"/>
     </w:lvl>
   </w:abstractNum>
   <w:abstractNum w:abstractNumId="2" w15:restartNumberingAfterBreak="0">
-    <w:nsid w:val="2DA251DB"/>
+    <w:nsid w:val="30FD11F5"/>
     <w:multiLevelType w:val="hybridMultilevel"/>
-    <w:tmpl w:val="ABFC536C"/>
-    <w:lvl w:ilvl="0" w:tplc="EF8684DE" w:tentative="1">
+    <w:tmpl w:val="C9B0FE58"/>
+    <w:lvl w:ilvl="0" w:tplc="09045E0E" w:tentative="1">
       <w:start w:val="1"/>
       <w:numFmt w:val="bullet"/>
       <w:lvlText w:val="●"/>
@@ -34107,7 +34543,7 @@
         <w:ind w:left="720" w:hanging="360"/>
       </w:pPr>
     </w:lvl>
-    <w:lvl w:ilvl="1" w:tplc="ACAE18AA" w:tentative="1">
+    <w:lvl w:ilvl="1" w:tplc="CECCE5CA" w:tentative="1">
       <w:start w:val="1"/>
       <w:numFmt w:val="bullet"/>
       <w:lvlText w:val="○"/>
@@ -34116,7 +34552,7 @@
         <w:ind w:left="1440" w:hanging="360"/>
       </w:pPr>
     </w:lvl>
-    <w:lvl w:ilvl="2" w:tplc="7CCC03FE" w:tentative="1">
+    <w:lvl w:ilvl="2" w:tplc="F63AC296" w:tentative="1">
       <w:start w:val="1"/>
       <w:numFmt w:val="bullet"/>
       <w:lvlText w:val="■"/>
@@ -34125,7 +34561,7 @@
         <w:ind w:left="2160" w:hanging="360"/>
       </w:pPr>
     </w:lvl>
-    <w:lvl w:ilvl="3" w:tplc="669E4550" w:tentative="1">
+    <w:lvl w:ilvl="3" w:tplc="7710FC82" w:tentative="1">
       <w:start w:val="1"/>
       <w:numFmt w:val="bullet"/>
       <w:lvlText w:val="●"/>
@@ -34134,7 +34570,7 @@
         <w:ind w:left="2880" w:hanging="360"/>
       </w:pPr>
     </w:lvl>
-    <w:lvl w:ilvl="4" w:tplc="87487210" w:tentative="1">
+    <w:lvl w:ilvl="4" w:tplc="9B4C3FBE" w:tentative="1">
       <w:start w:val="1"/>
       <w:numFmt w:val="bullet"/>
       <w:lvlText w:val="○"/>
@@ -34143,7 +34579,7 @@
         <w:ind w:left="3600" w:hanging="360"/>
       </w:pPr>
     </w:lvl>
-    <w:lvl w:ilvl="5" w:tplc="37BC8CF0" w:tentative="1">
+    <w:lvl w:ilvl="5" w:tplc="C2BA10AE" w:tentative="1">
       <w:start w:val="1"/>
       <w:numFmt w:val="bullet"/>
       <w:lvlText w:val="■"/>
@@ -34152,7 +34588,7 @@
         <w:ind w:left="4320" w:hanging="360"/>
       </w:pPr>
     </w:lvl>
-    <w:lvl w:ilvl="6" w:tplc="55B8CD62" w:tentative="1">
+    <w:lvl w:ilvl="6" w:tplc="4CA0FA16" w:tentative="1">
       <w:start w:val="1"/>
       <w:numFmt w:val="bullet"/>
       <w:lvlText w:val="●"/>
@@ -34161,7 +34597,7 @@
         <w:ind w:left="5040" w:hanging="360"/>
       </w:pPr>
     </w:lvl>
-    <w:lvl w:ilvl="7" w:tplc="C0C60524" w:tentative="1">
+    <w:lvl w:ilvl="7" w:tplc="BD1C56EC" w:tentative="1">
       <w:start w:val="1"/>
       <w:numFmt w:val="bullet"/>
       <w:lvlText w:val="●"/>
@@ -34170,7 +34606,7 @@
         <w:ind w:left="5760" w:hanging="360"/>
       </w:pPr>
     </w:lvl>
-    <w:lvl w:ilvl="8" w:tplc="995E4A54" w:tentative="1">
+    <w:lvl w:ilvl="8" w:tplc="259C2C9A" w:tentative="1">
       <w:start w:val="1"/>
       <w:numFmt w:val="bullet"/>
       <w:lvlText w:val="●"/>
@@ -34181,67 +34617,71 @@
     </w:lvl>
   </w:abstractNum>
   <w:abstractNum w:abstractNumId="3" w15:restartNumberingAfterBreak="0">
-    <w:nsid w:val="5EE83E9A"/>
+    <w:nsid w:val="757C60F7"/>
     <w:multiLevelType w:val="hybridMultilevel"/>
-    <w:tmpl w:val="D542E522"/>
-    <w:lvl w:ilvl="0" w:tplc="C748B3A2" w:tentative="1">
+    <w:tmpl w:val="446EACD0"/>
+    <w:lvl w:ilvl="0" w:tplc="3EEA2822">
       <w:start w:val="1"/>
-      <w:numFmt w:val="decimal"/>
-      <w:lvlText w:val="%1."/>
+      <w:numFmt w:val="bullet"/>
+      <w:lvlText w:val="•"/>
       <w:lvlJc w:val="left"/>
       <w:pPr>
         <w:ind w:left="720" w:hanging="360"/>
       </w:pPr>
     </w:lvl>
-    <w:lvl w:ilvl="1" w:tplc="C44E835C">
+    <w:lvl w:ilvl="1" w:tplc="199E2ACA" w:tentative="1">
+      <w:start w:val="1"/>
+      <w:numFmt w:val="bullet"/>
+      <w:lvlText w:val="◦"/>
+      <w:lvlJc w:val="left"/>
+      <w:pPr>
+        <w:ind w:left="1440" w:hanging="360"/>
+      </w:pPr>
+    </w:lvl>
+    <w:lvl w:ilvl="2" w:tplc="D85029EE">
       <w:numFmt w:val="decimal"/>
       <w:lvlText w:val=""/>
       <w:lvlJc w:val="left"/>
     </w:lvl>
-    <w:lvl w:ilvl="2" w:tplc="FE663140">
+    <w:lvl w:ilvl="3" w:tplc="FABED110">
       <w:numFmt w:val="decimal"/>
       <w:lvlText w:val=""/>
       <w:lvlJc w:val="left"/>
     </w:lvl>
-    <w:lvl w:ilvl="3" w:tplc="AB6A9FCA">
+    <w:lvl w:ilvl="4" w:tplc="F940CE86">
       <w:numFmt w:val="decimal"/>
       <w:lvlText w:val=""/>
       <w:lvlJc w:val="left"/>
     </w:lvl>
-    <w:lvl w:ilvl="4" w:tplc="9A30CEB4">
+    <w:lvl w:ilvl="5" w:tplc="8A1A8EF4">
       <w:numFmt w:val="decimal"/>
       <w:lvlText w:val=""/>
       <w:lvlJc w:val="left"/>
     </w:lvl>
-    <w:lvl w:ilvl="5" w:tplc="781C5916">
+    <w:lvl w:ilvl="6" w:tplc="B41877FC">
       <w:numFmt w:val="decimal"/>
       <w:lvlText w:val=""/>
       <w:lvlJc w:val="left"/>
     </w:lvl>
-    <w:lvl w:ilvl="6" w:tplc="0058750A">
+    <w:lvl w:ilvl="7" w:tplc="7DC8C640">
       <w:numFmt w:val="decimal"/>
       <w:lvlText w:val=""/>
       <w:lvlJc w:val="left"/>
     </w:lvl>
-    <w:lvl w:ilvl="7" w:tplc="71DEB9A8">
-      <w:numFmt w:val="decimal"/>
-      <w:lvlText w:val=""/>
-      <w:lvlJc w:val="left"/>
-    </w:lvl>
-    <w:lvl w:ilvl="8" w:tplc="E3E8DAE0">
+    <w:lvl w:ilvl="8" w:tplc="30544C98">
       <w:numFmt w:val="decimal"/>
       <w:lvlText w:val=""/>
       <w:lvlJc w:val="left"/>
     </w:lvl>
   </w:abstractNum>
-  <w:num w:numId="1" w16cid:durableId="1805535233">
+  <w:num w:numId="1" w16cid:durableId="1846312638">
     <w:abstractNumId w:val="2"/>
     <w:lvlOverride w:ilvl="0">
       <w:startOverride w:val="1"/>
     </w:lvlOverride>
   </w:num>
-  <w:num w:numId="2" w16cid:durableId="2021423376">
-    <w:abstractNumId w:val="1"/>
+  <w:num w:numId="2" w16cid:durableId="1247692018">
+    <w:abstractNumId w:val="3"/>
     <w:lvlOverride w:ilvl="0">
       <w:startOverride w:val="1"/>
     </w:lvlOverride>
@@ -34886,7 +35326,7 @@
     <w:autoRedefine/>
     <w:uiPriority w:val="39"/>
     <w:unhideWhenUsed/>
-    <w:rsid w:val="0039533E"/>
+    <w:rsid w:val="009A56B9"/>
     <w:pPr>
       <w:spacing w:after="100"/>
     </w:pPr>
@@ -34898,7 +35338,7 @@
     <w:autoRedefine/>
     <w:uiPriority w:val="39"/>
     <w:unhideWhenUsed/>
-    <w:rsid w:val="0039533E"/>
+    <w:rsid w:val="009A56B9"/>
     <w:pPr>
       <w:spacing w:after="100"/>
       <w:ind w:left="220"/>

</xml_diff>

<commit_message>
Test sonuçları beklenen sonuçlara göre denetlendi: 120 PASSED / 72 FAILED; SCRUM-273..275
Beklenen başarı/bilgilendirme mesajı veya bilgi alanı bulunmayan 8 test case
FAILED olarak düzeltildi; US_13 TC_02 kategori filtresi koşuldu; US_03 sonuç
metinleri gerçekte yapılan adımlara göre düzeltildi.

Co-Authored-By: Claude Opus 5.5 <noreply@anthropic.com>
</commit_message>
<xml_diff>
--- a/docs/Snack_Attack_Test_Plani.docx
+++ b/docs/Snack_Attack_Test_Plani.docx
@@ -615,7 +615,7 @@
       <w:pPr>
         <w:pStyle w:val="Balk1"/>
       </w:pPr>
-      <w:bookmarkStart w:id="0" w:name="_Toc242962092"/>
+      <w:bookmarkStart w:id="0" w:name="_Toc242964426"/>
       <w:r>
         <w:t>Revizyon Geçmişi</w:t>
       </w:r>
@@ -1090,7 +1090,7 @@
                 <w:sz w:val="19"/>
                 <w:szCs w:val="19"/>
               </w:rPr>
-              <w:t>Kalan 46 test case (admin kayıt/giriş, silme, sipariş statüleri) koşuldu; 192 test case’in tamamı koşulmuş durumda. SCRUM-270 – 272 eklendi.</w:t>
+              <w:t>Kalan 46 test case (admin kayıt/giriş, silme, sipariş statüleri) koşuldu; 192 test case’in tamamı koşulmuş durumda. SCRUM-270 – 275 eklendi; sonuçlar beklenen sonuçlara göre denetlendi.</w:t>
             </w:r>
           </w:p>
         </w:tc>
@@ -1105,7 +1105,7 @@
       <w:pPr>
         <w:pStyle w:val="Balk1"/>
       </w:pPr>
-      <w:bookmarkStart w:id="1" w:name="_Toc242962093"/>
+      <w:bookmarkStart w:id="1" w:name="_Toc242964427"/>
       <w:r>
         <w:t>İçindekiler</w:t>
       </w:r>
@@ -1114,7 +1114,7 @@
     <w:sdt>
       <w:sdtPr>
         <w:alias w:val="İçindekiler"/>
-        <w:id w:val="-1581901943"/>
+        <w:id w:val="-1366903848"/>
       </w:sdtPr>
       <w:sdtEndPr/>
       <w:sdtContent>
@@ -1137,7 +1137,7 @@
           <w:r>
             <w:fldChar w:fldCharType="separate"/>
           </w:r>
-          <w:hyperlink w:anchor="_Toc242962092" w:history="1">
+          <w:hyperlink w:anchor="_Toc242964426" w:history="1">
             <w:r>
               <w:rPr>
                 <w:rStyle w:val="Kpr"/>
@@ -1161,7 +1161,7 @@
               <w:rPr>
                 <w:noProof/>
               </w:rPr>
-              <w:instrText xml:space="preserve"> PAGEREF _Toc242962092 \h </w:instrText>
+              <w:instrText xml:space="preserve"> PAGEREF _Toc242964426 \h </w:instrText>
             </w:r>
             <w:r>
               <w:rPr>
@@ -1198,7 +1198,7 @@
               <w:noProof/>
             </w:rPr>
           </w:pPr>
-          <w:hyperlink w:anchor="_Toc242962093" w:history="1">
+          <w:hyperlink w:anchor="_Toc242964427" w:history="1">
             <w:r>
               <w:rPr>
                 <w:rStyle w:val="Kpr"/>
@@ -1222,7 +1222,7 @@
               <w:rPr>
                 <w:noProof/>
               </w:rPr>
-              <w:instrText xml:space="preserve"> PAGEREF _Toc242962093 \h </w:instrText>
+              <w:instrText xml:space="preserve"> PAGEREF _Toc242964427 \h </w:instrText>
             </w:r>
             <w:r>
               <w:rPr>
@@ -1259,7 +1259,7 @@
               <w:noProof/>
             </w:rPr>
           </w:pPr>
-          <w:hyperlink w:anchor="_Toc242962094" w:history="1">
+          <w:hyperlink w:anchor="_Toc242964428" w:history="1">
             <w:r>
               <w:rPr>
                 <w:rStyle w:val="Kpr"/>
@@ -1283,7 +1283,7 @@
               <w:rPr>
                 <w:noProof/>
               </w:rPr>
-              <w:instrText xml:space="preserve"> PAGEREF _Toc242962094 \h </w:instrText>
+              <w:instrText xml:space="preserve"> PAGEREF _Toc242964428 \h </w:instrText>
             </w:r>
             <w:r>
               <w:rPr>
@@ -1320,7 +1320,7 @@
               <w:noProof/>
             </w:rPr>
           </w:pPr>
-          <w:hyperlink w:anchor="_Toc242962095" w:history="1">
+          <w:hyperlink w:anchor="_Toc242964429" w:history="1">
             <w:r>
               <w:rPr>
                 <w:rStyle w:val="Kpr"/>
@@ -1344,7 +1344,7 @@
               <w:rPr>
                 <w:noProof/>
               </w:rPr>
-              <w:instrText xml:space="preserve"> PAGEREF _Toc242962095 \h </w:instrText>
+              <w:instrText xml:space="preserve"> PAGEREF _Toc242964429 \h </w:instrText>
             </w:r>
             <w:r>
               <w:rPr>
@@ -1381,7 +1381,7 @@
               <w:noProof/>
             </w:rPr>
           </w:pPr>
-          <w:hyperlink w:anchor="_Toc242962096" w:history="1">
+          <w:hyperlink w:anchor="_Toc242964430" w:history="1">
             <w:r>
               <w:rPr>
                 <w:rStyle w:val="Kpr"/>
@@ -1405,7 +1405,7 @@
               <w:rPr>
                 <w:noProof/>
               </w:rPr>
-              <w:instrText xml:space="preserve"> PAGEREF _Toc242962096 \h </w:instrText>
+              <w:instrText xml:space="preserve"> PAGEREF _Toc242964430 \h </w:instrText>
             </w:r>
             <w:r>
               <w:rPr>
@@ -1442,7 +1442,7 @@
               <w:noProof/>
             </w:rPr>
           </w:pPr>
-          <w:hyperlink w:anchor="_Toc242962097" w:history="1">
+          <w:hyperlink w:anchor="_Toc242964431" w:history="1">
             <w:r>
               <w:rPr>
                 <w:rStyle w:val="Kpr"/>
@@ -1466,7 +1466,7 @@
               <w:rPr>
                 <w:noProof/>
               </w:rPr>
-              <w:instrText xml:space="preserve"> PAGEREF _Toc242962097 \h </w:instrText>
+              <w:instrText xml:space="preserve"> PAGEREF _Toc242964431 \h </w:instrText>
             </w:r>
             <w:r>
               <w:rPr>
@@ -1503,7 +1503,7 @@
               <w:noProof/>
             </w:rPr>
           </w:pPr>
-          <w:hyperlink w:anchor="_Toc242962098" w:history="1">
+          <w:hyperlink w:anchor="_Toc242964432" w:history="1">
             <w:r>
               <w:rPr>
                 <w:rStyle w:val="Kpr"/>
@@ -1527,7 +1527,7 @@
               <w:rPr>
                 <w:noProof/>
               </w:rPr>
-              <w:instrText xml:space="preserve"> PAGEREF _Toc242962098 \h </w:instrText>
+              <w:instrText xml:space="preserve"> PAGEREF _Toc242964432 \h </w:instrText>
             </w:r>
             <w:r>
               <w:rPr>
@@ -1564,7 +1564,7 @@
               <w:noProof/>
             </w:rPr>
           </w:pPr>
-          <w:hyperlink w:anchor="_Toc242962099" w:history="1">
+          <w:hyperlink w:anchor="_Toc242964433" w:history="1">
             <w:r>
               <w:rPr>
                 <w:rStyle w:val="Kpr"/>
@@ -1588,7 +1588,7 @@
               <w:rPr>
                 <w:noProof/>
               </w:rPr>
-              <w:instrText xml:space="preserve"> PAGEREF _Toc242962099 \h </w:instrText>
+              <w:instrText xml:space="preserve"> PAGEREF _Toc242964433 \h </w:instrText>
             </w:r>
             <w:r>
               <w:rPr>
@@ -1625,7 +1625,7 @@
               <w:noProof/>
             </w:rPr>
           </w:pPr>
-          <w:hyperlink w:anchor="_Toc242962100" w:history="1">
+          <w:hyperlink w:anchor="_Toc242964434" w:history="1">
             <w:r>
               <w:rPr>
                 <w:rStyle w:val="Kpr"/>
@@ -1649,7 +1649,7 @@
               <w:rPr>
                 <w:noProof/>
               </w:rPr>
-              <w:instrText xml:space="preserve"> PAGEREF _Toc242962100 \h </w:instrText>
+              <w:instrText xml:space="preserve"> PAGEREF _Toc242964434 \h </w:instrText>
             </w:r>
             <w:r>
               <w:rPr>
@@ -1686,7 +1686,7 @@
               <w:noProof/>
             </w:rPr>
           </w:pPr>
-          <w:hyperlink w:anchor="_Toc242962101" w:history="1">
+          <w:hyperlink w:anchor="_Toc242964435" w:history="1">
             <w:r>
               <w:rPr>
                 <w:rStyle w:val="Kpr"/>
@@ -1710,7 +1710,7 @@
               <w:rPr>
                 <w:noProof/>
               </w:rPr>
-              <w:instrText xml:space="preserve"> PAGEREF _Toc242962101 \h </w:instrText>
+              <w:instrText xml:space="preserve"> PAGEREF _Toc242964435 \h </w:instrText>
             </w:r>
             <w:r>
               <w:rPr>
@@ -1747,7 +1747,7 @@
               <w:noProof/>
             </w:rPr>
           </w:pPr>
-          <w:hyperlink w:anchor="_Toc242962102" w:history="1">
+          <w:hyperlink w:anchor="_Toc242964436" w:history="1">
             <w:r>
               <w:rPr>
                 <w:rStyle w:val="Kpr"/>
@@ -1771,7 +1771,7 @@
               <w:rPr>
                 <w:noProof/>
               </w:rPr>
-              <w:instrText xml:space="preserve"> PAGEREF _Toc242962102 \h </w:instrText>
+              <w:instrText xml:space="preserve"> PAGEREF _Toc242964436 \h </w:instrText>
             </w:r>
             <w:r>
               <w:rPr>
@@ -1808,7 +1808,7 @@
               <w:noProof/>
             </w:rPr>
           </w:pPr>
-          <w:hyperlink w:anchor="_Toc242962103" w:history="1">
+          <w:hyperlink w:anchor="_Toc242964437" w:history="1">
             <w:r>
               <w:rPr>
                 <w:rStyle w:val="Kpr"/>
@@ -1832,7 +1832,7 @@
               <w:rPr>
                 <w:noProof/>
               </w:rPr>
-              <w:instrText xml:space="preserve"> PAGEREF _Toc242962103 \h </w:instrText>
+              <w:instrText xml:space="preserve"> PAGEREF _Toc242964437 \h </w:instrText>
             </w:r>
             <w:r>
               <w:rPr>
@@ -1869,7 +1869,7 @@
               <w:noProof/>
             </w:rPr>
           </w:pPr>
-          <w:hyperlink w:anchor="_Toc242962104" w:history="1">
+          <w:hyperlink w:anchor="_Toc242964438" w:history="1">
             <w:r>
               <w:rPr>
                 <w:rStyle w:val="Kpr"/>
@@ -1893,7 +1893,7 @@
               <w:rPr>
                 <w:noProof/>
               </w:rPr>
-              <w:instrText xml:space="preserve"> PAGEREF _Toc242962104 \h </w:instrText>
+              <w:instrText xml:space="preserve"> PAGEREF _Toc242964438 \h </w:instrText>
             </w:r>
             <w:r>
               <w:rPr>
@@ -1930,7 +1930,7 @@
               <w:noProof/>
             </w:rPr>
           </w:pPr>
-          <w:hyperlink w:anchor="_Toc242962105" w:history="1">
+          <w:hyperlink w:anchor="_Toc242964439" w:history="1">
             <w:r>
               <w:rPr>
                 <w:rStyle w:val="Kpr"/>
@@ -1954,7 +1954,7 @@
               <w:rPr>
                 <w:noProof/>
               </w:rPr>
-              <w:instrText xml:space="preserve"> PAGEREF _Toc242962105 \h </w:instrText>
+              <w:instrText xml:space="preserve"> PAGEREF _Toc242964439 \h </w:instrText>
             </w:r>
             <w:r>
               <w:rPr>
@@ -1991,7 +1991,7 @@
               <w:noProof/>
             </w:rPr>
           </w:pPr>
-          <w:hyperlink w:anchor="_Toc242962106" w:history="1">
+          <w:hyperlink w:anchor="_Toc242964440" w:history="1">
             <w:r>
               <w:rPr>
                 <w:rStyle w:val="Kpr"/>
@@ -2015,7 +2015,7 @@
               <w:rPr>
                 <w:noProof/>
               </w:rPr>
-              <w:instrText xml:space="preserve"> PAGEREF _Toc242962106 \h </w:instrText>
+              <w:instrText xml:space="preserve"> PAGEREF _Toc242964440 \h </w:instrText>
             </w:r>
             <w:r>
               <w:rPr>
@@ -2052,7 +2052,7 @@
               <w:noProof/>
             </w:rPr>
           </w:pPr>
-          <w:hyperlink w:anchor="_Toc242962107" w:history="1">
+          <w:hyperlink w:anchor="_Toc242964441" w:history="1">
             <w:r>
               <w:rPr>
                 <w:rStyle w:val="Kpr"/>
@@ -2076,7 +2076,7 @@
               <w:rPr>
                 <w:noProof/>
               </w:rPr>
-              <w:instrText xml:space="preserve"> PAGEREF _Toc242962107 \h </w:instrText>
+              <w:instrText xml:space="preserve"> PAGEREF _Toc242964441 \h </w:instrText>
             </w:r>
             <w:r>
               <w:rPr>
@@ -2113,7 +2113,7 @@
               <w:noProof/>
             </w:rPr>
           </w:pPr>
-          <w:hyperlink w:anchor="_Toc242962108" w:history="1">
+          <w:hyperlink w:anchor="_Toc242964442" w:history="1">
             <w:r>
               <w:rPr>
                 <w:rStyle w:val="Kpr"/>
@@ -2137,7 +2137,7 @@
               <w:rPr>
                 <w:noProof/>
               </w:rPr>
-              <w:instrText xml:space="preserve"> PAGEREF _Toc242962108 \h </w:instrText>
+              <w:instrText xml:space="preserve"> PAGEREF _Toc242964442 \h </w:instrText>
             </w:r>
             <w:r>
               <w:rPr>
@@ -2174,7 +2174,7 @@
               <w:noProof/>
             </w:rPr>
           </w:pPr>
-          <w:hyperlink w:anchor="_Toc242962109" w:history="1">
+          <w:hyperlink w:anchor="_Toc242964443" w:history="1">
             <w:r>
               <w:rPr>
                 <w:rStyle w:val="Kpr"/>
@@ -2198,7 +2198,7 @@
               <w:rPr>
                 <w:noProof/>
               </w:rPr>
-              <w:instrText xml:space="preserve"> PAGEREF _Toc242962109 \h </w:instrText>
+              <w:instrText xml:space="preserve"> PAGEREF _Toc242964443 \h </w:instrText>
             </w:r>
             <w:r>
               <w:rPr>
@@ -2235,7 +2235,7 @@
               <w:noProof/>
             </w:rPr>
           </w:pPr>
-          <w:hyperlink w:anchor="_Toc242962110" w:history="1">
+          <w:hyperlink w:anchor="_Toc242964444" w:history="1">
             <w:r>
               <w:rPr>
                 <w:rStyle w:val="Kpr"/>
@@ -2259,7 +2259,7 @@
               <w:rPr>
                 <w:noProof/>
               </w:rPr>
-              <w:instrText xml:space="preserve"> PAGEREF _Toc242962110 \h </w:instrText>
+              <w:instrText xml:space="preserve"> PAGEREF _Toc242964444 \h </w:instrText>
             </w:r>
             <w:r>
               <w:rPr>
@@ -2296,7 +2296,7 @@
               <w:noProof/>
             </w:rPr>
           </w:pPr>
-          <w:hyperlink w:anchor="_Toc242962111" w:history="1">
+          <w:hyperlink w:anchor="_Toc242964445" w:history="1">
             <w:r>
               <w:rPr>
                 <w:rStyle w:val="Kpr"/>
@@ -2320,7 +2320,7 @@
               <w:rPr>
                 <w:noProof/>
               </w:rPr>
-              <w:instrText xml:space="preserve"> PAGEREF _Toc242962111 \h </w:instrText>
+              <w:instrText xml:space="preserve"> PAGEREF _Toc242964445 \h </w:instrText>
             </w:r>
             <w:r>
               <w:rPr>
@@ -2357,7 +2357,7 @@
               <w:noProof/>
             </w:rPr>
           </w:pPr>
-          <w:hyperlink w:anchor="_Toc242962112" w:history="1">
+          <w:hyperlink w:anchor="_Toc242964446" w:history="1">
             <w:r>
               <w:rPr>
                 <w:rStyle w:val="Kpr"/>
@@ -2381,7 +2381,7 @@
               <w:rPr>
                 <w:noProof/>
               </w:rPr>
-              <w:instrText xml:space="preserve"> PAGEREF _Toc242962112 \h </w:instrText>
+              <w:instrText xml:space="preserve"> PAGEREF _Toc242964446 \h </w:instrText>
             </w:r>
             <w:r>
               <w:rPr>
@@ -2418,7 +2418,7 @@
               <w:noProof/>
             </w:rPr>
           </w:pPr>
-          <w:hyperlink w:anchor="_Toc242962113" w:history="1">
+          <w:hyperlink w:anchor="_Toc242964447" w:history="1">
             <w:r>
               <w:rPr>
                 <w:rStyle w:val="Kpr"/>
@@ -2442,7 +2442,7 @@
               <w:rPr>
                 <w:noProof/>
               </w:rPr>
-              <w:instrText xml:space="preserve"> PAGEREF _Toc242962113 \h </w:instrText>
+              <w:instrText xml:space="preserve"> PAGEREF _Toc242964447 \h </w:instrText>
             </w:r>
             <w:r>
               <w:rPr>
@@ -2479,7 +2479,7 @@
               <w:noProof/>
             </w:rPr>
           </w:pPr>
-          <w:hyperlink w:anchor="_Toc242962114" w:history="1">
+          <w:hyperlink w:anchor="_Toc242964448" w:history="1">
             <w:r>
               <w:rPr>
                 <w:rStyle w:val="Kpr"/>
@@ -2503,7 +2503,7 @@
               <w:rPr>
                 <w:noProof/>
               </w:rPr>
-              <w:instrText xml:space="preserve"> PAGEREF _Toc242962114 \h </w:instrText>
+              <w:instrText xml:space="preserve"> PAGEREF _Toc242964448 \h </w:instrText>
             </w:r>
             <w:r>
               <w:rPr>
@@ -2540,7 +2540,7 @@
               <w:noProof/>
             </w:rPr>
           </w:pPr>
-          <w:hyperlink w:anchor="_Toc242962115" w:history="1">
+          <w:hyperlink w:anchor="_Toc242964449" w:history="1">
             <w:r>
               <w:rPr>
                 <w:rStyle w:val="Kpr"/>
@@ -2564,7 +2564,7 @@
               <w:rPr>
                 <w:noProof/>
               </w:rPr>
-              <w:instrText xml:space="preserve"> PAGEREF _Toc242962115 \h </w:instrText>
+              <w:instrText xml:space="preserve"> PAGEREF _Toc242964449 \h </w:instrText>
             </w:r>
             <w:r>
               <w:rPr>
@@ -2601,7 +2601,7 @@
               <w:noProof/>
             </w:rPr>
           </w:pPr>
-          <w:hyperlink w:anchor="_Toc242962116" w:history="1">
+          <w:hyperlink w:anchor="_Toc242964450" w:history="1">
             <w:r>
               <w:rPr>
                 <w:rStyle w:val="Kpr"/>
@@ -2625,7 +2625,7 @@
               <w:rPr>
                 <w:noProof/>
               </w:rPr>
-              <w:instrText xml:space="preserve"> PAGEREF _Toc242962116 \h </w:instrText>
+              <w:instrText xml:space="preserve"> PAGEREF _Toc242964450 \h </w:instrText>
             </w:r>
             <w:r>
               <w:rPr>
@@ -2662,7 +2662,7 @@
               <w:noProof/>
             </w:rPr>
           </w:pPr>
-          <w:hyperlink w:anchor="_Toc242962117" w:history="1">
+          <w:hyperlink w:anchor="_Toc242964451" w:history="1">
             <w:r>
               <w:rPr>
                 <w:rStyle w:val="Kpr"/>
@@ -2686,7 +2686,7 @@
               <w:rPr>
                 <w:noProof/>
               </w:rPr>
-              <w:instrText xml:space="preserve"> PAGEREF _Toc242962117 \h </w:instrText>
+              <w:instrText xml:space="preserve"> PAGEREF _Toc242964451 \h </w:instrText>
             </w:r>
             <w:r>
               <w:rPr>
@@ -2723,7 +2723,7 @@
               <w:noProof/>
             </w:rPr>
           </w:pPr>
-          <w:hyperlink w:anchor="_Toc242962118" w:history="1">
+          <w:hyperlink w:anchor="_Toc242964452" w:history="1">
             <w:r>
               <w:rPr>
                 <w:rStyle w:val="Kpr"/>
@@ -2747,7 +2747,7 @@
               <w:rPr>
                 <w:noProof/>
               </w:rPr>
-              <w:instrText xml:space="preserve"> PAGEREF _Toc242962118 \h </w:instrText>
+              <w:instrText xml:space="preserve"> PAGEREF _Toc242964452 \h </w:instrText>
             </w:r>
             <w:r>
               <w:rPr>
@@ -2784,7 +2784,7 @@
               <w:noProof/>
             </w:rPr>
           </w:pPr>
-          <w:hyperlink w:anchor="_Toc242962119" w:history="1">
+          <w:hyperlink w:anchor="_Toc242964453" w:history="1">
             <w:r>
               <w:rPr>
                 <w:rStyle w:val="Kpr"/>
@@ -2808,7 +2808,7 @@
               <w:rPr>
                 <w:noProof/>
               </w:rPr>
-              <w:instrText xml:space="preserve"> PAGEREF _Toc242962119 \h </w:instrText>
+              <w:instrText xml:space="preserve"> PAGEREF _Toc242964453 \h </w:instrText>
             </w:r>
             <w:r>
               <w:rPr>
@@ -2845,7 +2845,7 @@
               <w:noProof/>
             </w:rPr>
           </w:pPr>
-          <w:hyperlink w:anchor="_Toc242962120" w:history="1">
+          <w:hyperlink w:anchor="_Toc242964454" w:history="1">
             <w:r>
               <w:rPr>
                 <w:rStyle w:val="Kpr"/>
@@ -2869,7 +2869,7 @@
               <w:rPr>
                 <w:noProof/>
               </w:rPr>
-              <w:instrText xml:space="preserve"> PAGEREF _Toc242962120 \h </w:instrText>
+              <w:instrText xml:space="preserve"> PAGEREF _Toc242964454 \h </w:instrText>
             </w:r>
             <w:r>
               <w:rPr>
@@ -2906,7 +2906,7 @@
               <w:noProof/>
             </w:rPr>
           </w:pPr>
-          <w:hyperlink w:anchor="_Toc242962121" w:history="1">
+          <w:hyperlink w:anchor="_Toc242964455" w:history="1">
             <w:r>
               <w:rPr>
                 <w:rStyle w:val="Kpr"/>
@@ -2930,7 +2930,7 @@
               <w:rPr>
                 <w:noProof/>
               </w:rPr>
-              <w:instrText xml:space="preserve"> PAGEREF _Toc242962121 \h </w:instrText>
+              <w:instrText xml:space="preserve"> PAGEREF _Toc242964455 \h </w:instrText>
             </w:r>
             <w:r>
               <w:rPr>
@@ -2967,7 +2967,7 @@
               <w:noProof/>
             </w:rPr>
           </w:pPr>
-          <w:hyperlink w:anchor="_Toc242962122" w:history="1">
+          <w:hyperlink w:anchor="_Toc242964456" w:history="1">
             <w:r>
               <w:rPr>
                 <w:rStyle w:val="Kpr"/>
@@ -2991,7 +2991,7 @@
               <w:rPr>
                 <w:noProof/>
               </w:rPr>
-              <w:instrText xml:space="preserve"> PAGEREF _Toc242962122 \h </w:instrText>
+              <w:instrText xml:space="preserve"> PAGEREF _Toc242964456 \h </w:instrText>
             </w:r>
             <w:r>
               <w:rPr>
@@ -3028,7 +3028,7 @@
               <w:noProof/>
             </w:rPr>
           </w:pPr>
-          <w:hyperlink w:anchor="_Toc242962123" w:history="1">
+          <w:hyperlink w:anchor="_Toc242964457" w:history="1">
             <w:r>
               <w:rPr>
                 <w:rStyle w:val="Kpr"/>
@@ -3052,7 +3052,7 @@
               <w:rPr>
                 <w:noProof/>
               </w:rPr>
-              <w:instrText xml:space="preserve"> PAGEREF _Toc242962123 \h </w:instrText>
+              <w:instrText xml:space="preserve"> PAGEREF _Toc242964457 \h </w:instrText>
             </w:r>
             <w:r>
               <w:rPr>
@@ -3089,7 +3089,7 @@
               <w:noProof/>
             </w:rPr>
           </w:pPr>
-          <w:hyperlink w:anchor="_Toc242962124" w:history="1">
+          <w:hyperlink w:anchor="_Toc242964458" w:history="1">
             <w:r>
               <w:rPr>
                 <w:rStyle w:val="Kpr"/>
@@ -3113,7 +3113,7 @@
               <w:rPr>
                 <w:noProof/>
               </w:rPr>
-              <w:instrText xml:space="preserve"> PAGEREF _Toc242962124 \h </w:instrText>
+              <w:instrText xml:space="preserve"> PAGEREF _Toc242964458 \h </w:instrText>
             </w:r>
             <w:r>
               <w:rPr>
@@ -3150,7 +3150,7 @@
               <w:noProof/>
             </w:rPr>
           </w:pPr>
-          <w:hyperlink w:anchor="_Toc242962125" w:history="1">
+          <w:hyperlink w:anchor="_Toc242964459" w:history="1">
             <w:r>
               <w:rPr>
                 <w:rStyle w:val="Kpr"/>
@@ -3174,7 +3174,7 @@
               <w:rPr>
                 <w:noProof/>
               </w:rPr>
-              <w:instrText xml:space="preserve"> PAGEREF _Toc242962125 \h </w:instrText>
+              <w:instrText xml:space="preserve"> PAGEREF _Toc242964459 \h </w:instrText>
             </w:r>
             <w:r>
               <w:rPr>
@@ -3211,7 +3211,7 @@
               <w:noProof/>
             </w:rPr>
           </w:pPr>
-          <w:hyperlink w:anchor="_Toc242962126" w:history="1">
+          <w:hyperlink w:anchor="_Toc242964460" w:history="1">
             <w:r>
               <w:rPr>
                 <w:rStyle w:val="Kpr"/>
@@ -3235,7 +3235,7 @@
               <w:rPr>
                 <w:noProof/>
               </w:rPr>
-              <w:instrText xml:space="preserve"> PAGEREF _Toc242962126 \h </w:instrText>
+              <w:instrText xml:space="preserve"> PAGEREF _Toc242964460 \h </w:instrText>
             </w:r>
             <w:r>
               <w:rPr>
@@ -3272,7 +3272,7 @@
               <w:noProof/>
             </w:rPr>
           </w:pPr>
-          <w:hyperlink w:anchor="_Toc242962127" w:history="1">
+          <w:hyperlink w:anchor="_Toc242964461" w:history="1">
             <w:r>
               <w:rPr>
                 <w:rStyle w:val="Kpr"/>
@@ -3296,7 +3296,7 @@
               <w:rPr>
                 <w:noProof/>
               </w:rPr>
-              <w:instrText xml:space="preserve"> PAGEREF _Toc242962127 \h </w:instrText>
+              <w:instrText xml:space="preserve"> PAGEREF _Toc242964461 \h </w:instrText>
             </w:r>
             <w:r>
               <w:rPr>
@@ -3333,7 +3333,7 @@
               <w:noProof/>
             </w:rPr>
           </w:pPr>
-          <w:hyperlink w:anchor="_Toc242962128" w:history="1">
+          <w:hyperlink w:anchor="_Toc242964462" w:history="1">
             <w:r>
               <w:rPr>
                 <w:rStyle w:val="Kpr"/>
@@ -3357,7 +3357,7 @@
               <w:rPr>
                 <w:noProof/>
               </w:rPr>
-              <w:instrText xml:space="preserve"> PAGEREF _Toc242962128 \h </w:instrText>
+              <w:instrText xml:space="preserve"> PAGEREF _Toc242964462 \h </w:instrText>
             </w:r>
             <w:r>
               <w:rPr>
@@ -3394,7 +3394,7 @@
               <w:noProof/>
             </w:rPr>
           </w:pPr>
-          <w:hyperlink w:anchor="_Toc242962129" w:history="1">
+          <w:hyperlink w:anchor="_Toc242964463" w:history="1">
             <w:r>
               <w:rPr>
                 <w:rStyle w:val="Kpr"/>
@@ -3418,7 +3418,7 @@
               <w:rPr>
                 <w:noProof/>
               </w:rPr>
-              <w:instrText xml:space="preserve"> PAGEREF _Toc242962129 \h </w:instrText>
+              <w:instrText xml:space="preserve"> PAGEREF _Toc242964463 \h </w:instrText>
             </w:r>
             <w:r>
               <w:rPr>
@@ -3455,7 +3455,7 @@
               <w:noProof/>
             </w:rPr>
           </w:pPr>
-          <w:hyperlink w:anchor="_Toc242962130" w:history="1">
+          <w:hyperlink w:anchor="_Toc242964464" w:history="1">
             <w:r>
               <w:rPr>
                 <w:rStyle w:val="Kpr"/>
@@ -3479,7 +3479,7 @@
               <w:rPr>
                 <w:noProof/>
               </w:rPr>
-              <w:instrText xml:space="preserve"> PAGEREF _Toc242962130 \h </w:instrText>
+              <w:instrText xml:space="preserve"> PAGEREF _Toc242964464 \h </w:instrText>
             </w:r>
             <w:r>
               <w:rPr>
@@ -3516,7 +3516,7 @@
               <w:noProof/>
             </w:rPr>
           </w:pPr>
-          <w:hyperlink w:anchor="_Toc242962131" w:history="1">
+          <w:hyperlink w:anchor="_Toc242964465" w:history="1">
             <w:r>
               <w:rPr>
                 <w:rStyle w:val="Kpr"/>
@@ -3540,7 +3540,7 @@
               <w:rPr>
                 <w:noProof/>
               </w:rPr>
-              <w:instrText xml:space="preserve"> PAGEREF _Toc242962131 \h </w:instrText>
+              <w:instrText xml:space="preserve"> PAGEREF _Toc242964465 \h </w:instrText>
             </w:r>
             <w:r>
               <w:rPr>
@@ -3577,7 +3577,7 @@
               <w:noProof/>
             </w:rPr>
           </w:pPr>
-          <w:hyperlink w:anchor="_Toc242962132" w:history="1">
+          <w:hyperlink w:anchor="_Toc242964466" w:history="1">
             <w:r>
               <w:rPr>
                 <w:rStyle w:val="Kpr"/>
@@ -3601,7 +3601,7 @@
               <w:rPr>
                 <w:noProof/>
               </w:rPr>
-              <w:instrText xml:space="preserve"> PAGEREF _Toc242962132 \h </w:instrText>
+              <w:instrText xml:space="preserve"> PAGEREF _Toc242964466 \h </w:instrText>
             </w:r>
             <w:r>
               <w:rPr>
@@ -3638,7 +3638,7 @@
               <w:noProof/>
             </w:rPr>
           </w:pPr>
-          <w:hyperlink w:anchor="_Toc242962133" w:history="1">
+          <w:hyperlink w:anchor="_Toc242964467" w:history="1">
             <w:r>
               <w:rPr>
                 <w:rStyle w:val="Kpr"/>
@@ -3662,7 +3662,7 @@
               <w:rPr>
                 <w:noProof/>
               </w:rPr>
-              <w:instrText xml:space="preserve"> PAGEREF _Toc242962133 \h </w:instrText>
+              <w:instrText xml:space="preserve"> PAGEREF _Toc242964467 \h </w:instrText>
             </w:r>
             <w:r>
               <w:rPr>
@@ -3699,7 +3699,7 @@
               <w:noProof/>
             </w:rPr>
           </w:pPr>
-          <w:hyperlink w:anchor="_Toc242962134" w:history="1">
+          <w:hyperlink w:anchor="_Toc242964468" w:history="1">
             <w:r>
               <w:rPr>
                 <w:rStyle w:val="Kpr"/>
@@ -3723,7 +3723,7 @@
               <w:rPr>
                 <w:noProof/>
               </w:rPr>
-              <w:instrText xml:space="preserve"> PAGEREF _Toc242962134 \h </w:instrText>
+              <w:instrText xml:space="preserve"> PAGEREF _Toc242964468 \h </w:instrText>
             </w:r>
             <w:r>
               <w:rPr>
@@ -3760,7 +3760,7 @@
               <w:noProof/>
             </w:rPr>
           </w:pPr>
-          <w:hyperlink w:anchor="_Toc242962135" w:history="1">
+          <w:hyperlink w:anchor="_Toc242964469" w:history="1">
             <w:r>
               <w:rPr>
                 <w:rStyle w:val="Kpr"/>
@@ -3784,7 +3784,7 @@
               <w:rPr>
                 <w:noProof/>
               </w:rPr>
-              <w:instrText xml:space="preserve"> PAGEREF _Toc242962135 \h </w:instrText>
+              <w:instrText xml:space="preserve"> PAGEREF _Toc242964469 \h </w:instrText>
             </w:r>
             <w:r>
               <w:rPr>
@@ -3821,7 +3821,7 @@
               <w:noProof/>
             </w:rPr>
           </w:pPr>
-          <w:hyperlink w:anchor="_Toc242962136" w:history="1">
+          <w:hyperlink w:anchor="_Toc242964470" w:history="1">
             <w:r>
               <w:rPr>
                 <w:rStyle w:val="Kpr"/>
@@ -3845,7 +3845,7 @@
               <w:rPr>
                 <w:noProof/>
               </w:rPr>
-              <w:instrText xml:space="preserve"> PAGEREF _Toc242962136 \h </w:instrText>
+              <w:instrText xml:space="preserve"> PAGEREF _Toc242964470 \h </w:instrText>
             </w:r>
             <w:r>
               <w:rPr>
@@ -3882,7 +3882,7 @@
               <w:noProof/>
             </w:rPr>
           </w:pPr>
-          <w:hyperlink w:anchor="_Toc242962137" w:history="1">
+          <w:hyperlink w:anchor="_Toc242964471" w:history="1">
             <w:r>
               <w:rPr>
                 <w:rStyle w:val="Kpr"/>
@@ -3906,7 +3906,7 @@
               <w:rPr>
                 <w:noProof/>
               </w:rPr>
-              <w:instrText xml:space="preserve"> PAGEREF _Toc242962137 \h </w:instrText>
+              <w:instrText xml:space="preserve"> PAGEREF _Toc242964471 \h </w:instrText>
             </w:r>
             <w:r>
               <w:rPr>
@@ -3943,7 +3943,7 @@
               <w:noProof/>
             </w:rPr>
           </w:pPr>
-          <w:hyperlink w:anchor="_Toc242962138" w:history="1">
+          <w:hyperlink w:anchor="_Toc242964472" w:history="1">
             <w:r>
               <w:rPr>
                 <w:rStyle w:val="Kpr"/>
@@ -3967,7 +3967,7 @@
               <w:rPr>
                 <w:noProof/>
               </w:rPr>
-              <w:instrText xml:space="preserve"> PAGEREF _Toc242962138 \h </w:instrText>
+              <w:instrText xml:space="preserve"> PAGEREF _Toc242964472 \h </w:instrText>
             </w:r>
             <w:r>
               <w:rPr>
@@ -4004,7 +4004,7 @@
               <w:noProof/>
             </w:rPr>
           </w:pPr>
-          <w:hyperlink w:anchor="_Toc242962139" w:history="1">
+          <w:hyperlink w:anchor="_Toc242964473" w:history="1">
             <w:r>
               <w:rPr>
                 <w:rStyle w:val="Kpr"/>
@@ -4028,7 +4028,7 @@
               <w:rPr>
                 <w:noProof/>
               </w:rPr>
-              <w:instrText xml:space="preserve"> PAGEREF _Toc242962139 \h </w:instrText>
+              <w:instrText xml:space="preserve"> PAGEREF _Toc242964473 \h </w:instrText>
             </w:r>
             <w:r>
               <w:rPr>
@@ -4065,7 +4065,7 @@
               <w:noProof/>
             </w:rPr>
           </w:pPr>
-          <w:hyperlink w:anchor="_Toc242962140" w:history="1">
+          <w:hyperlink w:anchor="_Toc242964474" w:history="1">
             <w:r>
               <w:rPr>
                 <w:rStyle w:val="Kpr"/>
@@ -4089,7 +4089,7 @@
               <w:rPr>
                 <w:noProof/>
               </w:rPr>
-              <w:instrText xml:space="preserve"> PAGEREF _Toc242962140 \h </w:instrText>
+              <w:instrText xml:space="preserve"> PAGEREF _Toc242964474 \h </w:instrText>
             </w:r>
             <w:r>
               <w:rPr>
@@ -4126,7 +4126,7 @@
               <w:noProof/>
             </w:rPr>
           </w:pPr>
-          <w:hyperlink w:anchor="_Toc242962141" w:history="1">
+          <w:hyperlink w:anchor="_Toc242964475" w:history="1">
             <w:r>
               <w:rPr>
                 <w:rStyle w:val="Kpr"/>
@@ -4150,7 +4150,7 @@
               <w:rPr>
                 <w:noProof/>
               </w:rPr>
-              <w:instrText xml:space="preserve"> PAGEREF _Toc242962141 \h </w:instrText>
+              <w:instrText xml:space="preserve"> PAGEREF _Toc242964475 \h </w:instrText>
             </w:r>
             <w:r>
               <w:rPr>
@@ -4187,7 +4187,7 @@
               <w:noProof/>
             </w:rPr>
           </w:pPr>
-          <w:hyperlink w:anchor="_Toc242962142" w:history="1">
+          <w:hyperlink w:anchor="_Toc242964476" w:history="1">
             <w:r>
               <w:rPr>
                 <w:rStyle w:val="Kpr"/>
@@ -4211,7 +4211,7 @@
               <w:rPr>
                 <w:noProof/>
               </w:rPr>
-              <w:instrText xml:space="preserve"> PAGEREF _Toc242962142 \h </w:instrText>
+              <w:instrText xml:space="preserve"> PAGEREF _Toc242964476 \h </w:instrText>
             </w:r>
             <w:r>
               <w:rPr>
@@ -4228,7 +4228,7 @@
               <w:rPr>
                 <w:noProof/>
               </w:rPr>
-              <w:t>17</w:t>
+              <w:t>18</w:t>
             </w:r>
             <w:r>
               <w:rPr>
@@ -4248,7 +4248,7 @@
               <w:noProof/>
             </w:rPr>
           </w:pPr>
-          <w:hyperlink w:anchor="_Toc242962143" w:history="1">
+          <w:hyperlink w:anchor="_Toc242964477" w:history="1">
             <w:r>
               <w:rPr>
                 <w:rStyle w:val="Kpr"/>
@@ -4272,7 +4272,7 @@
               <w:rPr>
                 <w:noProof/>
               </w:rPr>
-              <w:instrText xml:space="preserve"> PAGEREF _Toc242962143 \h </w:instrText>
+              <w:instrText xml:space="preserve"> PAGEREF _Toc242964477 \h </w:instrText>
             </w:r>
             <w:r>
               <w:rPr>
@@ -4309,7 +4309,7 @@
               <w:noProof/>
             </w:rPr>
           </w:pPr>
-          <w:hyperlink w:anchor="_Toc242962144" w:history="1">
+          <w:hyperlink w:anchor="_Toc242964478" w:history="1">
             <w:r>
               <w:rPr>
                 <w:rStyle w:val="Kpr"/>
@@ -4333,7 +4333,7 @@
               <w:rPr>
                 <w:noProof/>
               </w:rPr>
-              <w:instrText xml:space="preserve"> PAGEREF _Toc242962144 \h </w:instrText>
+              <w:instrText xml:space="preserve"> PAGEREF _Toc242964478 \h </w:instrText>
             </w:r>
             <w:r>
               <w:rPr>
@@ -4392,7 +4392,7 @@
       <w:pPr>
         <w:pStyle w:val="Balk1"/>
       </w:pPr>
-      <w:bookmarkStart w:id="2" w:name="_Toc242962094"/>
+      <w:bookmarkStart w:id="2" w:name="_Toc242964428"/>
       <w:r>
         <w:t>1. Giriş</w:t>
       </w:r>
@@ -4402,7 +4402,7 @@
       <w:pPr>
         <w:pStyle w:val="Balk2"/>
       </w:pPr>
-      <w:bookmarkStart w:id="3" w:name="_Toc242962095"/>
+      <w:bookmarkStart w:id="3" w:name="_Toc242964429"/>
       <w:r>
         <w:t>1.1 Amaç</w:t>
       </w:r>
@@ -4430,7 +4430,7 @@
       <w:pPr>
         <w:pStyle w:val="Balk2"/>
       </w:pPr>
-      <w:bookmarkStart w:id="4" w:name="_Toc242962096"/>
+      <w:bookmarkStart w:id="4" w:name="_Toc242964430"/>
       <w:r>
         <w:t>1.2 Kapsam Özeti</w:t>
       </w:r>
@@ -4449,7 +4449,7 @@
       <w:pPr>
         <w:pStyle w:val="Balk2"/>
       </w:pPr>
-      <w:bookmarkStart w:id="5" w:name="_Toc242962097"/>
+      <w:bookmarkStart w:id="5" w:name="_Toc242964431"/>
       <w:r>
         <w:t>1.3 Referans Dokümanlar</w:t>
       </w:r>
@@ -4988,7 +4988,7 @@
       <w:pPr>
         <w:pStyle w:val="Balk2"/>
       </w:pPr>
-      <w:bookmarkStart w:id="6" w:name="_Toc242962098"/>
+      <w:bookmarkStart w:id="6" w:name="_Toc242964432"/>
       <w:r>
         <w:t>1.4 Kısaltmalar</w:t>
       </w:r>
@@ -5641,7 +5641,7 @@
       <w:pPr>
         <w:pStyle w:val="Balk1"/>
       </w:pPr>
-      <w:bookmarkStart w:id="7" w:name="_Toc242962099"/>
+      <w:bookmarkStart w:id="7" w:name="_Toc242964433"/>
       <w:r>
         <w:t>2. Test Edilecek Sistem</w:t>
       </w:r>
@@ -5651,7 +5651,7 @@
       <w:pPr>
         <w:pStyle w:val="Balk2"/>
       </w:pPr>
-      <w:bookmarkStart w:id="8" w:name="_Toc242962100"/>
+      <w:bookmarkStart w:id="8" w:name="_Toc242964434"/>
       <w:r>
         <w:t>2.1 Uygulama Tanımı</w:t>
       </w:r>
@@ -5670,7 +5670,7 @@
       <w:pPr>
         <w:pStyle w:val="Balk2"/>
       </w:pPr>
-      <w:bookmarkStart w:id="9" w:name="_Toc242962101"/>
+      <w:bookmarkStart w:id="9" w:name="_Toc242964435"/>
       <w:r>
         <w:t>2.2 Mimari ve Bileşenler</w:t>
       </w:r>
@@ -6126,7 +6126,7 @@
       <w:pPr>
         <w:pStyle w:val="Balk2"/>
       </w:pPr>
-      <w:bookmarkStart w:id="10" w:name="_Toc242962102"/>
+      <w:bookmarkStart w:id="10" w:name="_Toc242964436"/>
       <w:r>
         <w:t>2.3 Kullanıcı Rolleri</w:t>
       </w:r>
@@ -6387,7 +6387,7 @@
       <w:pPr>
         <w:pStyle w:val="Balk2"/>
       </w:pPr>
-      <w:bookmarkStart w:id="11" w:name="_Toc242962103"/>
+      <w:bookmarkStart w:id="11" w:name="_Toc242964437"/>
       <w:r>
         <w:t>2.4 Uygulama Modülleri (Site Analizi Sonucu)</w:t>
       </w:r>
@@ -7341,7 +7341,7 @@
       <w:pPr>
         <w:pStyle w:val="Balk1"/>
       </w:pPr>
-      <w:bookmarkStart w:id="12" w:name="_Toc242962104"/>
+      <w:bookmarkStart w:id="12" w:name="_Toc242964438"/>
       <w:r>
         <w:t>3. Test Kapsamı</w:t>
       </w:r>
@@ -7351,7 +7351,7 @@
       <w:pPr>
         <w:pStyle w:val="Balk2"/>
       </w:pPr>
-      <w:bookmarkStart w:id="13" w:name="_Toc242962105"/>
+      <w:bookmarkStart w:id="13" w:name="_Toc242964439"/>
       <w:r>
         <w:t>3.1 Test Edilecek Özellikler (In Scope)</w:t>
       </w:r>
@@ -10443,7 +10443,7 @@
       <w:pPr>
         <w:pStyle w:val="Balk2"/>
       </w:pPr>
-      <w:bookmarkStart w:id="14" w:name="_Toc242962106"/>
+      <w:bookmarkStart w:id="14" w:name="_Toc242964440"/>
       <w:r>
         <w:t>3.2 Test Edilmeyecek Özellikler (Out of Scope)</w:t>
       </w:r>
@@ -10544,7 +10544,7 @@
       <w:pPr>
         <w:pStyle w:val="Balk1"/>
       </w:pPr>
-      <w:bookmarkStart w:id="15" w:name="_Toc242962107"/>
+      <w:bookmarkStart w:id="15" w:name="_Toc242964441"/>
       <w:r>
         <w:t>4. Test Yaklaşımı ve Stratejisi</w:t>
       </w:r>
@@ -10554,7 +10554,7 @@
       <w:pPr>
         <w:pStyle w:val="Balk2"/>
       </w:pPr>
-      <w:bookmarkStart w:id="16" w:name="_Toc242962108"/>
+      <w:bookmarkStart w:id="16" w:name="_Toc242964442"/>
       <w:r>
         <w:t>4.1 Test Seviyeleri</w:t>
       </w:r>
@@ -11176,7 +11176,7 @@
       <w:pPr>
         <w:pStyle w:val="Balk2"/>
       </w:pPr>
-      <w:bookmarkStart w:id="17" w:name="_Toc242962109"/>
+      <w:bookmarkStart w:id="17" w:name="_Toc242964443"/>
       <w:r>
         <w:t>4.2 Test Türleri</w:t>
       </w:r>
@@ -11306,7 +11306,7 @@
       <w:pPr>
         <w:pStyle w:val="Balk2"/>
       </w:pPr>
-      <w:bookmarkStart w:id="18" w:name="_Toc242962110"/>
+      <w:bookmarkStart w:id="18" w:name="_Toc242964444"/>
       <w:r>
         <w:t>4.3 Test Tasarım Teknikleri</w:t>
       </w:r>
@@ -11735,7 +11735,7 @@
       <w:pPr>
         <w:pStyle w:val="Balk2"/>
       </w:pPr>
-      <w:bookmarkStart w:id="19" w:name="_Toc242962111"/>
+      <w:bookmarkStart w:id="19" w:name="_Toc242964445"/>
       <w:r>
         <w:t>4.4 Sipariş Statü Geçiş Kuralları</w:t>
       </w:r>
@@ -12330,7 +12330,7 @@
       <w:pPr>
         <w:pStyle w:val="Balk1"/>
       </w:pPr>
-      <w:bookmarkStart w:id="20" w:name="_Toc242962112"/>
+      <w:bookmarkStart w:id="20" w:name="_Toc242964446"/>
       <w:r>
         <w:t>5. Test Süreci ve Fazlar</w:t>
       </w:r>
@@ -14034,7 +14034,7 @@
       <w:pPr>
         <w:pStyle w:val="Balk1"/>
       </w:pPr>
-      <w:bookmarkStart w:id="21" w:name="_Toc242962113"/>
+      <w:bookmarkStart w:id="21" w:name="_Toc242964447"/>
       <w:r>
         <w:t>6. Test Ortamı</w:t>
       </w:r>
@@ -14044,7 +14044,7 @@
       <w:pPr>
         <w:pStyle w:val="Balk2"/>
       </w:pPr>
-      <w:bookmarkStart w:id="22" w:name="_Toc242962114"/>
+      <w:bookmarkStart w:id="22" w:name="_Toc242964448"/>
       <w:r>
         <w:t>6.1 Ortam Bilgileri</w:t>
       </w:r>
@@ -14529,7 +14529,7 @@
       <w:pPr>
         <w:pStyle w:val="Balk2"/>
       </w:pPr>
-      <w:bookmarkStart w:id="23" w:name="_Toc242962115"/>
+      <w:bookmarkStart w:id="23" w:name="_Toc242964449"/>
       <w:r>
         <w:t>6.2 Araçlar ve Kütüphaneler</w:t>
       </w:r>
@@ -15815,7 +15815,7 @@
       <w:pPr>
         <w:pStyle w:val="Balk2"/>
       </w:pPr>
-      <w:bookmarkStart w:id="24" w:name="_Toc242962116"/>
+      <w:bookmarkStart w:id="24" w:name="_Toc242964450"/>
       <w:r>
         <w:t>6.3 Test Verisi Yönetimi</w:t>
       </w:r>
@@ -15877,7 +15877,7 @@
       <w:pPr>
         <w:pStyle w:val="Balk1"/>
       </w:pPr>
-      <w:bookmarkStart w:id="25" w:name="_Toc242962117"/>
+      <w:bookmarkStart w:id="25" w:name="_Toc242964451"/>
       <w:r>
         <w:t>7. Test Otomasyon Mimarisi</w:t>
       </w:r>
@@ -15887,7 +15887,7 @@
       <w:pPr>
         <w:pStyle w:val="Balk2"/>
       </w:pPr>
-      <w:bookmarkStart w:id="26" w:name="_Toc242962118"/>
+      <w:bookmarkStart w:id="26" w:name="_Toc242964452"/>
       <w:r>
         <w:t>7.1 Selenium + TestNG (POM)</w:t>
       </w:r>
@@ -16015,7 +16015,7 @@
       <w:pPr>
         <w:pStyle w:val="Balk2"/>
       </w:pPr>
-      <w:bookmarkStart w:id="27" w:name="_Toc242962119"/>
+      <w:bookmarkStart w:id="27" w:name="_Toc242964453"/>
       <w:r>
         <w:t>7.2 Selenium + Cucumber (BDD + POM)</w:t>
       </w:r>
@@ -16104,7 +16104,7 @@
       <w:pPr>
         <w:pStyle w:val="Balk2"/>
       </w:pPr>
-      <w:bookmarkStart w:id="28" w:name="_Toc242962120"/>
+      <w:bookmarkStart w:id="28" w:name="_Toc242964454"/>
       <w:r>
         <w:t>7.3 API Otomasyonu (Rest Assured + POJO)</w:t>
       </w:r>
@@ -16193,7 +16193,7 @@
       <w:pPr>
         <w:pStyle w:val="Balk2"/>
       </w:pPr>
-      <w:bookmarkStart w:id="29" w:name="_Toc242962121"/>
+      <w:bookmarkStart w:id="29" w:name="_Toc242964455"/>
       <w:r>
         <w:t>7.4 Veritabanı ve E2E Otomasyonu</w:t>
       </w:r>
@@ -16212,7 +16212,7 @@
       <w:pPr>
         <w:pStyle w:val="Balk1"/>
       </w:pPr>
-      <w:bookmarkStart w:id="30" w:name="_Toc242962122"/>
+      <w:bookmarkStart w:id="30" w:name="_Toc242964456"/>
       <w:r>
         <w:t>8. Giriş, Çıkış ve Askıya Alma Kriterleri</w:t>
       </w:r>
@@ -16222,7 +16222,7 @@
       <w:pPr>
         <w:pStyle w:val="Balk2"/>
       </w:pPr>
-      <w:bookmarkStart w:id="31" w:name="_Toc242962123"/>
+      <w:bookmarkStart w:id="31" w:name="_Toc242964457"/>
       <w:r>
         <w:t>8.1 Giriş Kriterleri (Entry Criteria)</w:t>
       </w:r>
@@ -16310,7 +16310,7 @@
       <w:pPr>
         <w:pStyle w:val="Balk2"/>
       </w:pPr>
-      <w:bookmarkStart w:id="32" w:name="_Toc242962124"/>
+      <w:bookmarkStart w:id="32" w:name="_Toc242964458"/>
       <w:r>
         <w:t>8.2 Çıkış Kriterleri (Exit Criteria)</w:t>
       </w:r>
@@ -16398,7 +16398,7 @@
       <w:pPr>
         <w:pStyle w:val="Balk2"/>
       </w:pPr>
-      <w:bookmarkStart w:id="33" w:name="_Toc242962125"/>
+      <w:bookmarkStart w:id="33" w:name="_Toc242964459"/>
       <w:r>
         <w:t>8.3 Askıya Alma ve Devam Kriterleri</w:t>
       </w:r>
@@ -16659,7 +16659,7 @@
       <w:pPr>
         <w:pStyle w:val="Balk1"/>
       </w:pPr>
-      <w:bookmarkStart w:id="34" w:name="_Toc242962126"/>
+      <w:bookmarkStart w:id="34" w:name="_Toc242964460"/>
       <w:r>
         <w:t>9. Test Case Yazım Standartları</w:t>
       </w:r>
@@ -17394,7 +17394,7 @@
       <w:pPr>
         <w:pStyle w:val="Balk1"/>
       </w:pPr>
-      <w:bookmarkStart w:id="35" w:name="_Toc242962127"/>
+      <w:bookmarkStart w:id="35" w:name="_Toc242964461"/>
       <w:r>
         <w:t>10. JIRA ve Xray Yapılandırması</w:t>
       </w:r>
@@ -18113,7 +18113,7 @@
       <w:pPr>
         <w:pStyle w:val="Balk1"/>
       </w:pPr>
-      <w:bookmarkStart w:id="36" w:name="_Toc242962128"/>
+      <w:bookmarkStart w:id="36" w:name="_Toc242964462"/>
       <w:r>
         <w:t>11. Hata Yönetimi</w:t>
       </w:r>
@@ -18123,7 +18123,7 @@
       <w:pPr>
         <w:pStyle w:val="Balk2"/>
       </w:pPr>
-      <w:bookmarkStart w:id="37" w:name="_Toc242962129"/>
+      <w:bookmarkStart w:id="37" w:name="_Toc242964463"/>
       <w:r>
         <w:t>11.1 Hata Yaşam Döngüsü</w:t>
       </w:r>
@@ -18142,7 +18142,7 @@
       <w:pPr>
         <w:pStyle w:val="Balk2"/>
       </w:pPr>
-      <w:bookmarkStart w:id="38" w:name="_Toc242962130"/>
+      <w:bookmarkStart w:id="38" w:name="_Toc242964464"/>
       <w:r>
         <w:t>11.2 Severity (Ciddiyet) Tanımları</w:t>
       </w:r>
@@ -18681,7 +18681,7 @@
       <w:pPr>
         <w:pStyle w:val="Balk2"/>
       </w:pPr>
-      <w:bookmarkStart w:id="39" w:name="_Toc242962131"/>
+      <w:bookmarkStart w:id="39" w:name="_Toc242964465"/>
       <w:r>
         <w:t>11.3 Priority (Öncelik) Tanımları</w:t>
       </w:r>
@@ -18942,7 +18942,7 @@
       <w:pPr>
         <w:pStyle w:val="Balk2"/>
       </w:pPr>
-      <w:bookmarkStart w:id="40" w:name="_Toc242962132"/>
+      <w:bookmarkStart w:id="40" w:name="_Toc242964466"/>
       <w:r>
         <w:t>11.4 Bug Ticket Şablonu</w:t>
       </w:r>
@@ -19595,7 +19595,7 @@
       <w:pPr>
         <w:pStyle w:val="Balk1"/>
       </w:pPr>
-      <w:bookmarkStart w:id="41" w:name="_Toc242962133"/>
+      <w:bookmarkStart w:id="41" w:name="_Toc242964467"/>
       <w:r>
         <w:t>12. Ön Analiz Bulguları</w:t>
       </w:r>
@@ -20529,7 +20529,7 @@
       <w:pPr>
         <w:pStyle w:val="Balk1"/>
       </w:pPr>
-      <w:bookmarkStart w:id="42" w:name="_Toc242962134"/>
+      <w:bookmarkStart w:id="42" w:name="_Toc242964468"/>
       <w:r>
         <w:t>13. Takvim ve Sprint Planı</w:t>
       </w:r>
@@ -21133,7 +21133,7 @@
       <w:pPr>
         <w:pStyle w:val="Balk1"/>
       </w:pPr>
-      <w:bookmarkStart w:id="43" w:name="_Toc242962135"/>
+      <w:bookmarkStart w:id="43" w:name="_Toc242964469"/>
       <w:r>
         <w:t>14. Roller ve Sorumluluklar</w:t>
       </w:r>
@@ -21506,7 +21506,7 @@
       <w:pPr>
         <w:pStyle w:val="Balk1"/>
       </w:pPr>
-      <w:bookmarkStart w:id="44" w:name="_Toc242962136"/>
+      <w:bookmarkStart w:id="44" w:name="_Toc242964470"/>
       <w:r>
         <w:t>15. Riskler ve Önlemler</w:t>
       </w:r>
@@ -22321,7 +22321,7 @@
       <w:pPr>
         <w:pStyle w:val="Balk1"/>
       </w:pPr>
-      <w:bookmarkStart w:id="45" w:name="_Toc242962137"/>
+      <w:bookmarkStart w:id="45" w:name="_Toc242964471"/>
       <w:r>
         <w:t>16. Teslimatlar</w:t>
       </w:r>
@@ -23275,7 +23275,7 @@
       <w:pPr>
         <w:pStyle w:val="Balk1"/>
       </w:pPr>
-      <w:bookmarkStart w:id="46" w:name="_Toc242962138"/>
+      <w:bookmarkStart w:id="46" w:name="_Toc242964472"/>
       <w:r>
         <w:t>17. Test Özet Raporu (Koşum Sonuçları)</w:t>
       </w:r>
@@ -23294,7 +23294,7 @@
       <w:pPr>
         <w:pStyle w:val="Balk2"/>
       </w:pPr>
-      <w:bookmarkStart w:id="47" w:name="_Toc242962139"/>
+      <w:bookmarkStart w:id="47" w:name="_Toc242964473"/>
       <w:r>
         <w:t>17.1 Manuel Koşum Özeti</w:t>
       </w:r>
@@ -25060,7 +25060,7 @@
                 <w:sz w:val="19"/>
                 <w:szCs w:val="19"/>
               </w:rPr>
-              <w:t>5</w:t>
+              <w:t>4</w:t>
             </w:r>
           </w:p>
         </w:tc>
@@ -25087,7 +25087,7 @@
                 <w:sz w:val="19"/>
                 <w:szCs w:val="19"/>
               </w:rPr>
-              <w:t>0</w:t>
+              <w:t>1</w:t>
             </w:r>
           </w:p>
         </w:tc>
@@ -25224,7 +25224,7 @@
                 <w:sz w:val="19"/>
                 <w:szCs w:val="19"/>
               </w:rPr>
-              <w:t>4</w:t>
+              <w:t>3</w:t>
             </w:r>
           </w:p>
         </w:tc>
@@ -25251,7 +25251,7 @@
                 <w:sz w:val="19"/>
                 <w:szCs w:val="19"/>
               </w:rPr>
-              <w:t>1</w:t>
+              <w:t>2</w:t>
             </w:r>
           </w:p>
         </w:tc>
@@ -25552,7 +25552,7 @@
                 <w:sz w:val="19"/>
                 <w:szCs w:val="19"/>
               </w:rPr>
-              <w:t>4</w:t>
+              <w:t>2</w:t>
             </w:r>
           </w:p>
         </w:tc>
@@ -25579,7 +25579,7 @@
                 <w:sz w:val="19"/>
                 <w:szCs w:val="19"/>
               </w:rPr>
-              <w:t>0</w:t>
+              <w:t>2</w:t>
             </w:r>
           </w:p>
         </w:tc>
@@ -26208,7 +26208,7 @@
                 <w:sz w:val="19"/>
                 <w:szCs w:val="19"/>
               </w:rPr>
-              <w:t>5</w:t>
+              <w:t>2</w:t>
             </w:r>
           </w:p>
         </w:tc>
@@ -26235,7 +26235,7 @@
                 <w:sz w:val="19"/>
                 <w:szCs w:val="19"/>
               </w:rPr>
-              <w:t>1</w:t>
+              <w:t>4</w:t>
             </w:r>
           </w:p>
         </w:tc>
@@ -26864,7 +26864,7 @@
                 <w:sz w:val="19"/>
                 <w:szCs w:val="19"/>
               </w:rPr>
-              <w:t>6</w:t>
+              <w:t>5</w:t>
             </w:r>
           </w:p>
         </w:tc>
@@ -26891,7 +26891,7 @@
                 <w:sz w:val="19"/>
                 <w:szCs w:val="19"/>
               </w:rPr>
-              <w:t>3</w:t>
+              <w:t>4</w:t>
             </w:r>
           </w:p>
         </w:tc>
@@ -27028,7 +27028,7 @@
                 <w:sz w:val="19"/>
                 <w:szCs w:val="19"/>
               </w:rPr>
-              <w:t>128</w:t>
+              <w:t>120</w:t>
             </w:r>
           </w:p>
         </w:tc>
@@ -27055,7 +27055,7 @@
                 <w:sz w:val="19"/>
                 <w:szCs w:val="19"/>
               </w:rPr>
-              <w:t>64</w:t>
+              <w:t>72</w:t>
             </w:r>
           </w:p>
         </w:tc>
@@ -27121,7 +27121,7 @@
         <w:jc w:val="both"/>
       </w:pPr>
       <w:r>
-        <w:t>Koşulan test case oranı: %100 — Başarı oranı (PASSED / koşulan): %67.</w:t>
+        <w:t>Koşulan test case oranı: %100 — Başarı oranı (PASSED / koşulan): %63.</w:t>
       </w:r>
     </w:p>
     <w:p>
@@ -27161,7 +27161,10 @@
         <w:t xml:space="preserve">Kapsam: </w:t>
       </w:r>
       <w:r>
-        <w:t>192 test case’in tamamı koşulmuştur (BLOCKED / NOT RUN kalmamıştır). Şifre girişi ve paylaşımlı veride kalıcı değişiklik gerektiren senaryolar (admin kayıt/giriş, kullanıcı/admin silme, sipariş statüsü değişimi, mesaj silme) test eden tarafından koşulmuştur. Arayüzden sipariş oluşturulamadığı için (SCRUM-232) statü senaryoları mevcut Order #2 üzerinden yürütülmüştür.</w:t>
+        <w:t>192 test case’in tamamı koşulmuştur (BLOCKED / NOT RUN kalmamıştır). Sonuçlar, her test case’in kendi beklenen sonucuna göre değerlendirilmiş; beklenen başarı/bilgilendirme mesajı görüntülenmeyen veya beklenen bilgi alanı bulunmayan durumlar FAILED olarak işaretlenip bug kaydına bağlanmıştır. Şifre girişi ve paylaşımlı veride kalıcı değişiklik gerektiren senaryolar (admin kayıt/giriş, kullanıcı/admin silme, sipariş statüsü değişimi, mesaj silme) test eden tarafından koşulmuştur. Arayüzden sipariş oluşturula</w:t>
+      </w:r>
+      <w:r>
+        <w:t>madığı için (SCRUM-232) statü senaryoları mevcut Order #2 üzerinden yürütülmüştür.</w:t>
       </w:r>
     </w:p>
     <w:p>
@@ -27188,7 +27191,7 @@
       <w:pPr>
         <w:pStyle w:val="Balk2"/>
       </w:pPr>
-      <w:bookmarkStart w:id="48" w:name="_Toc242962140"/>
+      <w:bookmarkStart w:id="48" w:name="_Toc242964474"/>
       <w:r>
         <w:t>17.2 Otomasyon Koşum Özeti</w:t>
       </w:r>
@@ -27819,7 +27822,7 @@
       <w:pPr>
         <w:pStyle w:val="Balk2"/>
       </w:pPr>
-      <w:bookmarkStart w:id="49" w:name="_Toc242962141"/>
+      <w:bookmarkStart w:id="49" w:name="_Toc242964475"/>
       <w:r>
         <w:t>17.3 Bulunan Hatalar (JIRA – SCRUM)</w:t>
       </w:r>
@@ -27839,10 +27842,10 @@
         <w:tblLook w:val="04A0" w:firstRow="1" w:lastRow="0" w:firstColumn="1" w:lastColumn="0" w:noHBand="0" w:noVBand="1"/>
       </w:tblPr>
       <w:tblGrid>
-        <w:gridCol w:w="1300"/>
-        <w:gridCol w:w="1100"/>
-        <w:gridCol w:w="1100"/>
-        <w:gridCol w:w="6138"/>
+        <w:gridCol w:w="1288"/>
+        <w:gridCol w:w="1093"/>
+        <w:gridCol w:w="1229"/>
+        <w:gridCol w:w="6028"/>
       </w:tblGrid>
       <w:tr>
         <w:trPr>
@@ -33465,6 +33468,336 @@
                 <w:szCs w:val="19"/>
               </w:rPr>
               <w:t>Ana admin (admin@example.com) silinmeye karşı korunmuyor</w:t>
+            </w:r>
+          </w:p>
+        </w:tc>
+      </w:tr>
+      <w:tr>
+        <w:tc>
+          <w:tcPr>
+            <w:tcW w:w="1300" w:type="dxa"/>
+            <w:tcBorders>
+              <w:top w:val="single" w:sz="4" w:space="0" w:color="8EA9DB"/>
+              <w:left w:val="single" w:sz="4" w:space="0" w:color="8EA9DB"/>
+              <w:bottom w:val="single" w:sz="4" w:space="0" w:color="8EA9DB"/>
+              <w:right w:val="single" w:sz="4" w:space="0" w:color="8EA9DB"/>
+            </w:tcBorders>
+            <w:tcMar>
+              <w:top w:w="60" w:type="dxa"/>
+              <w:left w:w="100" w:type="dxa"/>
+              <w:bottom w:w="60" w:type="dxa"/>
+              <w:right w:w="100" w:type="dxa"/>
+            </w:tcMar>
+            <w:vAlign w:val="center"/>
+          </w:tcPr>
+          <w:p>
+            <w:r>
+              <w:rPr>
+                <w:sz w:val="19"/>
+                <w:szCs w:val="19"/>
+              </w:rPr>
+              <w:t>SCRUM-273</w:t>
+            </w:r>
+          </w:p>
+        </w:tc>
+        <w:tc>
+          <w:tcPr>
+            <w:tcW w:w="1100" w:type="dxa"/>
+            <w:tcBorders>
+              <w:top w:val="single" w:sz="4" w:space="0" w:color="8EA9DB"/>
+              <w:left w:val="single" w:sz="4" w:space="0" w:color="8EA9DB"/>
+              <w:bottom w:val="single" w:sz="4" w:space="0" w:color="8EA9DB"/>
+              <w:right w:val="single" w:sz="4" w:space="0" w:color="8EA9DB"/>
+            </w:tcBorders>
+            <w:tcMar>
+              <w:top w:w="60" w:type="dxa"/>
+              <w:left w:w="100" w:type="dxa"/>
+              <w:bottom w:w="60" w:type="dxa"/>
+              <w:right w:w="100" w:type="dxa"/>
+            </w:tcMar>
+            <w:vAlign w:val="center"/>
+          </w:tcPr>
+          <w:p>
+            <w:r>
+              <w:rPr>
+                <w:sz w:val="19"/>
+                <w:szCs w:val="19"/>
+              </w:rPr>
+              <w:t>Low</w:t>
+            </w:r>
+          </w:p>
+        </w:tc>
+        <w:tc>
+          <w:tcPr>
+            <w:tcW w:w="1100" w:type="dxa"/>
+            <w:tcBorders>
+              <w:top w:val="single" w:sz="4" w:space="0" w:color="8EA9DB"/>
+              <w:left w:val="single" w:sz="4" w:space="0" w:color="8EA9DB"/>
+              <w:bottom w:val="single" w:sz="4" w:space="0" w:color="8EA9DB"/>
+              <w:right w:val="single" w:sz="4" w:space="0" w:color="8EA9DB"/>
+            </w:tcBorders>
+            <w:tcMar>
+              <w:top w:w="60" w:type="dxa"/>
+              <w:left w:w="100" w:type="dxa"/>
+              <w:bottom w:w="60" w:type="dxa"/>
+              <w:right w:w="100" w:type="dxa"/>
+            </w:tcMar>
+            <w:vAlign w:val="center"/>
+          </w:tcPr>
+          <w:p>
+            <w:r>
+              <w:rPr>
+                <w:sz w:val="19"/>
+                <w:szCs w:val="19"/>
+              </w:rPr>
+              <w:t>US_10/11/17</w:t>
+            </w:r>
+          </w:p>
+        </w:tc>
+        <w:tc>
+          <w:tcPr>
+            <w:tcW w:w="6138" w:type="dxa"/>
+            <w:tcBorders>
+              <w:top w:val="single" w:sz="4" w:space="0" w:color="8EA9DB"/>
+              <w:left w:val="single" w:sz="4" w:space="0" w:color="8EA9DB"/>
+              <w:bottom w:val="single" w:sz="4" w:space="0" w:color="8EA9DB"/>
+              <w:right w:val="single" w:sz="4" w:space="0" w:color="8EA9DB"/>
+            </w:tcBorders>
+            <w:tcMar>
+              <w:top w:w="60" w:type="dxa"/>
+              <w:left w:w="100" w:type="dxa"/>
+              <w:bottom w:w="60" w:type="dxa"/>
+              <w:right w:w="100" w:type="dxa"/>
+            </w:tcMar>
+            <w:vAlign w:val="center"/>
+          </w:tcPr>
+          <w:p>
+            <w:r>
+              <w:rPr>
+                <w:sz w:val="19"/>
+                <w:szCs w:val="19"/>
+              </w:rPr>
+              <w:t>Kullanıcı/admin silme ve kategori ekleme/silmede başarı mesajı yok</w:t>
+            </w:r>
+          </w:p>
+        </w:tc>
+      </w:tr>
+      <w:tr>
+        <w:tc>
+          <w:tcPr>
+            <w:tcW w:w="1300" w:type="dxa"/>
+            <w:tcBorders>
+              <w:top w:val="single" w:sz="4" w:space="0" w:color="8EA9DB"/>
+              <w:left w:val="single" w:sz="4" w:space="0" w:color="8EA9DB"/>
+              <w:bottom w:val="single" w:sz="4" w:space="0" w:color="8EA9DB"/>
+              <w:right w:val="single" w:sz="4" w:space="0" w:color="8EA9DB"/>
+            </w:tcBorders>
+            <w:tcMar>
+              <w:top w:w="60" w:type="dxa"/>
+              <w:left w:w="100" w:type="dxa"/>
+              <w:bottom w:w="60" w:type="dxa"/>
+              <w:right w:w="100" w:type="dxa"/>
+            </w:tcMar>
+            <w:vAlign w:val="center"/>
+          </w:tcPr>
+          <w:p>
+            <w:r>
+              <w:rPr>
+                <w:sz w:val="19"/>
+                <w:szCs w:val="19"/>
+              </w:rPr>
+              <w:t>SCRUM-274</w:t>
+            </w:r>
+          </w:p>
+        </w:tc>
+        <w:tc>
+          <w:tcPr>
+            <w:tcW w:w="1100" w:type="dxa"/>
+            <w:tcBorders>
+              <w:top w:val="single" w:sz="4" w:space="0" w:color="8EA9DB"/>
+              <w:left w:val="single" w:sz="4" w:space="0" w:color="8EA9DB"/>
+              <w:bottom w:val="single" w:sz="4" w:space="0" w:color="8EA9DB"/>
+              <w:right w:val="single" w:sz="4" w:space="0" w:color="8EA9DB"/>
+            </w:tcBorders>
+            <w:tcMar>
+              <w:top w:w="60" w:type="dxa"/>
+              <w:left w:w="100" w:type="dxa"/>
+              <w:bottom w:w="60" w:type="dxa"/>
+              <w:right w:w="100" w:type="dxa"/>
+            </w:tcMar>
+            <w:vAlign w:val="center"/>
+          </w:tcPr>
+          <w:p>
+            <w:r>
+              <w:rPr>
+                <w:sz w:val="19"/>
+                <w:szCs w:val="19"/>
+              </w:rPr>
+              <w:t>Low</w:t>
+            </w:r>
+          </w:p>
+        </w:tc>
+        <w:tc>
+          <w:tcPr>
+            <w:tcW w:w="1100" w:type="dxa"/>
+            <w:tcBorders>
+              <w:top w:val="single" w:sz="4" w:space="0" w:color="8EA9DB"/>
+              <w:left w:val="single" w:sz="4" w:space="0" w:color="8EA9DB"/>
+              <w:bottom w:val="single" w:sz="4" w:space="0" w:color="8EA9DB"/>
+              <w:right w:val="single" w:sz="4" w:space="0" w:color="8EA9DB"/>
+            </w:tcBorders>
+            <w:tcMar>
+              <w:top w:w="60" w:type="dxa"/>
+              <w:left w:w="100" w:type="dxa"/>
+              <w:bottom w:w="60" w:type="dxa"/>
+              <w:right w:w="100" w:type="dxa"/>
+            </w:tcMar>
+            <w:vAlign w:val="center"/>
+          </w:tcPr>
+          <w:p>
+            <w:r>
+              <w:rPr>
+                <w:sz w:val="19"/>
+                <w:szCs w:val="19"/>
+              </w:rPr>
+              <w:t>US_13/17/21</w:t>
+            </w:r>
+          </w:p>
+        </w:tc>
+        <w:tc>
+          <w:tcPr>
+            <w:tcW w:w="6138" w:type="dxa"/>
+            <w:tcBorders>
+              <w:top w:val="single" w:sz="4" w:space="0" w:color="8EA9DB"/>
+              <w:left w:val="single" w:sz="4" w:space="0" w:color="8EA9DB"/>
+              <w:bottom w:val="single" w:sz="4" w:space="0" w:color="8EA9DB"/>
+              <w:right w:val="single" w:sz="4" w:space="0" w:color="8EA9DB"/>
+            </w:tcBorders>
+            <w:tcMar>
+              <w:top w:w="60" w:type="dxa"/>
+              <w:left w:w="100" w:type="dxa"/>
+              <w:bottom w:w="60" w:type="dxa"/>
+              <w:right w:w="100" w:type="dxa"/>
+            </w:tcMar>
+            <w:vAlign w:val="center"/>
+          </w:tcPr>
+          <w:p>
+            <w:r>
+              <w:rPr>
+                <w:sz w:val="19"/>
+                <w:szCs w:val="19"/>
+              </w:rPr>
+              <w:t>Admin liste ekranlarında beklenen kolonlar eksik (indirim/durum, açıklama, tarih)</w:t>
+            </w:r>
+          </w:p>
+        </w:tc>
+      </w:tr>
+      <w:tr>
+        <w:tc>
+          <w:tcPr>
+            <w:tcW w:w="1300" w:type="dxa"/>
+            <w:tcBorders>
+              <w:top w:val="single" w:sz="4" w:space="0" w:color="8EA9DB"/>
+              <w:left w:val="single" w:sz="4" w:space="0" w:color="8EA9DB"/>
+              <w:bottom w:val="single" w:sz="4" w:space="0" w:color="8EA9DB"/>
+              <w:right w:val="single" w:sz="4" w:space="0" w:color="8EA9DB"/>
+            </w:tcBorders>
+            <w:tcMar>
+              <w:top w:w="60" w:type="dxa"/>
+              <w:left w:w="100" w:type="dxa"/>
+              <w:bottom w:w="60" w:type="dxa"/>
+              <w:right w:w="100" w:type="dxa"/>
+            </w:tcMar>
+            <w:vAlign w:val="center"/>
+          </w:tcPr>
+          <w:p>
+            <w:r>
+              <w:rPr>
+                <w:sz w:val="19"/>
+                <w:szCs w:val="19"/>
+              </w:rPr>
+              <w:t>SCRUM-275</w:t>
+            </w:r>
+          </w:p>
+        </w:tc>
+        <w:tc>
+          <w:tcPr>
+            <w:tcW w:w="1100" w:type="dxa"/>
+            <w:tcBorders>
+              <w:top w:val="single" w:sz="4" w:space="0" w:color="8EA9DB"/>
+              <w:left w:val="single" w:sz="4" w:space="0" w:color="8EA9DB"/>
+              <w:bottom w:val="single" w:sz="4" w:space="0" w:color="8EA9DB"/>
+              <w:right w:val="single" w:sz="4" w:space="0" w:color="8EA9DB"/>
+            </w:tcBorders>
+            <w:tcMar>
+              <w:top w:w="60" w:type="dxa"/>
+              <w:left w:w="100" w:type="dxa"/>
+              <w:bottom w:w="60" w:type="dxa"/>
+              <w:right w:w="100" w:type="dxa"/>
+            </w:tcMar>
+            <w:vAlign w:val="center"/>
+          </w:tcPr>
+          <w:p>
+            <w:r>
+              <w:rPr>
+                <w:sz w:val="19"/>
+                <w:szCs w:val="19"/>
+              </w:rPr>
+              <w:t>Low</w:t>
+            </w:r>
+          </w:p>
+        </w:tc>
+        <w:tc>
+          <w:tcPr>
+            <w:tcW w:w="1100" w:type="dxa"/>
+            <w:tcBorders>
+              <w:top w:val="single" w:sz="4" w:space="0" w:color="8EA9DB"/>
+              <w:left w:val="single" w:sz="4" w:space="0" w:color="8EA9DB"/>
+              <w:bottom w:val="single" w:sz="4" w:space="0" w:color="8EA9DB"/>
+              <w:right w:val="single" w:sz="4" w:space="0" w:color="8EA9DB"/>
+            </w:tcBorders>
+            <w:tcMar>
+              <w:top w:w="60" w:type="dxa"/>
+              <w:left w:w="100" w:type="dxa"/>
+              <w:bottom w:w="60" w:type="dxa"/>
+              <w:right w:w="100" w:type="dxa"/>
+            </w:tcMar>
+            <w:vAlign w:val="center"/>
+          </w:tcPr>
+          <w:p>
+            <w:r>
+              <w:rPr>
+                <w:sz w:val="19"/>
+                <w:szCs w:val="19"/>
+              </w:rPr>
+              <w:t>US_13</w:t>
+            </w:r>
+          </w:p>
+        </w:tc>
+        <w:tc>
+          <w:tcPr>
+            <w:tcW w:w="6138" w:type="dxa"/>
+            <w:tcBorders>
+              <w:top w:val="single" w:sz="4" w:space="0" w:color="8EA9DB"/>
+              <w:left w:val="single" w:sz="4" w:space="0" w:color="8EA9DB"/>
+              <w:bottom w:val="single" w:sz="4" w:space="0" w:color="8EA9DB"/>
+              <w:right w:val="single" w:sz="4" w:space="0" w:color="8EA9DB"/>
+            </w:tcBorders>
+            <w:tcMar>
+              <w:top w:w="60" w:type="dxa"/>
+              <w:left w:w="100" w:type="dxa"/>
+              <w:bottom w:w="60" w:type="dxa"/>
+              <w:right w:w="100" w:type="dxa"/>
+            </w:tcMar>
+            <w:vAlign w:val="center"/>
+          </w:tcPr>
+          <w:p>
+            <w:r>
+              <w:rPr>
+                <w:sz w:val="19"/>
+                <w:szCs w:val="19"/>
+              </w:rPr>
+              <w:t>Admin ürün aramasında sonuç yokken bilgilendirme mesajı yok</w:t>
             </w:r>
           </w:p>
         </w:tc>
@@ -33476,14 +33809,14 @@
         <w:jc w:val="both"/>
       </w:pPr>
       <w:r>
-        <w:t>Toplam 50 bug kaydı açılmıştır. Kritik (Highest) bulgular: arayüzden sipariş oluşturulamaması (SCRUM-232), admin uç noktalarının kimlik doğrulamasız erişilebilmesi (SCRUM-244) ve kullanıcı yanıtında şifre hash’inin dönmesi (SCRUM-248).</w:t>
+        <w:t>Toplam 53 bug kaydı açılmıştır. Kritik (Highest) bulgular: arayüzden sipariş oluşturulamaması (SCRUM-232), admin uç noktalarının kimlik doğrulamasız erişilebilmesi (SCRUM-244) ve kullanıcı yanıtında şifre hash’inin dönmesi (SCRUM-248).</w:t>
       </w:r>
     </w:p>
     <w:p>
       <w:pPr>
         <w:pStyle w:val="Balk2"/>
       </w:pPr>
-      <w:bookmarkStart w:id="50" w:name="_Toc242962142"/>
+      <w:bookmarkStart w:id="50" w:name="_Toc242964476"/>
       <w:r>
         <w:t>17.4 Teslimat Konumları</w:t>
       </w:r>
@@ -33800,7 +34133,7 @@
       <w:pPr>
         <w:pStyle w:val="Balk2"/>
       </w:pPr>
-      <w:bookmarkStart w:id="51" w:name="_Toc242962143"/>
+      <w:bookmarkStart w:id="51" w:name="_Toc242964477"/>
       <w:r>
         <w:t>17.5 Sonuç ve Öneriler</w:t>
       </w:r>
@@ -33901,7 +34234,7 @@
       <w:pPr>
         <w:pStyle w:val="Balk1"/>
       </w:pPr>
-      <w:bookmarkStart w:id="52" w:name="_Toc242962144"/>
+      <w:bookmarkStart w:id="52" w:name="_Toc242964478"/>
       <w:r>
         <w:t>18. Onay</w:t>
       </w:r>
@@ -34423,10 +34756,10 @@
 <file path=word/numbering.xml><?xml version="1.0" encoding="utf-8"?>
 <w:numbering xmlns:wpc="http://schemas.microsoft.com/office/word/2010/wordprocessingCanvas" xmlns:cx="http://schemas.microsoft.com/office/drawing/2014/chartex" xmlns:cx1="http://schemas.microsoft.com/office/drawing/2015/9/8/chartex" xmlns:cx2="http://schemas.microsoft.com/office/drawing/2015/10/21/chartex" xmlns:cx3="http://schemas.microsoft.com/office/drawing/2016/5/9/chartex" xmlns:cx4="http://schemas.microsoft.com/office/drawing/2016/5/10/chartex" xmlns:cx5="http://schemas.microsoft.com/office/drawing/2016/5/11/chartex" xmlns:cx6="http://schemas.microsoft.com/office/drawing/2016/5/12/chartex" xmlns:cx7="http://schemas.microsoft.com/office/drawing/2016/5/13/chartex" xmlns:cx8="http://schemas.microsoft.com/office/drawing/2016/5/14/chartex" xmlns:mc="http://schemas.openxmlformats.org/markup-compatibility/2006" xmlns:aink="http://schemas.microsoft.com/office/drawing/2016/ink" xmlns:am3d="http://schemas.microsoft.com/office/drawing/2017/model3d" xmlns:o="urn:schemas-microsoft-com:office:office" xmlns:oel="http://schemas.microsoft.com/office/2019/extlst" xmlns:r="http://schemas.openxmlformats.org/officeDocument/2006/relationships" xmlns:m="http://schemas.openxmlformats.org/officeDocument/2006/math" xmlns:v="urn:schemas-microsoft-com:vml" xmlns:wp14="http://schemas.microsoft.com/office/word/2010/wordprocessingDrawing" xmlns:wp="http://schemas.openxmlformats.org/drawingml/2006/wordprocessingDrawing" xmlns:w10="urn:schemas-microsoft-com:office:word" xmlns:w="http://schemas.openxmlformats.org/wordprocessingml/2006/main" xmlns:w14="http://schemas.microsoft.com/office/word/2010/wordml" xmlns:w15="http://schemas.microsoft.com/office/word/2012/wordml" xmlns:w16cex="http://schemas.microsoft.com/office/word/2018/wordml/cex" xmlns:w16cid="http://schemas.microsoft.com/office/word/2016/wordml/cid" xmlns:w16="http://schemas.microsoft.com/office/word/2018/wordml" xmlns:w16du="http://schemas.microsoft.com/office/word/2023/wordml/word16du" xmlns:w16sdtdh="http://schemas.microsoft.com/office/word/2020/wordml/sdtdatahash" xmlns:w16sdtfl="http://schemas.microsoft.com/office/word/2024/wordml/sdtformatlock" xmlns:w16se="http://schemas.microsoft.com/office/word/2015/wordml/symex" xmlns:wpg="http://schemas.microsoft.com/office/word/2010/wordprocessingGroup" xmlns:wpi="http://schemas.microsoft.com/office/word/2010/wordprocessingInk" xmlns:wne="http://schemas.microsoft.com/office/word/2006/wordml" xmlns:wps="http://schemas.microsoft.com/office/word/2010/wordprocessingShape" mc:Ignorable="w14 w15 w16se w16cid w16 w16cex w16sdtdh w16sdtfl w16du wp14">
   <w:abstractNum w:abstractNumId="0" w15:restartNumberingAfterBreak="0">
-    <w:nsid w:val="16F55899"/>
+    <w:nsid w:val="06940FE4"/>
     <w:multiLevelType w:val="hybridMultilevel"/>
-    <w:tmpl w:val="3766A1EA"/>
-    <w:lvl w:ilvl="0" w:tplc="279A9476" w:tentative="1">
+    <w:tmpl w:val="AE22FE7A"/>
+    <w:lvl w:ilvl="0" w:tplc="37925B26" w:tentative="1">
       <w:start w:val="1"/>
       <w:numFmt w:val="decimal"/>
       <w:lvlText w:val="%1."/>
@@ -34435,106 +34768,110 @@
         <w:ind w:left="720" w:hanging="360"/>
       </w:pPr>
     </w:lvl>
-    <w:lvl w:ilvl="1" w:tplc="FDCAF298">
+    <w:lvl w:ilvl="1" w:tplc="15A243F4">
       <w:numFmt w:val="decimal"/>
       <w:lvlText w:val=""/>
       <w:lvlJc w:val="left"/>
     </w:lvl>
-    <w:lvl w:ilvl="2" w:tplc="703E6E44">
+    <w:lvl w:ilvl="2" w:tplc="6DC82D1A">
       <w:numFmt w:val="decimal"/>
       <w:lvlText w:val=""/>
       <w:lvlJc w:val="left"/>
     </w:lvl>
-    <w:lvl w:ilvl="3" w:tplc="7DFCC390">
+    <w:lvl w:ilvl="3" w:tplc="B88420AA">
       <w:numFmt w:val="decimal"/>
       <w:lvlText w:val=""/>
       <w:lvlJc w:val="left"/>
     </w:lvl>
-    <w:lvl w:ilvl="4" w:tplc="01BCF6F2">
+    <w:lvl w:ilvl="4" w:tplc="94EA5BFA">
       <w:numFmt w:val="decimal"/>
       <w:lvlText w:val=""/>
       <w:lvlJc w:val="left"/>
     </w:lvl>
-    <w:lvl w:ilvl="5" w:tplc="46A44E82">
+    <w:lvl w:ilvl="5" w:tplc="E9A4F948">
       <w:numFmt w:val="decimal"/>
       <w:lvlText w:val=""/>
       <w:lvlJc w:val="left"/>
     </w:lvl>
-    <w:lvl w:ilvl="6" w:tplc="3B2A1D80">
+    <w:lvl w:ilvl="6" w:tplc="EFA2D476">
       <w:numFmt w:val="decimal"/>
       <w:lvlText w:val=""/>
       <w:lvlJc w:val="left"/>
     </w:lvl>
-    <w:lvl w:ilvl="7" w:tplc="26A286B4">
+    <w:lvl w:ilvl="7" w:tplc="2D6002AE">
       <w:numFmt w:val="decimal"/>
       <w:lvlText w:val=""/>
       <w:lvlJc w:val="left"/>
     </w:lvl>
-    <w:lvl w:ilvl="8" w:tplc="4732BE62">
+    <w:lvl w:ilvl="8" w:tplc="36DE70FA">
       <w:numFmt w:val="decimal"/>
       <w:lvlText w:val=""/>
       <w:lvlJc w:val="left"/>
     </w:lvl>
   </w:abstractNum>
   <w:abstractNum w:abstractNumId="1" w15:restartNumberingAfterBreak="0">
-    <w:nsid w:val="2FA51A1A"/>
+    <w:nsid w:val="218A5B27"/>
     <w:multiLevelType w:val="hybridMultilevel"/>
-    <w:tmpl w:val="37C607D0"/>
-    <w:lvl w:ilvl="0" w:tplc="39B09448" w:tentative="1">
+    <w:tmpl w:val="6DB64362"/>
+    <w:lvl w:ilvl="0" w:tplc="82B286C8">
       <w:start w:val="1"/>
-      <w:numFmt w:val="decimal"/>
-      <w:lvlText w:val="%1."/>
+      <w:numFmt w:val="bullet"/>
+      <w:lvlText w:val="•"/>
       <w:lvlJc w:val="left"/>
       <w:pPr>
         <w:ind w:left="720" w:hanging="360"/>
       </w:pPr>
     </w:lvl>
-    <w:lvl w:ilvl="1" w:tplc="1ABE6146">
+    <w:lvl w:ilvl="1" w:tplc="22A4397E" w:tentative="1">
+      <w:start w:val="1"/>
+      <w:numFmt w:val="bullet"/>
+      <w:lvlText w:val="◦"/>
+      <w:lvlJc w:val="left"/>
+      <w:pPr>
+        <w:ind w:left="1440" w:hanging="360"/>
+      </w:pPr>
+    </w:lvl>
+    <w:lvl w:ilvl="2" w:tplc="040A34B4">
       <w:numFmt w:val="decimal"/>
       <w:lvlText w:val=""/>
       <w:lvlJc w:val="left"/>
     </w:lvl>
-    <w:lvl w:ilvl="2" w:tplc="35B2731E">
+    <w:lvl w:ilvl="3" w:tplc="38F0CFEE">
       <w:numFmt w:val="decimal"/>
       <w:lvlText w:val=""/>
       <w:lvlJc w:val="left"/>
     </w:lvl>
-    <w:lvl w:ilvl="3" w:tplc="BC883806">
+    <w:lvl w:ilvl="4" w:tplc="83083EFE">
       <w:numFmt w:val="decimal"/>
       <w:lvlText w:val=""/>
       <w:lvlJc w:val="left"/>
     </w:lvl>
-    <w:lvl w:ilvl="4" w:tplc="C03EC3EE">
+    <w:lvl w:ilvl="5" w:tplc="01AEAB42">
       <w:numFmt w:val="decimal"/>
       <w:lvlText w:val=""/>
       <w:lvlJc w:val="left"/>
     </w:lvl>
-    <w:lvl w:ilvl="5" w:tplc="2EFA8924">
+    <w:lvl w:ilvl="6" w:tplc="7556ECFA">
       <w:numFmt w:val="decimal"/>
       <w:lvlText w:val=""/>
       <w:lvlJc w:val="left"/>
     </w:lvl>
-    <w:lvl w:ilvl="6" w:tplc="CCB2834C">
+    <w:lvl w:ilvl="7" w:tplc="EB166DA6">
       <w:numFmt w:val="decimal"/>
       <w:lvlText w:val=""/>
       <w:lvlJc w:val="left"/>
     </w:lvl>
-    <w:lvl w:ilvl="7" w:tplc="6E94BE7A">
-      <w:numFmt w:val="decimal"/>
-      <w:lvlText w:val=""/>
-      <w:lvlJc w:val="left"/>
-    </w:lvl>
-    <w:lvl w:ilvl="8" w:tplc="DFE88866">
+    <w:lvl w:ilvl="8" w:tplc="10BA0F42">
       <w:numFmt w:val="decimal"/>
       <w:lvlText w:val=""/>
       <w:lvlJc w:val="left"/>
     </w:lvl>
   </w:abstractNum>
   <w:abstractNum w:abstractNumId="2" w15:restartNumberingAfterBreak="0">
-    <w:nsid w:val="30FD11F5"/>
+    <w:nsid w:val="2B077477"/>
     <w:multiLevelType w:val="hybridMultilevel"/>
-    <w:tmpl w:val="C9B0FE58"/>
-    <w:lvl w:ilvl="0" w:tplc="09045E0E" w:tentative="1">
+    <w:tmpl w:val="E59C4E76"/>
+    <w:lvl w:ilvl="0" w:tplc="536E3B20" w:tentative="1">
       <w:start w:val="1"/>
       <w:numFmt w:val="bullet"/>
       <w:lvlText w:val="●"/>
@@ -34543,7 +34880,7 @@
         <w:ind w:left="720" w:hanging="360"/>
       </w:pPr>
     </w:lvl>
-    <w:lvl w:ilvl="1" w:tplc="CECCE5CA" w:tentative="1">
+    <w:lvl w:ilvl="1" w:tplc="AF4810DE" w:tentative="1">
       <w:start w:val="1"/>
       <w:numFmt w:val="bullet"/>
       <w:lvlText w:val="○"/>
@@ -34552,7 +34889,7 @@
         <w:ind w:left="1440" w:hanging="360"/>
       </w:pPr>
     </w:lvl>
-    <w:lvl w:ilvl="2" w:tplc="F63AC296" w:tentative="1">
+    <w:lvl w:ilvl="2" w:tplc="96E68968" w:tentative="1">
       <w:start w:val="1"/>
       <w:numFmt w:val="bullet"/>
       <w:lvlText w:val="■"/>
@@ -34561,7 +34898,7 @@
         <w:ind w:left="2160" w:hanging="360"/>
       </w:pPr>
     </w:lvl>
-    <w:lvl w:ilvl="3" w:tplc="7710FC82" w:tentative="1">
+    <w:lvl w:ilvl="3" w:tplc="EF0C2FA8" w:tentative="1">
       <w:start w:val="1"/>
       <w:numFmt w:val="bullet"/>
       <w:lvlText w:val="●"/>
@@ -34570,7 +34907,7 @@
         <w:ind w:left="2880" w:hanging="360"/>
       </w:pPr>
     </w:lvl>
-    <w:lvl w:ilvl="4" w:tplc="9B4C3FBE" w:tentative="1">
+    <w:lvl w:ilvl="4" w:tplc="BC1E3E30" w:tentative="1">
       <w:start w:val="1"/>
       <w:numFmt w:val="bullet"/>
       <w:lvlText w:val="○"/>
@@ -34579,7 +34916,7 @@
         <w:ind w:left="3600" w:hanging="360"/>
       </w:pPr>
     </w:lvl>
-    <w:lvl w:ilvl="5" w:tplc="C2BA10AE" w:tentative="1">
+    <w:lvl w:ilvl="5" w:tplc="0248CF6C" w:tentative="1">
       <w:start w:val="1"/>
       <w:numFmt w:val="bullet"/>
       <w:lvlText w:val="■"/>
@@ -34588,7 +34925,7 @@
         <w:ind w:left="4320" w:hanging="360"/>
       </w:pPr>
     </w:lvl>
-    <w:lvl w:ilvl="6" w:tplc="4CA0FA16" w:tentative="1">
+    <w:lvl w:ilvl="6" w:tplc="DB027300" w:tentative="1">
       <w:start w:val="1"/>
       <w:numFmt w:val="bullet"/>
       <w:lvlText w:val="●"/>
@@ -34597,7 +34934,7 @@
         <w:ind w:left="5040" w:hanging="360"/>
       </w:pPr>
     </w:lvl>
-    <w:lvl w:ilvl="7" w:tplc="BD1C56EC" w:tentative="1">
+    <w:lvl w:ilvl="7" w:tplc="3C980340" w:tentative="1">
       <w:start w:val="1"/>
       <w:numFmt w:val="bullet"/>
       <w:lvlText w:val="●"/>
@@ -34606,7 +34943,7 @@
         <w:ind w:left="5760" w:hanging="360"/>
       </w:pPr>
     </w:lvl>
-    <w:lvl w:ilvl="8" w:tplc="259C2C9A" w:tentative="1">
+    <w:lvl w:ilvl="8" w:tplc="EF86A296" w:tentative="1">
       <w:start w:val="1"/>
       <w:numFmt w:val="bullet"/>
       <w:lvlText w:val="●"/>
@@ -34617,71 +34954,67 @@
     </w:lvl>
   </w:abstractNum>
   <w:abstractNum w:abstractNumId="3" w15:restartNumberingAfterBreak="0">
-    <w:nsid w:val="757C60F7"/>
+    <w:nsid w:val="6B881B27"/>
     <w:multiLevelType w:val="hybridMultilevel"/>
-    <w:tmpl w:val="446EACD0"/>
-    <w:lvl w:ilvl="0" w:tplc="3EEA2822">
+    <w:tmpl w:val="C254A7C6"/>
+    <w:lvl w:ilvl="0" w:tplc="E0D29E3E" w:tentative="1">
       <w:start w:val="1"/>
-      <w:numFmt w:val="bullet"/>
-      <w:lvlText w:val="•"/>
+      <w:numFmt w:val="decimal"/>
+      <w:lvlText w:val="%1."/>
       <w:lvlJc w:val="left"/>
       <w:pPr>
         <w:ind w:left="720" w:hanging="360"/>
       </w:pPr>
     </w:lvl>
-    <w:lvl w:ilvl="1" w:tplc="199E2ACA" w:tentative="1">
-      <w:start w:val="1"/>
-      <w:numFmt w:val="bullet"/>
-      <w:lvlText w:val="◦"/>
-      <w:lvlJc w:val="left"/>
-      <w:pPr>
-        <w:ind w:left="1440" w:hanging="360"/>
-      </w:pPr>
-    </w:lvl>
-    <w:lvl w:ilvl="2" w:tplc="D85029EE">
+    <w:lvl w:ilvl="1" w:tplc="2612F4AE">
       <w:numFmt w:val="decimal"/>
       <w:lvlText w:val=""/>
       <w:lvlJc w:val="left"/>
     </w:lvl>
-    <w:lvl w:ilvl="3" w:tplc="FABED110">
+    <w:lvl w:ilvl="2" w:tplc="7FC669DA">
       <w:numFmt w:val="decimal"/>
       <w:lvlText w:val=""/>
       <w:lvlJc w:val="left"/>
     </w:lvl>
-    <w:lvl w:ilvl="4" w:tplc="F940CE86">
+    <w:lvl w:ilvl="3" w:tplc="6EB228EA">
       <w:numFmt w:val="decimal"/>
       <w:lvlText w:val=""/>
       <w:lvlJc w:val="left"/>
     </w:lvl>
-    <w:lvl w:ilvl="5" w:tplc="8A1A8EF4">
+    <w:lvl w:ilvl="4" w:tplc="0588ADC0">
       <w:numFmt w:val="decimal"/>
       <w:lvlText w:val=""/>
       <w:lvlJc w:val="left"/>
     </w:lvl>
-    <w:lvl w:ilvl="6" w:tplc="B41877FC">
+    <w:lvl w:ilvl="5" w:tplc="19A66A36">
       <w:numFmt w:val="decimal"/>
       <w:lvlText w:val=""/>
       <w:lvlJc w:val="left"/>
     </w:lvl>
-    <w:lvl w:ilvl="7" w:tplc="7DC8C640">
+    <w:lvl w:ilvl="6" w:tplc="2048ABB2">
       <w:numFmt w:val="decimal"/>
       <w:lvlText w:val=""/>
       <w:lvlJc w:val="left"/>
     </w:lvl>
-    <w:lvl w:ilvl="8" w:tplc="30544C98">
+    <w:lvl w:ilvl="7" w:tplc="7FB602C2">
+      <w:numFmt w:val="decimal"/>
+      <w:lvlText w:val=""/>
+      <w:lvlJc w:val="left"/>
+    </w:lvl>
+    <w:lvl w:ilvl="8" w:tplc="0A7EEC00">
       <w:numFmt w:val="decimal"/>
       <w:lvlText w:val=""/>
       <w:lvlJc w:val="left"/>
     </w:lvl>
   </w:abstractNum>
-  <w:num w:numId="1" w16cid:durableId="1846312638">
+  <w:num w:numId="1" w16cid:durableId="1592465078">
     <w:abstractNumId w:val="2"/>
     <w:lvlOverride w:ilvl="0">
       <w:startOverride w:val="1"/>
     </w:lvlOverride>
   </w:num>
-  <w:num w:numId="2" w16cid:durableId="1247692018">
-    <w:abstractNumId w:val="3"/>
+  <w:num w:numId="2" w16cid:durableId="580679970">
+    <w:abstractNumId w:val="1"/>
     <w:lvlOverride w:ilvl="0">
       <w:startOverride w:val="1"/>
     </w:lvlOverride>
@@ -35326,7 +35659,7 @@
     <w:autoRedefine/>
     <w:uiPriority w:val="39"/>
     <w:unhideWhenUsed/>
-    <w:rsid w:val="009A56B9"/>
+    <w:rsid w:val="004E5906"/>
     <w:pPr>
       <w:spacing w:after="100"/>
     </w:pPr>
@@ -35338,7 +35671,7 @@
     <w:autoRedefine/>
     <w:uiPriority w:val="39"/>
     <w:unhideWhenUsed/>
-    <w:rsid w:val="009A56B9"/>
+    <w:rsid w:val="004E5906"/>
     <w:pPr>
       <w:spacing w:after="100"/>
       <w:ind w:left="220"/>

</xml_diff>

<commit_message>
Testler ortak ortamdaki değişken veriye dayanıklı hale getirildi; suite'ler yeniden koşuldu
Admin testlerinin ortama eklediği (bug nedeniyle silinemeyen) kayıtlar sabit
ürün/kategori sayısı bekleyen testleri kırıyordu:
- DB_03/DB_04, listCategories, listProductsAsPojo: sabit sayı yerine başlangıç verisi
- Kategori kontrolü ayrı teste alındı (bilinen bug SCRUM-258)
- E2E_02: UI sayfaları sabit 3 sayfa yerine son sayfaya kadar sayılıyor
- US06 sayfalama: son sayfa içeriği sabit ürün adına bağlı değil
- Postman TC_API_01 / TC_API_07: en az 28 ürün / 6 kategori

15.10.2026 koşumu: UI 40/48, Cucumber 30/34, API 14/20, DB 9/12, E2E 4/4 –
tüm FAIL'ler bilinen bug kayıtlarına karşılık geliyor.

Co-Authored-By: Claude Opus 5.5 <noreply@anthropic.com>
</commit_message>
<xml_diff>
--- a/docs/Snack_Attack_Test_Plani.docx
+++ b/docs/Snack_Attack_Test_Plani.docx
@@ -615,7 +615,7 @@
       <w:pPr>
         <w:pStyle w:val="Balk1"/>
       </w:pPr>
-      <w:bookmarkStart w:id="0" w:name="_Toc242964426"/>
+      <w:bookmarkStart w:id="0" w:name="_Toc242966684"/>
       <w:r>
         <w:t>Revizyon Geçmişi</w:t>
       </w:r>
@@ -1105,7 +1105,7 @@
       <w:pPr>
         <w:pStyle w:val="Balk1"/>
       </w:pPr>
-      <w:bookmarkStart w:id="1" w:name="_Toc242964427"/>
+      <w:bookmarkStart w:id="1" w:name="_Toc242966685"/>
       <w:r>
         <w:t>İçindekiler</w:t>
       </w:r>
@@ -1114,7 +1114,7 @@
     <w:sdt>
       <w:sdtPr>
         <w:alias w:val="İçindekiler"/>
-        <w:id w:val="-1366903848"/>
+        <w:id w:val="-306790635"/>
       </w:sdtPr>
       <w:sdtEndPr/>
       <w:sdtContent>
@@ -1137,7 +1137,7 @@
           <w:r>
             <w:fldChar w:fldCharType="separate"/>
           </w:r>
-          <w:hyperlink w:anchor="_Toc242964426" w:history="1">
+          <w:hyperlink w:anchor="_Toc242966684" w:history="1">
             <w:r>
               <w:rPr>
                 <w:rStyle w:val="Kpr"/>
@@ -1161,7 +1161,7 @@
               <w:rPr>
                 <w:noProof/>
               </w:rPr>
-              <w:instrText xml:space="preserve"> PAGEREF _Toc242964426 \h </w:instrText>
+              <w:instrText xml:space="preserve"> PAGEREF _Toc242966684 \h </w:instrText>
             </w:r>
             <w:r>
               <w:rPr>
@@ -1198,7 +1198,7 @@
               <w:noProof/>
             </w:rPr>
           </w:pPr>
-          <w:hyperlink w:anchor="_Toc242964427" w:history="1">
+          <w:hyperlink w:anchor="_Toc242966685" w:history="1">
             <w:r>
               <w:rPr>
                 <w:rStyle w:val="Kpr"/>
@@ -1222,7 +1222,7 @@
               <w:rPr>
                 <w:noProof/>
               </w:rPr>
-              <w:instrText xml:space="preserve"> PAGEREF _Toc242964427 \h </w:instrText>
+              <w:instrText xml:space="preserve"> PAGEREF _Toc242966685 \h </w:instrText>
             </w:r>
             <w:r>
               <w:rPr>
@@ -1259,7 +1259,7 @@
               <w:noProof/>
             </w:rPr>
           </w:pPr>
-          <w:hyperlink w:anchor="_Toc242964428" w:history="1">
+          <w:hyperlink w:anchor="_Toc242966686" w:history="1">
             <w:r>
               <w:rPr>
                 <w:rStyle w:val="Kpr"/>
@@ -1283,7 +1283,7 @@
               <w:rPr>
                 <w:noProof/>
               </w:rPr>
-              <w:instrText xml:space="preserve"> PAGEREF _Toc242964428 \h </w:instrText>
+              <w:instrText xml:space="preserve"> PAGEREF _Toc242966686 \h </w:instrText>
             </w:r>
             <w:r>
               <w:rPr>
@@ -1320,7 +1320,7 @@
               <w:noProof/>
             </w:rPr>
           </w:pPr>
-          <w:hyperlink w:anchor="_Toc242964429" w:history="1">
+          <w:hyperlink w:anchor="_Toc242966687" w:history="1">
             <w:r>
               <w:rPr>
                 <w:rStyle w:val="Kpr"/>
@@ -1344,7 +1344,7 @@
               <w:rPr>
                 <w:noProof/>
               </w:rPr>
-              <w:instrText xml:space="preserve"> PAGEREF _Toc242964429 \h </w:instrText>
+              <w:instrText xml:space="preserve"> PAGEREF _Toc242966687 \h </w:instrText>
             </w:r>
             <w:r>
               <w:rPr>
@@ -1381,7 +1381,7 @@
               <w:noProof/>
             </w:rPr>
           </w:pPr>
-          <w:hyperlink w:anchor="_Toc242964430" w:history="1">
+          <w:hyperlink w:anchor="_Toc242966688" w:history="1">
             <w:r>
               <w:rPr>
                 <w:rStyle w:val="Kpr"/>
@@ -1405,7 +1405,7 @@
               <w:rPr>
                 <w:noProof/>
               </w:rPr>
-              <w:instrText xml:space="preserve"> PAGEREF _Toc242964430 \h </w:instrText>
+              <w:instrText xml:space="preserve"> PAGEREF _Toc242966688 \h </w:instrText>
             </w:r>
             <w:r>
               <w:rPr>
@@ -1442,7 +1442,7 @@
               <w:noProof/>
             </w:rPr>
           </w:pPr>
-          <w:hyperlink w:anchor="_Toc242964431" w:history="1">
+          <w:hyperlink w:anchor="_Toc242966689" w:history="1">
             <w:r>
               <w:rPr>
                 <w:rStyle w:val="Kpr"/>
@@ -1466,7 +1466,7 @@
               <w:rPr>
                 <w:noProof/>
               </w:rPr>
-              <w:instrText xml:space="preserve"> PAGEREF _Toc242964431 \h </w:instrText>
+              <w:instrText xml:space="preserve"> PAGEREF _Toc242966689 \h </w:instrText>
             </w:r>
             <w:r>
               <w:rPr>
@@ -1503,7 +1503,7 @@
               <w:noProof/>
             </w:rPr>
           </w:pPr>
-          <w:hyperlink w:anchor="_Toc242964432" w:history="1">
+          <w:hyperlink w:anchor="_Toc242966690" w:history="1">
             <w:r>
               <w:rPr>
                 <w:rStyle w:val="Kpr"/>
@@ -1527,7 +1527,7 @@
               <w:rPr>
                 <w:noProof/>
               </w:rPr>
-              <w:instrText xml:space="preserve"> PAGEREF _Toc242964432 \h </w:instrText>
+              <w:instrText xml:space="preserve"> PAGEREF _Toc242966690 \h </w:instrText>
             </w:r>
             <w:r>
               <w:rPr>
@@ -1564,7 +1564,7 @@
               <w:noProof/>
             </w:rPr>
           </w:pPr>
-          <w:hyperlink w:anchor="_Toc242964433" w:history="1">
+          <w:hyperlink w:anchor="_Toc242966691" w:history="1">
             <w:r>
               <w:rPr>
                 <w:rStyle w:val="Kpr"/>
@@ -1588,7 +1588,7 @@
               <w:rPr>
                 <w:noProof/>
               </w:rPr>
-              <w:instrText xml:space="preserve"> PAGEREF _Toc242964433 \h </w:instrText>
+              <w:instrText xml:space="preserve"> PAGEREF _Toc242966691 \h </w:instrText>
             </w:r>
             <w:r>
               <w:rPr>
@@ -1625,7 +1625,7 @@
               <w:noProof/>
             </w:rPr>
           </w:pPr>
-          <w:hyperlink w:anchor="_Toc242964434" w:history="1">
+          <w:hyperlink w:anchor="_Toc242966692" w:history="1">
             <w:r>
               <w:rPr>
                 <w:rStyle w:val="Kpr"/>
@@ -1649,7 +1649,7 @@
               <w:rPr>
                 <w:noProof/>
               </w:rPr>
-              <w:instrText xml:space="preserve"> PAGEREF _Toc242964434 \h </w:instrText>
+              <w:instrText xml:space="preserve"> PAGEREF _Toc242966692 \h </w:instrText>
             </w:r>
             <w:r>
               <w:rPr>
@@ -1686,7 +1686,7 @@
               <w:noProof/>
             </w:rPr>
           </w:pPr>
-          <w:hyperlink w:anchor="_Toc242964435" w:history="1">
+          <w:hyperlink w:anchor="_Toc242966693" w:history="1">
             <w:r>
               <w:rPr>
                 <w:rStyle w:val="Kpr"/>
@@ -1710,7 +1710,7 @@
               <w:rPr>
                 <w:noProof/>
               </w:rPr>
-              <w:instrText xml:space="preserve"> PAGEREF _Toc242964435 \h </w:instrText>
+              <w:instrText xml:space="preserve"> PAGEREF _Toc242966693 \h </w:instrText>
             </w:r>
             <w:r>
               <w:rPr>
@@ -1747,7 +1747,7 @@
               <w:noProof/>
             </w:rPr>
           </w:pPr>
-          <w:hyperlink w:anchor="_Toc242964436" w:history="1">
+          <w:hyperlink w:anchor="_Toc242966694" w:history="1">
             <w:r>
               <w:rPr>
                 <w:rStyle w:val="Kpr"/>
@@ -1771,7 +1771,7 @@
               <w:rPr>
                 <w:noProof/>
               </w:rPr>
-              <w:instrText xml:space="preserve"> PAGEREF _Toc242964436 \h </w:instrText>
+              <w:instrText xml:space="preserve"> PAGEREF _Toc242966694 \h </w:instrText>
             </w:r>
             <w:r>
               <w:rPr>
@@ -1808,7 +1808,7 @@
               <w:noProof/>
             </w:rPr>
           </w:pPr>
-          <w:hyperlink w:anchor="_Toc242964437" w:history="1">
+          <w:hyperlink w:anchor="_Toc242966695" w:history="1">
             <w:r>
               <w:rPr>
                 <w:rStyle w:val="Kpr"/>
@@ -1832,7 +1832,7 @@
               <w:rPr>
                 <w:noProof/>
               </w:rPr>
-              <w:instrText xml:space="preserve"> PAGEREF _Toc242964437 \h </w:instrText>
+              <w:instrText xml:space="preserve"> PAGEREF _Toc242966695 \h </w:instrText>
             </w:r>
             <w:r>
               <w:rPr>
@@ -1869,7 +1869,7 @@
               <w:noProof/>
             </w:rPr>
           </w:pPr>
-          <w:hyperlink w:anchor="_Toc242964438" w:history="1">
+          <w:hyperlink w:anchor="_Toc242966696" w:history="1">
             <w:r>
               <w:rPr>
                 <w:rStyle w:val="Kpr"/>
@@ -1893,7 +1893,7 @@
               <w:rPr>
                 <w:noProof/>
               </w:rPr>
-              <w:instrText xml:space="preserve"> PAGEREF _Toc242964438 \h </w:instrText>
+              <w:instrText xml:space="preserve"> PAGEREF _Toc242966696 \h </w:instrText>
             </w:r>
             <w:r>
               <w:rPr>
@@ -1930,7 +1930,7 @@
               <w:noProof/>
             </w:rPr>
           </w:pPr>
-          <w:hyperlink w:anchor="_Toc242964439" w:history="1">
+          <w:hyperlink w:anchor="_Toc242966697" w:history="1">
             <w:r>
               <w:rPr>
                 <w:rStyle w:val="Kpr"/>
@@ -1954,7 +1954,7 @@
               <w:rPr>
                 <w:noProof/>
               </w:rPr>
-              <w:instrText xml:space="preserve"> PAGEREF _Toc242964439 \h </w:instrText>
+              <w:instrText xml:space="preserve"> PAGEREF _Toc242966697 \h </w:instrText>
             </w:r>
             <w:r>
               <w:rPr>
@@ -1991,7 +1991,7 @@
               <w:noProof/>
             </w:rPr>
           </w:pPr>
-          <w:hyperlink w:anchor="_Toc242964440" w:history="1">
+          <w:hyperlink w:anchor="_Toc242966698" w:history="1">
             <w:r>
               <w:rPr>
                 <w:rStyle w:val="Kpr"/>
@@ -2015,7 +2015,7 @@
               <w:rPr>
                 <w:noProof/>
               </w:rPr>
-              <w:instrText xml:space="preserve"> PAGEREF _Toc242964440 \h </w:instrText>
+              <w:instrText xml:space="preserve"> PAGEREF _Toc242966698 \h </w:instrText>
             </w:r>
             <w:r>
               <w:rPr>
@@ -2052,7 +2052,7 @@
               <w:noProof/>
             </w:rPr>
           </w:pPr>
-          <w:hyperlink w:anchor="_Toc242964441" w:history="1">
+          <w:hyperlink w:anchor="_Toc242966699" w:history="1">
             <w:r>
               <w:rPr>
                 <w:rStyle w:val="Kpr"/>
@@ -2076,7 +2076,7 @@
               <w:rPr>
                 <w:noProof/>
               </w:rPr>
-              <w:instrText xml:space="preserve"> PAGEREF _Toc242964441 \h </w:instrText>
+              <w:instrText xml:space="preserve"> PAGEREF _Toc242966699 \h </w:instrText>
             </w:r>
             <w:r>
               <w:rPr>
@@ -2113,7 +2113,7 @@
               <w:noProof/>
             </w:rPr>
           </w:pPr>
-          <w:hyperlink w:anchor="_Toc242964442" w:history="1">
+          <w:hyperlink w:anchor="_Toc242966700" w:history="1">
             <w:r>
               <w:rPr>
                 <w:rStyle w:val="Kpr"/>
@@ -2137,7 +2137,7 @@
               <w:rPr>
                 <w:noProof/>
               </w:rPr>
-              <w:instrText xml:space="preserve"> PAGEREF _Toc242964442 \h </w:instrText>
+              <w:instrText xml:space="preserve"> PAGEREF _Toc242966700 \h </w:instrText>
             </w:r>
             <w:r>
               <w:rPr>
@@ -2174,7 +2174,7 @@
               <w:noProof/>
             </w:rPr>
           </w:pPr>
-          <w:hyperlink w:anchor="_Toc242964443" w:history="1">
+          <w:hyperlink w:anchor="_Toc242966701" w:history="1">
             <w:r>
               <w:rPr>
                 <w:rStyle w:val="Kpr"/>
@@ -2198,7 +2198,7 @@
               <w:rPr>
                 <w:noProof/>
               </w:rPr>
-              <w:instrText xml:space="preserve"> PAGEREF _Toc242964443 \h </w:instrText>
+              <w:instrText xml:space="preserve"> PAGEREF _Toc242966701 \h </w:instrText>
             </w:r>
             <w:r>
               <w:rPr>
@@ -2235,7 +2235,7 @@
               <w:noProof/>
             </w:rPr>
           </w:pPr>
-          <w:hyperlink w:anchor="_Toc242964444" w:history="1">
+          <w:hyperlink w:anchor="_Toc242966702" w:history="1">
             <w:r>
               <w:rPr>
                 <w:rStyle w:val="Kpr"/>
@@ -2259,7 +2259,7 @@
               <w:rPr>
                 <w:noProof/>
               </w:rPr>
-              <w:instrText xml:space="preserve"> PAGEREF _Toc242964444 \h </w:instrText>
+              <w:instrText xml:space="preserve"> PAGEREF _Toc242966702 \h </w:instrText>
             </w:r>
             <w:r>
               <w:rPr>
@@ -2296,7 +2296,7 @@
               <w:noProof/>
             </w:rPr>
           </w:pPr>
-          <w:hyperlink w:anchor="_Toc242964445" w:history="1">
+          <w:hyperlink w:anchor="_Toc242966703" w:history="1">
             <w:r>
               <w:rPr>
                 <w:rStyle w:val="Kpr"/>
@@ -2320,7 +2320,7 @@
               <w:rPr>
                 <w:noProof/>
               </w:rPr>
-              <w:instrText xml:space="preserve"> PAGEREF _Toc242964445 \h </w:instrText>
+              <w:instrText xml:space="preserve"> PAGEREF _Toc242966703 \h </w:instrText>
             </w:r>
             <w:r>
               <w:rPr>
@@ -2357,7 +2357,7 @@
               <w:noProof/>
             </w:rPr>
           </w:pPr>
-          <w:hyperlink w:anchor="_Toc242964446" w:history="1">
+          <w:hyperlink w:anchor="_Toc242966704" w:history="1">
             <w:r>
               <w:rPr>
                 <w:rStyle w:val="Kpr"/>
@@ -2381,7 +2381,7 @@
               <w:rPr>
                 <w:noProof/>
               </w:rPr>
-              <w:instrText xml:space="preserve"> PAGEREF _Toc242964446 \h </w:instrText>
+              <w:instrText xml:space="preserve"> PAGEREF _Toc242966704 \h </w:instrText>
             </w:r>
             <w:r>
               <w:rPr>
@@ -2418,7 +2418,7 @@
               <w:noProof/>
             </w:rPr>
           </w:pPr>
-          <w:hyperlink w:anchor="_Toc242964447" w:history="1">
+          <w:hyperlink w:anchor="_Toc242966705" w:history="1">
             <w:r>
               <w:rPr>
                 <w:rStyle w:val="Kpr"/>
@@ -2442,7 +2442,7 @@
               <w:rPr>
                 <w:noProof/>
               </w:rPr>
-              <w:instrText xml:space="preserve"> PAGEREF _Toc242964447 \h </w:instrText>
+              <w:instrText xml:space="preserve"> PAGEREF _Toc242966705 \h </w:instrText>
             </w:r>
             <w:r>
               <w:rPr>
@@ -2479,7 +2479,7 @@
               <w:noProof/>
             </w:rPr>
           </w:pPr>
-          <w:hyperlink w:anchor="_Toc242964448" w:history="1">
+          <w:hyperlink w:anchor="_Toc242966706" w:history="1">
             <w:r>
               <w:rPr>
                 <w:rStyle w:val="Kpr"/>
@@ -2503,7 +2503,7 @@
               <w:rPr>
                 <w:noProof/>
               </w:rPr>
-              <w:instrText xml:space="preserve"> PAGEREF _Toc242964448 \h </w:instrText>
+              <w:instrText xml:space="preserve"> PAGEREF _Toc242966706 \h </w:instrText>
             </w:r>
             <w:r>
               <w:rPr>
@@ -2540,7 +2540,7 @@
               <w:noProof/>
             </w:rPr>
           </w:pPr>
-          <w:hyperlink w:anchor="_Toc242964449" w:history="1">
+          <w:hyperlink w:anchor="_Toc242966707" w:history="1">
             <w:r>
               <w:rPr>
                 <w:rStyle w:val="Kpr"/>
@@ -2564,7 +2564,7 @@
               <w:rPr>
                 <w:noProof/>
               </w:rPr>
-              <w:instrText xml:space="preserve"> PAGEREF _Toc242964449 \h </w:instrText>
+              <w:instrText xml:space="preserve"> PAGEREF _Toc242966707 \h </w:instrText>
             </w:r>
             <w:r>
               <w:rPr>
@@ -2601,7 +2601,7 @@
               <w:noProof/>
             </w:rPr>
           </w:pPr>
-          <w:hyperlink w:anchor="_Toc242964450" w:history="1">
+          <w:hyperlink w:anchor="_Toc242966708" w:history="1">
             <w:r>
               <w:rPr>
                 <w:rStyle w:val="Kpr"/>
@@ -2625,7 +2625,7 @@
               <w:rPr>
                 <w:noProof/>
               </w:rPr>
-              <w:instrText xml:space="preserve"> PAGEREF _Toc242964450 \h </w:instrText>
+              <w:instrText xml:space="preserve"> PAGEREF _Toc242966708 \h </w:instrText>
             </w:r>
             <w:r>
               <w:rPr>
@@ -2662,7 +2662,7 @@
               <w:noProof/>
             </w:rPr>
           </w:pPr>
-          <w:hyperlink w:anchor="_Toc242964451" w:history="1">
+          <w:hyperlink w:anchor="_Toc242966709" w:history="1">
             <w:r>
               <w:rPr>
                 <w:rStyle w:val="Kpr"/>
@@ -2686,7 +2686,7 @@
               <w:rPr>
                 <w:noProof/>
               </w:rPr>
-              <w:instrText xml:space="preserve"> PAGEREF _Toc242964451 \h </w:instrText>
+              <w:instrText xml:space="preserve"> PAGEREF _Toc242966709 \h </w:instrText>
             </w:r>
             <w:r>
               <w:rPr>
@@ -2723,7 +2723,7 @@
               <w:noProof/>
             </w:rPr>
           </w:pPr>
-          <w:hyperlink w:anchor="_Toc242964452" w:history="1">
+          <w:hyperlink w:anchor="_Toc242966710" w:history="1">
             <w:r>
               <w:rPr>
                 <w:rStyle w:val="Kpr"/>
@@ -2747,7 +2747,7 @@
               <w:rPr>
                 <w:noProof/>
               </w:rPr>
-              <w:instrText xml:space="preserve"> PAGEREF _Toc242964452 \h </w:instrText>
+              <w:instrText xml:space="preserve"> PAGEREF _Toc242966710 \h </w:instrText>
             </w:r>
             <w:r>
               <w:rPr>
@@ -2784,7 +2784,7 @@
               <w:noProof/>
             </w:rPr>
           </w:pPr>
-          <w:hyperlink w:anchor="_Toc242964453" w:history="1">
+          <w:hyperlink w:anchor="_Toc242966711" w:history="1">
             <w:r>
               <w:rPr>
                 <w:rStyle w:val="Kpr"/>
@@ -2808,7 +2808,7 @@
               <w:rPr>
                 <w:noProof/>
               </w:rPr>
-              <w:instrText xml:space="preserve"> PAGEREF _Toc242964453 \h </w:instrText>
+              <w:instrText xml:space="preserve"> PAGEREF _Toc242966711 \h </w:instrText>
             </w:r>
             <w:r>
               <w:rPr>
@@ -2845,7 +2845,7 @@
               <w:noProof/>
             </w:rPr>
           </w:pPr>
-          <w:hyperlink w:anchor="_Toc242964454" w:history="1">
+          <w:hyperlink w:anchor="_Toc242966712" w:history="1">
             <w:r>
               <w:rPr>
                 <w:rStyle w:val="Kpr"/>
@@ -2869,7 +2869,7 @@
               <w:rPr>
                 <w:noProof/>
               </w:rPr>
-              <w:instrText xml:space="preserve"> PAGEREF _Toc242964454 \h </w:instrText>
+              <w:instrText xml:space="preserve"> PAGEREF _Toc242966712 \h </w:instrText>
             </w:r>
             <w:r>
               <w:rPr>
@@ -2906,7 +2906,7 @@
               <w:noProof/>
             </w:rPr>
           </w:pPr>
-          <w:hyperlink w:anchor="_Toc242964455" w:history="1">
+          <w:hyperlink w:anchor="_Toc242966713" w:history="1">
             <w:r>
               <w:rPr>
                 <w:rStyle w:val="Kpr"/>
@@ -2930,7 +2930,7 @@
               <w:rPr>
                 <w:noProof/>
               </w:rPr>
-              <w:instrText xml:space="preserve"> PAGEREF _Toc242964455 \h </w:instrText>
+              <w:instrText xml:space="preserve"> PAGEREF _Toc242966713 \h </w:instrText>
             </w:r>
             <w:r>
               <w:rPr>
@@ -2967,7 +2967,7 @@
               <w:noProof/>
             </w:rPr>
           </w:pPr>
-          <w:hyperlink w:anchor="_Toc242964456" w:history="1">
+          <w:hyperlink w:anchor="_Toc242966714" w:history="1">
             <w:r>
               <w:rPr>
                 <w:rStyle w:val="Kpr"/>
@@ -2991,7 +2991,7 @@
               <w:rPr>
                 <w:noProof/>
               </w:rPr>
-              <w:instrText xml:space="preserve"> PAGEREF _Toc242964456 \h </w:instrText>
+              <w:instrText xml:space="preserve"> PAGEREF _Toc242966714 \h </w:instrText>
             </w:r>
             <w:r>
               <w:rPr>
@@ -3028,7 +3028,7 @@
               <w:noProof/>
             </w:rPr>
           </w:pPr>
-          <w:hyperlink w:anchor="_Toc242964457" w:history="1">
+          <w:hyperlink w:anchor="_Toc242966715" w:history="1">
             <w:r>
               <w:rPr>
                 <w:rStyle w:val="Kpr"/>
@@ -3052,7 +3052,7 @@
               <w:rPr>
                 <w:noProof/>
               </w:rPr>
-              <w:instrText xml:space="preserve"> PAGEREF _Toc242964457 \h </w:instrText>
+              <w:instrText xml:space="preserve"> PAGEREF _Toc242966715 \h </w:instrText>
             </w:r>
             <w:r>
               <w:rPr>
@@ -3089,7 +3089,7 @@
               <w:noProof/>
             </w:rPr>
           </w:pPr>
-          <w:hyperlink w:anchor="_Toc242964458" w:history="1">
+          <w:hyperlink w:anchor="_Toc242966716" w:history="1">
             <w:r>
               <w:rPr>
                 <w:rStyle w:val="Kpr"/>
@@ -3113,7 +3113,7 @@
               <w:rPr>
                 <w:noProof/>
               </w:rPr>
-              <w:instrText xml:space="preserve"> PAGEREF _Toc242964458 \h </w:instrText>
+              <w:instrText xml:space="preserve"> PAGEREF _Toc242966716 \h </w:instrText>
             </w:r>
             <w:r>
               <w:rPr>
@@ -3150,7 +3150,7 @@
               <w:noProof/>
             </w:rPr>
           </w:pPr>
-          <w:hyperlink w:anchor="_Toc242964459" w:history="1">
+          <w:hyperlink w:anchor="_Toc242966717" w:history="1">
             <w:r>
               <w:rPr>
                 <w:rStyle w:val="Kpr"/>
@@ -3174,7 +3174,7 @@
               <w:rPr>
                 <w:noProof/>
               </w:rPr>
-              <w:instrText xml:space="preserve"> PAGEREF _Toc242964459 \h </w:instrText>
+              <w:instrText xml:space="preserve"> PAGEREF _Toc242966717 \h </w:instrText>
             </w:r>
             <w:r>
               <w:rPr>
@@ -3211,7 +3211,7 @@
               <w:noProof/>
             </w:rPr>
           </w:pPr>
-          <w:hyperlink w:anchor="_Toc242964460" w:history="1">
+          <w:hyperlink w:anchor="_Toc242966718" w:history="1">
             <w:r>
               <w:rPr>
                 <w:rStyle w:val="Kpr"/>
@@ -3235,7 +3235,7 @@
               <w:rPr>
                 <w:noProof/>
               </w:rPr>
-              <w:instrText xml:space="preserve"> PAGEREF _Toc242964460 \h </w:instrText>
+              <w:instrText xml:space="preserve"> PAGEREF _Toc242966718 \h </w:instrText>
             </w:r>
             <w:r>
               <w:rPr>
@@ -3272,7 +3272,7 @@
               <w:noProof/>
             </w:rPr>
           </w:pPr>
-          <w:hyperlink w:anchor="_Toc242964461" w:history="1">
+          <w:hyperlink w:anchor="_Toc242966719" w:history="1">
             <w:r>
               <w:rPr>
                 <w:rStyle w:val="Kpr"/>
@@ -3296,7 +3296,7 @@
               <w:rPr>
                 <w:noProof/>
               </w:rPr>
-              <w:instrText xml:space="preserve"> PAGEREF _Toc242964461 \h </w:instrText>
+              <w:instrText xml:space="preserve"> PAGEREF _Toc242966719 \h </w:instrText>
             </w:r>
             <w:r>
               <w:rPr>
@@ -3333,7 +3333,7 @@
               <w:noProof/>
             </w:rPr>
           </w:pPr>
-          <w:hyperlink w:anchor="_Toc242964462" w:history="1">
+          <w:hyperlink w:anchor="_Toc242966720" w:history="1">
             <w:r>
               <w:rPr>
                 <w:rStyle w:val="Kpr"/>
@@ -3357,7 +3357,7 @@
               <w:rPr>
                 <w:noProof/>
               </w:rPr>
-              <w:instrText xml:space="preserve"> PAGEREF _Toc242964462 \h </w:instrText>
+              <w:instrText xml:space="preserve"> PAGEREF _Toc242966720 \h </w:instrText>
             </w:r>
             <w:r>
               <w:rPr>
@@ -3394,7 +3394,7 @@
               <w:noProof/>
             </w:rPr>
           </w:pPr>
-          <w:hyperlink w:anchor="_Toc242964463" w:history="1">
+          <w:hyperlink w:anchor="_Toc242966721" w:history="1">
             <w:r>
               <w:rPr>
                 <w:rStyle w:val="Kpr"/>
@@ -3418,7 +3418,7 @@
               <w:rPr>
                 <w:noProof/>
               </w:rPr>
-              <w:instrText xml:space="preserve"> PAGEREF _Toc242964463 \h </w:instrText>
+              <w:instrText xml:space="preserve"> PAGEREF _Toc242966721 \h </w:instrText>
             </w:r>
             <w:r>
               <w:rPr>
@@ -3455,7 +3455,7 @@
               <w:noProof/>
             </w:rPr>
           </w:pPr>
-          <w:hyperlink w:anchor="_Toc242964464" w:history="1">
+          <w:hyperlink w:anchor="_Toc242966722" w:history="1">
             <w:r>
               <w:rPr>
                 <w:rStyle w:val="Kpr"/>
@@ -3479,7 +3479,7 @@
               <w:rPr>
                 <w:noProof/>
               </w:rPr>
-              <w:instrText xml:space="preserve"> PAGEREF _Toc242964464 \h </w:instrText>
+              <w:instrText xml:space="preserve"> PAGEREF _Toc242966722 \h </w:instrText>
             </w:r>
             <w:r>
               <w:rPr>
@@ -3516,7 +3516,7 @@
               <w:noProof/>
             </w:rPr>
           </w:pPr>
-          <w:hyperlink w:anchor="_Toc242964465" w:history="1">
+          <w:hyperlink w:anchor="_Toc242966723" w:history="1">
             <w:r>
               <w:rPr>
                 <w:rStyle w:val="Kpr"/>
@@ -3540,7 +3540,7 @@
               <w:rPr>
                 <w:noProof/>
               </w:rPr>
-              <w:instrText xml:space="preserve"> PAGEREF _Toc242964465 \h </w:instrText>
+              <w:instrText xml:space="preserve"> PAGEREF _Toc242966723 \h </w:instrText>
             </w:r>
             <w:r>
               <w:rPr>
@@ -3577,7 +3577,7 @@
               <w:noProof/>
             </w:rPr>
           </w:pPr>
-          <w:hyperlink w:anchor="_Toc242964466" w:history="1">
+          <w:hyperlink w:anchor="_Toc242966724" w:history="1">
             <w:r>
               <w:rPr>
                 <w:rStyle w:val="Kpr"/>
@@ -3601,7 +3601,7 @@
               <w:rPr>
                 <w:noProof/>
               </w:rPr>
-              <w:instrText xml:space="preserve"> PAGEREF _Toc242964466 \h </w:instrText>
+              <w:instrText xml:space="preserve"> PAGEREF _Toc242966724 \h </w:instrText>
             </w:r>
             <w:r>
               <w:rPr>
@@ -3638,7 +3638,7 @@
               <w:noProof/>
             </w:rPr>
           </w:pPr>
-          <w:hyperlink w:anchor="_Toc242964467" w:history="1">
+          <w:hyperlink w:anchor="_Toc242966725" w:history="1">
             <w:r>
               <w:rPr>
                 <w:rStyle w:val="Kpr"/>
@@ -3662,7 +3662,7 @@
               <w:rPr>
                 <w:noProof/>
               </w:rPr>
-              <w:instrText xml:space="preserve"> PAGEREF _Toc242964467 \h </w:instrText>
+              <w:instrText xml:space="preserve"> PAGEREF _Toc242966725 \h </w:instrText>
             </w:r>
             <w:r>
               <w:rPr>
@@ -3699,7 +3699,7 @@
               <w:noProof/>
             </w:rPr>
           </w:pPr>
-          <w:hyperlink w:anchor="_Toc242964468" w:history="1">
+          <w:hyperlink w:anchor="_Toc242966726" w:history="1">
             <w:r>
               <w:rPr>
                 <w:rStyle w:val="Kpr"/>
@@ -3723,7 +3723,7 @@
               <w:rPr>
                 <w:noProof/>
               </w:rPr>
-              <w:instrText xml:space="preserve"> PAGEREF _Toc242964468 \h </w:instrText>
+              <w:instrText xml:space="preserve"> PAGEREF _Toc242966726 \h </w:instrText>
             </w:r>
             <w:r>
               <w:rPr>
@@ -3760,7 +3760,7 @@
               <w:noProof/>
             </w:rPr>
           </w:pPr>
-          <w:hyperlink w:anchor="_Toc242964469" w:history="1">
+          <w:hyperlink w:anchor="_Toc242966727" w:history="1">
             <w:r>
               <w:rPr>
                 <w:rStyle w:val="Kpr"/>
@@ -3784,7 +3784,7 @@
               <w:rPr>
                 <w:noProof/>
               </w:rPr>
-              <w:instrText xml:space="preserve"> PAGEREF _Toc242964469 \h </w:instrText>
+              <w:instrText xml:space="preserve"> PAGEREF _Toc242966727 \h </w:instrText>
             </w:r>
             <w:r>
               <w:rPr>
@@ -3821,7 +3821,7 @@
               <w:noProof/>
             </w:rPr>
           </w:pPr>
-          <w:hyperlink w:anchor="_Toc242964470" w:history="1">
+          <w:hyperlink w:anchor="_Toc242966728" w:history="1">
             <w:r>
               <w:rPr>
                 <w:rStyle w:val="Kpr"/>
@@ -3845,7 +3845,7 @@
               <w:rPr>
                 <w:noProof/>
               </w:rPr>
-              <w:instrText xml:space="preserve"> PAGEREF _Toc242964470 \h </w:instrText>
+              <w:instrText xml:space="preserve"> PAGEREF _Toc242966728 \h </w:instrText>
             </w:r>
             <w:r>
               <w:rPr>
@@ -3882,7 +3882,7 @@
               <w:noProof/>
             </w:rPr>
           </w:pPr>
-          <w:hyperlink w:anchor="_Toc242964471" w:history="1">
+          <w:hyperlink w:anchor="_Toc242966729" w:history="1">
             <w:r>
               <w:rPr>
                 <w:rStyle w:val="Kpr"/>
@@ -3906,7 +3906,7 @@
               <w:rPr>
                 <w:noProof/>
               </w:rPr>
-              <w:instrText xml:space="preserve"> PAGEREF _Toc242964471 \h </w:instrText>
+              <w:instrText xml:space="preserve"> PAGEREF _Toc242966729 \h </w:instrText>
             </w:r>
             <w:r>
               <w:rPr>
@@ -3943,7 +3943,7 @@
               <w:noProof/>
             </w:rPr>
           </w:pPr>
-          <w:hyperlink w:anchor="_Toc242964472" w:history="1">
+          <w:hyperlink w:anchor="_Toc242966730" w:history="1">
             <w:r>
               <w:rPr>
                 <w:rStyle w:val="Kpr"/>
@@ -3967,7 +3967,7 @@
               <w:rPr>
                 <w:noProof/>
               </w:rPr>
-              <w:instrText xml:space="preserve"> PAGEREF _Toc242964472 \h </w:instrText>
+              <w:instrText xml:space="preserve"> PAGEREF _Toc242966730 \h </w:instrText>
             </w:r>
             <w:r>
               <w:rPr>
@@ -4004,7 +4004,7 @@
               <w:noProof/>
             </w:rPr>
           </w:pPr>
-          <w:hyperlink w:anchor="_Toc242964473" w:history="1">
+          <w:hyperlink w:anchor="_Toc242966731" w:history="1">
             <w:r>
               <w:rPr>
                 <w:rStyle w:val="Kpr"/>
@@ -4028,7 +4028,7 @@
               <w:rPr>
                 <w:noProof/>
               </w:rPr>
-              <w:instrText xml:space="preserve"> PAGEREF _Toc242964473 \h </w:instrText>
+              <w:instrText xml:space="preserve"> PAGEREF _Toc242966731 \h </w:instrText>
             </w:r>
             <w:r>
               <w:rPr>
@@ -4065,7 +4065,7 @@
               <w:noProof/>
             </w:rPr>
           </w:pPr>
-          <w:hyperlink w:anchor="_Toc242964474" w:history="1">
+          <w:hyperlink w:anchor="_Toc242966732" w:history="1">
             <w:r>
               <w:rPr>
                 <w:rStyle w:val="Kpr"/>
@@ -4089,7 +4089,7 @@
               <w:rPr>
                 <w:noProof/>
               </w:rPr>
-              <w:instrText xml:space="preserve"> PAGEREF _Toc242964474 \h </w:instrText>
+              <w:instrText xml:space="preserve"> PAGEREF _Toc242966732 \h </w:instrText>
             </w:r>
             <w:r>
               <w:rPr>
@@ -4126,7 +4126,7 @@
               <w:noProof/>
             </w:rPr>
           </w:pPr>
-          <w:hyperlink w:anchor="_Toc242964475" w:history="1">
+          <w:hyperlink w:anchor="_Toc242966733" w:history="1">
             <w:r>
               <w:rPr>
                 <w:rStyle w:val="Kpr"/>
@@ -4150,7 +4150,7 @@
               <w:rPr>
                 <w:noProof/>
               </w:rPr>
-              <w:instrText xml:space="preserve"> PAGEREF _Toc242964475 \h </w:instrText>
+              <w:instrText xml:space="preserve"> PAGEREF _Toc242966733 \h </w:instrText>
             </w:r>
             <w:r>
               <w:rPr>
@@ -4187,7 +4187,7 @@
               <w:noProof/>
             </w:rPr>
           </w:pPr>
-          <w:hyperlink w:anchor="_Toc242964476" w:history="1">
+          <w:hyperlink w:anchor="_Toc242966734" w:history="1">
             <w:r>
               <w:rPr>
                 <w:rStyle w:val="Kpr"/>
@@ -4211,7 +4211,7 @@
               <w:rPr>
                 <w:noProof/>
               </w:rPr>
-              <w:instrText xml:space="preserve"> PAGEREF _Toc242964476 \h </w:instrText>
+              <w:instrText xml:space="preserve"> PAGEREF _Toc242966734 \h </w:instrText>
             </w:r>
             <w:r>
               <w:rPr>
@@ -4248,7 +4248,7 @@
               <w:noProof/>
             </w:rPr>
           </w:pPr>
-          <w:hyperlink w:anchor="_Toc242964477" w:history="1">
+          <w:hyperlink w:anchor="_Toc242966735" w:history="1">
             <w:r>
               <w:rPr>
                 <w:rStyle w:val="Kpr"/>
@@ -4272,7 +4272,7 @@
               <w:rPr>
                 <w:noProof/>
               </w:rPr>
-              <w:instrText xml:space="preserve"> PAGEREF _Toc242964477 \h </w:instrText>
+              <w:instrText xml:space="preserve"> PAGEREF _Toc242966735 \h </w:instrText>
             </w:r>
             <w:r>
               <w:rPr>
@@ -4309,7 +4309,7 @@
               <w:noProof/>
             </w:rPr>
           </w:pPr>
-          <w:hyperlink w:anchor="_Toc242964478" w:history="1">
+          <w:hyperlink w:anchor="_Toc242966736" w:history="1">
             <w:r>
               <w:rPr>
                 <w:rStyle w:val="Kpr"/>
@@ -4333,7 +4333,7 @@
               <w:rPr>
                 <w:noProof/>
               </w:rPr>
-              <w:instrText xml:space="preserve"> PAGEREF _Toc242964478 \h </w:instrText>
+              <w:instrText xml:space="preserve"> PAGEREF _Toc242966736 \h </w:instrText>
             </w:r>
             <w:r>
               <w:rPr>
@@ -4392,7 +4392,7 @@
       <w:pPr>
         <w:pStyle w:val="Balk1"/>
       </w:pPr>
-      <w:bookmarkStart w:id="2" w:name="_Toc242964428"/>
+      <w:bookmarkStart w:id="2" w:name="_Toc242966686"/>
       <w:r>
         <w:t>1. Giriş</w:t>
       </w:r>
@@ -4402,7 +4402,7 @@
       <w:pPr>
         <w:pStyle w:val="Balk2"/>
       </w:pPr>
-      <w:bookmarkStart w:id="3" w:name="_Toc242964429"/>
+      <w:bookmarkStart w:id="3" w:name="_Toc242966687"/>
       <w:r>
         <w:t>1.1 Amaç</w:t>
       </w:r>
@@ -4430,7 +4430,7 @@
       <w:pPr>
         <w:pStyle w:val="Balk2"/>
       </w:pPr>
-      <w:bookmarkStart w:id="4" w:name="_Toc242964430"/>
+      <w:bookmarkStart w:id="4" w:name="_Toc242966688"/>
       <w:r>
         <w:t>1.2 Kapsam Özeti</w:t>
       </w:r>
@@ -4449,7 +4449,7 @@
       <w:pPr>
         <w:pStyle w:val="Balk2"/>
       </w:pPr>
-      <w:bookmarkStart w:id="5" w:name="_Toc242964431"/>
+      <w:bookmarkStart w:id="5" w:name="_Toc242966689"/>
       <w:r>
         <w:t>1.3 Referans Dokümanlar</w:t>
       </w:r>
@@ -4988,7 +4988,7 @@
       <w:pPr>
         <w:pStyle w:val="Balk2"/>
       </w:pPr>
-      <w:bookmarkStart w:id="6" w:name="_Toc242964432"/>
+      <w:bookmarkStart w:id="6" w:name="_Toc242966690"/>
       <w:r>
         <w:t>1.4 Kısaltmalar</w:t>
       </w:r>
@@ -5641,7 +5641,7 @@
       <w:pPr>
         <w:pStyle w:val="Balk1"/>
       </w:pPr>
-      <w:bookmarkStart w:id="7" w:name="_Toc242964433"/>
+      <w:bookmarkStart w:id="7" w:name="_Toc242966691"/>
       <w:r>
         <w:t>2. Test Edilecek Sistem</w:t>
       </w:r>
@@ -5651,7 +5651,7 @@
       <w:pPr>
         <w:pStyle w:val="Balk2"/>
       </w:pPr>
-      <w:bookmarkStart w:id="8" w:name="_Toc242964434"/>
+      <w:bookmarkStart w:id="8" w:name="_Toc242966692"/>
       <w:r>
         <w:t>2.1 Uygulama Tanımı</w:t>
       </w:r>
@@ -5670,7 +5670,7 @@
       <w:pPr>
         <w:pStyle w:val="Balk2"/>
       </w:pPr>
-      <w:bookmarkStart w:id="9" w:name="_Toc242964435"/>
+      <w:bookmarkStart w:id="9" w:name="_Toc242966693"/>
       <w:r>
         <w:t>2.2 Mimari ve Bileşenler</w:t>
       </w:r>
@@ -6126,7 +6126,7 @@
       <w:pPr>
         <w:pStyle w:val="Balk2"/>
       </w:pPr>
-      <w:bookmarkStart w:id="10" w:name="_Toc242964436"/>
+      <w:bookmarkStart w:id="10" w:name="_Toc242966694"/>
       <w:r>
         <w:t>2.3 Kullanıcı Rolleri</w:t>
       </w:r>
@@ -6387,7 +6387,7 @@
       <w:pPr>
         <w:pStyle w:val="Balk2"/>
       </w:pPr>
-      <w:bookmarkStart w:id="11" w:name="_Toc242964437"/>
+      <w:bookmarkStart w:id="11" w:name="_Toc242966695"/>
       <w:r>
         <w:t>2.4 Uygulama Modülleri (Site Analizi Sonucu)</w:t>
       </w:r>
@@ -7341,7 +7341,7 @@
       <w:pPr>
         <w:pStyle w:val="Balk1"/>
       </w:pPr>
-      <w:bookmarkStart w:id="12" w:name="_Toc242964438"/>
+      <w:bookmarkStart w:id="12" w:name="_Toc242966696"/>
       <w:r>
         <w:t>3. Test Kapsamı</w:t>
       </w:r>
@@ -7351,7 +7351,7 @@
       <w:pPr>
         <w:pStyle w:val="Balk2"/>
       </w:pPr>
-      <w:bookmarkStart w:id="13" w:name="_Toc242964439"/>
+      <w:bookmarkStart w:id="13" w:name="_Toc242966697"/>
       <w:r>
         <w:t>3.1 Test Edilecek Özellikler (In Scope)</w:t>
       </w:r>
@@ -10443,7 +10443,7 @@
       <w:pPr>
         <w:pStyle w:val="Balk2"/>
       </w:pPr>
-      <w:bookmarkStart w:id="14" w:name="_Toc242964440"/>
+      <w:bookmarkStart w:id="14" w:name="_Toc242966698"/>
       <w:r>
         <w:t>3.2 Test Edilmeyecek Özellikler (Out of Scope)</w:t>
       </w:r>
@@ -10544,7 +10544,7 @@
       <w:pPr>
         <w:pStyle w:val="Balk1"/>
       </w:pPr>
-      <w:bookmarkStart w:id="15" w:name="_Toc242964441"/>
+      <w:bookmarkStart w:id="15" w:name="_Toc242966699"/>
       <w:r>
         <w:t>4. Test Yaklaşımı ve Stratejisi</w:t>
       </w:r>
@@ -10554,7 +10554,7 @@
       <w:pPr>
         <w:pStyle w:val="Balk2"/>
       </w:pPr>
-      <w:bookmarkStart w:id="16" w:name="_Toc242964442"/>
+      <w:bookmarkStart w:id="16" w:name="_Toc242966700"/>
       <w:r>
         <w:t>4.1 Test Seviyeleri</w:t>
       </w:r>
@@ -11176,7 +11176,7 @@
       <w:pPr>
         <w:pStyle w:val="Balk2"/>
       </w:pPr>
-      <w:bookmarkStart w:id="17" w:name="_Toc242964443"/>
+      <w:bookmarkStart w:id="17" w:name="_Toc242966701"/>
       <w:r>
         <w:t>4.2 Test Türleri</w:t>
       </w:r>
@@ -11306,7 +11306,7 @@
       <w:pPr>
         <w:pStyle w:val="Balk2"/>
       </w:pPr>
-      <w:bookmarkStart w:id="18" w:name="_Toc242964444"/>
+      <w:bookmarkStart w:id="18" w:name="_Toc242966702"/>
       <w:r>
         <w:t>4.3 Test Tasarım Teknikleri</w:t>
       </w:r>
@@ -11735,7 +11735,7 @@
       <w:pPr>
         <w:pStyle w:val="Balk2"/>
       </w:pPr>
-      <w:bookmarkStart w:id="19" w:name="_Toc242964445"/>
+      <w:bookmarkStart w:id="19" w:name="_Toc242966703"/>
       <w:r>
         <w:t>4.4 Sipariş Statü Geçiş Kuralları</w:t>
       </w:r>
@@ -12330,7 +12330,7 @@
       <w:pPr>
         <w:pStyle w:val="Balk1"/>
       </w:pPr>
-      <w:bookmarkStart w:id="20" w:name="_Toc242964446"/>
+      <w:bookmarkStart w:id="20" w:name="_Toc242966704"/>
       <w:r>
         <w:t>5. Test Süreci ve Fazlar</w:t>
       </w:r>
@@ -14034,7 +14034,7 @@
       <w:pPr>
         <w:pStyle w:val="Balk1"/>
       </w:pPr>
-      <w:bookmarkStart w:id="21" w:name="_Toc242964447"/>
+      <w:bookmarkStart w:id="21" w:name="_Toc242966705"/>
       <w:r>
         <w:t>6. Test Ortamı</w:t>
       </w:r>
@@ -14044,7 +14044,7 @@
       <w:pPr>
         <w:pStyle w:val="Balk2"/>
       </w:pPr>
-      <w:bookmarkStart w:id="22" w:name="_Toc242964448"/>
+      <w:bookmarkStart w:id="22" w:name="_Toc242966706"/>
       <w:r>
         <w:t>6.1 Ortam Bilgileri</w:t>
       </w:r>
@@ -14529,7 +14529,7 @@
       <w:pPr>
         <w:pStyle w:val="Balk2"/>
       </w:pPr>
-      <w:bookmarkStart w:id="23" w:name="_Toc242964449"/>
+      <w:bookmarkStart w:id="23" w:name="_Toc242966707"/>
       <w:r>
         <w:t>6.2 Araçlar ve Kütüphaneler</w:t>
       </w:r>
@@ -15815,7 +15815,7 @@
       <w:pPr>
         <w:pStyle w:val="Balk2"/>
       </w:pPr>
-      <w:bookmarkStart w:id="24" w:name="_Toc242964450"/>
+      <w:bookmarkStart w:id="24" w:name="_Toc242966708"/>
       <w:r>
         <w:t>6.3 Test Verisi Yönetimi</w:t>
       </w:r>
@@ -15877,7 +15877,7 @@
       <w:pPr>
         <w:pStyle w:val="Balk1"/>
       </w:pPr>
-      <w:bookmarkStart w:id="25" w:name="_Toc242964451"/>
+      <w:bookmarkStart w:id="25" w:name="_Toc242966709"/>
       <w:r>
         <w:t>7. Test Otomasyon Mimarisi</w:t>
       </w:r>
@@ -15887,7 +15887,7 @@
       <w:pPr>
         <w:pStyle w:val="Balk2"/>
       </w:pPr>
-      <w:bookmarkStart w:id="26" w:name="_Toc242964452"/>
+      <w:bookmarkStart w:id="26" w:name="_Toc242966710"/>
       <w:r>
         <w:t>7.1 Selenium + TestNG (POM)</w:t>
       </w:r>
@@ -16015,7 +16015,7 @@
       <w:pPr>
         <w:pStyle w:val="Balk2"/>
       </w:pPr>
-      <w:bookmarkStart w:id="27" w:name="_Toc242964453"/>
+      <w:bookmarkStart w:id="27" w:name="_Toc242966711"/>
       <w:r>
         <w:t>7.2 Selenium + Cucumber (BDD + POM)</w:t>
       </w:r>
@@ -16104,7 +16104,7 @@
       <w:pPr>
         <w:pStyle w:val="Balk2"/>
       </w:pPr>
-      <w:bookmarkStart w:id="28" w:name="_Toc242964454"/>
+      <w:bookmarkStart w:id="28" w:name="_Toc242966712"/>
       <w:r>
         <w:t>7.3 API Otomasyonu (Rest Assured + POJO)</w:t>
       </w:r>
@@ -16193,7 +16193,7 @@
       <w:pPr>
         <w:pStyle w:val="Balk2"/>
       </w:pPr>
-      <w:bookmarkStart w:id="29" w:name="_Toc242964455"/>
+      <w:bookmarkStart w:id="29" w:name="_Toc242966713"/>
       <w:r>
         <w:t>7.4 Veritabanı ve E2E Otomasyonu</w:t>
       </w:r>
@@ -16212,7 +16212,7 @@
       <w:pPr>
         <w:pStyle w:val="Balk1"/>
       </w:pPr>
-      <w:bookmarkStart w:id="30" w:name="_Toc242964456"/>
+      <w:bookmarkStart w:id="30" w:name="_Toc242966714"/>
       <w:r>
         <w:t>8. Giriş, Çıkış ve Askıya Alma Kriterleri</w:t>
       </w:r>
@@ -16222,7 +16222,7 @@
       <w:pPr>
         <w:pStyle w:val="Balk2"/>
       </w:pPr>
-      <w:bookmarkStart w:id="31" w:name="_Toc242964457"/>
+      <w:bookmarkStart w:id="31" w:name="_Toc242966715"/>
       <w:r>
         <w:t>8.1 Giriş Kriterleri (Entry Criteria)</w:t>
       </w:r>
@@ -16310,7 +16310,7 @@
       <w:pPr>
         <w:pStyle w:val="Balk2"/>
       </w:pPr>
-      <w:bookmarkStart w:id="32" w:name="_Toc242964458"/>
+      <w:bookmarkStart w:id="32" w:name="_Toc242966716"/>
       <w:r>
         <w:t>8.2 Çıkış Kriterleri (Exit Criteria)</w:t>
       </w:r>
@@ -16398,7 +16398,7 @@
       <w:pPr>
         <w:pStyle w:val="Balk2"/>
       </w:pPr>
-      <w:bookmarkStart w:id="33" w:name="_Toc242964459"/>
+      <w:bookmarkStart w:id="33" w:name="_Toc242966717"/>
       <w:r>
         <w:t>8.3 Askıya Alma ve Devam Kriterleri</w:t>
       </w:r>
@@ -16659,7 +16659,7 @@
       <w:pPr>
         <w:pStyle w:val="Balk1"/>
       </w:pPr>
-      <w:bookmarkStart w:id="34" w:name="_Toc242964460"/>
+      <w:bookmarkStart w:id="34" w:name="_Toc242966718"/>
       <w:r>
         <w:t>9. Test Case Yazım Standartları</w:t>
       </w:r>
@@ -17394,7 +17394,7 @@
       <w:pPr>
         <w:pStyle w:val="Balk1"/>
       </w:pPr>
-      <w:bookmarkStart w:id="35" w:name="_Toc242964461"/>
+      <w:bookmarkStart w:id="35" w:name="_Toc242966719"/>
       <w:r>
         <w:t>10. JIRA ve Xray Yapılandırması</w:t>
       </w:r>
@@ -18113,7 +18113,7 @@
       <w:pPr>
         <w:pStyle w:val="Balk1"/>
       </w:pPr>
-      <w:bookmarkStart w:id="36" w:name="_Toc242964462"/>
+      <w:bookmarkStart w:id="36" w:name="_Toc242966720"/>
       <w:r>
         <w:t>11. Hata Yönetimi</w:t>
       </w:r>
@@ -18123,7 +18123,7 @@
       <w:pPr>
         <w:pStyle w:val="Balk2"/>
       </w:pPr>
-      <w:bookmarkStart w:id="37" w:name="_Toc242964463"/>
+      <w:bookmarkStart w:id="37" w:name="_Toc242966721"/>
       <w:r>
         <w:t>11.1 Hata Yaşam Döngüsü</w:t>
       </w:r>
@@ -18142,7 +18142,7 @@
       <w:pPr>
         <w:pStyle w:val="Balk2"/>
       </w:pPr>
-      <w:bookmarkStart w:id="38" w:name="_Toc242964464"/>
+      <w:bookmarkStart w:id="38" w:name="_Toc242966722"/>
       <w:r>
         <w:t>11.2 Severity (Ciddiyet) Tanımları</w:t>
       </w:r>
@@ -18681,7 +18681,7 @@
       <w:pPr>
         <w:pStyle w:val="Balk2"/>
       </w:pPr>
-      <w:bookmarkStart w:id="39" w:name="_Toc242964465"/>
+      <w:bookmarkStart w:id="39" w:name="_Toc242966723"/>
       <w:r>
         <w:t>11.3 Priority (Öncelik) Tanımları</w:t>
       </w:r>
@@ -18942,7 +18942,7 @@
       <w:pPr>
         <w:pStyle w:val="Balk2"/>
       </w:pPr>
-      <w:bookmarkStart w:id="40" w:name="_Toc242964466"/>
+      <w:bookmarkStart w:id="40" w:name="_Toc242966724"/>
       <w:r>
         <w:t>11.4 Bug Ticket Şablonu</w:t>
       </w:r>
@@ -19595,7 +19595,7 @@
       <w:pPr>
         <w:pStyle w:val="Balk1"/>
       </w:pPr>
-      <w:bookmarkStart w:id="41" w:name="_Toc242964467"/>
+      <w:bookmarkStart w:id="41" w:name="_Toc242966725"/>
       <w:r>
         <w:t>12. Ön Analiz Bulguları</w:t>
       </w:r>
@@ -20529,7 +20529,7 @@
       <w:pPr>
         <w:pStyle w:val="Balk1"/>
       </w:pPr>
-      <w:bookmarkStart w:id="42" w:name="_Toc242964468"/>
+      <w:bookmarkStart w:id="42" w:name="_Toc242966726"/>
       <w:r>
         <w:t>13. Takvim ve Sprint Planı</w:t>
       </w:r>
@@ -21133,7 +21133,7 @@
       <w:pPr>
         <w:pStyle w:val="Balk1"/>
       </w:pPr>
-      <w:bookmarkStart w:id="43" w:name="_Toc242964469"/>
+      <w:bookmarkStart w:id="43" w:name="_Toc242966727"/>
       <w:r>
         <w:t>14. Roller ve Sorumluluklar</w:t>
       </w:r>
@@ -21506,7 +21506,7 @@
       <w:pPr>
         <w:pStyle w:val="Balk1"/>
       </w:pPr>
-      <w:bookmarkStart w:id="44" w:name="_Toc242964470"/>
+      <w:bookmarkStart w:id="44" w:name="_Toc242966728"/>
       <w:r>
         <w:t>15. Riskler ve Önlemler</w:t>
       </w:r>
@@ -22321,7 +22321,7 @@
       <w:pPr>
         <w:pStyle w:val="Balk1"/>
       </w:pPr>
-      <w:bookmarkStart w:id="45" w:name="_Toc242964471"/>
+      <w:bookmarkStart w:id="45" w:name="_Toc242966729"/>
       <w:r>
         <w:t>16. Teslimatlar</w:t>
       </w:r>
@@ -23275,7 +23275,7 @@
       <w:pPr>
         <w:pStyle w:val="Balk1"/>
       </w:pPr>
-      <w:bookmarkStart w:id="46" w:name="_Toc242964472"/>
+      <w:bookmarkStart w:id="46" w:name="_Toc242966730"/>
       <w:r>
         <w:t>17. Test Özet Raporu (Koşum Sonuçları)</w:t>
       </w:r>
@@ -23294,7 +23294,7 @@
       <w:pPr>
         <w:pStyle w:val="Balk2"/>
       </w:pPr>
-      <w:bookmarkStart w:id="47" w:name="_Toc242964473"/>
+      <w:bookmarkStart w:id="47" w:name="_Toc242966731"/>
       <w:r>
         <w:t>17.1 Manuel Koşum Özeti</w:t>
       </w:r>
@@ -27191,11 +27191,20 @@
       <w:pPr>
         <w:pStyle w:val="Balk2"/>
       </w:pPr>
-      <w:bookmarkStart w:id="48" w:name="_Toc242964474"/>
+      <w:bookmarkStart w:id="48" w:name="_Toc242966732"/>
       <w:r>
         <w:t>17.2 Otomasyon Koşum Özeti</w:t>
       </w:r>
       <w:bookmarkEnd w:id="48"/>
+    </w:p>
+    <w:p>
+      <w:pPr>
+        <w:spacing w:after="120" w:line="276" w:lineRule="auto"/>
+        <w:jc w:val="both"/>
+      </w:pPr>
+      <w:r>
+        <w:t>Otomasyon suite’leri 15.10.2026’da yeniden koşulmuştur (Postman/Newman: 10.10.2026). Ortak test ortamına admin testleriyle eklenen ve SCRUM-257 / SCRUM-266 nedeniyle silinemeyen kayıtlar nedeniyle testler sabit kayıt sayısı yerine başlangıç verisini ve UI / API / DB tutarlılığını doğrulayacak şekilde güncellenmiştir.</w:t>
+      </w:r>
     </w:p>
     <w:tbl>
       <w:tblPr>
@@ -27527,7 +27536,7 @@
                 <w:sz w:val="19"/>
                 <w:szCs w:val="19"/>
               </w:rPr>
-              <w:t>Ürün, kategori, iletişim, auth, sepet, sipariş – 19 test</w:t>
+              <w:t>Ürün, kategori, iletişim, auth, sepet, sipariş – 20 test</w:t>
             </w:r>
           </w:p>
         </w:tc>
@@ -27554,7 +27563,7 @@
                 <w:sz w:val="19"/>
                 <w:szCs w:val="19"/>
               </w:rPr>
-              <w:t>14 PASS / 5 FAIL</w:t>
+              <w:t>14 PASS / 6 FAIL</w:t>
             </w:r>
           </w:p>
         </w:tc>
@@ -27637,7 +27646,7 @@
                 <w:sz w:val="19"/>
                 <w:szCs w:val="19"/>
               </w:rPr>
-              <w:t>10 PASS / 2 FAIL</w:t>
+              <w:t>9 PASS / 3 FAIL</w:t>
             </w:r>
           </w:p>
         </w:tc>
@@ -27822,7 +27831,7 @@
       <w:pPr>
         <w:pStyle w:val="Balk2"/>
       </w:pPr>
-      <w:bookmarkStart w:id="49" w:name="_Toc242964475"/>
+      <w:bookmarkStart w:id="49" w:name="_Toc242966733"/>
       <w:r>
         <w:t>17.3 Bulunan Hatalar (JIRA – SCRUM)</w:t>
       </w:r>
@@ -33816,7 +33825,7 @@
       <w:pPr>
         <w:pStyle w:val="Balk2"/>
       </w:pPr>
-      <w:bookmarkStart w:id="50" w:name="_Toc242964476"/>
+      <w:bookmarkStart w:id="50" w:name="_Toc242966734"/>
       <w:r>
         <w:t>17.4 Teslimat Konumları</w:t>
       </w:r>
@@ -34133,7 +34142,7 @@
       <w:pPr>
         <w:pStyle w:val="Balk2"/>
       </w:pPr>
-      <w:bookmarkStart w:id="51" w:name="_Toc242964477"/>
+      <w:bookmarkStart w:id="51" w:name="_Toc242966735"/>
       <w:r>
         <w:t>17.5 Sonuç ve Öneriler</w:t>
       </w:r>
@@ -34234,7 +34243,7 @@
       <w:pPr>
         <w:pStyle w:val="Balk1"/>
       </w:pPr>
-      <w:bookmarkStart w:id="52" w:name="_Toc242964478"/>
+      <w:bookmarkStart w:id="52" w:name="_Toc242966736"/>
       <w:r>
         <w:t>18. Onay</w:t>
       </w:r>
@@ -34756,10 +34765,68 @@
 <file path=word/numbering.xml><?xml version="1.0" encoding="utf-8"?>
 <w:numbering xmlns:wpc="http://schemas.microsoft.com/office/word/2010/wordprocessingCanvas" xmlns:cx="http://schemas.microsoft.com/office/drawing/2014/chartex" xmlns:cx1="http://schemas.microsoft.com/office/drawing/2015/9/8/chartex" xmlns:cx2="http://schemas.microsoft.com/office/drawing/2015/10/21/chartex" xmlns:cx3="http://schemas.microsoft.com/office/drawing/2016/5/9/chartex" xmlns:cx4="http://schemas.microsoft.com/office/drawing/2016/5/10/chartex" xmlns:cx5="http://schemas.microsoft.com/office/drawing/2016/5/11/chartex" xmlns:cx6="http://schemas.microsoft.com/office/drawing/2016/5/12/chartex" xmlns:cx7="http://schemas.microsoft.com/office/drawing/2016/5/13/chartex" xmlns:cx8="http://schemas.microsoft.com/office/drawing/2016/5/14/chartex" xmlns:mc="http://schemas.openxmlformats.org/markup-compatibility/2006" xmlns:aink="http://schemas.microsoft.com/office/drawing/2016/ink" xmlns:am3d="http://schemas.microsoft.com/office/drawing/2017/model3d" xmlns:o="urn:schemas-microsoft-com:office:office" xmlns:oel="http://schemas.microsoft.com/office/2019/extlst" xmlns:r="http://schemas.openxmlformats.org/officeDocument/2006/relationships" xmlns:m="http://schemas.openxmlformats.org/officeDocument/2006/math" xmlns:v="urn:schemas-microsoft-com:vml" xmlns:wp14="http://schemas.microsoft.com/office/word/2010/wordprocessingDrawing" xmlns:wp="http://schemas.openxmlformats.org/drawingml/2006/wordprocessingDrawing" xmlns:w10="urn:schemas-microsoft-com:office:word" xmlns:w="http://schemas.openxmlformats.org/wordprocessingml/2006/main" xmlns:w14="http://schemas.microsoft.com/office/word/2010/wordml" xmlns:w15="http://schemas.microsoft.com/office/word/2012/wordml" xmlns:w16cex="http://schemas.microsoft.com/office/word/2018/wordml/cex" xmlns:w16cid="http://schemas.microsoft.com/office/word/2016/wordml/cid" xmlns:w16="http://schemas.microsoft.com/office/word/2018/wordml" xmlns:w16du="http://schemas.microsoft.com/office/word/2023/wordml/word16du" xmlns:w16sdtdh="http://schemas.microsoft.com/office/word/2020/wordml/sdtdatahash" xmlns:w16sdtfl="http://schemas.microsoft.com/office/word/2024/wordml/sdtformatlock" xmlns:w16se="http://schemas.microsoft.com/office/word/2015/wordml/symex" xmlns:wpg="http://schemas.microsoft.com/office/word/2010/wordprocessingGroup" xmlns:wpi="http://schemas.microsoft.com/office/word/2010/wordprocessingInk" xmlns:wne="http://schemas.microsoft.com/office/word/2006/wordml" xmlns:wps="http://schemas.microsoft.com/office/word/2010/wordprocessingShape" mc:Ignorable="w14 w15 w16se w16cid w16 w16cex w16sdtdh w16sdtfl w16du wp14">
   <w:abstractNum w:abstractNumId="0" w15:restartNumberingAfterBreak="0">
-    <w:nsid w:val="06940FE4"/>
+    <w:nsid w:val="356E707B"/>
     <w:multiLevelType w:val="hybridMultilevel"/>
-    <w:tmpl w:val="AE22FE7A"/>
-    <w:lvl w:ilvl="0" w:tplc="37925B26" w:tentative="1">
+    <w:tmpl w:val="C44E8694"/>
+    <w:lvl w:ilvl="0" w:tplc="6C8254A2">
+      <w:start w:val="1"/>
+      <w:numFmt w:val="bullet"/>
+      <w:lvlText w:val="•"/>
+      <w:lvlJc w:val="left"/>
+      <w:pPr>
+        <w:ind w:left="720" w:hanging="360"/>
+      </w:pPr>
+    </w:lvl>
+    <w:lvl w:ilvl="1" w:tplc="473E9428" w:tentative="1">
+      <w:start w:val="1"/>
+      <w:numFmt w:val="bullet"/>
+      <w:lvlText w:val="◦"/>
+      <w:lvlJc w:val="left"/>
+      <w:pPr>
+        <w:ind w:left="1440" w:hanging="360"/>
+      </w:pPr>
+    </w:lvl>
+    <w:lvl w:ilvl="2" w:tplc="718EEABC">
+      <w:numFmt w:val="decimal"/>
+      <w:lvlText w:val=""/>
+      <w:lvlJc w:val="left"/>
+    </w:lvl>
+    <w:lvl w:ilvl="3" w:tplc="E0CCA8EE">
+      <w:numFmt w:val="decimal"/>
+      <w:lvlText w:val=""/>
+      <w:lvlJc w:val="left"/>
+    </w:lvl>
+    <w:lvl w:ilvl="4" w:tplc="60EA4654">
+      <w:numFmt w:val="decimal"/>
+      <w:lvlText w:val=""/>
+      <w:lvlJc w:val="left"/>
+    </w:lvl>
+    <w:lvl w:ilvl="5" w:tplc="5D587286">
+      <w:numFmt w:val="decimal"/>
+      <w:lvlText w:val=""/>
+      <w:lvlJc w:val="left"/>
+    </w:lvl>
+    <w:lvl w:ilvl="6" w:tplc="18389FB8">
+      <w:numFmt w:val="decimal"/>
+      <w:lvlText w:val=""/>
+      <w:lvlJc w:val="left"/>
+    </w:lvl>
+    <w:lvl w:ilvl="7" w:tplc="F7D068BC">
+      <w:numFmt w:val="decimal"/>
+      <w:lvlText w:val=""/>
+      <w:lvlJc w:val="left"/>
+    </w:lvl>
+    <w:lvl w:ilvl="8" w:tplc="6A6629F2">
+      <w:numFmt w:val="decimal"/>
+      <w:lvlText w:val=""/>
+      <w:lvlJc w:val="left"/>
+    </w:lvl>
+  </w:abstractNum>
+  <w:abstractNum w:abstractNumId="1" w15:restartNumberingAfterBreak="0">
+    <w:nsid w:val="492A1260"/>
+    <w:multiLevelType w:val="hybridMultilevel"/>
+    <w:tmpl w:val="49E8DF7A"/>
+    <w:lvl w:ilvl="0" w:tplc="E7727F6C" w:tentative="1">
       <w:start w:val="1"/>
       <w:numFmt w:val="decimal"/>
       <w:lvlText w:val="%1."/>
@@ -34768,110 +34835,52 @@
         <w:ind w:left="720" w:hanging="360"/>
       </w:pPr>
     </w:lvl>
-    <w:lvl w:ilvl="1" w:tplc="15A243F4">
+    <w:lvl w:ilvl="1" w:tplc="BE0C7520">
       <w:numFmt w:val="decimal"/>
       <w:lvlText w:val=""/>
       <w:lvlJc w:val="left"/>
     </w:lvl>
-    <w:lvl w:ilvl="2" w:tplc="6DC82D1A">
+    <w:lvl w:ilvl="2" w:tplc="F20088E0">
       <w:numFmt w:val="decimal"/>
       <w:lvlText w:val=""/>
       <w:lvlJc w:val="left"/>
     </w:lvl>
-    <w:lvl w:ilvl="3" w:tplc="B88420AA">
+    <w:lvl w:ilvl="3" w:tplc="880CC462">
       <w:numFmt w:val="decimal"/>
       <w:lvlText w:val=""/>
       <w:lvlJc w:val="left"/>
     </w:lvl>
-    <w:lvl w:ilvl="4" w:tplc="94EA5BFA">
+    <w:lvl w:ilvl="4" w:tplc="64F6CE2A">
       <w:numFmt w:val="decimal"/>
       <w:lvlText w:val=""/>
       <w:lvlJc w:val="left"/>
     </w:lvl>
-    <w:lvl w:ilvl="5" w:tplc="E9A4F948">
+    <w:lvl w:ilvl="5" w:tplc="CD7A4D84">
       <w:numFmt w:val="decimal"/>
       <w:lvlText w:val=""/>
       <w:lvlJc w:val="left"/>
     </w:lvl>
-    <w:lvl w:ilvl="6" w:tplc="EFA2D476">
+    <w:lvl w:ilvl="6" w:tplc="387C6054">
       <w:numFmt w:val="decimal"/>
       <w:lvlText w:val=""/>
       <w:lvlJc w:val="left"/>
     </w:lvl>
-    <w:lvl w:ilvl="7" w:tplc="2D6002AE">
+    <w:lvl w:ilvl="7" w:tplc="0E7C2F2A">
       <w:numFmt w:val="decimal"/>
       <w:lvlText w:val=""/>
       <w:lvlJc w:val="left"/>
     </w:lvl>
-    <w:lvl w:ilvl="8" w:tplc="36DE70FA">
-      <w:numFmt w:val="decimal"/>
-      <w:lvlText w:val=""/>
-      <w:lvlJc w:val="left"/>
-    </w:lvl>
-  </w:abstractNum>
-  <w:abstractNum w:abstractNumId="1" w15:restartNumberingAfterBreak="0">
-    <w:nsid w:val="218A5B27"/>
-    <w:multiLevelType w:val="hybridMultilevel"/>
-    <w:tmpl w:val="6DB64362"/>
-    <w:lvl w:ilvl="0" w:tplc="82B286C8">
-      <w:start w:val="1"/>
-      <w:numFmt w:val="bullet"/>
-      <w:lvlText w:val="•"/>
-      <w:lvlJc w:val="left"/>
-      <w:pPr>
-        <w:ind w:left="720" w:hanging="360"/>
-      </w:pPr>
-    </w:lvl>
-    <w:lvl w:ilvl="1" w:tplc="22A4397E" w:tentative="1">
-      <w:start w:val="1"/>
-      <w:numFmt w:val="bullet"/>
-      <w:lvlText w:val="◦"/>
-      <w:lvlJc w:val="left"/>
-      <w:pPr>
-        <w:ind w:left="1440" w:hanging="360"/>
-      </w:pPr>
-    </w:lvl>
-    <w:lvl w:ilvl="2" w:tplc="040A34B4">
-      <w:numFmt w:val="decimal"/>
-      <w:lvlText w:val=""/>
-      <w:lvlJc w:val="left"/>
-    </w:lvl>
-    <w:lvl w:ilvl="3" w:tplc="38F0CFEE">
-      <w:numFmt w:val="decimal"/>
-      <w:lvlText w:val=""/>
-      <w:lvlJc w:val="left"/>
-    </w:lvl>
-    <w:lvl w:ilvl="4" w:tplc="83083EFE">
-      <w:numFmt w:val="decimal"/>
-      <w:lvlText w:val=""/>
-      <w:lvlJc w:val="left"/>
-    </w:lvl>
-    <w:lvl w:ilvl="5" w:tplc="01AEAB42">
-      <w:numFmt w:val="decimal"/>
-      <w:lvlText w:val=""/>
-      <w:lvlJc w:val="left"/>
-    </w:lvl>
-    <w:lvl w:ilvl="6" w:tplc="7556ECFA">
-      <w:numFmt w:val="decimal"/>
-      <w:lvlText w:val=""/>
-      <w:lvlJc w:val="left"/>
-    </w:lvl>
-    <w:lvl w:ilvl="7" w:tplc="EB166DA6">
-      <w:numFmt w:val="decimal"/>
-      <w:lvlText w:val=""/>
-      <w:lvlJc w:val="left"/>
-    </w:lvl>
-    <w:lvl w:ilvl="8" w:tplc="10BA0F42">
+    <w:lvl w:ilvl="8" w:tplc="AC7C8CA4">
       <w:numFmt w:val="decimal"/>
       <w:lvlText w:val=""/>
       <w:lvlJc w:val="left"/>
     </w:lvl>
   </w:abstractNum>
   <w:abstractNum w:abstractNumId="2" w15:restartNumberingAfterBreak="0">
-    <w:nsid w:val="2B077477"/>
+    <w:nsid w:val="639C19DB"/>
     <w:multiLevelType w:val="hybridMultilevel"/>
-    <w:tmpl w:val="E59C4E76"/>
-    <w:lvl w:ilvl="0" w:tplc="536E3B20" w:tentative="1">
+    <w:tmpl w:val="8434321C"/>
+    <w:lvl w:ilvl="0" w:tplc="C99AA7CA" w:tentative="1">
       <w:start w:val="1"/>
       <w:numFmt w:val="bullet"/>
       <w:lvlText w:val="●"/>
@@ -34880,7 +34889,7 @@
         <w:ind w:left="720" w:hanging="360"/>
       </w:pPr>
     </w:lvl>
-    <w:lvl w:ilvl="1" w:tplc="AF4810DE" w:tentative="1">
+    <w:lvl w:ilvl="1" w:tplc="72A24C24" w:tentative="1">
       <w:start w:val="1"/>
       <w:numFmt w:val="bullet"/>
       <w:lvlText w:val="○"/>
@@ -34889,7 +34898,7 @@
         <w:ind w:left="1440" w:hanging="360"/>
       </w:pPr>
     </w:lvl>
-    <w:lvl w:ilvl="2" w:tplc="96E68968" w:tentative="1">
+    <w:lvl w:ilvl="2" w:tplc="6BBEE1AA" w:tentative="1">
       <w:start w:val="1"/>
       <w:numFmt w:val="bullet"/>
       <w:lvlText w:val="■"/>
@@ -34898,7 +34907,7 @@
         <w:ind w:left="2160" w:hanging="360"/>
       </w:pPr>
     </w:lvl>
-    <w:lvl w:ilvl="3" w:tplc="EF0C2FA8" w:tentative="1">
+    <w:lvl w:ilvl="3" w:tplc="E886F3AA" w:tentative="1">
       <w:start w:val="1"/>
       <w:numFmt w:val="bullet"/>
       <w:lvlText w:val="●"/>
@@ -34907,7 +34916,7 @@
         <w:ind w:left="2880" w:hanging="360"/>
       </w:pPr>
     </w:lvl>
-    <w:lvl w:ilvl="4" w:tplc="BC1E3E30" w:tentative="1">
+    <w:lvl w:ilvl="4" w:tplc="7F56AD80" w:tentative="1">
       <w:start w:val="1"/>
       <w:numFmt w:val="bullet"/>
       <w:lvlText w:val="○"/>
@@ -34916,7 +34925,7 @@
         <w:ind w:left="3600" w:hanging="360"/>
       </w:pPr>
     </w:lvl>
-    <w:lvl w:ilvl="5" w:tplc="0248CF6C" w:tentative="1">
+    <w:lvl w:ilvl="5" w:tplc="963C15D8" w:tentative="1">
       <w:start w:val="1"/>
       <w:numFmt w:val="bullet"/>
       <w:lvlText w:val="■"/>
@@ -34925,7 +34934,7 @@
         <w:ind w:left="4320" w:hanging="360"/>
       </w:pPr>
     </w:lvl>
-    <w:lvl w:ilvl="6" w:tplc="DB027300" w:tentative="1">
+    <w:lvl w:ilvl="6" w:tplc="6180D890" w:tentative="1">
       <w:start w:val="1"/>
       <w:numFmt w:val="bullet"/>
       <w:lvlText w:val="●"/>
@@ -34934,7 +34943,7 @@
         <w:ind w:left="5040" w:hanging="360"/>
       </w:pPr>
     </w:lvl>
-    <w:lvl w:ilvl="7" w:tplc="3C980340" w:tentative="1">
+    <w:lvl w:ilvl="7" w:tplc="B3EE4240" w:tentative="1">
       <w:start w:val="1"/>
       <w:numFmt w:val="bullet"/>
       <w:lvlText w:val="●"/>
@@ -34943,7 +34952,7 @@
         <w:ind w:left="5760" w:hanging="360"/>
       </w:pPr>
     </w:lvl>
-    <w:lvl w:ilvl="8" w:tplc="EF86A296" w:tentative="1">
+    <w:lvl w:ilvl="8" w:tplc="13062E02" w:tentative="1">
       <w:start w:val="1"/>
       <w:numFmt w:val="bullet"/>
       <w:lvlText w:val="●"/>
@@ -34954,10 +34963,10 @@
     </w:lvl>
   </w:abstractNum>
   <w:abstractNum w:abstractNumId="3" w15:restartNumberingAfterBreak="0">
-    <w:nsid w:val="6B881B27"/>
+    <w:nsid w:val="7CBA4345"/>
     <w:multiLevelType w:val="hybridMultilevel"/>
-    <w:tmpl w:val="C254A7C6"/>
-    <w:lvl w:ilvl="0" w:tplc="E0D29E3E" w:tentative="1">
+    <w:tmpl w:val="C138212C"/>
+    <w:lvl w:ilvl="0" w:tplc="F90035FA" w:tentative="1">
       <w:start w:val="1"/>
       <w:numFmt w:val="decimal"/>
       <w:lvlText w:val="%1."/>
@@ -34966,55 +34975,55 @@
         <w:ind w:left="720" w:hanging="360"/>
       </w:pPr>
     </w:lvl>
-    <w:lvl w:ilvl="1" w:tplc="2612F4AE">
+    <w:lvl w:ilvl="1" w:tplc="3F9215A2">
       <w:numFmt w:val="decimal"/>
       <w:lvlText w:val=""/>
       <w:lvlJc w:val="left"/>
     </w:lvl>
-    <w:lvl w:ilvl="2" w:tplc="7FC669DA">
+    <w:lvl w:ilvl="2" w:tplc="4D504A76">
       <w:numFmt w:val="decimal"/>
       <w:lvlText w:val=""/>
       <w:lvlJc w:val="left"/>
     </w:lvl>
-    <w:lvl w:ilvl="3" w:tplc="6EB228EA">
+    <w:lvl w:ilvl="3" w:tplc="FC7CC08E">
       <w:numFmt w:val="decimal"/>
       <w:lvlText w:val=""/>
       <w:lvlJc w:val="left"/>
     </w:lvl>
-    <w:lvl w:ilvl="4" w:tplc="0588ADC0">
+    <w:lvl w:ilvl="4" w:tplc="BE14BF6A">
       <w:numFmt w:val="decimal"/>
       <w:lvlText w:val=""/>
       <w:lvlJc w:val="left"/>
     </w:lvl>
-    <w:lvl w:ilvl="5" w:tplc="19A66A36">
+    <w:lvl w:ilvl="5" w:tplc="F90E423A">
       <w:numFmt w:val="decimal"/>
       <w:lvlText w:val=""/>
       <w:lvlJc w:val="left"/>
     </w:lvl>
-    <w:lvl w:ilvl="6" w:tplc="2048ABB2">
+    <w:lvl w:ilvl="6" w:tplc="3ED252FA">
       <w:numFmt w:val="decimal"/>
       <w:lvlText w:val=""/>
       <w:lvlJc w:val="left"/>
     </w:lvl>
-    <w:lvl w:ilvl="7" w:tplc="7FB602C2">
+    <w:lvl w:ilvl="7" w:tplc="BD6A0526">
       <w:numFmt w:val="decimal"/>
       <w:lvlText w:val=""/>
       <w:lvlJc w:val="left"/>
     </w:lvl>
-    <w:lvl w:ilvl="8" w:tplc="0A7EEC00">
+    <w:lvl w:ilvl="8" w:tplc="EDAA1B10">
       <w:numFmt w:val="decimal"/>
       <w:lvlText w:val=""/>
       <w:lvlJc w:val="left"/>
     </w:lvl>
   </w:abstractNum>
-  <w:num w:numId="1" w16cid:durableId="1592465078">
+  <w:num w:numId="1" w16cid:durableId="462115679">
     <w:abstractNumId w:val="2"/>
     <w:lvlOverride w:ilvl="0">
       <w:startOverride w:val="1"/>
     </w:lvlOverride>
   </w:num>
-  <w:num w:numId="2" w16cid:durableId="580679970">
-    <w:abstractNumId w:val="1"/>
+  <w:num w:numId="2" w16cid:durableId="961570295">
+    <w:abstractNumId w:val="0"/>
     <w:lvlOverride w:ilvl="0">
       <w:startOverride w:val="1"/>
     </w:lvlOverride>
@@ -35659,7 +35668,7 @@
     <w:autoRedefine/>
     <w:uiPriority w:val="39"/>
     <w:unhideWhenUsed/>
-    <w:rsid w:val="004E5906"/>
+    <w:rsid w:val="00A538C6"/>
     <w:pPr>
       <w:spacing w:after="100"/>
     </w:pPr>
@@ -35671,7 +35680,7 @@
     <w:autoRedefine/>
     <w:uiPriority w:val="39"/>
     <w:unhideWhenUsed/>
-    <w:rsid w:val="004E5906"/>
+    <w:rsid w:val="00A538C6"/>
     <w:pPr>
       <w:spacing w:after="100"/>
       <w:ind w:left="220"/>

</xml_diff>